<commit_message>
docs: Update Nikos Vasileiadis's CV documents.
</commit_message>
<xml_diff>
--- a/assets/Nikos_Vasileiadis_CV.docx
+++ b/assets/Nikos_Vasileiadis_CV.docx
@@ -100,7 +100,7 @@
         <w:pStyle w:val="FirstParagraph"/>
       </w:pPr>
       <w:r>
-        <w:t xml:space="preserve">Download executive profile:</w:t>
+        <w:t xml:space="preserve">Download profile:</w:t>
       </w:r>
       <w:r>
         <w:t xml:space="preserve"> </w:t>
@@ -192,10 +192,10 @@
           <w:b/>
           <w:bCs/>
         </w:rPr>
-        <w:t xml:space="preserve">Agile Transformation &amp; Delivery</w:t>
-      </w:r>
-      <w:r>
-        <w:t xml:space="preserve">: Deep expertise in stepping into complex, low-maturity environments, introducing structured Agile/Scrum methodologies, and driving predictable delivery.</w:t>
+        <w:t xml:space="preserve">Design Systems Leadership</w:t>
+      </w:r>
+      <w:r>
+        <w:t xml:space="preserve">: End-to-end experience building and managing Design Systems — from open-source implementation (Pulsar at Jadu) to leading a dedicated Design Systems team at scale, enabling consistent, high-velocity delivery across product and engineering.</w:t>
       </w:r>
     </w:p>
     <w:p>
@@ -211,6 +211,25 @@
           <w:b/>
           <w:bCs/>
         </w:rPr>
+        <w:t xml:space="preserve">Agile Transformation &amp; Delivery</w:t>
+      </w:r>
+      <w:r>
+        <w:t xml:space="preserve">: Deep expertise in stepping into complex, low-maturity environments, introducing structured Agile/Scrum methodologies, and driving predictable delivery.</w:t>
+      </w:r>
+    </w:p>
+    <w:p>
+      <w:pPr>
+        <w:pStyle w:val="Compact"/>
+        <w:numPr>
+          <w:ilvl w:val="0"/>
+          <w:numId w:val="1002"/>
+        </w:numPr>
+      </w:pPr>
+      <w:r>
+        <w:rPr>
+          <w:b/>
+          <w:bCs/>
+        </w:rPr>
         <w:t xml:space="preserve">Cross-Functional Technical Vision</w:t>
       </w:r>
       <w:r>
@@ -360,11 +379,29 @@
         <w:pStyle w:val="BodyText"/>
       </w:pPr>
       <w:r>
+        <w:rPr>
+          <w:b/>
+          <w:bCs/>
+        </w:rPr>
+        <w:t xml:space="preserve">Progressive Leadership Arc (7+ years):</w:t>
+      </w:r>
+      <w:r>
+        <w:t xml:space="preserve"> </w:t>
+      </w:r>
+      <w:r>
+        <w:t xml:space="preserve">My leadership responsibilities have grown continuously since 2017 — from rotating Scrum Master at Jadu, to Interim Scrum Master during a critical digital transformation at Leeds Building Society, to formal Scrum Master at IMA-HOME, to bootstrapping and leading the Content Capability team at Utility Warehouse, to my current Engineering Manager role overseeing two teams and eight engineers. Each step was a deliberate expansion of scope.</w:t>
+      </w:r>
+    </w:p>
+    <w:p>
+      <w:pPr>
+        <w:pStyle w:val="BodyText"/>
+      </w:pPr>
+      <w:r>
         <w:t xml:space="preserve">I am looking to join a progressive company where I can operate at a high leadership level, utilizing my commercial mindset and technical depth to shape technical strategy, drive business resilience, and lead engineering organizations that actually serve the bottom line. Let’s connect.</w:t>
       </w:r>
     </w:p>
     <w:bookmarkEnd w:id="13"/>
-    <w:bookmarkStart w:id="22" w:name="experience"/>
+    <w:bookmarkStart w:id="23" w:name="experience"/>
     <w:p>
       <w:pPr>
         <w:pStyle w:val="Heading2"/>
@@ -505,13 +542,13 @@
           <w:b/>
           <w:bCs/>
         </w:rPr>
-        <w:t xml:space="preserve">Commercial &amp; Vendor Management:</w:t>
-      </w:r>
-      <w:r>
-        <w:t xml:space="preserve"> </w:t>
-      </w:r>
-      <w:r>
-        <w:t xml:space="preserve">Evaluated CMS solutions, negotiated requirements, and conducted extensive technical due diligence for a legacy CMS replacement to mitigate enterprise risk.</w:t>
+        <w:t xml:space="preserve">Design Systems Leadership:</w:t>
+      </w:r>
+      <w:r>
+        <w:t xml:space="preserve"> </w:t>
+      </w:r>
+      <w:r>
+        <w:t xml:space="preserve">Managed a dedicated Design Systems team — a cross-functional capability enabling consistent, high-velocity delivery across product and engineering. Design Systems work is inherently UX-led and organisation-wide in its reach.</w:t>
       </w:r>
     </w:p>
     <w:p>
@@ -527,29 +564,13 @@
           <w:b/>
           <w:bCs/>
         </w:rPr>
-        <w:t xml:space="preserve">Team Topology &amp; Culture:</w:t>
-      </w:r>
-      <w:r>
-        <w:t xml:space="preserve"> </w:t>
-      </w:r>
-      <w:r>
-        <w:t xml:space="preserve">Built a high-performing engineering culture with a</w:t>
-      </w:r>
-      <w:r>
-        <w:t xml:space="preserve"> </w:t>
-      </w:r>
-      <w:r>
-        <w:rPr>
-          <w:b/>
-          <w:bCs/>
-        </w:rPr>
-        <w:t xml:space="preserve">100% retention rate</w:t>
-      </w:r>
-      <w:r>
-        <w:t xml:space="preserve"> </w:t>
-      </w:r>
-      <w:r>
-        <w:t xml:space="preserve">across two teams (8 engineers). Optimized team structures to deliver continuous enterprise value, resolving high-level organizational unknowns.</w:t>
+        <w:t xml:space="preserve">Commercial &amp; Vendor Management:</w:t>
+      </w:r>
+      <w:r>
+        <w:t xml:space="preserve"> </w:t>
+      </w:r>
+      <w:r>
+        <w:t xml:space="preserve">Evaluated CMS solutions, negotiated requirements, and conducted extensive technical due diligence for a legacy CMS replacement to mitigate enterprise risk.</w:t>
       </w:r>
     </w:p>
     <w:p>
@@ -565,6 +586,44 @@
           <w:b/>
           <w:bCs/>
         </w:rPr>
+        <w:t xml:space="preserve">Team Topology &amp; Culture:</w:t>
+      </w:r>
+      <w:r>
+        <w:t xml:space="preserve"> </w:t>
+      </w:r>
+      <w:r>
+        <w:t xml:space="preserve">Built a high-performing engineering culture with a</w:t>
+      </w:r>
+      <w:r>
+        <w:t xml:space="preserve"> </w:t>
+      </w:r>
+      <w:r>
+        <w:rPr>
+          <w:b/>
+          <w:bCs/>
+        </w:rPr>
+        <w:t xml:space="preserve">100% retention rate</w:t>
+      </w:r>
+      <w:r>
+        <w:t xml:space="preserve"> </w:t>
+      </w:r>
+      <w:r>
+        <w:t xml:space="preserve">across two teams (8 engineers). Optimized team structures to deliver continuous enterprise value, resolving high-level organizational unknowns.</w:t>
+      </w:r>
+    </w:p>
+    <w:p>
+      <w:pPr>
+        <w:pStyle w:val="Compact"/>
+        <w:numPr>
+          <w:ilvl w:val="0"/>
+          <w:numId w:val="1003"/>
+        </w:numPr>
+      </w:pPr>
+      <w:r>
+        <w:rPr>
+          <w:b/>
+          <w:bCs/>
+        </w:rPr>
         <w:t xml:space="preserve">Cross-Functional Leadership:</w:t>
       </w:r>
       <w:r>
@@ -990,7 +1049,7 @@
       </w:r>
     </w:p>
     <w:bookmarkEnd w:id="17"/>
-    <w:bookmarkStart w:id="18" w:name="ux-interface-developer"/>
+    <w:bookmarkStart w:id="19" w:name="ux-interface-developer"/>
     <w:p>
       <w:pPr>
         <w:pStyle w:val="Heading3"/>
@@ -1065,7 +1124,7 @@
         <w:t xml:space="preserve">Description</w:t>
       </w:r>
       <w:r>
-        <w:t xml:space="preserve">: Designed UIs and developed new features with a strict focus on user experience, accessibility, and W3C standards for an award-winning custom CMS.</w:t>
+        <w:t xml:space="preserve">: Designed UIs and developed new features with a strict focus on user experience, accessibility, and W3C standards for an award-winning custom CMS used by Local Authorities, Higher Education, and third-sector organisations.</w:t>
       </w:r>
     </w:p>
     <w:p>
@@ -1077,6 +1136,37 @@
           <w:b/>
           <w:bCs/>
         </w:rPr>
+        <w:t xml:space="preserve">Design Systems</w:t>
+      </w:r>
+      <w:r>
+        <w:t xml:space="preserve">: Co-created and maintained</w:t>
+      </w:r>
+      <w:r>
+        <w:t xml:space="preserve"> </w:t>
+      </w:r>
+      <w:r>
+        <w:rPr>
+          <w:b/>
+          <w:bCs/>
+        </w:rPr>
+        <w:t xml:space="preserve">Pulsar</w:t>
+      </w:r>
+      <w:r>
+        <w:t xml:space="preserve"> </w:t>
+      </w:r>
+      <w:r>
+        <w:t xml:space="preserve">— an open-source UX and Interface Design System powering the Jadu Continuum Platform. This is the foundation of my Design Systems specialism, combining component architecture, accessibility, and cross-team enablement.</w:t>
+      </w:r>
+    </w:p>
+    <w:p>
+      <w:pPr>
+        <w:pStyle w:val="BodyText"/>
+      </w:pPr>
+      <w:r>
+        <w:rPr>
+          <w:b/>
+          <w:bCs/>
+        </w:rPr>
         <w:t xml:space="preserve">Agile Delivery</w:t>
       </w:r>
       <w:r>
@@ -1110,11 +1200,22 @@
         <w:t xml:space="preserve">Projects</w:t>
       </w:r>
       <w:r>
-        <w:t xml:space="preserve">: Award Winning custom CMS for large-scale institutions like Local Authorities, Higher Education and third-sector not-for-profit organisations, Open source Interface Design System (Pulsar)</w:t>
-      </w:r>
-    </w:p>
-    <w:bookmarkEnd w:id="18"/>
-    <w:bookmarkStart w:id="19" w:name="digital-developer"/>
+        <w:t xml:space="preserve">: Award-winning custom CMS for large-scale public sector institutions — Open source Interface Design System (</w:t>
+      </w:r>
+      <w:hyperlink r:id="rId18">
+        <w:r>
+          <w:rPr>
+            <w:rStyle w:val="Hyperlink"/>
+          </w:rPr>
+          <w:t xml:space="preserve">Pulsar</w:t>
+        </w:r>
+      </w:hyperlink>
+      <w:r>
+        <w:t xml:space="preserve">)</w:t>
+      </w:r>
+    </w:p>
+    <w:bookmarkEnd w:id="19"/>
+    <w:bookmarkStart w:id="20" w:name="digital-developer"/>
     <w:p>
       <w:pPr>
         <w:pStyle w:val="Heading3"/>
@@ -1245,8 +1346,8 @@
         <w:t xml:space="preserve">: Silverstone, Bowcliffe Hall, St. Leonard’s Place, Woodside Square, Sixteen Real Estate</w:t>
       </w:r>
     </w:p>
-    <w:bookmarkEnd w:id="19"/>
-    <w:bookmarkStart w:id="20" w:name="front-end-developer"/>
+    <w:bookmarkEnd w:id="20"/>
+    <w:bookmarkStart w:id="21" w:name="front-end-developer"/>
     <w:p>
       <w:pPr>
         <w:pStyle w:val="Heading3"/>
@@ -1293,10 +1394,10 @@
         <w:t xml:space="preserve">Location</w:t>
       </w:r>
       <w:r>
-        <w:t xml:space="preserve">: Greater Leeds Area</w:t>
-      </w:r>
-      <w:r>
-        <w:br/>
+        <w:t xml:space="preserve">: Leeds, England, United Kingdom</w:t>
+      </w:r>
+      <w:r>
+        <w:t xml:space="preserve"> </w:t>
       </w:r>
       <w:r>
         <w:rPr>
@@ -1377,8 +1478,8 @@
         <w:t xml:space="preserve">: Vivienne Westwood, Kärcher, CACI, EQVVS, G-Type</w:t>
       </w:r>
     </w:p>
-    <w:bookmarkEnd w:id="20"/>
-    <w:bookmarkStart w:id="21" w:name="early-career-consulting"/>
+    <w:bookmarkEnd w:id="21"/>
+    <w:bookmarkStart w:id="22" w:name="early-career-consulting"/>
     <w:p>
       <w:pPr>
         <w:pStyle w:val="Heading3"/>
@@ -1415,9 +1516,9 @@
         <w:t xml:space="preserve">: Various full-stack development, consultancy, and training roles building the foundation of my technical and leadership capabilities. Key experiences included developing CMS-based solutions for non-profits (UNESCO) and local businesses, architecting real estate platforms, engineering e-commerce splits payment systems, and delivering technical training (C Programming, Algorithms).</w:t>
       </w:r>
     </w:p>
-    <w:bookmarkEnd w:id="21"/>
     <w:bookmarkEnd w:id="22"/>
-    <w:bookmarkStart w:id="23" w:name="education"/>
+    <w:bookmarkEnd w:id="23"/>
+    <w:bookmarkStart w:id="24" w:name="education"/>
     <w:p>
       <w:pPr>
         <w:pStyle w:val="Heading2"/>
@@ -1484,8 +1585,8 @@
         <w:t xml:space="preserve">: BSc Informatics Engineering (attended 2007–2012; did not graduate due to the Greek financial crisis)</w:t>
       </w:r>
     </w:p>
-    <w:bookmarkEnd w:id="23"/>
-    <w:bookmarkStart w:id="25" w:name="professional-credentials"/>
+    <w:bookmarkEnd w:id="24"/>
+    <w:bookmarkStart w:id="26" w:name="professional-credentials"/>
     <w:p>
       <w:pPr>
         <w:pStyle w:val="Heading2"/>
@@ -1578,7 +1679,7 @@
         </w:rPr>
         <w:t xml:space="preserve"> </w:t>
       </w:r>
-      <w:hyperlink r:id="rId24">
+      <w:hyperlink r:id="rId25">
         <w:r>
           <w:rPr>
             <w:rStyle w:val="Hyperlink"/>
@@ -1603,8 +1704,8 @@
         <w:t xml:space="preserve">page.</w:t>
       </w:r>
     </w:p>
-    <w:bookmarkEnd w:id="25"/>
-    <w:bookmarkStart w:id="26" w:name="community-leadership"/>
+    <w:bookmarkEnd w:id="26"/>
+    <w:bookmarkStart w:id="27" w:name="community-leadership"/>
     <w:p>
       <w:pPr>
         <w:pStyle w:val="Heading2"/>
@@ -1688,7 +1789,7 @@
         <w:t xml:space="preserve">: Revived an inactive GDG chapter; organised conferences, workshops, and technical meetups.</w:t>
       </w:r>
     </w:p>
-    <w:bookmarkEnd w:id="26"/>
+    <w:bookmarkEnd w:id="27"/>
     <w:sectPr>
       <w:footnotePr>
         <w:numRestart w:val="eachSect"/>

</xml_diff>

<commit_message>
feat: Update CV content and presentation, adding conditional rendering for web and PDF/DOCX formats.
</commit_message>
<xml_diff>
--- a/assets/Nikos_Vasileiadis_CV.docx
+++ b/assets/Nikos_Vasileiadis_CV.docx
@@ -7,92 +7,16 @@
         <w:pStyle w:val="Title"/>
       </w:pPr>
       <w:r>
-        <w:t xml:space="preserve">CV</w:t>
-      </w:r>
-    </w:p>
-    <w:bookmarkStart w:id="11" w:name="who-am-i"/>
-    <w:p>
-      <w:pPr>
-        <w:pStyle w:val="Heading2"/>
-      </w:pPr>
-      <w:r>
-        <w:t xml:space="preserve">Who am I?</w:t>
-      </w:r>
-    </w:p>
-    <w:p>
-      <w:pPr>
-        <w:pStyle w:val="Compact"/>
-        <w:numPr>
-          <w:ilvl w:val="0"/>
-          <w:numId w:val="1001"/>
-        </w:numPr>
-      </w:pPr>
-      <w:r>
-        <w:rPr>
-          <w:b/>
-          <w:bCs/>
-        </w:rPr>
-        <w:t xml:space="preserve">Name</w:t>
-      </w:r>
-      <w:r>
-        <w:t xml:space="preserve">: Nikos Vasileiadis</w:t>
-      </w:r>
-    </w:p>
-    <w:p>
-      <w:pPr>
-        <w:pStyle w:val="Compact"/>
-        <w:numPr>
-          <w:ilvl w:val="0"/>
-          <w:numId w:val="1001"/>
-        </w:numPr>
-      </w:pPr>
-      <w:r>
-        <w:rPr>
-          <w:b/>
-          <w:bCs/>
-        </w:rPr>
-        <w:t xml:space="preserve">Title</w:t>
-      </w:r>
-      <w:r>
-        <w:t xml:space="preserve">: Engineering Leader</w:t>
-      </w:r>
-    </w:p>
-    <w:p>
-      <w:pPr>
-        <w:pStyle w:val="Compact"/>
-        <w:numPr>
-          <w:ilvl w:val="0"/>
-          <w:numId w:val="1001"/>
-        </w:numPr>
-      </w:pPr>
-      <w:r>
-        <w:rPr>
-          <w:b/>
-          <w:bCs/>
-        </w:rPr>
-        <w:t xml:space="preserve">Location</w:t>
-      </w:r>
-      <w:r>
-        <w:t xml:space="preserve">: Leeds, England, United Kingdom</w:t>
-      </w:r>
-    </w:p>
-    <w:p>
-      <w:pPr>
-        <w:pStyle w:val="Compact"/>
-        <w:numPr>
-          <w:ilvl w:val="0"/>
-          <w:numId w:val="1001"/>
-        </w:numPr>
-      </w:pPr>
-      <w:r>
-        <w:rPr>
-          <w:b/>
-          <w:bCs/>
-        </w:rPr>
-        <w:t xml:space="preserve">Right to work</w:t>
-      </w:r>
-      <w:r>
-        <w:t xml:space="preserve">: British Citizen</w:t>
+        <w:t xml:space="preserve">CV — Nikos Vasileiadis | Engineering Leader | Leeds, UK</w:t>
+      </w:r>
+    </w:p>
+    <w:bookmarkStart w:id="30" w:name="nikos-vasileiadis"/>
+    <w:p>
+      <w:pPr>
+        <w:pStyle w:val="Heading1"/>
+      </w:pPr>
+      <w:r>
+        <w:t xml:space="preserve">Nikos Vasileiadis</w:t>
       </w:r>
     </w:p>
     <w:p>
@@ -100,12 +24,81 @@
         <w:pStyle w:val="FirstParagraph"/>
       </w:pPr>
       <w:r>
+        <w:rPr>
+          <w:b/>
+          <w:bCs/>
+        </w:rPr>
+        <w:t xml:space="preserve">Engineering Leader</w:t>
+      </w:r>
+      <w:r>
+        <w:t xml:space="preserve"> </w:t>
+      </w:r>
+      <w:r>
+        <w:t xml:space="preserve">· Leeds, England, United Kingdom · British Citizen</w:t>
+      </w:r>
+      <w:r>
+        <w:br/>
+      </w:r>
+      <w:hyperlink r:id="rId9">
+        <w:r>
+          <w:rPr>
+            <w:rStyle w:val="Hyperlink"/>
+          </w:rPr>
+          <w:t xml:space="preserve">vasileiadis.nikos@gmail.com</w:t>
+        </w:r>
+      </w:hyperlink>
+      <w:r>
+        <w:t xml:space="preserve"> </w:t>
+      </w:r>
+      <w:r>
+        <w:t xml:space="preserve">·</w:t>
+      </w:r>
+      <w:r>
+        <w:t xml:space="preserve"> </w:t>
+      </w:r>
+      <w:hyperlink r:id="rId10">
+        <w:r>
+          <w:rPr>
+            <w:rStyle w:val="Hyperlink"/>
+          </w:rPr>
+          <w:t xml:space="preserve">linkedin.com/in/nvasileiadis</w:t>
+        </w:r>
+      </w:hyperlink>
+      <w:r>
+        <w:t xml:space="preserve"> </w:t>
+      </w:r>
+      <w:r>
+        <w:t xml:space="preserve">·</w:t>
+      </w:r>
+      <w:r>
+        <w:t xml:space="preserve"> </w:t>
+      </w:r>
+      <w:hyperlink r:id="rId11">
+        <w:r>
+          <w:rPr>
+            <w:rStyle w:val="Hyperlink"/>
+          </w:rPr>
+          <w:t xml:space="preserve">nvasileiadis.github.io</w:t>
+        </w:r>
+      </w:hyperlink>
+      <w:r>
+        <w:t xml:space="preserve"> </w:t>
+      </w:r>
+      <w:r>
+        <w:t xml:space="preserve">· 07729 021 996</w:t>
+      </w:r>
+    </w:p>
+    <w:p>
+      <w:pPr>
+        <w:pStyle w:val="BodyText"/>
+      </w:pPr>
+      <w:r>
         <w:t xml:space="preserve">Download profile:</w:t>
       </w:r>
       <w:r>
         <w:t xml:space="preserve"> </w:t>
       </w:r>
-      <w:hyperlink r:id="rId9">
+      <w:hyperlink r:id="rId12">
         <w:r>
           <w:rPr>
             <w:rStyle w:val="Hyperlink"/>
@@ -122,7 +115,7 @@
       <w:r>
         <w:t xml:space="preserve"> </w:t>
       </w:r>
-      <w:hyperlink r:id="rId10">
+      <w:hyperlink r:id="rId13">
         <w:r>
           <w:rPr>
             <w:rStyle w:val="Hyperlink"/>
@@ -131,14 +124,211 @@
         </w:r>
       </w:hyperlink>
     </w:p>
-    <w:bookmarkEnd w:id="11"/>
-    <w:bookmarkStart w:id="12" w:name="top-skills"/>
+    <w:bookmarkStart w:id="14" w:name="top-skills"/>
     <w:p>
       <w:pPr>
         <w:pStyle w:val="Heading2"/>
       </w:pPr>
       <w:r>
         <w:t xml:space="preserve">Top skills</w:t>
+      </w:r>
+    </w:p>
+    <w:p>
+      <w:pPr>
+        <w:pStyle w:val="Compact"/>
+        <w:numPr>
+          <w:ilvl w:val="0"/>
+          <w:numId w:val="1001"/>
+        </w:numPr>
+      </w:pPr>
+      <w:r>
+        <w:rPr>
+          <w:b/>
+          <w:bCs/>
+        </w:rPr>
+        <w:t xml:space="preserve">Engineering Leadership &amp; Scaling</w:t>
+      </w:r>
+      <w:r>
+        <w:t xml:space="preserve">: Proven track record of building, mentoring, and retaining high-performing remote teams (100% retention rate) while establishing robust Agile practices.</w:t>
+      </w:r>
+    </w:p>
+    <w:p>
+      <w:pPr>
+        <w:pStyle w:val="Compact"/>
+        <w:numPr>
+          <w:ilvl w:val="0"/>
+          <w:numId w:val="1001"/>
+        </w:numPr>
+      </w:pPr>
+      <w:r>
+        <w:rPr>
+          <w:b/>
+          <w:bCs/>
+        </w:rPr>
+        <w:t xml:space="preserve">Platform &amp; Infrastructure Strategy</w:t>
+      </w:r>
+      <w:r>
+        <w:t xml:space="preserve">: Architecting and managing critical platform services and dependencies with a focus on SLAs, SLIs, and operational excellence for 15+ engineering teams.</w:t>
+      </w:r>
+    </w:p>
+    <w:p>
+      <w:pPr>
+        <w:pStyle w:val="Compact"/>
+        <w:numPr>
+          <w:ilvl w:val="0"/>
+          <w:numId w:val="1001"/>
+        </w:numPr>
+      </w:pPr>
+      <w:r>
+        <w:rPr>
+          <w:b/>
+          <w:bCs/>
+        </w:rPr>
+        <w:t xml:space="preserve">Design Systems Leadership</w:t>
+      </w:r>
+      <w:r>
+        <w:t xml:space="preserve">: End-to-end experience building and managing Design Systems — from open-source implementation (Pulsar at Jadu) to leading a dedicated Design Systems team at scale, enabling consistent, high-velocity delivery across product and engineering.</w:t>
+      </w:r>
+    </w:p>
+    <w:p>
+      <w:pPr>
+        <w:pStyle w:val="Compact"/>
+        <w:numPr>
+          <w:ilvl w:val="0"/>
+          <w:numId w:val="1001"/>
+        </w:numPr>
+      </w:pPr>
+      <w:r>
+        <w:rPr>
+          <w:b/>
+          <w:bCs/>
+        </w:rPr>
+        <w:t xml:space="preserve">Agile Transformation &amp; Delivery</w:t>
+      </w:r>
+      <w:r>
+        <w:t xml:space="preserve">: Deep expertise in stepping into complex, low-maturity environments, introducing structured Agile/Scrum methodologies, and driving predictable delivery.</w:t>
+      </w:r>
+    </w:p>
+    <w:p>
+      <w:pPr>
+        <w:pStyle w:val="Compact"/>
+        <w:numPr>
+          <w:ilvl w:val="0"/>
+          <w:numId w:val="1001"/>
+        </w:numPr>
+      </w:pPr>
+      <w:r>
+        <w:rPr>
+          <w:b/>
+          <w:bCs/>
+        </w:rPr>
+        <w:t xml:space="preserve">Cross-Functional Technical Vision</w:t>
+      </w:r>
+      <w:r>
+        <w:t xml:space="preserve">: Bridging the gap between product strategy, UX, and technical execution, backed by a 20-year foundation in full-stack architecture and digital transformation.</w:t>
+      </w:r>
+    </w:p>
+    <w:bookmarkEnd w:id="14"/>
+    <w:bookmarkStart w:id="15" w:name="about"/>
+    <w:p>
+      <w:pPr>
+        <w:pStyle w:val="Heading2"/>
+      </w:pPr>
+      <w:r>
+        <w:t xml:space="preserve">About</w:t>
+      </w:r>
+    </w:p>
+    <w:p>
+      <w:pPr>
+        <w:pStyle w:val="FirstParagraph"/>
+      </w:pPr>
+      <w:r>
+        <w:t xml:space="preserve">Strategic engineering leader with 20+ years of full-stack experience, operating at the intersection of product strategy, technical architecture, and commercial reality. I treat engineering as a business lever — contributing to CapEx/OpEx planning, evaluating vendor ROI, and ensuring technical investments map directly to business outcomes. My leadership arc has grown continuously since 2017: from rotating Scrum Master roles at Jadu and Leeds Building Society, to bootstrapping and leading the Content Capability team at Utility Warehouse, to my current Engineering Manager role overseeing two teams and eight engineers — each step a deliberate expansion of scope.</w:t>
+      </w:r>
+    </w:p>
+    <w:bookmarkEnd w:id="15"/>
+    <w:bookmarkStart w:id="25" w:name="experience"/>
+    <w:p>
+      <w:pPr>
+        <w:pStyle w:val="Heading2"/>
+      </w:pPr>
+      <w:r>
+        <w:t xml:space="preserve">Experience</w:t>
+      </w:r>
+    </w:p>
+    <w:bookmarkStart w:id="16" w:name="software-engineering-manager"/>
+    <w:p>
+      <w:pPr>
+        <w:pStyle w:val="Heading3"/>
+      </w:pPr>
+      <w:r>
+        <w:t xml:space="preserve">Software Engineering Manager</w:t>
+      </w:r>
+    </w:p>
+    <w:p>
+      <w:pPr>
+        <w:pStyle w:val="FirstParagraph"/>
+      </w:pPr>
+      <w:r>
+        <w:rPr>
+          <w:b/>
+          <w:bCs/>
+        </w:rPr>
+        <w:t xml:space="preserve">Company</w:t>
+      </w:r>
+      <w:r>
+        <w:t xml:space="preserve">: Utility Warehouse</w:t>
+      </w:r>
+      <w:r>
+        <w:br/>
+      </w:r>
+      <w:r>
+        <w:rPr>
+          <w:b/>
+          <w:bCs/>
+        </w:rPr>
+        <w:t xml:space="preserve">Dates</w:t>
+      </w:r>
+      <w:r>
+        <w:t xml:space="preserve">: Jul 2023 - Present (2 yrs 3 mos)</w:t>
+      </w:r>
+      <w:r>
+        <w:br/>
+      </w:r>
+      <w:r>
+        <w:rPr>
+          <w:b/>
+          <w:bCs/>
+        </w:rPr>
+        <w:t xml:space="preserve">Location</w:t>
+      </w:r>
+      <w:r>
+        <w:t xml:space="preserve">: United Kingdom · Remote</w:t>
+      </w:r>
+      <w:r>
+        <w:br/>
+      </w:r>
+      <w:r>
+        <w:rPr>
+          <w:b/>
+          <w:bCs/>
+        </w:rPr>
+        <w:t xml:space="preserve">Employment Type</w:t>
+      </w:r>
+      <w:r>
+        <w:t xml:space="preserve">: Full-time</w:t>
+      </w:r>
+    </w:p>
+    <w:p>
+      <w:pPr>
+        <w:pStyle w:val="BodyText"/>
+      </w:pPr>
+      <w:r>
+        <w:rPr>
+          <w:b/>
+          <w:bCs/>
+        </w:rPr>
+        <w:t xml:space="preserve">Responsibilities:</w:t>
       </w:r>
     </w:p>
     <w:p>
@@ -154,10 +344,13 @@
           <w:b/>
           <w:bCs/>
         </w:rPr>
-        <w:t xml:space="preserve">Engineering Leadership &amp; Scaling</w:t>
-      </w:r>
-      <w:r>
-        <w:t xml:space="preserve">: Proven track record of building, mentoring, and retaining high-performing remote teams (100% retention rate) while establishing robust Agile practices.</w:t>
+        <w:t xml:space="preserve">Rebranding Programme (2 quarters; 500 pages shipped):</w:t>
+      </w:r>
+      <w:r>
+        <w:t xml:space="preserve"> </w:t>
+      </w:r>
+      <w:r>
+        <w:t xml:space="preserve">Delivered UW’s company-wide brand refresh across the full uw.co.uk estate — the primary digital entry point for customers, partners, and the subscriber account system, and the platform where all A/B tests and business tracking metrics run. Our delivery was the critical path: no other team’s rebranding work could go live until the main website shipped. Authored automated migration scripts that saved content editors hundreds of manual hours.</w:t>
       </w:r>
     </w:p>
     <w:p>
@@ -173,10 +366,29 @@
           <w:b/>
           <w:bCs/>
         </w:rPr>
-        <w:t xml:space="preserve">Platform &amp; Infrastructure Strategy</w:t>
-      </w:r>
-      <w:r>
-        <w:t xml:space="preserve">: Architecting and managing critical platform services and dependencies with a focus on SLAs, SLIs, and operational excellence for 15+ engineering teams.</w:t>
+        <w:t xml:space="preserve">Platform Reliability:</w:t>
+      </w:r>
+      <w:r>
+        <w:t xml:space="preserve"> </w:t>
+      </w:r>
+      <w:r>
+        <w:t xml:space="preserve">Maintained</w:t>
+      </w:r>
+      <w:r>
+        <w:t xml:space="preserve"> </w:t>
+      </w:r>
+      <w:r>
+        <w:rPr>
+          <w:b/>
+          <w:bCs/>
+        </w:rPr>
+        <w:t xml:space="preserve">100% uptime</w:t>
+      </w:r>
+      <w:r>
+        <w:t xml:space="preserve"> </w:t>
+      </w:r>
+      <w:r>
+        <w:t xml:space="preserve">on uw.co.uk (SLO: 99.99%) with &lt;3s page load times on critical-path pages and ≤2 incidents per year, all resolved within hours. Supported 15 dependent teams across Customer Marketing, Digital Marketing, Partner Marketing, Acquisition, Data Science, Recruitment, and more (monitored via Kubernetes, Sentry, Prometheus, Pingdom, Cloudflare).</w:t>
       </w:r>
     </w:p>
     <w:p>
@@ -192,10 +404,13 @@
           <w:b/>
           <w:bCs/>
         </w:rPr>
-        <w:t xml:space="preserve">Design Systems Leadership</w:t>
-      </w:r>
-      <w:r>
-        <w:t xml:space="preserve">: End-to-end experience building and managing Design Systems — from open-source implementation (Pulsar at Jadu) to leading a dedicated Design Systems team at scale, enabling consistent, high-velocity delivery across product and engineering.</w:t>
+        <w:t xml:space="preserve">Design Systems (Hearth) — 20 teams, company-wide adoption:</w:t>
+      </w:r>
+      <w:r>
+        <w:t xml:space="preserve"> </w:t>
+      </w:r>
+      <w:r>
+        <w:t xml:space="preserve">Led adoption of the Hearth Design System across 20 engineering and product teams (15 full adoption, 5 partial). Consolidating component work at the Design System level eliminated thousands of hours of duplicated engineering effort — at £35+/hour, savings at rebrand scale reached into the hundreds of thousands.</w:t>
       </w:r>
     </w:p>
     <w:p>
@@ -211,10 +426,13 @@
           <w:b/>
           <w:bCs/>
         </w:rPr>
-        <w:t xml:space="preserve">Agile Transformation &amp; Delivery</w:t>
-      </w:r>
-      <w:r>
-        <w:t xml:space="preserve">: Deep expertise in stepping into complex, low-maturity environments, introducing structured Agile/Scrum methodologies, and driving predictable delivery.</w:t>
+        <w:t xml:space="preserve">CMS Transformation (Apostrophe → Contentful):</w:t>
+      </w:r>
+      <w:r>
+        <w:t xml:space="preserve"> </w:t>
+      </w:r>
+      <w:r>
+        <w:t xml:space="preserve">Led the end-to-end replacement of an effectively abandoned legacy CMS (no SLA, no SSO, dead tech stack). Conducted rigorous 2-month evaluation across 10 vendors, shortlisted to 3, and selected Contentful. Executed a zero-disruption dual-serve migration; three marketing teams (~18 people) gained content scheduling, structured content models, and eliminated duplication — removing major technical debt.</w:t>
       </w:r>
     </w:p>
     <w:p>
@@ -230,20 +448,83 @@
           <w:b/>
           <w:bCs/>
         </w:rPr>
-        <w:t xml:space="preserve">Cross-Functional Technical Vision</w:t>
-      </w:r>
-      <w:r>
-        <w:t xml:space="preserve">: Bridging the gap between product strategy, UX, and technical execution, backed by a 20-year foundation in full-stack architecture and digital transformation.</w:t>
-      </w:r>
-    </w:p>
-    <w:bookmarkEnd w:id="12"/>
-    <w:bookmarkStart w:id="13" w:name="about"/>
-    <w:p>
-      <w:pPr>
-        <w:pStyle w:val="Heading2"/>
-      </w:pPr>
-      <w:r>
-        <w:t xml:space="preserve">About</w:t>
+        <w:t xml:space="preserve">Team Leadership, Retention &amp; Developing Leaders:</w:t>
+      </w:r>
+      <w:r>
+        <w:t xml:space="preserve"> </w:t>
+      </w:r>
+      <w:r>
+        <w:t xml:space="preserve">Managed two teams (8 engineers) with a</w:t>
+      </w:r>
+      <w:r>
+        <w:t xml:space="preserve"> </w:t>
+      </w:r>
+      <w:r>
+        <w:rPr>
+          <w:b/>
+          <w:bCs/>
+        </w:rPr>
+        <w:t xml:space="preserve">100% retention rate</w:t>
+      </w:r>
+      <w:r>
+        <w:t xml:space="preserve"> </w:t>
+      </w:r>
+      <w:r>
+        <w:t xml:space="preserve">through three company restructurings. Mentored engineers who subsequently moved into Engineering Manager roles — both within UW and externally — developing leadership capability one level above my formal remit.</w:t>
+      </w:r>
+    </w:p>
+    <w:p>
+      <w:pPr>
+        <w:pStyle w:val="Compact"/>
+        <w:numPr>
+          <w:ilvl w:val="0"/>
+          <w:numId w:val="1002"/>
+        </w:numPr>
+      </w:pPr>
+      <w:r>
+        <w:rPr>
+          <w:b/>
+          <w:bCs/>
+        </w:rPr>
+        <w:t xml:space="preserve">Hiring &amp; Talent Acquisition:</w:t>
+      </w:r>
+      <w:r>
+        <w:t xml:space="preserve"> </w:t>
+      </w:r>
+      <w:r>
+        <w:t xml:space="preserve">Involved in the end-to-end hiring of 3 external engineers and facilitated 4 internal transfers, contributing to recruitment decisions, candidate assessment, and onboarding.</w:t>
+      </w:r>
+    </w:p>
+    <w:p>
+      <w:pPr>
+        <w:pStyle w:val="Compact"/>
+        <w:numPr>
+          <w:ilvl w:val="0"/>
+          <w:numId w:val="1002"/>
+        </w:numPr>
+      </w:pPr>
+      <w:r>
+        <w:rPr>
+          <w:b/>
+          <w:bCs/>
+        </w:rPr>
+        <w:t xml:space="preserve">Org Design &amp; Structural Influence:</w:t>
+      </w:r>
+      <w:r>
+        <w:t xml:space="preserve"> </w:t>
+      </w:r>
+      <w:r>
+        <w:t xml:space="preserve">During restructurings, took on unguided responsibility for scoping and executing team migrations — including the Content Capability team’s move between departments — by independently mapping scope, chasing stakeholder alignment, and building consensus from scratch. Challenged and reversed structural decisions that would have eliminated the Design Systems team, demonstrating strategic influence well above the Engineering Manager remit.</w:t>
+      </w:r>
+    </w:p>
+    <w:bookmarkEnd w:id="16"/>
+    <w:bookmarkStart w:id="17" w:name="lead-software-engineer"/>
+    <w:p>
+      <w:pPr>
+        <w:pStyle w:val="Heading3"/>
+      </w:pPr>
+      <w:r>
+        <w:t xml:space="preserve">Lead Software Engineer</w:t>
       </w:r>
     </w:p>
     <w:p>
@@ -251,19 +532,53 @@
         <w:pStyle w:val="FirstParagraph"/>
       </w:pPr>
       <w:r>
-        <w:t xml:space="preserve">I am a strategic engineering leader with over two decades of full-stack experience, now focused on aligning technical infrastructure with business outcomes. Having spent 20 years deep in the code, I now operate at the intersection of product strategy, engineering delivery, and commercial realities. I don’t believe in over-engineering for the sake of it; I am a strong advocate for pragmatic,</w:t>
-      </w:r>
-      <w:r>
-        <w:t xml:space="preserve"> </w:t>
-      </w:r>
-      <w:r>
-        <w:t xml:space="preserve">“just right”</w:t>
-      </w:r>
-      <w:r>
-        <w:t xml:space="preserve"> </w:t>
-      </w:r>
-      <w:r>
-        <w:t xml:space="preserve">architecture that solves the actual business problem, scales gracefully, and protects margins.</w:t>
+        <w:rPr>
+          <w:b/>
+          <w:bCs/>
+        </w:rPr>
+        <w:t xml:space="preserve">Company</w:t>
+      </w:r>
+      <w:r>
+        <w:t xml:space="preserve">: Utility Warehouse</w:t>
+      </w:r>
+      <w:r>
+        <w:br/>
+      </w:r>
+      <w:r>
+        <w:rPr>
+          <w:b/>
+          <w:bCs/>
+        </w:rPr>
+        <w:t xml:space="preserve">Dates</w:t>
+      </w:r>
+      <w:r>
+        <w:t xml:space="preserve">: May 2022 - Jul 2023 (1 yr 3 mos)</w:t>
+      </w:r>
+      <w:r>
+        <w:br/>
+      </w:r>
+      <w:r>
+        <w:rPr>
+          <w:b/>
+          <w:bCs/>
+        </w:rPr>
+        <w:t xml:space="preserve">Location</w:t>
+      </w:r>
+      <w:r>
+        <w:t xml:space="preserve">: United Kingdom · Remote</w:t>
+      </w:r>
+      <w:r>
+        <w:br/>
+      </w:r>
+      <w:r>
+        <w:rPr>
+          <w:b/>
+          <w:bCs/>
+        </w:rPr>
+        <w:t xml:space="preserve">Employment Type</w:t>
+      </w:r>
+      <w:r>
+        <w:t xml:space="preserve">: Full-time</w:t>
       </w:r>
     </w:p>
     <w:p>
@@ -275,214 +590,13 @@
           <w:b/>
           <w:bCs/>
         </w:rPr>
-        <w:t xml:space="preserve">Commercial Acumen &amp; Financial Literacy:</w:t>
-      </w:r>
-      <w:r>
-        <w:t xml:space="preserve"> </w:t>
-      </w:r>
-      <w:r>
-        <w:t xml:space="preserve">I approach engineering not just as a technical function, but as a lever for business growth. Supported by formal training in</w:t>
-      </w:r>
-      <w:r>
-        <w:t xml:space="preserve"> </w:t>
-      </w:r>
-      <w:r>
-        <w:t xml:space="preserve">“Finance for Non-Financial Managers,”</w:t>
-      </w:r>
-      <w:r>
-        <w:t xml:space="preserve"> </w:t>
-      </w:r>
-      <w:r>
-        <w:t xml:space="preserve">CapEx/OpEx budgeting, and business metrics, I actively evaluate vendor ROI and ensure technical investments map directly to company strategy.</w:t>
-      </w:r>
-    </w:p>
-    <w:p>
-      <w:pPr>
-        <w:pStyle w:val="BodyText"/>
-      </w:pPr>
-      <w:r>
-        <w:rPr>
-          <w:b/>
-          <w:bCs/>
-        </w:rPr>
-        <w:t xml:space="preserve">Platform Leadership &amp; Risk Management:</w:t>
-      </w:r>
-      <w:r>
-        <w:t xml:space="preserve"> </w:t>
-      </w:r>
-      <w:r>
-        <w:t xml:space="preserve">I manage critical infrastructure services that act as dependencies for 15+ teams. By leading extensive due diligence and audit work—such as replacing legacy CMS platforms—I proactively mitigate risk, ensure operational SLAs/SLOs, and provide the stable foundation upon which the rest of the business builds and scales.</w:t>
-      </w:r>
-    </w:p>
-    <w:p>
-      <w:pPr>
-        <w:pStyle w:val="BodyText"/>
-      </w:pPr>
-      <w:r>
-        <w:rPr>
-          <w:b/>
-          <w:bCs/>
-        </w:rPr>
-        <w:t xml:space="preserve">Operational Excellence &amp; Team Retention:</w:t>
-      </w:r>
-      <w:r>
-        <w:t xml:space="preserve"> </w:t>
-      </w:r>
-      <w:r>
-        <w:t xml:space="preserve">I believe that a healthy culture is the ultimate productivity hack. I currently maintain a</w:t>
-      </w:r>
-      <w:r>
-        <w:t xml:space="preserve"> </w:t>
-      </w:r>
-      <w:r>
-        <w:rPr>
-          <w:b/>
-          <w:bCs/>
-        </w:rPr>
-        <w:t xml:space="preserve">100% team retention rate</w:t>
-      </w:r>
-      <w:r>
-        <w:t xml:space="preserve"> </w:t>
-      </w:r>
-      <w:r>
-        <w:t xml:space="preserve">across my engineering teams, ensuring we deliver predictable, high-quality results even in lean, resource-efficient setups.</w:t>
-      </w:r>
-    </w:p>
-    <w:p>
-      <w:pPr>
-        <w:pStyle w:val="BodyText"/>
-      </w:pPr>
-      <w:r>
-        <w:rPr>
-          <w:b/>
-          <w:bCs/>
-        </w:rPr>
-        <w:t xml:space="preserve">Strategic Execution:</w:t>
-      </w:r>
-      <w:r>
-        <w:t xml:space="preserve"> </w:t>
-      </w:r>
-      <w:r>
-        <w:t xml:space="preserve">Currently leading a company-wide rebranding initiative involving 50 distinct components and 460+ pages across two quarters, demonstrating my capability to execute large-scale, cross-functional organizational change.</w:t>
-      </w:r>
-    </w:p>
-    <w:p>
-      <w:pPr>
-        <w:pStyle w:val="BodyText"/>
-      </w:pPr>
-      <w:r>
-        <w:t xml:space="preserve">My 20-year technical foundation—spanning digital strategy, organisational engineering, CMS platforms, modern web architecture, UX, and agile delivery—now serves as a profound strategic advantage. I sit comfortably in the boardroom understanding the financial roadmap, and can seamlessly translate that into a scalable engineering blueprint.</w:t>
-      </w:r>
-    </w:p>
-    <w:p>
-      <w:pPr>
-        <w:pStyle w:val="BodyText"/>
-      </w:pPr>
-      <w:r>
-        <w:rPr>
-          <w:b/>
-          <w:bCs/>
-        </w:rPr>
-        <w:t xml:space="preserve">Progressive Leadership Arc (7+ years):</w:t>
-      </w:r>
-      <w:r>
-        <w:t xml:space="preserve"> </w:t>
-      </w:r>
-      <w:r>
-        <w:t xml:space="preserve">My leadership responsibilities have grown continuously since 2017 — from rotating Scrum Master at Jadu, to Interim Scrum Master during a critical digital transformation at Leeds Building Society, to formal Scrum Master at IMA-HOME, to bootstrapping and leading the Content Capability team at Utility Warehouse, to my current Engineering Manager role overseeing two teams and eight engineers. Each step was a deliberate expansion of scope.</w:t>
-      </w:r>
-    </w:p>
-    <w:p>
-      <w:pPr>
-        <w:pStyle w:val="BodyText"/>
-      </w:pPr>
-      <w:r>
-        <w:t xml:space="preserve">I am looking to join a progressive company where I can operate at a high leadership level, utilizing my commercial mindset and technical depth to shape technical strategy, drive business resilience, and lead engineering organizations that actually serve the bottom line. Let’s connect.</w:t>
-      </w:r>
-    </w:p>
-    <w:bookmarkEnd w:id="13"/>
-    <w:bookmarkStart w:id="23" w:name="experience"/>
-    <w:p>
-      <w:pPr>
-        <w:pStyle w:val="Heading2"/>
-      </w:pPr>
-      <w:r>
-        <w:t xml:space="preserve">Experience</w:t>
-      </w:r>
-    </w:p>
-    <w:bookmarkStart w:id="14" w:name="software-engineering-manager"/>
-    <w:p>
-      <w:pPr>
-        <w:pStyle w:val="Heading3"/>
-      </w:pPr>
-      <w:r>
-        <w:t xml:space="preserve">Software Engineering Manager</w:t>
-      </w:r>
-    </w:p>
-    <w:p>
-      <w:pPr>
-        <w:pStyle w:val="FirstParagraph"/>
-      </w:pPr>
-      <w:r>
-        <w:rPr>
-          <w:b/>
-          <w:bCs/>
-        </w:rPr>
-        <w:t xml:space="preserve">Company</w:t>
-      </w:r>
-      <w:r>
-        <w:t xml:space="preserve">: Utility Warehouse</w:t>
-      </w:r>
-      <w:r>
-        <w:br/>
-      </w:r>
-      <w:r>
-        <w:rPr>
-          <w:b/>
-          <w:bCs/>
-        </w:rPr>
-        <w:t xml:space="preserve">Dates</w:t>
-      </w:r>
-      <w:r>
-        <w:t xml:space="preserve">: Jul 2023 - Present (2 yrs 3 mos)</w:t>
-      </w:r>
-      <w:r>
-        <w:br/>
-      </w:r>
-      <w:r>
-        <w:rPr>
-          <w:b/>
-          <w:bCs/>
-        </w:rPr>
-        <w:t xml:space="preserve">Location</w:t>
-      </w:r>
-      <w:r>
-        <w:t xml:space="preserve">: United Kingdom · Remote</w:t>
-      </w:r>
-      <w:r>
-        <w:br/>
-      </w:r>
-      <w:r>
-        <w:rPr>
-          <w:b/>
-          <w:bCs/>
-        </w:rPr>
-        <w:t xml:space="preserve">Employment Type</w:t>
-      </w:r>
-      <w:r>
-        <w:t xml:space="preserve">: Full-time</w:t>
-      </w:r>
-    </w:p>
-    <w:p>
-      <w:pPr>
-        <w:pStyle w:val="BodyText"/>
-      </w:pPr>
-      <w:r>
-        <w:rPr>
-          <w:b/>
-          <w:bCs/>
-        </w:rPr>
-        <w:t xml:space="preserve">Responsibilities:</w:t>
+        <w:t xml:space="preserve">Description:</w:t>
+      </w:r>
+      <w:r>
+        <w:t xml:space="preserve"> </w:t>
+      </w:r>
+      <w:r>
+        <w:t xml:space="preserve">The Content Capability team was built around me to leverage my cross-functional expertise in engineering, UX, and Agile delivery.</w:t>
       </w:r>
     </w:p>
     <w:p>
@@ -498,13 +612,13 @@
           <w:b/>
           <w:bCs/>
         </w:rPr>
-        <w:t xml:space="preserve">Strategic Delivery &amp; Scaling:</w:t>
-      </w:r>
-      <w:r>
-        <w:t xml:space="preserve"> </w:t>
-      </w:r>
-      <w:r>
-        <w:t xml:space="preserve">Leading a company-wide rebranding initiative across 50 components and 460+ pages, directly managing related CapEx/OpEx budgets, staffing needs, and capacity planning.</w:t>
+        <w:t xml:space="preserve">Team Building from Zero:</w:t>
+      </w:r>
+      <w:r>
+        <w:t xml:space="preserve"> </w:t>
+      </w:r>
+      <w:r>
+        <w:t xml:space="preserve">Joined as the founding engineer and grew the team from 3 to 6+ through recruitment and restructuring. The team survived three company-wide restructurings (Marketing Capability → Content Capability → COREX + CMS Team) — a mark of its embedded value to the business.</w:t>
       </w:r>
     </w:p>
     <w:p>
@@ -520,13 +634,13 @@
           <w:b/>
           <w:bCs/>
         </w:rPr>
-        <w:t xml:space="preserve">Platform Architecture &amp; Dependencies:</w:t>
-      </w:r>
-      <w:r>
-        <w:t xml:space="preserve"> </w:t>
-      </w:r>
-      <w:r>
-        <w:t xml:space="preserve">Architecting and managing critical platform services acting as dependencies for 15+ engineering teams, ensuring high availability and strict SLA/SLO adherence.</w:t>
+        <w:t xml:space="preserve">Engineering Rigour from Scratch:</w:t>
+      </w:r>
+      <w:r>
+        <w:t xml:space="preserve"> </w:t>
+      </w:r>
+      <w:r>
+        <w:t xml:space="preserve">Primary Year 1 objective met: a fully operational Scrum environment with structured backlog, measurable velocity, and predictable delivery — transforming a nascent capability into a reliable engineering team.</w:t>
       </w:r>
     </w:p>
     <w:p>
@@ -542,105 +656,23 @@
           <w:b/>
           <w:bCs/>
         </w:rPr>
-        <w:t xml:space="preserve">Design Systems Leadership:</w:t>
-      </w:r>
-      <w:r>
-        <w:t xml:space="preserve"> </w:t>
-      </w:r>
-      <w:r>
-        <w:t xml:space="preserve">Managed a dedicated Design Systems team — a cross-functional capability enabling consistent, high-velocity delivery across product and engineering. Design Systems work is inherently UX-led and organisation-wide in its reach.</w:t>
-      </w:r>
-    </w:p>
-    <w:p>
-      <w:pPr>
-        <w:pStyle w:val="Compact"/>
-        <w:numPr>
-          <w:ilvl w:val="0"/>
-          <w:numId w:val="1003"/>
-        </w:numPr>
-      </w:pPr>
-      <w:r>
-        <w:rPr>
-          <w:b/>
-          <w:bCs/>
-        </w:rPr>
-        <w:t xml:space="preserve">Commercial &amp; Vendor Management:</w:t>
-      </w:r>
-      <w:r>
-        <w:t xml:space="preserve"> </w:t>
-      </w:r>
-      <w:r>
-        <w:t xml:space="preserve">Evaluated CMS solutions, negotiated requirements, and conducted extensive technical due diligence for a legacy CMS replacement to mitigate enterprise risk.</w:t>
-      </w:r>
-    </w:p>
-    <w:p>
-      <w:pPr>
-        <w:pStyle w:val="Compact"/>
-        <w:numPr>
-          <w:ilvl w:val="0"/>
-          <w:numId w:val="1003"/>
-        </w:numPr>
-      </w:pPr>
-      <w:r>
-        <w:rPr>
-          <w:b/>
-          <w:bCs/>
-        </w:rPr>
-        <w:t xml:space="preserve">Team Topology &amp; Culture:</w:t>
-      </w:r>
-      <w:r>
-        <w:t xml:space="preserve"> </w:t>
-      </w:r>
-      <w:r>
-        <w:t xml:space="preserve">Built a high-performing engineering culture with a</w:t>
-      </w:r>
-      <w:r>
-        <w:t xml:space="preserve"> </w:t>
-      </w:r>
-      <w:r>
-        <w:rPr>
-          <w:b/>
-          <w:bCs/>
-        </w:rPr>
-        <w:t xml:space="preserve">100% retention rate</w:t>
-      </w:r>
-      <w:r>
-        <w:t xml:space="preserve"> </w:t>
-      </w:r>
-      <w:r>
-        <w:t xml:space="preserve">across two teams (8 engineers). Optimized team structures to deliver continuous enterprise value, resolving high-level organizational unknowns.</w:t>
-      </w:r>
-    </w:p>
-    <w:p>
-      <w:pPr>
-        <w:pStyle w:val="Compact"/>
-        <w:numPr>
-          <w:ilvl w:val="0"/>
-          <w:numId w:val="1003"/>
-        </w:numPr>
-      </w:pPr>
-      <w:r>
-        <w:rPr>
-          <w:b/>
-          <w:bCs/>
-        </w:rPr>
-        <w:t xml:space="preserve">Cross-Functional Leadership:</w:t>
-      </w:r>
-      <w:r>
-        <w:t xml:space="preserve"> </w:t>
-      </w:r>
-      <w:r>
-        <w:t xml:space="preserve">Proactively driving strategic partnerships across marketing, product, and engineering. Acting as the bridge between technical execution and executive roadmaps.</w:t>
-      </w:r>
-    </w:p>
-    <w:bookmarkEnd w:id="14"/>
-    <w:bookmarkStart w:id="15" w:name="lead-software-engineer"/>
+        <w:t xml:space="preserve">CMS Strategy &amp; Decision:</w:t>
+      </w:r>
+      <w:r>
+        <w:t xml:space="preserve"> </w:t>
+      </w:r>
+      <w:r>
+        <w:t xml:space="preserve">Led the evaluation process that resulted in UW’s adoption of Contentful as its enterprise CMS. Presented findings and audit trail to leadership; recommendation accepted and implemented.</w:t>
+      </w:r>
+    </w:p>
+    <w:bookmarkEnd w:id="17"/>
+    <w:bookmarkStart w:id="18" w:name="senior-full-stack-developer-scrum-master"/>
     <w:p>
       <w:pPr>
         <w:pStyle w:val="Heading3"/>
       </w:pPr>
       <w:r>
-        <w:t xml:space="preserve">Lead Software Engineer</w:t>
+        <w:t xml:space="preserve">Senior Full Stack Developer &amp; Scrum Master</w:t>
       </w:r>
     </w:p>
     <w:p>
@@ -655,7 +687,7 @@
         <w:t xml:space="preserve">Company</w:t>
       </w:r>
       <w:r>
-        <w:t xml:space="preserve">: Utility Warehouse</w:t>
+        <w:t xml:space="preserve">: IMA-HOME</w:t>
       </w:r>
       <w:r>
         <w:br/>
@@ -668,7 +700,7 @@
         <w:t xml:space="preserve">Dates</w:t>
       </w:r>
       <w:r>
-        <w:t xml:space="preserve">: May 2022 - Jul 2023 (1 yr 3 mos)</w:t>
+        <w:t xml:space="preserve">: Jan 2020 - Apr 2022 (2 yrs 4 mos)</w:t>
       </w:r>
       <w:r>
         <w:br/>
@@ -681,7 +713,7 @@
         <w:t xml:space="preserve">Location</w:t>
       </w:r>
       <w:r>
-        <w:t xml:space="preserve">: United Kingdom · Remote</w:t>
+        <w:t xml:space="preserve">: Leeds, England, United Kingdom</w:t>
       </w:r>
       <w:r>
         <w:br/>
@@ -694,6 +726,136 @@
         <w:t xml:space="preserve">Employment Type</w:t>
       </w:r>
       <w:r>
+        <w:t xml:space="preserve">: Full-time, Hybrid</w:t>
+      </w:r>
+    </w:p>
+    <w:p>
+      <w:pPr>
+        <w:pStyle w:val="BodyText"/>
+      </w:pPr>
+      <w:r>
+        <w:rPr>
+          <w:b/>
+          <w:bCs/>
+        </w:rPr>
+        <w:t xml:space="preserve">Description</w:t>
+      </w:r>
+      <w:r>
+        <w:t xml:space="preserve">: Operated as a dual-threat technical leader for global brands (Adidas, MARS). Alongside architecting frontend solutions, I formally took on Scrum Master responsibilities to elevate the organization’s delivery standards and project predictability.</w:t>
+      </w:r>
+    </w:p>
+    <w:p>
+      <w:pPr>
+        <w:pStyle w:val="BodyText"/>
+      </w:pPr>
+      <w:r>
+        <w:rPr>
+          <w:b/>
+          <w:bCs/>
+        </w:rPr>
+        <w:t xml:space="preserve">Agile Transformation:</w:t>
+      </w:r>
+      <w:r>
+        <w:t xml:space="preserve"> </w:t>
+      </w:r>
+      <w:r>
+        <w:t xml:space="preserve">Introduced structured Agile/Scrum practices to an agency running entirely on ad-hoc, fire-driven delivery. Result: measurable sprint velocity, predictable project allocation, and regular client demos — improving delivery health and client confidence across the board.</w:t>
+      </w:r>
+    </w:p>
+    <w:p>
+      <w:pPr>
+        <w:pStyle w:val="BodyText"/>
+      </w:pPr>
+      <w:r>
+        <w:rPr>
+          <w:b/>
+          <w:bCs/>
+        </w:rPr>
+        <w:t xml:space="preserve">Global Design Systems (Royal Canin / MARS):</w:t>
+      </w:r>
+      <w:r>
+        <w:t xml:space="preserve"> </w:t>
+      </w:r>
+      <w:r>
+        <w:t xml:space="preserve">Architected the frontend for Royal Canin’s global web presence — a single design system serving 30+ countries including Japan and Saudi Arabia, with RTL and vertical reading direction support. Served traffic in the millions.</w:t>
+      </w:r>
+    </w:p>
+    <w:p>
+      <w:pPr>
+        <w:pStyle w:val="BodyText"/>
+      </w:pPr>
+      <w:r>
+        <w:rPr>
+          <w:b/>
+          <w:bCs/>
+        </w:rPr>
+        <w:t xml:space="preserve">Projects</w:t>
+      </w:r>
+      <w:r>
+        <w:t xml:space="preserve">: Adidas, MARS, Gregg Wallace, Leeds Rhinos, Royal Canin</w:t>
+      </w:r>
+    </w:p>
+    <w:bookmarkEnd w:id="18"/>
+    <w:bookmarkStart w:id="19" w:name="senior-digital-developer"/>
+    <w:p>
+      <w:pPr>
+        <w:pStyle w:val="Heading3"/>
+      </w:pPr>
+      <w:r>
+        <w:t xml:space="preserve">Senior Digital Developer</w:t>
+      </w:r>
+    </w:p>
+    <w:p>
+      <w:pPr>
+        <w:pStyle w:val="FirstParagraph"/>
+      </w:pPr>
+      <w:r>
+        <w:rPr>
+          <w:b/>
+          <w:bCs/>
+        </w:rPr>
+        <w:t xml:space="preserve">Company</w:t>
+      </w:r>
+      <w:r>
+        <w:t xml:space="preserve">: Leeds Building Society</w:t>
+      </w:r>
+      <w:r>
+        <w:br/>
+      </w:r>
+      <w:r>
+        <w:rPr>
+          <w:b/>
+          <w:bCs/>
+        </w:rPr>
+        <w:t xml:space="preserve">Dates</w:t>
+      </w:r>
+      <w:r>
+        <w:t xml:space="preserve">: Oct 2018 - Jan 2020 (1 yr 4 mos)</w:t>
+      </w:r>
+      <w:r>
+        <w:br/>
+      </w:r>
+      <w:r>
+        <w:rPr>
+          <w:b/>
+          <w:bCs/>
+        </w:rPr>
+        <w:t xml:space="preserve">Location</w:t>
+      </w:r>
+      <w:r>
+        <w:t xml:space="preserve">: Leeds, England, United Kingdom · Hybrid</w:t>
+      </w:r>
+      <w:r>
+        <w:br/>
+      </w:r>
+      <w:r>
+        <w:rPr>
+          <w:b/>
+          <w:bCs/>
+        </w:rPr>
+        <w:t xml:space="preserve">Employment Type</w:t>
+      </w:r>
+      <w:r>
         <w:t xml:space="preserve">: Full-time</w:t>
       </w:r>
     </w:p>
@@ -706,111 +868,56 @@
           <w:b/>
           <w:bCs/>
         </w:rPr>
-        <w:t xml:space="preserve">Description:</w:t>
-      </w:r>
-      <w:r>
-        <w:t xml:space="preserve"> </w:t>
-      </w:r>
-      <w:r>
-        <w:t xml:space="preserve">The Content Capability team was built around me to leverage my cross-functional expertise in engineering, UX, and Agile delivery.</w:t>
-      </w:r>
-    </w:p>
-    <w:p>
-      <w:pPr>
-        <w:pStyle w:val="Compact"/>
-        <w:numPr>
-          <w:ilvl w:val="0"/>
-          <w:numId w:val="1004"/>
-        </w:numPr>
-      </w:pPr>
-      <w:r>
-        <w:rPr>
-          <w:b/>
-          <w:bCs/>
-        </w:rPr>
-        <w:t xml:space="preserve">Foundational Architecture:</w:t>
-      </w:r>
-      <w:r>
-        <w:t xml:space="preserve"> </w:t>
-      </w:r>
-      <w:r>
-        <w:t xml:space="preserve">Bootstrapped the core team from the ground up, translating business needs into a scalable engineering blueprint.</w:t>
-      </w:r>
-    </w:p>
-    <w:p>
-      <w:pPr>
-        <w:pStyle w:val="Compact"/>
-        <w:numPr>
-          <w:ilvl w:val="0"/>
-          <w:numId w:val="1004"/>
-        </w:numPr>
-      </w:pPr>
-      <w:r>
-        <w:rPr>
-          <w:b/>
-          <w:bCs/>
-        </w:rPr>
-        <w:t xml:space="preserve">Strategic Migration Planning:</w:t>
-      </w:r>
-      <w:r>
-        <w:t xml:space="preserve"> </w:t>
-      </w:r>
-      <w:r>
-        <w:t xml:space="preserve">Conducted rigorous CMS benchmarking, mapped technical debt, and authored the strategy for a large-scale enterprise transition between legacy systems.</w:t>
-      </w:r>
-    </w:p>
-    <w:p>
-      <w:pPr>
-        <w:pStyle w:val="Compact"/>
-        <w:numPr>
-          <w:ilvl w:val="0"/>
-          <w:numId w:val="1004"/>
-        </w:numPr>
-      </w:pPr>
-      <w:r>
-        <w:rPr>
-          <w:b/>
-          <w:bCs/>
-        </w:rPr>
-        <w:t xml:space="preserve">Process Engineering:</w:t>
-      </w:r>
-      <w:r>
-        <w:t xml:space="preserve"> </w:t>
-      </w:r>
-      <w:r>
-        <w:t xml:space="preserve">Established robust development lifecycles, definition of done, and workflows that served as the operational foundation for the new team.</w:t>
-      </w:r>
-    </w:p>
-    <w:p>
-      <w:pPr>
-        <w:pStyle w:val="Compact"/>
-        <w:numPr>
-          <w:ilvl w:val="0"/>
-          <w:numId w:val="1004"/>
-        </w:numPr>
-      </w:pPr>
-      <w:r>
-        <w:rPr>
-          <w:b/>
-          <w:bCs/>
-        </w:rPr>
-        <w:t xml:space="preserve">Talent Development:</w:t>
-      </w:r>
-      <w:r>
-        <w:t xml:space="preserve"> </w:t>
-      </w:r>
-      <w:r>
-        <w:t xml:space="preserve">Coached and up-skilled engineering talent, functioning as a technical multiplier to elevate the overall capability of the department.</w:t>
-      </w:r>
-    </w:p>
-    <w:bookmarkEnd w:id="15"/>
-    <w:bookmarkStart w:id="16" w:name="senior-full-stack-developer-scrum-master"/>
+        <w:t xml:space="preserve">Description</w:t>
+      </w:r>
+      <w:r>
+        <w:t xml:space="preserve">: Maintained public-facing digital assets in a highly regulated FinTech environment while actively mentoring engineering teams to elevate code quality and UX standards.</w:t>
+      </w:r>
+    </w:p>
+    <w:p>
+      <w:pPr>
+        <w:pStyle w:val="BodyText"/>
+      </w:pPr>
+      <w:r>
+        <w:rPr>
+          <w:b/>
+          <w:bCs/>
+        </w:rPr>
+        <w:t xml:space="preserve">Agile First Mover:</w:t>
+      </w:r>
+      <w:r>
+        <w:t xml:space="preserve"> </w:t>
+      </w:r>
+      <w:r>
+        <w:t xml:space="preserve">Introduced Agile and Scrum to LBS for the first time, shifting a high-bureaucracy, low-velocity organisation from ad-hoc output to sprint-based iterative delivery with measurable velocity. Served as the unofficial internal Agile champion throughout my tenure.</w:t>
+      </w:r>
+    </w:p>
+    <w:p>
+      <w:pPr>
+        <w:pStyle w:val="BodyText"/>
+      </w:pPr>
+      <w:r>
+        <w:rPr>
+          <w:b/>
+          <w:bCs/>
+        </w:rPr>
+        <w:t xml:space="preserve">Digital Transformation (Interim Scrum Master, Jun–Oct 2019):</w:t>
+      </w:r>
+      <w:r>
+        <w:t xml:space="preserve"> </w:t>
+      </w:r>
+      <w:r>
+        <w:t xml:space="preserve">Appointed to lead the Digital Transformation programme alongside external consultants and cross-functional teams — moving from firefighting culture to structured, iterative feature development with regular delivery cadences.</w:t>
+      </w:r>
+    </w:p>
+    <w:bookmarkEnd w:id="19"/>
+    <w:bookmarkStart w:id="21" w:name="ux-interface-developer"/>
     <w:p>
       <w:pPr>
         <w:pStyle w:val="Heading3"/>
       </w:pPr>
       <w:r>
-        <w:t xml:space="preserve">Senior Full Stack Developer &amp; Scrum Master</w:t>
+        <w:t xml:space="preserve">UX Interface Developer</w:t>
       </w:r>
     </w:p>
     <w:p>
@@ -825,7 +932,7 @@
         <w:t xml:space="preserve">Company</w:t>
       </w:r>
       <w:r>
-        <w:t xml:space="preserve">: IMA-HOME</w:t>
+        <w:t xml:space="preserve">: Jadu</w:t>
       </w:r>
       <w:r>
         <w:br/>
@@ -838,7 +945,7 @@
         <w:t xml:space="preserve">Dates</w:t>
       </w:r>
       <w:r>
-        <w:t xml:space="preserve">: Jan 2020 - Apr 2022 (2 yrs 4 mos)</w:t>
+        <w:t xml:space="preserve">: Jan 2017 - Oct 2018 (1 yr 10 mos)</w:t>
       </w:r>
       <w:r>
         <w:br/>
@@ -851,7 +958,7 @@
         <w:t xml:space="preserve">Location</w:t>
       </w:r>
       <w:r>
-        <w:t xml:space="preserve">: Leeds, England, United Kingdom</w:t>
+        <w:t xml:space="preserve">: Leeds, England, United Kingdom · Hybrid</w:t>
       </w:r>
       <w:r>
         <w:br/>
@@ -864,7 +971,7 @@
         <w:t xml:space="preserve">Employment Type</w:t>
       </w:r>
       <w:r>
-        <w:t xml:space="preserve">: Full-time, Hybrid</w:t>
+        <w:t xml:space="preserve">: Full-time</w:t>
       </w:r>
     </w:p>
     <w:p>
@@ -879,7 +986,7 @@
         <w:t xml:space="preserve">Description</w:t>
       </w:r>
       <w:r>
-        <w:t xml:space="preserve">: Operated as a dual-threat technical leader for global brands (Adidas, MARS). Alongside architecting frontend solutions, I formally took on Scrum Master responsibilities to elevate the organization’s delivery standards and project predictability.</w:t>
+        <w:t xml:space="preserve">: Designed UIs and developed new features with a strict focus on user experience, accessibility, and W3C standards for an award-winning custom CMS used by Local Authorities, Higher Education, and third-sector organisations.</w:t>
       </w:r>
     </w:p>
     <w:p>
@@ -891,10 +998,26 @@
           <w:b/>
           <w:bCs/>
         </w:rPr>
-        <w:t xml:space="preserve">Technical Strategy</w:t>
-      </w:r>
-      <w:r>
-        <w:t xml:space="preserve">: Architected and supported scalable, long-term design systems capable of handling high-traffic, global campaigns.</w:t>
+        <w:t xml:space="preserve">Design Systems</w:t>
+      </w:r>
+      <w:r>
+        <w:t xml:space="preserve">: Co-created and maintained</w:t>
+      </w:r>
+      <w:r>
+        <w:t xml:space="preserve"> </w:t>
+      </w:r>
+      <w:r>
+        <w:rPr>
+          <w:b/>
+          <w:bCs/>
+        </w:rPr>
+        <w:t xml:space="preserve">Pulsar</w:t>
+      </w:r>
+      <w:r>
+        <w:t xml:space="preserve"> </w:t>
+      </w:r>
+      <w:r>
+        <w:t xml:space="preserve">— an open-source UX and Interface Design System powering the Jadu Continuum Platform. This is the foundation of my Design Systems specialism, combining component architecture, accessibility, and cross-team enablement.</w:t>
       </w:r>
     </w:p>
     <w:p>
@@ -906,22 +1029,10 @@
           <w:b/>
           <w:bCs/>
         </w:rPr>
-        <w:t xml:space="preserve">Agile Leadership &amp; Process Engineering</w:t>
-      </w:r>
-      <w:r>
-        <w:t xml:space="preserve">: Led as a servant-leader across multiple projects. Redefined</w:t>
-      </w:r>
-      <w:r>
-        <w:t xml:space="preserve"> </w:t>
-      </w:r>
-      <w:r>
-        <w:t xml:space="preserve">“Ways of Working,”</w:t>
-      </w:r>
-      <w:r>
-        <w:t xml:space="preserve"> </w:t>
-      </w:r>
-      <w:r>
-        <w:t xml:space="preserve">established rigorous coding best practices, and embedded a mature Agile culture to ensure consistent, high-quality agency output.</w:t>
+        <w:t xml:space="preserve">Agile Delivery</w:t>
+      </w:r>
+      <w:r>
+        <w:t xml:space="preserve">: Gained foundational, hands-on Agile leadership experience through a rotating Scrum Master model, facilitating sprint planning, daily standups, and embedding the core principles of the Agile manifesto into the team’s workflow.</w:t>
       </w:r>
     </w:p>
     <w:p>
@@ -933,276 +1044,27 @@
           <w:b/>
           <w:bCs/>
         </w:rPr>
+        <w:t xml:space="preserve">UX Research</w:t>
+      </w:r>
+      <w:r>
+        <w:t xml:space="preserve">: Conducted UX interviews, user testing, and research to improve the decision-making process for the design and development teams.</w:t>
+      </w:r>
+    </w:p>
+    <w:p>
+      <w:pPr>
+        <w:pStyle w:val="BodyText"/>
+      </w:pPr>
+      <w:r>
+        <w:rPr>
+          <w:b/>
+          <w:bCs/>
+        </w:rPr>
         <w:t xml:space="preserve">Projects</w:t>
       </w:r>
       <w:r>
-        <w:t xml:space="preserve">: Adidas, MARS, Gregg Wallace, Leeds Rhinos, Royal Canin</w:t>
-      </w:r>
-    </w:p>
-    <w:bookmarkEnd w:id="16"/>
-    <w:bookmarkStart w:id="17" w:name="senior-digital-developer"/>
-    <w:p>
-      <w:pPr>
-        <w:pStyle w:val="Heading3"/>
-      </w:pPr>
-      <w:r>
-        <w:t xml:space="preserve">Senior Digital Developer</w:t>
-      </w:r>
-    </w:p>
-    <w:p>
-      <w:pPr>
-        <w:pStyle w:val="FirstParagraph"/>
-      </w:pPr>
-      <w:r>
-        <w:rPr>
-          <w:b/>
-          <w:bCs/>
-        </w:rPr>
-        <w:t xml:space="preserve">Company</w:t>
-      </w:r>
-      <w:r>
-        <w:t xml:space="preserve">: Leeds Building Society</w:t>
-      </w:r>
-      <w:r>
-        <w:br/>
-      </w:r>
-      <w:r>
-        <w:rPr>
-          <w:b/>
-          <w:bCs/>
-        </w:rPr>
-        <w:t xml:space="preserve">Dates</w:t>
-      </w:r>
-      <w:r>
-        <w:t xml:space="preserve">: Oct 2018 - Jan 2020 (1 yr 4 mos)</w:t>
-      </w:r>
-      <w:r>
-        <w:br/>
-      </w:r>
-      <w:r>
-        <w:rPr>
-          <w:b/>
-          <w:bCs/>
-        </w:rPr>
-        <w:t xml:space="preserve">Location</w:t>
-      </w:r>
-      <w:r>
-        <w:t xml:space="preserve">: Leeds, England, United Kingdom · Hybrid</w:t>
-      </w:r>
-      <w:r>
-        <w:br/>
-      </w:r>
-      <w:r>
-        <w:rPr>
-          <w:b/>
-          <w:bCs/>
-        </w:rPr>
-        <w:t xml:space="preserve">Employment Type</w:t>
-      </w:r>
-      <w:r>
-        <w:t xml:space="preserve">: Full-time</w:t>
-      </w:r>
-    </w:p>
-    <w:p>
-      <w:pPr>
-        <w:pStyle w:val="BodyText"/>
-      </w:pPr>
-      <w:r>
-        <w:rPr>
-          <w:b/>
-          <w:bCs/>
-        </w:rPr>
-        <w:t xml:space="preserve">Description</w:t>
-      </w:r>
-      <w:r>
-        <w:t xml:space="preserve">: Maintained public-facing digital assets in a highly regulated FinTech environment while actively mentoring engineering teams to elevate code quality and UX standards.</w:t>
-      </w:r>
-    </w:p>
-    <w:p>
-      <w:pPr>
-        <w:pStyle w:val="BodyText"/>
-      </w:pPr>
-      <w:r>
-        <w:rPr>
-          <w:b/>
-          <w:bCs/>
-        </w:rPr>
-        <w:t xml:space="preserve">Agile Transformation</w:t>
-      </w:r>
-      <w:r>
-        <w:t xml:space="preserve">: Introduced Agile and Scrum practices to the organization for the first time. Functioned as the unofficial Agile champion for the majority of my tenure, scaling these processes to improve team delivery.</w:t>
-      </w:r>
-    </w:p>
-    <w:p>
-      <w:pPr>
-        <w:pStyle w:val="BodyText"/>
-      </w:pPr>
-      <w:r>
-        <w:rPr>
-          <w:b/>
-          <w:bCs/>
-        </w:rPr>
-        <w:t xml:space="preserve">Leadership in Crisis</w:t>
-      </w:r>
-      <w:r>
-        <w:t xml:space="preserve">: Following the successful introduction of Agile workflows, I was formally appointed as Interim Scrum Master (Jun 2019 - Oct 2019) to stabilize delivery and lead a web development team through a critical digital transformation program.</w:t>
-      </w:r>
-    </w:p>
-    <w:bookmarkEnd w:id="17"/>
-    <w:bookmarkStart w:id="19" w:name="ux-interface-developer"/>
-    <w:p>
-      <w:pPr>
-        <w:pStyle w:val="Heading3"/>
-      </w:pPr>
-      <w:r>
-        <w:t xml:space="preserve">UX Interface Developer</w:t>
-      </w:r>
-    </w:p>
-    <w:p>
-      <w:pPr>
-        <w:pStyle w:val="FirstParagraph"/>
-      </w:pPr>
-      <w:r>
-        <w:rPr>
-          <w:b/>
-          <w:bCs/>
-        </w:rPr>
-        <w:t xml:space="preserve">Company</w:t>
-      </w:r>
-      <w:r>
-        <w:t xml:space="preserve">: Jadu</w:t>
-      </w:r>
-      <w:r>
-        <w:br/>
-      </w:r>
-      <w:r>
-        <w:rPr>
-          <w:b/>
-          <w:bCs/>
-        </w:rPr>
-        <w:t xml:space="preserve">Dates</w:t>
-      </w:r>
-      <w:r>
-        <w:t xml:space="preserve">: Jan 2017 - Oct 2018 (1 yr 10 mos)</w:t>
-      </w:r>
-      <w:r>
-        <w:br/>
-      </w:r>
-      <w:r>
-        <w:rPr>
-          <w:b/>
-          <w:bCs/>
-        </w:rPr>
-        <w:t xml:space="preserve">Location</w:t>
-      </w:r>
-      <w:r>
-        <w:t xml:space="preserve">: Leeds, England, United Kingdom · Hybrid</w:t>
-      </w:r>
-      <w:r>
-        <w:br/>
-      </w:r>
-      <w:r>
-        <w:rPr>
-          <w:b/>
-          <w:bCs/>
-        </w:rPr>
-        <w:t xml:space="preserve">Employment Type</w:t>
-      </w:r>
-      <w:r>
-        <w:t xml:space="preserve">: Full-time</w:t>
-      </w:r>
-    </w:p>
-    <w:p>
-      <w:pPr>
-        <w:pStyle w:val="BodyText"/>
-      </w:pPr>
-      <w:r>
-        <w:rPr>
-          <w:b/>
-          <w:bCs/>
-        </w:rPr>
-        <w:t xml:space="preserve">Description</w:t>
-      </w:r>
-      <w:r>
-        <w:t xml:space="preserve">: Designed UIs and developed new features with a strict focus on user experience, accessibility, and W3C standards for an award-winning custom CMS used by Local Authorities, Higher Education, and third-sector organisations.</w:t>
-      </w:r>
-    </w:p>
-    <w:p>
-      <w:pPr>
-        <w:pStyle w:val="BodyText"/>
-      </w:pPr>
-      <w:r>
-        <w:rPr>
-          <w:b/>
-          <w:bCs/>
-        </w:rPr>
-        <w:t xml:space="preserve">Design Systems</w:t>
-      </w:r>
-      <w:r>
-        <w:t xml:space="preserve">: Co-created and maintained</w:t>
-      </w:r>
-      <w:r>
-        <w:t xml:space="preserve"> </w:t>
-      </w:r>
-      <w:r>
-        <w:rPr>
-          <w:b/>
-          <w:bCs/>
-        </w:rPr>
-        <w:t xml:space="preserve">Pulsar</w:t>
-      </w:r>
-      <w:r>
-        <w:t xml:space="preserve"> </w:t>
-      </w:r>
-      <w:r>
-        <w:t xml:space="preserve">— an open-source UX and Interface Design System powering the Jadu Continuum Platform. This is the foundation of my Design Systems specialism, combining component architecture, accessibility, and cross-team enablement.</w:t>
-      </w:r>
-    </w:p>
-    <w:p>
-      <w:pPr>
-        <w:pStyle w:val="BodyText"/>
-      </w:pPr>
-      <w:r>
-        <w:rPr>
-          <w:b/>
-          <w:bCs/>
-        </w:rPr>
-        <w:t xml:space="preserve">Agile Delivery</w:t>
-      </w:r>
-      <w:r>
-        <w:t xml:space="preserve">: Gained foundational, hands-on Agile leadership experience through a rotating Scrum Master model, facilitating sprint planning, daily standups, and embedding the core principles of the Agile manifesto into the team’s workflow.</w:t>
-      </w:r>
-    </w:p>
-    <w:p>
-      <w:pPr>
-        <w:pStyle w:val="BodyText"/>
-      </w:pPr>
-      <w:r>
-        <w:rPr>
-          <w:b/>
-          <w:bCs/>
-        </w:rPr>
-        <w:t xml:space="preserve">UX Research</w:t>
-      </w:r>
-      <w:r>
-        <w:t xml:space="preserve">: Conducted UX interviews, user testing, and research to improve the decision-making process for the design and development teams.</w:t>
-      </w:r>
-    </w:p>
-    <w:p>
-      <w:pPr>
-        <w:pStyle w:val="BodyText"/>
-      </w:pPr>
-      <w:r>
-        <w:rPr>
-          <w:b/>
-          <w:bCs/>
-        </w:rPr>
-        <w:t xml:space="preserve">Projects</w:t>
-      </w:r>
-      <w:r>
         <w:t xml:space="preserve">: Award-winning custom CMS for large-scale public sector institutions — Open source Interface Design System (</w:t>
       </w:r>
-      <w:hyperlink r:id="rId18">
+      <w:hyperlink r:id="rId20">
         <w:r>
           <w:rPr>
             <w:rStyle w:val="Hyperlink"/>
@@ -1214,8 +1076,8 @@
         <w:t xml:space="preserve">)</w:t>
       </w:r>
     </w:p>
-    <w:bookmarkEnd w:id="19"/>
-    <w:bookmarkStart w:id="20" w:name="digital-developer"/>
+    <w:bookmarkEnd w:id="21"/>
+    <w:bookmarkStart w:id="22" w:name="digital-developer"/>
     <w:p>
       <w:pPr>
         <w:pStyle w:val="Heading3"/>
@@ -1291,6 +1153,138 @@
       </w:r>
       <w:r>
         <w:t xml:space="preserve">: Delivered high-performance frontend solutions for premium real estate and automotive clients (e.g., Silverstone).</w:t>
+      </w:r>
+    </w:p>
+    <w:p>
+      <w:pPr>
+        <w:pStyle w:val="Compact"/>
+        <w:numPr>
+          <w:ilvl w:val="0"/>
+          <w:numId w:val="1004"/>
+        </w:numPr>
+      </w:pPr>
+      <w:r>
+        <w:rPr>
+          <w:b/>
+          <w:bCs/>
+        </w:rPr>
+        <w:t xml:space="preserve">Performance Optimization</w:t>
+      </w:r>
+      <w:r>
+        <w:t xml:space="preserve">: Spearheaded critical performance optimizations across a portfolio of existing projects, significantly improving load times and user engagement metrics.</w:t>
+      </w:r>
+    </w:p>
+    <w:p>
+      <w:pPr>
+        <w:pStyle w:val="Compact"/>
+        <w:numPr>
+          <w:ilvl w:val="0"/>
+          <w:numId w:val="1004"/>
+        </w:numPr>
+      </w:pPr>
+      <w:r>
+        <w:rPr>
+          <w:b/>
+          <w:bCs/>
+        </w:rPr>
+        <w:t xml:space="preserve">Workflow Modernization</w:t>
+      </w:r>
+      <w:r>
+        <w:t xml:space="preserve">: Championed the transition to modern deployment lifecycles and structured version control (Git), establishing more reliable and efficient engineering workflows for the agency.</w:t>
+      </w:r>
+    </w:p>
+    <w:p>
+      <w:pPr>
+        <w:pStyle w:val="FirstParagraph"/>
+      </w:pPr>
+      <w:r>
+        <w:rPr>
+          <w:b/>
+          <w:bCs/>
+        </w:rPr>
+        <w:t xml:space="preserve">Projects</w:t>
+      </w:r>
+      <w:r>
+        <w:t xml:space="preserve">: Silverstone, Bowcliffe Hall, St. Leonard’s Place, Woodside Square, Sixteen Real Estate</w:t>
+      </w:r>
+    </w:p>
+    <w:bookmarkEnd w:id="22"/>
+    <w:bookmarkStart w:id="23" w:name="front-end-developer"/>
+    <w:p>
+      <w:pPr>
+        <w:pStyle w:val="Heading3"/>
+      </w:pPr>
+      <w:r>
+        <w:t xml:space="preserve">Front-end Developer</w:t>
+      </w:r>
+    </w:p>
+    <w:p>
+      <w:pPr>
+        <w:pStyle w:val="FirstParagraph"/>
+      </w:pPr>
+      <w:r>
+        <w:rPr>
+          <w:b/>
+          <w:bCs/>
+        </w:rPr>
+        <w:t xml:space="preserve">Company</w:t>
+      </w:r>
+      <w:r>
+        <w:t xml:space="preserve">: Creode</w:t>
+      </w:r>
+      <w:r>
+        <w:br/>
+      </w:r>
+      <w:r>
+        <w:rPr>
+          <w:b/>
+          <w:bCs/>
+        </w:rPr>
+        <w:t xml:space="preserve">Dates</w:t>
+      </w:r>
+      <w:r>
+        <w:t xml:space="preserve">: Oct 2015 - Sep 2016 (1 year)</w:t>
+      </w:r>
+      <w:r>
+        <w:br/>
+      </w:r>
+      <w:r>
+        <w:rPr>
+          <w:b/>
+          <w:bCs/>
+        </w:rPr>
+        <w:t xml:space="preserve">Location</w:t>
+      </w:r>
+      <w:r>
+        <w:t xml:space="preserve">: Leeds, England, United Kingdom</w:t>
+      </w:r>
+      <w:r>
+        <w:t xml:space="preserve"> </w:t>
+      </w:r>
+      <w:r>
+        <w:rPr>
+          <w:b/>
+          <w:bCs/>
+        </w:rPr>
+        <w:t xml:space="preserve">Employment Type</w:t>
+      </w:r>
+      <w:r>
+        <w:t xml:space="preserve">: Full-time, On-site</w:t>
+      </w:r>
+    </w:p>
+    <w:p>
+      <w:pPr>
+        <w:pStyle w:val="BodyText"/>
+      </w:pPr>
+      <w:r>
+        <w:rPr>
+          <w:b/>
+          <w:bCs/>
+        </w:rPr>
+        <w:t xml:space="preserve">Description</w:t>
+      </w:r>
+      <w:r>
+        <w:t xml:space="preserve">: Engineered responsive e-commerce solutions for major retail brands (Vivienne Westwood, Kärcher).</w:t>
       </w:r>
     </w:p>
     <w:p>
@@ -1306,10 +1300,10 @@
           <w:b/>
           <w:bCs/>
         </w:rPr>
-        <w:t xml:space="preserve">Performance Optimization</w:t>
-      </w:r>
-      <w:r>
-        <w:t xml:space="preserve">: Spearheaded critical performance optimizations across a portfolio of existing projects, significantly improving load times and user engagement metrics.</w:t>
+        <w:t xml:space="preserve">E-Commerce Delivery</w:t>
+      </w:r>
+      <w:r>
+        <w:t xml:space="preserve">: Collaborated cross-functionally to bring complex UI designs to life, ensuring seamless cross-browser compatibility and strict adherence to brand standards.</w:t>
       </w:r>
     </w:p>
     <w:p>
@@ -1325,10 +1319,10 @@
           <w:b/>
           <w:bCs/>
         </w:rPr>
-        <w:t xml:space="preserve">Workflow Modernization</w:t>
-      </w:r>
-      <w:r>
-        <w:t xml:space="preserve">: Championed the transition to modern deployment lifecycles and structured version control (Git), establishing more reliable and efficient engineering workflows for the agency.</w:t>
+        <w:t xml:space="preserve">Digital Marketing Support</w:t>
+      </w:r>
+      <w:r>
+        <w:t xml:space="preserve">: Developed robust architecture for high-conversion HTML email campaigns, directly supporting the agency’s retention and sales generation strategies.</w:t>
       </w:r>
     </w:p>
     <w:p>
@@ -1343,17 +1337,17 @@
         <w:t xml:space="preserve">Projects</w:t>
       </w:r>
       <w:r>
-        <w:t xml:space="preserve">: Silverstone, Bowcliffe Hall, St. Leonard’s Place, Woodside Square, Sixteen Real Estate</w:t>
-      </w:r>
-    </w:p>
-    <w:bookmarkEnd w:id="20"/>
-    <w:bookmarkStart w:id="21" w:name="front-end-developer"/>
+        <w:t xml:space="preserve">: Vivienne Westwood, Kärcher, CACI, EQVVS, G-Type</w:t>
+      </w:r>
+    </w:p>
+    <w:bookmarkEnd w:id="23"/>
+    <w:bookmarkStart w:id="24" w:name="early-career-consulting"/>
     <w:p>
       <w:pPr>
         <w:pStyle w:val="Heading3"/>
       </w:pPr>
       <w:r>
-        <w:t xml:space="preserve">Front-end Developer</w:t>
+        <w:t xml:space="preserve">Early Career &amp; Consulting</w:t>
       </w:r>
     </w:p>
     <w:p>
@@ -1365,10 +1359,79 @@
           <w:b/>
           <w:bCs/>
         </w:rPr>
-        <w:t xml:space="preserve">Company</w:t>
-      </w:r>
-      <w:r>
-        <w:t xml:space="preserve">: Creode</w:t>
+        <w:t xml:space="preserve">Dates</w:t>
+      </w:r>
+      <w:r>
+        <w:t xml:space="preserve">: Oct 2005 - Sep 2015 (10 years)</w:t>
+      </w:r>
+      <w:r>
+        <w:t xml:space="preserve"> </w:t>
+      </w:r>
+      <w:r>
+        <w:rPr>
+          <w:b/>
+          <w:bCs/>
+        </w:rPr>
+        <w:t xml:space="preserve">Description</w:t>
+      </w:r>
+      <w:r>
+        <w:t xml:space="preserve">: Various full-stack development, consultancy, and training roles building the foundation of my technical and leadership capabilities. Key experiences included developing CMS-based solutions for non-profits (UNESCO) and local businesses, architecting real estate platforms, engineering e-commerce splits payment systems, and delivering technical training (C Programming, Algorithms).</w:t>
+      </w:r>
+    </w:p>
+    <w:bookmarkEnd w:id="24"/>
+    <w:bookmarkEnd w:id="25"/>
+    <w:bookmarkStart w:id="26" w:name="education"/>
+    <w:p>
+      <w:pPr>
+        <w:pStyle w:val="Heading2"/>
+      </w:pPr>
+      <w:r>
+        <w:t xml:space="preserve">Education</w:t>
+      </w:r>
+    </w:p>
+    <w:p>
+      <w:pPr>
+        <w:pStyle w:val="FirstParagraph"/>
+      </w:pPr>
+      <w:r>
+        <w:rPr>
+          <w:b/>
+          <w:bCs/>
+        </w:rPr>
+        <w:t xml:space="preserve">Institution</w:t>
+      </w:r>
+      <w:r>
+        <w:t xml:space="preserve">: freeCodeCamp — Computer Software Engineering</w:t>
+      </w:r>
+    </w:p>
+    <w:p>
+      <w:pPr>
+        <w:pStyle w:val="BodyText"/>
+      </w:pPr>
+      <w:r>
+        <w:rPr>
+          <w:b/>
+          <w:bCs/>
+        </w:rPr>
+        <w:t xml:space="preserve">Institution</w:t>
+      </w:r>
+      <w:r>
+        <w:t xml:space="preserve">: IxDF - The Interaction Design Foundation — User Experience and Interaction Design (2017–2020)</w:t>
+      </w:r>
+    </w:p>
+    <w:p>
+      <w:pPr>
+        <w:pStyle w:val="BodyText"/>
+      </w:pPr>
+      <w:r>
+        <w:rPr>
+          <w:b/>
+          <w:bCs/>
+        </w:rPr>
+        <w:t xml:space="preserve">Institution</w:t>
+      </w:r>
+      <w:r>
+        <w:t xml:space="preserve">: International University of Greece - Serres Campus</w:t>
       </w:r>
       <w:r>
         <w:br/>
@@ -1378,215 +1441,14 @@
           <w:b/>
           <w:bCs/>
         </w:rPr>
-        <w:t xml:space="preserve">Dates</w:t>
-      </w:r>
-      <w:r>
-        <w:t xml:space="preserve">: Oct 2015 - Sep 2016 (1 year)</w:t>
-      </w:r>
-      <w:r>
-        <w:br/>
-      </w:r>
-      <w:r>
-        <w:rPr>
-          <w:b/>
-          <w:bCs/>
-        </w:rPr>
-        <w:t xml:space="preserve">Location</w:t>
-      </w:r>
-      <w:r>
-        <w:t xml:space="preserve">: Leeds, England, United Kingdom</w:t>
-      </w:r>
-      <w:r>
-        <w:t xml:space="preserve"> </w:t>
-      </w:r>
-      <w:r>
-        <w:rPr>
-          <w:b/>
-          <w:bCs/>
-        </w:rPr>
-        <w:t xml:space="preserve">Employment Type</w:t>
-      </w:r>
-      <w:r>
-        <w:t xml:space="preserve">: Full-time, On-site</w:t>
-      </w:r>
-    </w:p>
-    <w:p>
-      <w:pPr>
-        <w:pStyle w:val="BodyText"/>
-      </w:pPr>
-      <w:r>
-        <w:rPr>
-          <w:b/>
-          <w:bCs/>
-        </w:rPr>
-        <w:t xml:space="preserve">Description</w:t>
-      </w:r>
-      <w:r>
-        <w:t xml:space="preserve">: Engineered responsive e-commerce solutions for major retail brands (Vivienne Westwood, Kärcher).</w:t>
-      </w:r>
-    </w:p>
-    <w:p>
-      <w:pPr>
-        <w:pStyle w:val="Compact"/>
-        <w:numPr>
-          <w:ilvl w:val="0"/>
-          <w:numId w:val="1006"/>
-        </w:numPr>
-      </w:pPr>
-      <w:r>
-        <w:rPr>
-          <w:b/>
-          <w:bCs/>
-        </w:rPr>
-        <w:t xml:space="preserve">E-Commerce Delivery</w:t>
-      </w:r>
-      <w:r>
-        <w:t xml:space="preserve">: Collaborated cross-functionally to bring complex UI designs to life, ensuring seamless cross-browser compatibility and strict adherence to brand standards.</w:t>
-      </w:r>
-    </w:p>
-    <w:p>
-      <w:pPr>
-        <w:pStyle w:val="Compact"/>
-        <w:numPr>
-          <w:ilvl w:val="0"/>
-          <w:numId w:val="1006"/>
-        </w:numPr>
-      </w:pPr>
-      <w:r>
-        <w:rPr>
-          <w:b/>
-          <w:bCs/>
-        </w:rPr>
-        <w:t xml:space="preserve">Digital Marketing Support</w:t>
-      </w:r>
-      <w:r>
-        <w:t xml:space="preserve">: Developed robust architecture for high-conversion HTML email campaigns, directly supporting the agency’s retention and sales generation strategies.</w:t>
-      </w:r>
-    </w:p>
-    <w:p>
-      <w:pPr>
-        <w:pStyle w:val="FirstParagraph"/>
-      </w:pPr>
-      <w:r>
-        <w:rPr>
-          <w:b/>
-          <w:bCs/>
-        </w:rPr>
-        <w:t xml:space="preserve">Projects</w:t>
-      </w:r>
-      <w:r>
-        <w:t xml:space="preserve">: Vivienne Westwood, Kärcher, CACI, EQVVS, G-Type</w:t>
-      </w:r>
-    </w:p>
-    <w:bookmarkEnd w:id="21"/>
-    <w:bookmarkStart w:id="22" w:name="early-career-consulting"/>
-    <w:p>
-      <w:pPr>
-        <w:pStyle w:val="Heading3"/>
-      </w:pPr>
-      <w:r>
-        <w:t xml:space="preserve">Early Career &amp; Consulting</w:t>
-      </w:r>
-    </w:p>
-    <w:p>
-      <w:pPr>
-        <w:pStyle w:val="FirstParagraph"/>
-      </w:pPr>
-      <w:r>
-        <w:rPr>
-          <w:b/>
-          <w:bCs/>
-        </w:rPr>
-        <w:t xml:space="preserve">Dates</w:t>
-      </w:r>
-      <w:r>
-        <w:t xml:space="preserve">: Oct 2005 - Sep 2015 (10 years)</w:t>
-      </w:r>
-      <w:r>
-        <w:t xml:space="preserve"> </w:t>
-      </w:r>
-      <w:r>
-        <w:rPr>
-          <w:b/>
-          <w:bCs/>
-        </w:rPr>
-        <w:t xml:space="preserve">Description</w:t>
-      </w:r>
-      <w:r>
-        <w:t xml:space="preserve">: Various full-stack development, consultancy, and training roles building the foundation of my technical and leadership capabilities. Key experiences included developing CMS-based solutions for non-profits (UNESCO) and local businesses, architecting real estate platforms, engineering e-commerce splits payment systems, and delivering technical training (C Programming, Algorithms).</w:t>
-      </w:r>
-    </w:p>
-    <w:bookmarkEnd w:id="22"/>
-    <w:bookmarkEnd w:id="23"/>
-    <w:bookmarkStart w:id="24" w:name="education"/>
-    <w:p>
-      <w:pPr>
-        <w:pStyle w:val="Heading2"/>
-      </w:pPr>
-      <w:r>
-        <w:t xml:space="preserve">Education</w:t>
-      </w:r>
-    </w:p>
-    <w:p>
-      <w:pPr>
-        <w:pStyle w:val="FirstParagraph"/>
-      </w:pPr>
-      <w:r>
-        <w:rPr>
-          <w:b/>
-          <w:bCs/>
-        </w:rPr>
-        <w:t xml:space="preserve">Institution</w:t>
-      </w:r>
-      <w:r>
-        <w:t xml:space="preserve">: freeCodeCamp — Computer Software Engineering</w:t>
-      </w:r>
-    </w:p>
-    <w:p>
-      <w:pPr>
-        <w:pStyle w:val="BodyText"/>
-      </w:pPr>
-      <w:r>
-        <w:rPr>
-          <w:b/>
-          <w:bCs/>
-        </w:rPr>
-        <w:t xml:space="preserve">Institution</w:t>
-      </w:r>
-      <w:r>
-        <w:t xml:space="preserve">: IxDF - The Interaction Design Foundation — User Experience and Interaction Design (2017–2020)</w:t>
-      </w:r>
-    </w:p>
-    <w:p>
-      <w:pPr>
-        <w:pStyle w:val="BodyText"/>
-      </w:pPr>
-      <w:r>
-        <w:rPr>
-          <w:b/>
-          <w:bCs/>
-        </w:rPr>
-        <w:t xml:space="preserve">Institution</w:t>
-      </w:r>
-      <w:r>
-        <w:t xml:space="preserve">: International University of Greece - Serres Campus</w:t>
-      </w:r>
-      <w:r>
-        <w:br/>
-      </w:r>
-      <w:r>
-        <w:rPr>
-          <w:b/>
-          <w:bCs/>
-        </w:rPr>
         <w:t xml:space="preserve">Degree</w:t>
       </w:r>
       <w:r>
         <w:t xml:space="preserve">: BSc Informatics Engineering (attended 2007–2012; did not graduate due to the Greek financial crisis)</w:t>
       </w:r>
     </w:p>
-    <w:bookmarkEnd w:id="24"/>
-    <w:bookmarkStart w:id="26" w:name="professional-credentials"/>
+    <w:bookmarkEnd w:id="26"/>
+    <w:bookmarkStart w:id="28" w:name="professional-credentials"/>
     <w:p>
       <w:pPr>
         <w:pStyle w:val="Heading2"/>
@@ -1679,7 +1541,7 @@
         </w:rPr>
         <w:t xml:space="preserve"> </w:t>
       </w:r>
-      <w:hyperlink r:id="rId25">
+      <w:hyperlink r:id="rId27">
         <w:r>
           <w:rPr>
             <w:rStyle w:val="Hyperlink"/>
@@ -1704,8 +1566,8 @@
         <w:t xml:space="preserve">page.</w:t>
       </w:r>
     </w:p>
-    <w:bookmarkEnd w:id="26"/>
-    <w:bookmarkStart w:id="27" w:name="community-leadership"/>
+    <w:bookmarkEnd w:id="28"/>
+    <w:bookmarkStart w:id="29" w:name="community-leadership"/>
     <w:p>
       <w:pPr>
         <w:pStyle w:val="Heading2"/>
@@ -1736,7 +1598,7 @@
         <w:t xml:space="preserve">(Feb 2023–Present)</w:t>
       </w:r>
       <w:r>
-        <w:t xml:space="preserve">: Peer mentoring network with Engineering Managers, Heads of Engineering, VPs, and CTOs.</w:t>
+        <w:t xml:space="preserve">: Mentored engineers who progressed into Engineering Manager roles (both within UW and externally). Peer mentoring network spanning Engineering Managers, Heads of Engineering, VPs, and CTOs.</w:t>
       </w:r>
     </w:p>
     <w:p>
@@ -1789,7 +1651,8 @@
         <w:t xml:space="preserve">: Revived an inactive GDG chapter; organised conferences, workshops, and technical meetups.</w:t>
       </w:r>
     </w:p>
-    <w:bookmarkEnd w:id="27"/>
+    <w:bookmarkEnd w:id="29"/>
+    <w:bookmarkEnd w:id="30"/>
     <w:sectPr>
       <w:footnotePr>
         <w:numRestart w:val="eachSect"/>
@@ -2019,9 +1882,6 @@
     <w:abstractNumId w:val="991"/>
   </w:num>
   <w:num w:numId="1005">
-    <w:abstractNumId w:val="991"/>
-  </w:num>
-  <w:num w:numId="1006">
     <w:abstractNumId w:val="991"/>
   </w:num>
 </w:numbering>

</xml_diff>

<commit_message>
docs: Update Nikos Vasileiadis's CV in both PDF and DOCX formats.
</commit_message>
<xml_diff>
--- a/assets/Nikos_Vasileiadis_CV.docx
+++ b/assets/Nikos_Vasileiadis_CV.docx
@@ -1721,6 +1721,22 @@
       <w:pPr>
         <w:pStyle w:val="FirstParagraph"/>
       </w:pPr>
+      <w:r>
+        <w:rPr>
+          <w:b/>
+          <w:bCs/>
+        </w:rPr>
+        <w:t xml:space="preserve">AI Leader: Generative AI &amp; Agentic AI for Leaders &amp; Founders</w:t>
+      </w:r>
+      <w:r>
+        <w:t xml:space="preserve"> </w:t>
+      </w:r>
+      <w:r>
+        <w:t xml:space="preserve">· Udemy, Mar 2026</w:t>
+      </w:r>
+      <w:r>
+        <w:br/>
+      </w:r>
       <w:r>
         <w:rPr>
           <w:b/>

</xml_diff>

<commit_message>
refactor: update CV and professional development documentation to reflect leadership evolution and organisational focus
</commit_message>
<xml_diff>
--- a/assets/Nikos_Vasileiadis_CV.docx
+++ b/assets/Nikos_Vasileiadis_CV.docx
@@ -146,7 +146,7 @@
           <w:b/>
           <w:bCs/>
         </w:rPr>
-        <w:t xml:space="preserve">Engineering Leadership &amp; Scaling</w:t>
+        <w:t xml:space="preserve">Engineering Leadership &amp; People Development</w:t>
       </w:r>
       <w:r>
         <w:t xml:space="preserve">: Proven track record of building, mentoring, and retaining high-performing remote teams (</w:t>
@@ -155,7 +155,19 @@
         <w:t xml:space="preserve">100% retention rate</w:t>
       </w:r>
       <w:r>
-        <w:t xml:space="preserve">) while establishing robust Agile practices.</w:t>
+        <w:t xml:space="preserve">) while driving</w:t>
+      </w:r>
+      <w:r>
+        <w:t xml:space="preserve"> </w:t>
+      </w:r>
+      <w:r>
+        <w:t xml:space="preserve">3 promotions</w:t>
+      </w:r>
+      <w:r>
+        <w:t xml:space="preserve"> </w:t>
+      </w:r>
+      <w:r>
+        <w:t xml:space="preserve">through evidence-based cases. Natural aptitude for understanding people, building trust, and creating the conditions for autonomous, high-quality delivery.</w:t>
       </w:r>
     </w:p>
     <w:p>
@@ -171,22 +183,10 @@
           <w:b/>
           <w:bCs/>
         </w:rPr>
-        <w:t xml:space="preserve">Platform &amp; Infrastructure Strategy</w:t>
-      </w:r>
-      <w:r>
-        <w:t xml:space="preserve">: Architecting and managing critical platform services and dependencies with a focus on SLAs, SLIs, and operational excellence for</w:t>
-      </w:r>
-      <w:r>
-        <w:t xml:space="preserve"> </w:t>
-      </w:r>
-      <w:r>
-        <w:t xml:space="preserve">15+</w:t>
-      </w:r>
-      <w:r>
-        <w:t xml:space="preserve"> </w:t>
-      </w:r>
-      <w:r>
-        <w:t xml:space="preserve">engineering teams.</w:t>
+        <w:t xml:space="preserve">Organisational Design &amp; Change Management</w:t>
+      </w:r>
+      <w:r>
+        <w:t xml:space="preserve">: Experienced in navigating complex restructurings, building teams from scratch, and shaping team structures that align engineering capability with business outcomes. Have built the same team twice from zero.</w:t>
       </w:r>
     </w:p>
     <w:p>
@@ -202,10 +202,22 @@
           <w:b/>
           <w:bCs/>
         </w:rPr>
-        <w:t xml:space="preserve">Design Systems Leadership</w:t>
-      </w:r>
-      <w:r>
-        <w:t xml:space="preserve">: End-to-end experience building and managing Design Systems — from open-source implementation (Pulsar at Jadu) to leading a dedicated Design Systems team at scale, enabling consistent, high-velocity delivery across product and engineering.</w:t>
+        <w:t xml:space="preserve">Platform &amp; Infrastructure Strategy</w:t>
+      </w:r>
+      <w:r>
+        <w:t xml:space="preserve">: Architecting and managing critical platform services and dependencies with a focus on SLAs, SLIs, and operational excellence for</w:t>
+      </w:r>
+      <w:r>
+        <w:t xml:space="preserve"> </w:t>
+      </w:r>
+      <w:r>
+        <w:t xml:space="preserve">15+</w:t>
+      </w:r>
+      <w:r>
+        <w:t xml:space="preserve"> </w:t>
+      </w:r>
+      <w:r>
+        <w:t xml:space="preserve">engineering teams.</w:t>
       </w:r>
     </w:p>
     <w:p>
@@ -221,10 +233,10 @@
           <w:b/>
           <w:bCs/>
         </w:rPr>
-        <w:t xml:space="preserve">Agile Transformation &amp; Delivery</w:t>
-      </w:r>
-      <w:r>
-        <w:t xml:space="preserve">: Deep expertise in stepping into complex, low-maturity environments, introducing structured Agile/Scrum methodologies, and driving predictable delivery.</w:t>
+        <w:t xml:space="preserve">Design Systems Leadership</w:t>
+      </w:r>
+      <w:r>
+        <w:t xml:space="preserve">: End-to-end experience building and managing Design Systems — from open-source implementation (Pulsar at Jadu) to leading a dedicated Design Systems team at scale, enabling consistent, high-velocity delivery across product and engineering.</w:t>
       </w:r>
     </w:p>
     <w:p>
@@ -240,22 +252,10 @@
           <w:b/>
           <w:bCs/>
         </w:rPr>
-        <w:t xml:space="preserve">Cross-Functional Technical Vision</w:t>
-      </w:r>
-      <w:r>
-        <w:t xml:space="preserve">: Bridging the gap between product strategy, UX, and technical execution, backed by a</w:t>
-      </w:r>
-      <w:r>
-        <w:t xml:space="preserve"> </w:t>
-      </w:r>
-      <w:r>
-        <w:t xml:space="preserve">20-year</w:t>
-      </w:r>
-      <w:r>
-        <w:t xml:space="preserve"> </w:t>
-      </w:r>
-      <w:r>
-        <w:t xml:space="preserve">foundation in full-stack architecture and digital transformation.</w:t>
+        <w:t xml:space="preserve">Commercial Engineering &amp; Business Acumen</w:t>
+      </w:r>
+      <w:r>
+        <w:t xml:space="preserve">: Treating engineering as a business lever, not a cost centre. Active contributor to CapEx/OpEx planning, vendor ROI evaluation, and ensuring every technical investment maps to a business outcome.</w:t>
       </w:r>
     </w:p>
     <w:bookmarkEnd w:id="14"/>
@@ -273,7 +273,7 @@
         <w:pStyle w:val="FirstParagraph"/>
       </w:pPr>
       <w:r>
-        <w:t xml:space="preserve">Strategic engineering leader with</w:t>
+        <w:t xml:space="preserve">Engineering leader with</w:t>
       </w:r>
       <w:r>
         <w:t xml:space="preserve"> </w:t>
@@ -285,19 +285,68 @@
         <w:t xml:space="preserve"> </w:t>
       </w:r>
       <w:r>
-        <w:t xml:space="preserve">of full-stack experience, operating at the intersection of product strategy, technical architecture, and commercial reality. I treat engineering as a business lever — contributing to CapEx/OpEx planning, evaluating vendor ROI, and ensuring technical investments map directly to business outcomes. My leadership arc has grown continuously since 2017: from rotating Scrum Master roles at Jadu and Leeds Building Society, to bootstrapping and leading the Content Capability team at Utility Warehouse, to my current Engineering Manager role overseeing two teams and</w:t>
-      </w:r>
-      <w:r>
-        <w:t xml:space="preserve"> </w:t>
-      </w:r>
-      <w:r>
-        <w:t xml:space="preserve">eight engineers</w:t>
-      </w:r>
-      <w:r>
-        <w:t xml:space="preserve"> </w:t>
-      </w:r>
-      <w:r>
-        <w:t xml:space="preserve">— each step a deliberate expansion of scope.</w:t>
+        <w:t xml:space="preserve">in technology and</w:t>
+      </w:r>
+      <w:r>
+        <w:t xml:space="preserve"> </w:t>
+      </w:r>
+      <w:r>
+        <w:t xml:space="preserve">9 years</w:t>
+      </w:r>
+      <w:r>
+        <w:t xml:space="preserve"> </w:t>
+      </w:r>
+      <w:r>
+        <w:t xml:space="preserve">of progressive leadership. I started in code — frontend, full-stack, CMS architecture, platform engineering — and mastered the craft. What I discovered along the way is that my real strength is people: building teams, developing talent, creating clarity, and designing the organisational conditions where engineers do their best work.</w:t>
+      </w:r>
+    </w:p>
+    <w:p>
+      <w:pPr>
+        <w:pStyle w:val="BodyText"/>
+      </w:pPr>
+      <w:r>
+        <w:t xml:space="preserve">My leadership arc has grown continuously since 2017: from Scrum Master rotations at Jadu and Leeds Building Society, to bootstrapping and leading the Content Capability team at Utility Warehouse, to managing multiple teams (</w:t>
+      </w:r>
+      <w:r>
+        <w:t xml:space="preserve">8 engineers</w:t>
+      </w:r>
+      <w:r>
+        <w:t xml:space="preserve"> </w:t>
+      </w:r>
+      <w:r>
+        <w:t xml:space="preserve">at peak) across Content Capability and Design Systems. Through three restructurings, I now lead a specialist</w:t>
+      </w:r>
+      <w:r>
+        <w:t xml:space="preserve"> </w:t>
+      </w:r>
+      <w:r>
+        <w:t xml:space="preserve">3-person</w:t>
+      </w:r>
+      <w:r>
+        <w:t xml:space="preserve"> </w:t>
+      </w:r>
+      <w:r>
+        <w:t xml:space="preserve">team covering</w:t>
+      </w:r>
+      <w:r>
+        <w:t xml:space="preserve"> </w:t>
+      </w:r>
+      <w:r>
+        <w:t xml:space="preserve">six critical platform services</w:t>
+      </w:r>
+      <w:r>
+        <w:t xml:space="preserve"> </w:t>
+      </w:r>
+      <w:r>
+        <w:t xml:space="preserve">across the uw.co.uk estate — having built the same team from scratch twice.</w:t>
+      </w:r>
+    </w:p>
+    <w:p>
+      <w:pPr>
+        <w:pStyle w:val="BodyText"/>
+      </w:pPr>
+      <w:r>
+        <w:t xml:space="preserve">I treat engineering as a business lever — contributing to CapEx/OpEx planning, evaluating vendor ROI, and ensuring technical investments map directly to business outcomes. My technical depth gives me credibility with engineers; my focus on people, process, and organisational design is where I create the most value.</w:t>
       </w:r>
     </w:p>
     <w:bookmarkEnd w:id="15"/>
@@ -398,55 +447,58 @@
           <w:b/>
           <w:bCs/>
         </w:rPr>
-        <w:t xml:space="preserve">Rebranding Programme (</w:t>
-      </w:r>
-      <w:r>
-        <w:rPr>
-          <w:b/>
-          <w:bCs/>
-        </w:rPr>
-        <w:t xml:space="preserve">2 quarters</w:t>
-      </w:r>
-      <w:r>
-        <w:rPr>
-          <w:b/>
-          <w:bCs/>
-        </w:rPr>
-        <w:t xml:space="preserve">;</w:t>
-      </w:r>
-      <w:r>
-        <w:rPr>
-          <w:b/>
-          <w:bCs/>
-        </w:rPr>
-        <w:t xml:space="preserve"> </w:t>
-      </w:r>
-      <w:r>
-        <w:rPr>
-          <w:b/>
-          <w:bCs/>
-        </w:rPr>
-        <w:t xml:space="preserve">500 pages</w:t>
-      </w:r>
-      <w:r>
-        <w:rPr>
-          <w:b/>
-          <w:bCs/>
-        </w:rPr>
-        <w:t xml:space="preserve"> </w:t>
-      </w:r>
-      <w:r>
-        <w:rPr>
-          <w:b/>
-          <w:bCs/>
-        </w:rPr>
-        <w:t xml:space="preserve">shipped):</w:t>
-      </w:r>
-      <w:r>
-        <w:t xml:space="preserve"> </w:t>
-      </w:r>
-      <w:r>
-        <w:t xml:space="preserve">Delivered UW’s company-wide brand refresh across the full uw.co.uk estate — the primary digital entry point for customers, partners, and the subscriber account system, and the platform where all A/B tests and business tracking metrics run. Our delivery was the critical path: no other team’s rebranding work could go live until the main website shipped. Authored automated migration scripts that saved content editors hundreds of manual hours.</w:t>
+        <w:t xml:space="preserve">Team Leadership, Retention &amp; Developing Talent:</w:t>
+      </w:r>
+      <w:r>
+        <w:t xml:space="preserve"> </w:t>
+      </w:r>
+      <w:r>
+        <w:t xml:space="preserve">Built and managed up to</w:t>
+      </w:r>
+      <w:r>
+        <w:t xml:space="preserve"> </w:t>
+      </w:r>
+      <w:r>
+        <w:t xml:space="preserve">8 engineers</w:t>
+      </w:r>
+      <w:r>
+        <w:t xml:space="preserve"> </w:t>
+      </w:r>
+      <w:r>
+        <w:t xml:space="preserve">across two teams with a</w:t>
+      </w:r>
+      <w:r>
+        <w:t xml:space="preserve"> </w:t>
+      </w:r>
+      <w:r>
+        <w:t xml:space="preserve">100% retention rate</w:t>
+      </w:r>
+      <w:r>
+        <w:t xml:space="preserve"> </w:t>
+      </w:r>
+      <w:r>
+        <w:t xml:space="preserve">— maintained through three company restructurings that progressively reduced headcount to a specialist core of</w:t>
+      </w:r>
+      <w:r>
+        <w:t xml:space="preserve"> </w:t>
+      </w:r>
+      <w:r>
+        <w:t xml:space="preserve">2 engineers</w:t>
+      </w:r>
+      <w:r>
+        <w:t xml:space="preserve">, including a pillar move from Customer Experience to Partner. Every reduction was organisational; zero attrition. Drove</w:t>
+      </w:r>
+      <w:r>
+        <w:t xml:space="preserve"> </w:t>
+      </w:r>
+      <w:r>
+        <w:t xml:space="preserve">3 promotions</w:t>
+      </w:r>
+      <w:r>
+        <w:t xml:space="preserve"> </w:t>
+      </w:r>
+      <w:r>
+        <w:t xml:space="preserve">through evidence-based cases — from Associate to Mid-level and Mid-level to Senior — advocating for talent recognition across organisational boundaries. Mentored engineers who subsequently moved into Engineering Manager roles — both within UW and externally — developing leadership capability one level above my formal remit.</w:t>
       </w:r>
     </w:p>
     <w:p>
@@ -462,49 +514,13 @@
           <w:b/>
           <w:bCs/>
         </w:rPr>
-        <w:t xml:space="preserve">Platform Reliability:</w:t>
-      </w:r>
-      <w:r>
-        <w:t xml:space="preserve"> </w:t>
-      </w:r>
-      <w:r>
-        <w:t xml:space="preserve">Maintained</w:t>
-      </w:r>
-      <w:r>
-        <w:t xml:space="preserve"> </w:t>
-      </w:r>
-      <w:r>
-        <w:t xml:space="preserve">100% uptime</w:t>
-      </w:r>
-      <w:r>
-        <w:t xml:space="preserve"> </w:t>
-      </w:r>
-      <w:r>
-        <w:t xml:space="preserve">on uw.co.uk (SLO: 99.99%) with</w:t>
-      </w:r>
-      <w:r>
-        <w:t xml:space="preserve"> </w:t>
-      </w:r>
-      <w:r>
-        <w:t xml:space="preserve">&lt;3s</w:t>
-      </w:r>
-      <w:r>
-        <w:t xml:space="preserve"> </w:t>
-      </w:r>
-      <w:r>
-        <w:t xml:space="preserve">page load times on critical-path pages and ≤2 incidents per year, all resolved within hours. Supported</w:t>
-      </w:r>
-      <w:r>
-        <w:t xml:space="preserve"> </w:t>
-      </w:r>
-      <w:r>
-        <w:t xml:space="preserve">15</w:t>
-      </w:r>
-      <w:r>
-        <w:t xml:space="preserve"> </w:t>
-      </w:r>
-      <w:r>
-        <w:t xml:space="preserve">dependent teams across Customer Marketing, Digital Marketing, Partner Marketing, Acquisition, Data Science, Recruitment, and more (monitored via Kubernetes, Sentry, Prometheus, Pingdom, Cloudflare).</w:t>
+        <w:t xml:space="preserve">Org Design &amp; Structural Influence:</w:t>
+      </w:r>
+      <w:r>
+        <w:t xml:space="preserve"> </w:t>
+      </w:r>
+      <w:r>
+        <w:t xml:space="preserve">During restructurings, took on unguided responsibility for scoping and executing team migrations — including the Content Capability team’s moves between pillars (Marketing Capability → Content Capability → CMS Team, spanning Platforms, Customer Experience, and Partner pillars) — by independently mapping scope, chasing stakeholder alignment, and building consensus from scratch. Challenged and reversed structural decisions that would have eliminated the Design Systems team, demonstrating strategic influence well above the Engineering Manager remit.</w:t>
       </w:r>
     </w:p>
     <w:p>
@@ -520,46 +536,31 @@
           <w:b/>
           <w:bCs/>
         </w:rPr>
-        <w:t xml:space="preserve">Design Systems (Hearth) —</w:t>
-      </w:r>
-      <w:r>
-        <w:rPr>
-          <w:b/>
-          <w:bCs/>
-        </w:rPr>
-        <w:t xml:space="preserve"> </w:t>
-      </w:r>
-      <w:r>
-        <w:rPr>
-          <w:b/>
-          <w:bCs/>
-        </w:rPr>
-        <w:t xml:space="preserve">20 teams</w:t>
-      </w:r>
-      <w:r>
-        <w:rPr>
-          <w:b/>
-          <w:bCs/>
-        </w:rPr>
-        <w:t xml:space="preserve">, company-wide adoption:</w:t>
-      </w:r>
-      <w:r>
-        <w:t xml:space="preserve"> </w:t>
-      </w:r>
-      <w:r>
-        <w:t xml:space="preserve">Led adoption of the Hearth Design System across</w:t>
-      </w:r>
-      <w:r>
-        <w:t xml:space="preserve"> </w:t>
-      </w:r>
-      <w:r>
-        <w:t xml:space="preserve">20</w:t>
-      </w:r>
-      <w:r>
-        <w:t xml:space="preserve"> </w:t>
-      </w:r>
-      <w:r>
-        <w:t xml:space="preserve">engineering and product teams (15 full adoption, 5 partial). Consolidating component work at the Design System level eliminated thousands of hours of duplicated engineering effort — at £35+/hour, savings at rebrand scale reached into the hundreds of thousands.</w:t>
+        <w:t xml:space="preserve">Documentation &amp; Knowledge Culture:</w:t>
+      </w:r>
+      <w:r>
+        <w:t xml:space="preserve"> </w:t>
+      </w:r>
+      <w:r>
+        <w:t xml:space="preserve">Authored over</w:t>
+      </w:r>
+      <w:r>
+        <w:t xml:space="preserve"> </w:t>
+      </w:r>
+      <w:r>
+        <w:t xml:space="preserve">100 articles</w:t>
+      </w:r>
+      <w:r>
+        <w:t xml:space="preserve"> </w:t>
+      </w:r>
+      <w:r>
+        <w:t xml:space="preserve">of technical documentation — from process guides to architecture decisions — making the team the most thoroughly documented at UW. Started from zero: inherited an undocumented legacy CMS and conducted systematic discovery (</w:t>
+      </w:r>
+      <w:r>
+        <w:t xml:space="preserve">“Archeology”</w:t>
+      </w:r>
+      <w:r>
+        <w:t xml:space="preserve">) to map what existed before building the documentation culture from scratch.</w:t>
       </w:r>
     </w:p>
     <w:p>
@@ -575,40 +576,13 @@
           <w:b/>
           <w:bCs/>
         </w:rPr>
-        <w:t xml:space="preserve">CMS Transformation (Apostrophe → Contentful):</w:t>
-      </w:r>
-      <w:r>
-        <w:t xml:space="preserve"> </w:t>
-      </w:r>
-      <w:r>
-        <w:t xml:space="preserve">Led the end-to-end replacement of an effectively abandoned legacy CMS (no SLA, no SSO, dead tech stack). Conducted rigorous</w:t>
-      </w:r>
-      <w:r>
-        <w:t xml:space="preserve"> </w:t>
-      </w:r>
-      <w:r>
-        <w:t xml:space="preserve">2-month</w:t>
-      </w:r>
-      <w:r>
-        <w:t xml:space="preserve"> </w:t>
-      </w:r>
-      <w:r>
-        <w:t xml:space="preserve">evaluation across</w:t>
-      </w:r>
-      <w:r>
-        <w:t xml:space="preserve"> </w:t>
-      </w:r>
-      <w:r>
-        <w:t xml:space="preserve">10 vendors</w:t>
-      </w:r>
-      <w:r>
-        <w:t xml:space="preserve">, shortlisted to 3, and selected Contentful. Executed a zero-disruption dual-serve migration; three marketing teams (</w:t>
-      </w:r>
-      <w:r>
-        <w:t xml:space="preserve">~18 people</w:t>
-      </w:r>
-      <w:r>
-        <w:t xml:space="preserve">) gained content scheduling, structured content models, and eliminated duplication — removing major technical debt.</w:t>
+        <w:t xml:space="preserve">Technical Enablement &amp; Upskilling:</w:t>
+      </w:r>
+      <w:r>
+        <w:t xml:space="preserve"> </w:t>
+      </w:r>
+      <w:r>
+        <w:t xml:space="preserve">Identified capability gaps (e.g. Kubernetes) and closed them through self-directed learning, then trained the team and documented the knowledge for future engineers. Pushed team members to take ownership of RFCs, technical presentations, and cross-team knowledge-sharing — developing engineers who could operate independently across the full platform stack.</w:t>
       </w:r>
     </w:p>
     <w:p>
@@ -624,31 +598,37 @@
           <w:b/>
           <w:bCs/>
         </w:rPr>
-        <w:t xml:space="preserve">Team Leadership, Retention &amp; Developing Leaders:</w:t>
-      </w:r>
-      <w:r>
-        <w:t xml:space="preserve"> </w:t>
-      </w:r>
-      <w:r>
-        <w:t xml:space="preserve">Managed two teams (</w:t>
-      </w:r>
-      <w:r>
-        <w:t xml:space="preserve">8 engineers</w:t>
-      </w:r>
-      <w:r>
-        <w:t xml:space="preserve">) with a</w:t>
-      </w:r>
-      <w:r>
-        <w:t xml:space="preserve"> </w:t>
-      </w:r>
-      <w:r>
-        <w:t xml:space="preserve">100% retention rate</w:t>
-      </w:r>
-      <w:r>
-        <w:t xml:space="preserve"> </w:t>
-      </w:r>
-      <w:r>
-        <w:t xml:space="preserve">through three company restructurings. Mentored engineers who subsequently moved into Engineering Manager roles — both within UW and externally — developing leadership capability one level above my formal remit.</w:t>
+        <w:t xml:space="preserve">Hiring &amp; Talent Acquisition:</w:t>
+      </w:r>
+      <w:r>
+        <w:t xml:space="preserve"> </w:t>
+      </w:r>
+      <w:r>
+        <w:t xml:space="preserve">Involved in the end-to-end hiring of</w:t>
+      </w:r>
+      <w:r>
+        <w:t xml:space="preserve"> </w:t>
+      </w:r>
+      <w:r>
+        <w:t xml:space="preserve">3</w:t>
+      </w:r>
+      <w:r>
+        <w:t xml:space="preserve"> </w:t>
+      </w:r>
+      <w:r>
+        <w:t xml:space="preserve">external engineers and facilitated</w:t>
+      </w:r>
+      <w:r>
+        <w:t xml:space="preserve"> </w:t>
+      </w:r>
+      <w:r>
+        <w:t xml:space="preserve">4</w:t>
+      </w:r>
+      <w:r>
+        <w:t xml:space="preserve"> </w:t>
+      </w:r>
+      <w:r>
+        <w:t xml:space="preserve">internal transfers, contributing to recruitment decisions, candidate assessment, and onboarding.</w:t>
       </w:r>
     </w:p>
     <w:p>
@@ -686,37 +666,55 @@
           <w:b/>
           <w:bCs/>
         </w:rPr>
-        <w:t xml:space="preserve">Hiring &amp; Talent Acquisition:</w:t>
-      </w:r>
-      <w:r>
-        <w:t xml:space="preserve"> </w:t>
-      </w:r>
-      <w:r>
-        <w:t xml:space="preserve">Involved in the end-to-end hiring of</w:t>
-      </w:r>
-      <w:r>
-        <w:t xml:space="preserve"> </w:t>
-      </w:r>
-      <w:r>
-        <w:t xml:space="preserve">3</w:t>
-      </w:r>
-      <w:r>
-        <w:t xml:space="preserve"> </w:t>
-      </w:r>
-      <w:r>
-        <w:t xml:space="preserve">external engineers and facilitated</w:t>
-      </w:r>
-      <w:r>
-        <w:t xml:space="preserve"> </w:t>
-      </w:r>
-      <w:r>
-        <w:t xml:space="preserve">4</w:t>
-      </w:r>
-      <w:r>
-        <w:t xml:space="preserve"> </w:t>
-      </w:r>
-      <w:r>
-        <w:t xml:space="preserve">internal transfers, contributing to recruitment decisions, candidate assessment, and onboarding.</w:t>
+        <w:t xml:space="preserve">Rebranding Programme (</w:t>
+      </w:r>
+      <w:r>
+        <w:rPr>
+          <w:b/>
+          <w:bCs/>
+        </w:rPr>
+        <w:t xml:space="preserve">2 quarters</w:t>
+      </w:r>
+      <w:r>
+        <w:rPr>
+          <w:b/>
+          <w:bCs/>
+        </w:rPr>
+        <w:t xml:space="preserve">;</w:t>
+      </w:r>
+      <w:r>
+        <w:rPr>
+          <w:b/>
+          <w:bCs/>
+        </w:rPr>
+        <w:t xml:space="preserve"> </w:t>
+      </w:r>
+      <w:r>
+        <w:rPr>
+          <w:b/>
+          <w:bCs/>
+        </w:rPr>
+        <w:t xml:space="preserve">500 pages</w:t>
+      </w:r>
+      <w:r>
+        <w:rPr>
+          <w:b/>
+          <w:bCs/>
+        </w:rPr>
+        <w:t xml:space="preserve"> </w:t>
+      </w:r>
+      <w:r>
+        <w:rPr>
+          <w:b/>
+          <w:bCs/>
+        </w:rPr>
+        <w:t xml:space="preserve">shipped):</w:t>
+      </w:r>
+      <w:r>
+        <w:t xml:space="preserve"> </w:t>
+      </w:r>
+      <w:r>
+        <w:t xml:space="preserve">Delivered UW’s company-wide brand refresh across the full uw.co.uk estate — the primary digital entry point for customers, partners, and the subscriber account system, and the platform where all A/B tests and business tracking metrics run. Our delivery was the critical path: no other team’s rebranding work could go live until the main website shipped. Authored automated migration scripts that saved content editors hundreds of manual hours.</w:t>
       </w:r>
     </w:p>
     <w:p>
@@ -732,13 +730,235 @@
           <w:b/>
           <w:bCs/>
         </w:rPr>
-        <w:t xml:space="preserve">Org Design &amp; Structural Influence:</w:t>
-      </w:r>
-      <w:r>
-        <w:t xml:space="preserve"> </w:t>
-      </w:r>
-      <w:r>
-        <w:t xml:space="preserve">During restructurings, took on unguided responsibility for scoping and executing team migrations — including the Content Capability team’s move between departments — by independently mapping scope, chasing stakeholder alignment, and building consensus from scratch. Challenged and reversed structural decisions that would have eliminated the Design Systems team, demonstrating strategic influence well above the Engineering Manager remit.</w:t>
+        <w:t xml:space="preserve">Platform Reliability &amp; Analytics Ownership:</w:t>
+      </w:r>
+      <w:r>
+        <w:t xml:space="preserve"> </w:t>
+      </w:r>
+      <w:r>
+        <w:t xml:space="preserve">Maintained</w:t>
+      </w:r>
+      <w:r>
+        <w:t xml:space="preserve"> </w:t>
+      </w:r>
+      <w:r>
+        <w:t xml:space="preserve">100% uptime</w:t>
+      </w:r>
+      <w:r>
+        <w:t xml:space="preserve"> </w:t>
+      </w:r>
+      <w:r>
+        <w:t xml:space="preserve">on uw.co.uk (SLO: 99.99%) with</w:t>
+      </w:r>
+      <w:r>
+        <w:t xml:space="preserve"> </w:t>
+      </w:r>
+      <w:r>
+        <w:t xml:space="preserve">&lt;3s</w:t>
+      </w:r>
+      <w:r>
+        <w:t xml:space="preserve"> </w:t>
+      </w:r>
+      <w:r>
+        <w:t xml:space="preserve">page load times on critical-path pages and ≤2 incidents per year, all resolved within hours. Supported</w:t>
+      </w:r>
+      <w:r>
+        <w:t xml:space="preserve"> </w:t>
+      </w:r>
+      <w:r>
+        <w:t xml:space="preserve">15</w:t>
+      </w:r>
+      <w:r>
+        <w:t xml:space="preserve"> </w:t>
+      </w:r>
+      <w:r>
+        <w:t xml:space="preserve">dependent teams across Customer Marketing, Digital Marketing, Partner Marketing, Acquisition, Data Science, Recruitment, and more. Owns the full platform analytics and compliance stack: Contentful CMS, Google Tag Manager, Snowplow, Mixpanel, Optimizely, and OneTrust —</w:t>
+      </w:r>
+      <w:r>
+        <w:t xml:space="preserve"> </w:t>
+      </w:r>
+      <w:r>
+        <w:t xml:space="preserve">six platform services</w:t>
+      </w:r>
+      <w:r>
+        <w:t xml:space="preserve"> </w:t>
+      </w:r>
+      <w:r>
+        <w:t xml:space="preserve">monitored via Kubernetes, Sentry, Prometheus, Pingdom, and Cloudflare.</w:t>
+      </w:r>
+    </w:p>
+    <w:p>
+      <w:pPr>
+        <w:pStyle w:val="Compact"/>
+        <w:numPr>
+          <w:ilvl w:val="0"/>
+          <w:numId w:val="1002"/>
+        </w:numPr>
+      </w:pPr>
+      <w:r>
+        <w:rPr>
+          <w:b/>
+          <w:bCs/>
+        </w:rPr>
+        <w:t xml:space="preserve">Design Systems (Hearth) —</w:t>
+      </w:r>
+      <w:r>
+        <w:rPr>
+          <w:b/>
+          <w:bCs/>
+        </w:rPr>
+        <w:t xml:space="preserve"> </w:t>
+      </w:r>
+      <w:r>
+        <w:rPr>
+          <w:b/>
+          <w:bCs/>
+        </w:rPr>
+        <w:t xml:space="preserve">20 teams</w:t>
+      </w:r>
+      <w:r>
+        <w:rPr>
+          <w:b/>
+          <w:bCs/>
+        </w:rPr>
+        <w:t xml:space="preserve">, company-wide adoption:</w:t>
+      </w:r>
+      <w:r>
+        <w:t xml:space="preserve"> </w:t>
+      </w:r>
+      <w:r>
+        <w:t xml:space="preserve">Led adoption of the Hearth Design System across</w:t>
+      </w:r>
+      <w:r>
+        <w:t xml:space="preserve"> </w:t>
+      </w:r>
+      <w:r>
+        <w:t xml:space="preserve">20</w:t>
+      </w:r>
+      <w:r>
+        <w:t xml:space="preserve"> </w:t>
+      </w:r>
+      <w:r>
+        <w:t xml:space="preserve">engineering and product teams (15 full adoption, 5 partial). Consolidating component work at the Design System level eliminated thousands of hours of duplicated engineering effort — at £35+/hour, savings at rebrand scale reached into the hundreds of thousands.</w:t>
+      </w:r>
+    </w:p>
+    <w:p>
+      <w:pPr>
+        <w:pStyle w:val="Compact"/>
+        <w:numPr>
+          <w:ilvl w:val="0"/>
+          <w:numId w:val="1002"/>
+        </w:numPr>
+      </w:pPr>
+      <w:r>
+        <w:rPr>
+          <w:b/>
+          <w:bCs/>
+        </w:rPr>
+        <w:t xml:space="preserve">CMS Transformation (Apostrophe → Contentful):</w:t>
+      </w:r>
+      <w:r>
+        <w:t xml:space="preserve"> </w:t>
+      </w:r>
+      <w:r>
+        <w:t xml:space="preserve">Led the end-to-end replacement of an effectively abandoned legacy CMS (no SLA, no SSO, dead tech stack). Conducted rigorous</w:t>
+      </w:r>
+      <w:r>
+        <w:t xml:space="preserve"> </w:t>
+      </w:r>
+      <w:r>
+        <w:t xml:space="preserve">2-month</w:t>
+      </w:r>
+      <w:r>
+        <w:t xml:space="preserve"> </w:t>
+      </w:r>
+      <w:r>
+        <w:t xml:space="preserve">evaluation across</w:t>
+      </w:r>
+      <w:r>
+        <w:t xml:space="preserve"> </w:t>
+      </w:r>
+      <w:r>
+        <w:t xml:space="preserve">10 vendors</w:t>
+      </w:r>
+      <w:r>
+        <w:t xml:space="preserve">, shortlisted to 3, and selected Contentful. Executed a zero-disruption dual-serve migration; three marketing teams (</w:t>
+      </w:r>
+      <w:r>
+        <w:t xml:space="preserve">~18 people</w:t>
+      </w:r>
+      <w:r>
+        <w:t xml:space="preserve">) gained content scheduling, structured content models, and eliminated duplication — removing major technical debt.</w:t>
+      </w:r>
+    </w:p>
+    <w:p>
+      <w:pPr>
+        <w:pStyle w:val="Compact"/>
+        <w:numPr>
+          <w:ilvl w:val="0"/>
+          <w:numId w:val="1002"/>
+        </w:numPr>
+      </w:pPr>
+      <w:r>
+        <w:rPr>
+          <w:b/>
+          <w:bCs/>
+        </w:rPr>
+        <w:t xml:space="preserve">Adaptability Under Constraints (2025–Present):</w:t>
+      </w:r>
+      <w:r>
+        <w:t xml:space="preserve"> </w:t>
+      </w:r>
+      <w:r>
+        <w:t xml:space="preserve">Following restructurings that reduced the team to</w:t>
+      </w:r>
+      <w:r>
+        <w:t xml:space="preserve"> </w:t>
+      </w:r>
+      <w:r>
+        <w:t xml:space="preserve">2 engineers</w:t>
+      </w:r>
+      <w:r>
+        <w:t xml:space="preserve">, stepped across role boundaries — absorbing Product Manager and on-call responsibilities alongside Engineering Management — to sustain delivery across</w:t>
+      </w:r>
+      <w:r>
+        <w:t xml:space="preserve"> </w:t>
+      </w:r>
+      <w:r>
+        <w:t xml:space="preserve">6 platform services</w:t>
+      </w:r>
+      <w:r>
+        <w:t xml:space="preserve"> </w:t>
+      </w:r>
+      <w:r>
+        <w:t xml:space="preserve">with a</w:t>
+      </w:r>
+      <w:r>
+        <w:t xml:space="preserve"> </w:t>
+      </w:r>
+      <w:r>
+        <w:t xml:space="preserve">2-person team</w:t>
+      </w:r>
+      <w:r>
+        <w:t xml:space="preserve">, while maintaining</w:t>
+      </w:r>
+      <w:r>
+        <w:t xml:space="preserve"> </w:t>
+      </w:r>
+      <w:r>
+        <w:t xml:space="preserve">100% team retention</w:t>
+      </w:r>
+      <w:r>
+        <w:t xml:space="preserve">,</w:t>
+      </w:r>
+      <w:r>
+        <w:t xml:space="preserve"> </w:t>
+      </w:r>
+      <w:r>
+        <w:t xml:space="preserve">100% platform uptime</w:t>
+      </w:r>
+      <w:r>
+        <w:t xml:space="preserve">, and full accountability for the uw.co.uk estate.</w:t>
       </w:r>
     </w:p>
     <w:bookmarkEnd w:id="16"/>
@@ -820,7 +1040,7 @@
         <w:t xml:space="preserve"> </w:t>
       </w:r>
       <w:r>
-        <w:t xml:space="preserve">The Content Capability team was built around me to leverage my cross-functional expertise in engineering, UX, and Agile delivery.</w:t>
+        <w:t xml:space="preserve">Joined a standalone team with no formal department, no established processes, and no documentation — built to leverage my cross-functional expertise in engineering, UX, and Agile delivery. A pattern I would repeat in 2025 when forming the specialist CMS Team from a larger restructuring.</w:t>
       </w:r>
     </w:p>
     <w:p>
@@ -842,7 +1062,7 @@
         <w:t xml:space="preserve"> </w:t>
       </w:r>
       <w:r>
-        <w:t xml:space="preserve">Joined as the founding engineer and grew the team from</w:t>
+        <w:t xml:space="preserve">Joined as the founding engineer in a standalone team supporting marketing — no department, no precedent. Grew the team from</w:t>
       </w:r>
       <w:r>
         <w:t xml:space="preserve"> </w:t>
@@ -854,7 +1074,7 @@
         <w:t xml:space="preserve"> </w:t>
       </w:r>
       <w:r>
-        <w:t xml:space="preserve">through recruitment and restructuring. The team survived</w:t>
+        <w:t xml:space="preserve">through recruitment and internal transfers. The team survived</w:t>
       </w:r>
       <w:r>
         <w:t xml:space="preserve"> </w:t>
@@ -866,7 +1086,7 @@
         <w:t xml:space="preserve"> </w:t>
       </w:r>
       <w:r>
-        <w:t xml:space="preserve">company-wide restructurings (Marketing Capability → Content Capability → COREX + CMS Team) — a mark of its embedded value to the business.</w:t>
+        <w:t xml:space="preserve">company-wide restructurings (Marketing Capability → Content Capability → CMS Team) — a mark of its embedded value to the business.</w:t>
       </w:r>
     </w:p>
     <w:p>
@@ -888,7 +1108,25 @@
         <w:t xml:space="preserve"> </w:t>
       </w:r>
       <w:r>
-        <w:t xml:space="preserve">Primary Year 1 objective met: a fully operational Scrum environment with structured backlog, measurable velocity, and predictable delivery — transforming a nascent capability into a reliable engineering team.</w:t>
+        <w:t xml:space="preserve">Established a fully operational Scrum environment with structured backlog, measurable velocity, and predictable delivery — filling Product Manager gaps when needed and transforming a nascent capability into a reliable engineering team. Conducted systematic discovery (</w:t>
+      </w:r>
+      <w:r>
+        <w:t xml:space="preserve">“Archeology”</w:t>
+      </w:r>
+      <w:r>
+        <w:t xml:space="preserve">) on the legacy Apostrophe CMS, authored the team’s foundational documentation, and set the standard that would grow into</w:t>
+      </w:r>
+      <w:r>
+        <w:t xml:space="preserve"> </w:t>
+      </w:r>
+      <w:r>
+        <w:t xml:space="preserve">100+ articles</w:t>
+      </w:r>
+      <w:r>
+        <w:t xml:space="preserve"> </w:t>
+      </w:r>
+      <w:r>
+        <w:t xml:space="preserve">of process and technical documentation.</w:t>
       </w:r>
     </w:p>
     <w:p>
@@ -1304,10 +1542,13 @@
           <w:b/>
           <w:bCs/>
         </w:rPr>
-        <w:t xml:space="preserve">UX Research</w:t>
-      </w:r>
-      <w:r>
-        <w:t xml:space="preserve">: Conducted UX interviews, user testing, and research to improve the decision-making process for the design and development teams.</w:t>
+        <w:t xml:space="preserve">UX Research &amp; End-to-End Feature Ownership:</w:t>
+      </w:r>
+      <w:r>
+        <w:t xml:space="preserve"> </w:t>
+      </w:r>
+      <w:r>
+        <w:t xml:space="preserve">Owned the full feature lifecycle for the CMS product — conducting regular on-site contextual inquiry at client organisations (Wyre Council, Rotherham Council, Greater Manchester Combined Authority, City of York Council, University of Leeds), distilling field research into reports that shaped the product roadmap, and iterating from mockups through usability testing to production release. Operated as one of three product-area leads (CMS, Forms, CRM), each independently responsible for their domain.</w:t>
       </w:r>
     </w:p>
     <w:p>

</xml_diff>

<commit_message>
docs: update CV and professional development profile with refined metrics and experience details
</commit_message>
<xml_diff>
--- a/assets/Nikos_Vasileiadis_CV.docx
+++ b/assets/Nikos_Vasileiadis_CV.docx
@@ -666,35 +666,21 @@
           <w:b/>
           <w:bCs/>
         </w:rPr>
-        <w:t xml:space="preserve">Rebranding Programme (</w:t>
-      </w:r>
-      <w:r>
-        <w:rPr>
-          <w:b/>
-          <w:bCs/>
-        </w:rPr>
-        <w:t xml:space="preserve">2 quarters</w:t>
-      </w:r>
-      <w:r>
-        <w:rPr>
-          <w:b/>
-          <w:bCs/>
-        </w:rPr>
-        <w:t xml:space="preserve">;</w:t>
-      </w:r>
-      <w:r>
-        <w:rPr>
-          <w:b/>
-          <w:bCs/>
-        </w:rPr>
-        <w:t xml:space="preserve"> </w:t>
-      </w:r>
-      <w:r>
-        <w:rPr>
-          <w:b/>
-          <w:bCs/>
-        </w:rPr>
-        <w:t xml:space="preserve">500 pages</w:t>
+        <w:t xml:space="preserve">Rebranding Programme (Oct 2025 – Apr 2026;</w:t>
+      </w:r>
+      <w:r>
+        <w:rPr>
+          <w:b/>
+          <w:bCs/>
+        </w:rPr>
+        <w:t xml:space="preserve"> </w:t>
+      </w:r>
+      <w:r>
+        <w:rPr>
+          <w:b/>
+          <w:bCs/>
+        </w:rPr>
+        <w:t xml:space="preserve">522 pages</w:t>
       </w:r>
       <w:r>
         <w:rPr>
@@ -760,19 +746,88 @@
         <w:t xml:space="preserve"> </w:t>
       </w:r>
       <w:r>
-        <w:t xml:space="preserve">page load times on critical-path pages and ≤2 incidents per year, all resolved within hours. Supported</w:t>
-      </w:r>
-      <w:r>
-        <w:t xml:space="preserve"> </w:t>
-      </w:r>
-      <w:r>
-        <w:t xml:space="preserve">15</w:t>
-      </w:r>
-      <w:r>
-        <w:t xml:space="preserve"> </w:t>
-      </w:r>
-      <w:r>
-        <w:t xml:space="preserve">dependent teams across Customer Marketing, Digital Marketing, Partner Marketing, Acquisition, Data Science, Recruitment, and more. Owns the full platform analytics and compliance stack: Contentful CMS, Google Tag Manager, Snowplow, Mixpanel, Optimizely, and OneTrust —</w:t>
+        <w:t xml:space="preserve">page load times on critical-path pages and</w:t>
+      </w:r>
+      <w:r>
+        <w:t xml:space="preserve"> </w:t>
+      </w:r>
+      <w:r>
+        <w:t xml:space="preserve">1 incident</w:t>
+      </w:r>
+      <w:r>
+        <w:t xml:space="preserve"> </w:t>
+      </w:r>
+      <w:r>
+        <w:t xml:space="preserve">in the current year, resolved within hours. Managing a digital estate of</w:t>
+      </w:r>
+      <w:r>
+        <w:t xml:space="preserve"> </w:t>
+      </w:r>
+      <w:r>
+        <w:t xml:space="preserve">522 pages</w:t>
+      </w:r>
+      <w:r>
+        <w:t xml:space="preserve">,</w:t>
+      </w:r>
+      <w:r>
+        <w:t xml:space="preserve"> </w:t>
+      </w:r>
+      <w:r>
+        <w:t xml:space="preserve">3,157 media assets</w:t>
+      </w:r>
+      <w:r>
+        <w:t xml:space="preserve">,</w:t>
+      </w:r>
+      <w:r>
+        <w:t xml:space="preserve"> </w:t>
+      </w:r>
+      <w:r>
+        <w:t xml:space="preserve">1,090 shortlinks</w:t>
+      </w:r>
+      <w:r>
+        <w:t xml:space="preserve">, and</w:t>
+      </w:r>
+      <w:r>
+        <w:t xml:space="preserve"> </w:t>
+      </w:r>
+      <w:r>
+        <w:t xml:space="preserve">218 redirects</w:t>
+      </w:r>
+      <w:r>
+        <w:t xml:space="preserve">. Supported</w:t>
+      </w:r>
+      <w:r>
+        <w:t xml:space="preserve"> </w:t>
+      </w:r>
+      <w:r>
+        <w:t xml:space="preserve">8</w:t>
+      </w:r>
+      <w:r>
+        <w:t xml:space="preserve"> </w:t>
+      </w:r>
+      <w:r>
+        <w:t xml:space="preserve">content teams (</w:t>
+      </w:r>
+      <w:r>
+        <w:t xml:space="preserve">33</w:t>
+      </w:r>
+      <w:r>
+        <w:t xml:space="preserve"> </w:t>
+      </w:r>
+      <w:r>
+        <w:t xml:space="preserve">direct users) across Customer Marketing, Digital Marketing, Partner Marketing, Acquisition, Data Science, Partner Training, Recruitment, and PR — plus</w:t>
+      </w:r>
+      <w:r>
+        <w:t xml:space="preserve"> </w:t>
+      </w:r>
+      <w:r>
+        <w:t xml:space="preserve">15+</w:t>
+      </w:r>
+      <w:r>
+        <w:t xml:space="preserve"> </w:t>
+      </w:r>
+      <w:r>
+        <w:t xml:space="preserve">engineering teams as platform dependencies. Owns the full platform analytics and compliance stack: Contentful CMS, Google Tag Manager, Snowplow, Mixpanel, Optimizely, and OneTrust —</w:t>
       </w:r>
       <w:r>
         <w:t xml:space="preserve"> </w:t>

</xml_diff>

<commit_message>
docs: update CV in PDF and DOCX formats
</commit_message>
<xml_diff>
--- a/assets/Nikos_Vasileiadis_CV.docx
+++ b/assets/Nikos_Vasileiadis_CV.docx
@@ -7,7 +7,7 @@
         <w:pStyle w:val="Title"/>
       </w:pPr>
       <w:r>
-        <w:t xml:space="preserve">CV — Nikos Vasileiadis | Engineering Leader | Leeds, UK</w:t>
+        <w:t xml:space="preserve">CV — Nikos Vasileiadis | Software Engineering Leader | Leeds, UK</w:t>
       </w:r>
     </w:p>
     <w:bookmarkStart w:id="30" w:name="nikos-vasileiadis"/>
@@ -28,7 +28,7 @@
           <w:b/>
           <w:bCs/>
         </w:rPr>
-        <w:t xml:space="preserve">Engineering Leader</w:t>
+        <w:t xml:space="preserve">Software Engineering Leader</w:t>
       </w:r>
       <w:r>
         <w:t xml:space="preserve"> </w:t>
@@ -273,7 +273,7 @@
         <w:pStyle w:val="FirstParagraph"/>
       </w:pPr>
       <w:r>
-        <w:t xml:space="preserve">Engineering leader with</w:t>
+        <w:t xml:space="preserve">Software engineering leader with</w:t>
       </w:r>
       <w:r>
         <w:t xml:space="preserve"> </w:t>

</xml_diff>

<commit_message>
feat: redesign homepage hero with metrics grid and update professional credentials text
</commit_message>
<xml_diff>
--- a/assets/Nikos_Vasileiadis_CV.docx
+++ b/assets/Nikos_Vasileiadis_CV.docx
@@ -273,7 +273,7 @@
         <w:pStyle w:val="FirstParagraph"/>
       </w:pPr>
       <w:r>
-        <w:t xml:space="preserve">Software engineering leader with</w:t>
+        <w:t xml:space="preserve">With</w:t>
       </w:r>
       <w:r>
         <w:t xml:space="preserve"> </w:t>
@@ -297,7 +297,7 @@
         <w:t xml:space="preserve"> </w:t>
       </w:r>
       <w:r>
-        <w:t xml:space="preserve">of progressive leadership. I started in code — frontend, full-stack, CMS architecture, platform engineering — and mastered the craft. What I discovered along the way is that my real strength is people: building teams, developing talent, creating clarity, and designing the organisational conditions where engineers do their best work.</w:t>
+        <w:t xml:space="preserve">of progressive leadership, I started in code — frontend, full-stack, CMS architecture, platform engineering — and mastered the craft. What I discovered along the way is that my real strength is people: building teams, developing talent, creating clarity, and designing the organisational conditions where engineers do their best work.</w:t>
       </w:r>
     </w:p>
     <w:p>

</xml_diff>

<commit_message>
refactor: update homepage layout with profile photo and grid navigation, refine professional development page, and restyle 404 error page
</commit_message>
<xml_diff>
--- a/assets/Nikos_Vasileiadis_CV.docx
+++ b/assets/Nikos_Vasileiadis_CV.docx
@@ -273,7 +273,7 @@
         <w:pStyle w:val="FirstParagraph"/>
       </w:pPr>
       <w:r>
-        <w:t xml:space="preserve">With</w:t>
+        <w:t xml:space="preserve">After</w:t>
       </w:r>
       <w:r>
         <w:t xml:space="preserve"> </w:t>
@@ -285,7 +285,7 @@
         <w:t xml:space="preserve"> </w:t>
       </w:r>
       <w:r>
-        <w:t xml:space="preserve">in technology and</w:t>
+        <w:t xml:space="preserve">building a career from self-taught web developer in Greece to engineering leader in the UK — and</w:t>
       </w:r>
       <w:r>
         <w:t xml:space="preserve"> </w:t>
@@ -297,7 +297,7 @@
         <w:t xml:space="preserve"> </w:t>
       </w:r>
       <w:r>
-        <w:t xml:space="preserve">of progressive leadership, I started in code — frontend, full-stack, CMS architecture, platform engineering — and mastered the craft. What I discovered along the way is that my real strength is people: building teams, developing talent, creating clarity, and designing the organisational conditions where engineers do their best work.</w:t>
+        <w:t xml:space="preserve">of progressive leadership — I’ve learned that my real strength is people: building teams, developing talent, creating clarity, and designing the organisational conditions where engineers do their best work.</w:t>
       </w:r>
     </w:p>
     <w:p>
@@ -346,7 +346,7 @@
         <w:pStyle w:val="BodyText"/>
       </w:pPr>
       <w:r>
-        <w:t xml:space="preserve">I treat engineering as a business lever — contributing to CapEx/OpEx planning, evaluating vendor ROI, and ensuring technical investments map directly to business outcomes. My technical depth gives me credibility with engineers; my focus on people, process, and organisational design is where I create the most value.</w:t>
+        <w:t xml:space="preserve">I treat engineering as a business lever — contributing to CapEx/OpEx planning, evaluating vendor ROI, and ensuring technical investments map directly to business outcomes. My technical depth — frontend, full-stack, CMS architecture, platform engineering — gives me credibility with engineers; my focus on people, process, and organisational design is where I create the most value.</w:t>
       </w:r>
     </w:p>
     <w:bookmarkEnd w:id="15"/>
@@ -380,7 +380,7 @@
         <w:t xml:space="preserve">Company</w:t>
       </w:r>
       <w:r>
-        <w:t xml:space="preserve">: Utility Warehouse</w:t>
+        <w:t xml:space="preserve">: Utility Warehouse (Telecom Plus PLC · FTSE 250)</w:t>
       </w:r>
       <w:r>
         <w:br/>
@@ -393,7 +393,7 @@
         <w:t xml:space="preserve">Dates</w:t>
       </w:r>
       <w:r>
-        <w:t xml:space="preserve">: Jul 2023 - Present (2 yrs 3 mos)</w:t>
+        <w:t xml:space="preserve">: Jul 2023 - Present</w:t>
       </w:r>
       <w:r>
         <w:br/>
@@ -1038,7 +1038,7 @@
         <w:t xml:space="preserve">Company</w:t>
       </w:r>
       <w:r>
-        <w:t xml:space="preserve">: Utility Warehouse</w:t>
+        <w:t xml:space="preserve">: Utility Warehouse (Telecom Plus PLC · FTSE 250)</w:t>
       </w:r>
       <w:r>
         <w:br/>
@@ -1370,7 +1370,7 @@
         <w:t xml:space="preserve">Company</w:t>
       </w:r>
       <w:r>
-        <w:t xml:space="preserve">: Leeds Building Society</w:t>
+        <w:t xml:space="preserve">: Leeds Building Society (5th largest UK building society · £31B+ assets)</w:t>
       </w:r>
       <w:r>
         <w:br/>

</xml_diff>

<commit_message>
refactor: update credentials display with progressive disclosure and refine styling in professional development documentation
</commit_message>
<xml_diff>
--- a/assets/Nikos_Vasileiadis_CV.docx
+++ b/assets/Nikos_Vasileiadis_CV.docx
@@ -10,7 +10,7 @@
         <w:t xml:space="preserve">CV — Nikos Vasileiadis | Software Engineering Leader | Leeds, UK</w:t>
       </w:r>
     </w:p>
-    <w:bookmarkStart w:id="30" w:name="nikos-vasileiadis"/>
+    <w:bookmarkStart w:id="28" w:name="nikos-vasileiadis"/>
     <w:p>
       <w:pPr>
         <w:pStyle w:val="Heading1"/>
@@ -93,38 +93,84 @@
         <w:pStyle w:val="BodyText"/>
       </w:pPr>
       <w:r>
-        <w:t xml:space="preserve">Download profile:</w:t>
-      </w:r>
-      <w:r>
-        <w:t xml:space="preserve"> </w:t>
-      </w:r>
-      <w:hyperlink r:id="rId12">
-        <w:r>
-          <w:rPr>
-            <w:rStyle w:val="Hyperlink"/>
-          </w:rPr>
-          <w:t xml:space="preserve">PDF Version</w:t>
-        </w:r>
-      </w:hyperlink>
-      <w:r>
-        <w:t xml:space="preserve"> </w:t>
-      </w:r>
-      <w:r>
-        <w:t xml:space="preserve">|</w:t>
-      </w:r>
-      <w:r>
-        <w:t xml:space="preserve"> </w:t>
-      </w:r>
-      <w:hyperlink r:id="rId13">
-        <w:r>
-          <w:rPr>
-            <w:rStyle w:val="Hyperlink"/>
-          </w:rPr>
-          <w:t xml:space="preserve">DOCX Version</w:t>
-        </w:r>
-      </w:hyperlink>
-    </w:p>
-    <w:bookmarkStart w:id="14" w:name="top-skills"/>
+        <w:t xml:space="preserve">Download CV:</w:t>
+      </w:r>
+    </w:p>
+    <w:p>
+      <w:pPr>
+        <w:pStyle w:val="SourceCode"/>
+      </w:pPr>
+      <w:r>
+        <w:rPr>
+          <w:rStyle w:val="VerbatimChar"/>
+        </w:rPr>
+        <w:t xml:space="preserve">&lt;a href="/assets/Nikos_Vasileiadis_CV.pdf" download target="_blank" rel="noopener" class="cv-download-btn cv-download-btn--primary"&gt;</w:t>
+      </w:r>
+      <w:r>
+        <w:br/>
+      </w:r>
+      <w:r>
+        <w:rPr>
+          <w:rStyle w:val="VerbatimChar"/>
+        </w:rPr>
+        <w:t xml:space="preserve">  &lt;svg xmlns="http://www.w3.org/2000/svg" width="16" height="16" viewBox="0 0 24 24" fill="none" stroke="currentColor" stroke-width="2" stroke-linecap="round" stroke-linejoin="round"&gt;&lt;path d="M21 15v4a2 2 0 0 1-2 2H5a2 2 0 0 1-2-2v-4"/&gt;&lt;polyline points="7 10 12 15 17 10"/&gt;&lt;line x1="12" y1="15" x2="12" y2="3"/&gt;&lt;/svg&gt;</w:t>
+      </w:r>
+      <w:r>
+        <w:br/>
+      </w:r>
+      <w:r>
+        <w:rPr>
+          <w:rStyle w:val="VerbatimChar"/>
+        </w:rPr>
+        <w:t xml:space="preserve">  PDF Version</w:t>
+      </w:r>
+      <w:r>
+        <w:br/>
+      </w:r>
+      <w:r>
+        <w:rPr>
+          <w:rStyle w:val="VerbatimChar"/>
+        </w:rPr>
+        <w:t xml:space="preserve">&lt;/a&gt;</w:t>
+      </w:r>
+      <w:r>
+        <w:br/>
+      </w:r>
+      <w:r>
+        <w:rPr>
+          <w:rStyle w:val="VerbatimChar"/>
+        </w:rPr>
+        <w:t xml:space="preserve">&lt;a href="/assets/Nikos_Vasileiadis_CV.docx" download target="_blank" rel="noopener" class="cv-download-btn cv-download-btn--secondary"&gt;</w:t>
+      </w:r>
+      <w:r>
+        <w:br/>
+      </w:r>
+      <w:r>
+        <w:rPr>
+          <w:rStyle w:val="VerbatimChar"/>
+        </w:rPr>
+        <w:t xml:space="preserve">  &lt;svg xmlns="http://www.w3.org/2000/svg" width="16" height="16" viewBox="0 0 24 24" fill="none" stroke="currentColor" stroke-width="2" stroke-linecap="round" stroke-linejoin="round"&gt;&lt;path d="M21 15v4a2 2 0 0 1-2 2H5a2 2 0 0 1-2-2v-4"/&gt;&lt;polyline points="7 10 12 15 17 10"/&gt;&lt;line x1="12" y1="15" x2="12" y2="3"/&gt;&lt;/svg&gt;</w:t>
+      </w:r>
+      <w:r>
+        <w:br/>
+      </w:r>
+      <w:r>
+        <w:rPr>
+          <w:rStyle w:val="VerbatimChar"/>
+        </w:rPr>
+        <w:t xml:space="preserve">  DOCX Version</w:t>
+      </w:r>
+      <w:r>
+        <w:br/>
+      </w:r>
+      <w:r>
+        <w:rPr>
+          <w:rStyle w:val="VerbatimChar"/>
+        </w:rPr>
+        <w:t xml:space="preserve">&lt;/a&gt;</w:t>
+      </w:r>
+    </w:p>
+    <w:bookmarkStart w:id="12" w:name="top-skills"/>
     <w:p>
       <w:pPr>
         <w:pStyle w:val="Heading2"/>
@@ -258,8 +304,8 @@
         <w:t xml:space="preserve">: Treating engineering as a business lever, not a cost centre. Active contributor to CapEx/OpEx planning, vendor ROI evaluation, and ensuring every technical investment maps to a business outcome.</w:t>
       </w:r>
     </w:p>
-    <w:bookmarkEnd w:id="14"/>
-    <w:bookmarkStart w:id="15" w:name="about"/>
+    <w:bookmarkEnd w:id="12"/>
+    <w:bookmarkStart w:id="13" w:name="about"/>
     <w:p>
       <w:pPr>
         <w:pStyle w:val="Heading2"/>
@@ -349,8 +395,8 @@
         <w:t xml:space="preserve">I treat engineering as a business lever — contributing to CapEx/OpEx planning, evaluating vendor ROI, and ensuring technical investments map directly to business outcomes. My technical depth — frontend, full-stack, CMS architecture, platform engineering — gives me credibility with engineers; my focus on people, process, and organisational design is where I create the most value.</w:t>
       </w:r>
     </w:p>
-    <w:bookmarkEnd w:id="15"/>
-    <w:bookmarkStart w:id="25" w:name="experience"/>
+    <w:bookmarkEnd w:id="13"/>
+    <w:bookmarkStart w:id="23" w:name="experience"/>
     <w:p>
       <w:pPr>
         <w:pStyle w:val="Heading2"/>
@@ -359,7 +405,7 @@
         <w:t xml:space="preserve">Experience</w:t>
       </w:r>
     </w:p>
-    <w:bookmarkStart w:id="16" w:name="software-engineering-manager"/>
+    <w:bookmarkStart w:id="14" w:name="software-engineering-manager"/>
     <w:p>
       <w:pPr>
         <w:pStyle w:val="Heading3"/>
@@ -1016,8 +1062,8 @@
         <w:t xml:space="preserve">, and full accountability for the uw.co.uk estate.</w:t>
       </w:r>
     </w:p>
-    <w:bookmarkEnd w:id="16"/>
-    <w:bookmarkStart w:id="17" w:name="lead-software-engineer"/>
+    <w:bookmarkEnd w:id="14"/>
+    <w:bookmarkStart w:id="15" w:name="lead-software-engineer"/>
     <w:p>
       <w:pPr>
         <w:pStyle w:val="Heading3"/>
@@ -1206,14 +1252,271 @@
         <w:t xml:space="preserve">Led the evaluation process that resulted in UW’s adoption of Contentful as its enterprise CMS. Presented findings and audit trail to leadership; recommendation accepted and implemented.</w:t>
       </w:r>
     </w:p>
+    <w:bookmarkEnd w:id="15"/>
+    <w:bookmarkStart w:id="16" w:name="senior-full-stack-developer-scrum-master"/>
+    <w:p>
+      <w:pPr>
+        <w:pStyle w:val="Heading3"/>
+      </w:pPr>
+      <w:r>
+        <w:t xml:space="preserve">Senior Full Stack Developer &amp; Scrum Master</w:t>
+      </w:r>
+    </w:p>
+    <w:p>
+      <w:pPr>
+        <w:pStyle w:val="FirstParagraph"/>
+      </w:pPr>
+      <w:r>
+        <w:rPr>
+          <w:b/>
+          <w:bCs/>
+        </w:rPr>
+        <w:t xml:space="preserve">Company</w:t>
+      </w:r>
+      <w:r>
+        <w:t xml:space="preserve">: IMA-HOME</w:t>
+      </w:r>
+      <w:r>
+        <w:br/>
+      </w:r>
+      <w:r>
+        <w:rPr>
+          <w:b/>
+          <w:bCs/>
+        </w:rPr>
+        <w:t xml:space="preserve">Dates</w:t>
+      </w:r>
+      <w:r>
+        <w:t xml:space="preserve">: Jan 2020 - Apr 2022 (2 yrs 4 mos)</w:t>
+      </w:r>
+      <w:r>
+        <w:br/>
+      </w:r>
+      <w:r>
+        <w:rPr>
+          <w:b/>
+          <w:bCs/>
+        </w:rPr>
+        <w:t xml:space="preserve">Location</w:t>
+      </w:r>
+      <w:r>
+        <w:t xml:space="preserve">: Leeds, England, United Kingdom</w:t>
+      </w:r>
+      <w:r>
+        <w:br/>
+      </w:r>
+      <w:r>
+        <w:rPr>
+          <w:b/>
+          <w:bCs/>
+        </w:rPr>
+        <w:t xml:space="preserve">Employment Type</w:t>
+      </w:r>
+      <w:r>
+        <w:t xml:space="preserve">: Full-time, Hybrid</w:t>
+      </w:r>
+    </w:p>
+    <w:p>
+      <w:pPr>
+        <w:pStyle w:val="BodyText"/>
+      </w:pPr>
+      <w:r>
+        <w:rPr>
+          <w:b/>
+          <w:bCs/>
+        </w:rPr>
+        <w:t xml:space="preserve">Description</w:t>
+      </w:r>
+      <w:r>
+        <w:t xml:space="preserve">: Operated as a dual-threat technical leader for global brands (Adidas, MARS). Alongside architecting frontend solutions, I formally took on Scrum Master responsibilities to elevate the organization’s delivery standards and project predictability.</w:t>
+      </w:r>
+    </w:p>
+    <w:p>
+      <w:pPr>
+        <w:pStyle w:val="BodyText"/>
+      </w:pPr>
+      <w:r>
+        <w:rPr>
+          <w:b/>
+          <w:bCs/>
+        </w:rPr>
+        <w:t xml:space="preserve">Agile Transformation:</w:t>
+      </w:r>
+      <w:r>
+        <w:t xml:space="preserve"> </w:t>
+      </w:r>
+      <w:r>
+        <w:t xml:space="preserve">Introduced structured Agile/Scrum practices to an agency running entirely on ad-hoc, fire-driven delivery. Result: measurable sprint velocity, predictable project allocation, and regular client demos — improving delivery health and client confidence across the board.</w:t>
+      </w:r>
+    </w:p>
+    <w:p>
+      <w:pPr>
+        <w:pStyle w:val="BodyText"/>
+      </w:pPr>
+      <w:r>
+        <w:rPr>
+          <w:b/>
+          <w:bCs/>
+        </w:rPr>
+        <w:t xml:space="preserve">Global Design Systems (Royal Canin / MARS):</w:t>
+      </w:r>
+      <w:r>
+        <w:t xml:space="preserve"> </w:t>
+      </w:r>
+      <w:r>
+        <w:t xml:space="preserve">Architected the frontend for Royal Canin’s global web presence — a single design system serving</w:t>
+      </w:r>
+      <w:r>
+        <w:t xml:space="preserve"> </w:t>
+      </w:r>
+      <w:r>
+        <w:t xml:space="preserve">30+ countries</w:t>
+      </w:r>
+      <w:r>
+        <w:t xml:space="preserve"> </w:t>
+      </w:r>
+      <w:r>
+        <w:t xml:space="preserve">including Japan and Saudi Arabia, with RTL and vertical reading direction support. Served traffic in the millions.</w:t>
+      </w:r>
+    </w:p>
+    <w:p>
+      <w:pPr>
+        <w:pStyle w:val="BodyText"/>
+      </w:pPr>
+      <w:r>
+        <w:rPr>
+          <w:b/>
+          <w:bCs/>
+        </w:rPr>
+        <w:t xml:space="preserve">Projects</w:t>
+      </w:r>
+      <w:r>
+        <w:t xml:space="preserve">: Adidas, MARS, Gregg Wallace, Leeds Rhinos, Royal Canin</w:t>
+      </w:r>
+    </w:p>
+    <w:bookmarkEnd w:id="16"/>
+    <w:bookmarkStart w:id="17" w:name="senior-digital-developer"/>
+    <w:p>
+      <w:pPr>
+        <w:pStyle w:val="Heading3"/>
+      </w:pPr>
+      <w:r>
+        <w:t xml:space="preserve">Senior Digital Developer</w:t>
+      </w:r>
+    </w:p>
+    <w:p>
+      <w:pPr>
+        <w:pStyle w:val="FirstParagraph"/>
+      </w:pPr>
+      <w:r>
+        <w:rPr>
+          <w:b/>
+          <w:bCs/>
+        </w:rPr>
+        <w:t xml:space="preserve">Company</w:t>
+      </w:r>
+      <w:r>
+        <w:t xml:space="preserve">: Leeds Building Society (5th largest UK building society · £31B+ assets)</w:t>
+      </w:r>
+      <w:r>
+        <w:br/>
+      </w:r>
+      <w:r>
+        <w:rPr>
+          <w:b/>
+          <w:bCs/>
+        </w:rPr>
+        <w:t xml:space="preserve">Dates</w:t>
+      </w:r>
+      <w:r>
+        <w:t xml:space="preserve">: Oct 2018 - Jan 2020 (1 yr 4 mos)</w:t>
+      </w:r>
+      <w:r>
+        <w:br/>
+      </w:r>
+      <w:r>
+        <w:rPr>
+          <w:b/>
+          <w:bCs/>
+        </w:rPr>
+        <w:t xml:space="preserve">Location</w:t>
+      </w:r>
+      <w:r>
+        <w:t xml:space="preserve">: Leeds, England, United Kingdom · Hybrid</w:t>
+      </w:r>
+      <w:r>
+        <w:br/>
+      </w:r>
+      <w:r>
+        <w:rPr>
+          <w:b/>
+          <w:bCs/>
+        </w:rPr>
+        <w:t xml:space="preserve">Employment Type</w:t>
+      </w:r>
+      <w:r>
+        <w:t xml:space="preserve">: Full-time</w:t>
+      </w:r>
+    </w:p>
+    <w:p>
+      <w:pPr>
+        <w:pStyle w:val="BodyText"/>
+      </w:pPr>
+      <w:r>
+        <w:rPr>
+          <w:b/>
+          <w:bCs/>
+        </w:rPr>
+        <w:t xml:space="preserve">Description</w:t>
+      </w:r>
+      <w:r>
+        <w:t xml:space="preserve">: Maintained public-facing digital assets in a highly regulated FinTech environment while actively mentoring engineering teams to elevate code quality and UX standards.</w:t>
+      </w:r>
+    </w:p>
+    <w:p>
+      <w:pPr>
+        <w:pStyle w:val="BodyText"/>
+      </w:pPr>
+      <w:r>
+        <w:rPr>
+          <w:b/>
+          <w:bCs/>
+        </w:rPr>
+        <w:t xml:space="preserve">Agile First Mover:</w:t>
+      </w:r>
+      <w:r>
+        <w:t xml:space="preserve"> </w:t>
+      </w:r>
+      <w:r>
+        <w:t xml:space="preserve">Introduced Agile and Scrum to LBS for the first time, shifting a high-bureaucracy, low-velocity organisation from ad-hoc output to sprint-based iterative delivery with measurable velocity. Served as the unofficial internal Agile champion throughout my tenure.</w:t>
+      </w:r>
+    </w:p>
+    <w:p>
+      <w:pPr>
+        <w:pStyle w:val="BodyText"/>
+      </w:pPr>
+      <w:r>
+        <w:rPr>
+          <w:b/>
+          <w:bCs/>
+        </w:rPr>
+        <w:t xml:space="preserve">Digital Transformation (Interim Scrum Master, Jun–Oct 2019):</w:t>
+      </w:r>
+      <w:r>
+        <w:t xml:space="preserve"> </w:t>
+      </w:r>
+      <w:r>
+        <w:t xml:space="preserve">Appointed to lead the Digital Transformation programme alongside external consultants and cross-functional teams — moving from firefighting culture to structured, iterative feature development with regular delivery cadences.</w:t>
+      </w:r>
+    </w:p>
     <w:bookmarkEnd w:id="17"/>
-    <w:bookmarkStart w:id="18" w:name="senior-full-stack-developer-scrum-master"/>
+    <w:bookmarkStart w:id="19" w:name="ux-interface-developer"/>
     <w:p>
       <w:pPr>
         <w:pStyle w:val="Heading3"/>
       </w:pPr>
       <w:r>
-        <w:t xml:space="preserve">Senior Full Stack Developer &amp; Scrum Master</w:t>
+        <w:t xml:space="preserve">UX Interface Developer</w:t>
       </w:r>
     </w:p>
     <w:p>
@@ -1228,7 +1531,7 @@
         <w:t xml:space="preserve">Company</w:t>
       </w:r>
       <w:r>
-        <w:t xml:space="preserve">: IMA-HOME</w:t>
+        <w:t xml:space="preserve">: Jadu</w:t>
       </w:r>
       <w:r>
         <w:br/>
@@ -1241,7 +1544,7 @@
         <w:t xml:space="preserve">Dates</w:t>
       </w:r>
       <w:r>
-        <w:t xml:space="preserve">: Jan 2020 - Apr 2022 (2 yrs 4 mos)</w:t>
+        <w:t xml:space="preserve">: Jan 2017 - Oct 2018 (1 yr 10 mos)</w:t>
       </w:r>
       <w:r>
         <w:br/>
@@ -1254,7 +1557,7 @@
         <w:t xml:space="preserve">Location</w:t>
       </w:r>
       <w:r>
-        <w:t xml:space="preserve">: Leeds, England, United Kingdom</w:t>
+        <w:t xml:space="preserve">: Leeds, England, United Kingdom · Hybrid</w:t>
       </w:r>
       <w:r>
         <w:br/>
@@ -1267,7 +1570,7 @@
         <w:t xml:space="preserve">Employment Type</w:t>
       </w:r>
       <w:r>
-        <w:t xml:space="preserve">: Full-time, Hybrid</w:t>
+        <w:t xml:space="preserve">: Full-time</w:t>
       </w:r>
     </w:p>
     <w:p>
@@ -1282,7 +1585,7 @@
         <w:t xml:space="preserve">Description</w:t>
       </w:r>
       <w:r>
-        <w:t xml:space="preserve">: Operated as a dual-threat technical leader for global brands (Adidas, MARS). Alongside architecting frontend solutions, I formally took on Scrum Master responsibilities to elevate the organization’s delivery standards and project predictability.</w:t>
+        <w:t xml:space="preserve">: Designed UIs and developed new features with a strict focus on user experience, accessibility, and W3C standards for an award-winning custom CMS used by Local Authorities, Higher Education, and third-sector organisations.</w:t>
       </w:r>
     </w:p>
     <w:p>
@@ -1294,13 +1597,26 @@
           <w:b/>
           <w:bCs/>
         </w:rPr>
-        <w:t xml:space="preserve">Agile Transformation:</w:t>
-      </w:r>
-      <w:r>
-        <w:t xml:space="preserve"> </w:t>
-      </w:r>
-      <w:r>
-        <w:t xml:space="preserve">Introduced structured Agile/Scrum practices to an agency running entirely on ad-hoc, fire-driven delivery. Result: measurable sprint velocity, predictable project allocation, and regular client demos — improving delivery health and client confidence across the board.</w:t>
+        <w:t xml:space="preserve">Design Systems</w:t>
+      </w:r>
+      <w:r>
+        <w:t xml:space="preserve">: Co-created and maintained</w:t>
+      </w:r>
+      <w:r>
+        <w:t xml:space="preserve"> </w:t>
+      </w:r>
+      <w:r>
+        <w:rPr>
+          <w:b/>
+          <w:bCs/>
+        </w:rPr>
+        <w:t xml:space="preserve">Pulsar</w:t>
+      </w:r>
+      <w:r>
+        <w:t xml:space="preserve"> </w:t>
+      </w:r>
+      <w:r>
+        <w:t xml:space="preserve">— an open-source UX and Interface Design System powering the Jadu Continuum Platform. This is the foundation of my Design Systems specialism, combining component architecture, accessibility, and cross-team enablement.</w:t>
       </w:r>
     </w:p>
     <w:p>
@@ -1312,25 +1628,10 @@
           <w:b/>
           <w:bCs/>
         </w:rPr>
-        <w:t xml:space="preserve">Global Design Systems (Royal Canin / MARS):</w:t>
-      </w:r>
-      <w:r>
-        <w:t xml:space="preserve"> </w:t>
-      </w:r>
-      <w:r>
-        <w:t xml:space="preserve">Architected the frontend for Royal Canin’s global web presence — a single design system serving</w:t>
-      </w:r>
-      <w:r>
-        <w:t xml:space="preserve"> </w:t>
-      </w:r>
-      <w:r>
-        <w:t xml:space="preserve">30+ countries</w:t>
-      </w:r>
-      <w:r>
-        <w:t xml:space="preserve"> </w:t>
-      </w:r>
-      <w:r>
-        <w:t xml:space="preserve">including Japan and Saudi Arabia, with RTL and vertical reading direction support. Served traffic in the millions.</w:t>
+        <w:t xml:space="preserve">Agile Delivery</w:t>
+      </w:r>
+      <w:r>
+        <w:t xml:space="preserve">: Gained foundational, hands-on Agile leadership experience through a rotating Scrum Master model, facilitating sprint planning, daily standups, and embedding the core principles of the Agile manifesto into the team’s workflow.</w:t>
       </w:r>
     </w:p>
     <w:p>
@@ -1342,285 +1643,30 @@
           <w:b/>
           <w:bCs/>
         </w:rPr>
+        <w:t xml:space="preserve">UX Research &amp; End-to-End Feature Ownership:</w:t>
+      </w:r>
+      <w:r>
+        <w:t xml:space="preserve"> </w:t>
+      </w:r>
+      <w:r>
+        <w:t xml:space="preserve">Owned the full feature lifecycle for the CMS product — conducting regular on-site contextual inquiry at client organisations (Wyre Council, Rotherham Council, Greater Manchester Combined Authority, City of York Council, University of Leeds), distilling field research into reports that shaped the product roadmap, and iterating from mockups through usability testing to production release. Operated as one of three product-area leads (CMS, Forms, CRM), each independently responsible for their domain.</w:t>
+      </w:r>
+    </w:p>
+    <w:p>
+      <w:pPr>
+        <w:pStyle w:val="BodyText"/>
+      </w:pPr>
+      <w:r>
+        <w:rPr>
+          <w:b/>
+          <w:bCs/>
+        </w:rPr>
         <w:t xml:space="preserve">Projects</w:t>
       </w:r>
       <w:r>
-        <w:t xml:space="preserve">: Adidas, MARS, Gregg Wallace, Leeds Rhinos, Royal Canin</w:t>
-      </w:r>
-    </w:p>
-    <w:bookmarkEnd w:id="18"/>
-    <w:bookmarkStart w:id="19" w:name="senior-digital-developer"/>
-    <w:p>
-      <w:pPr>
-        <w:pStyle w:val="Heading3"/>
-      </w:pPr>
-      <w:r>
-        <w:t xml:space="preserve">Senior Digital Developer</w:t>
-      </w:r>
-    </w:p>
-    <w:p>
-      <w:pPr>
-        <w:pStyle w:val="FirstParagraph"/>
-      </w:pPr>
-      <w:r>
-        <w:rPr>
-          <w:b/>
-          <w:bCs/>
-        </w:rPr>
-        <w:t xml:space="preserve">Company</w:t>
-      </w:r>
-      <w:r>
-        <w:t xml:space="preserve">: Leeds Building Society (5th largest UK building society · £31B+ assets)</w:t>
-      </w:r>
-      <w:r>
-        <w:br/>
-      </w:r>
-      <w:r>
-        <w:rPr>
-          <w:b/>
-          <w:bCs/>
-        </w:rPr>
-        <w:t xml:space="preserve">Dates</w:t>
-      </w:r>
-      <w:r>
-        <w:t xml:space="preserve">: Oct 2018 - Jan 2020 (1 yr 4 mos)</w:t>
-      </w:r>
-      <w:r>
-        <w:br/>
-      </w:r>
-      <w:r>
-        <w:rPr>
-          <w:b/>
-          <w:bCs/>
-        </w:rPr>
-        <w:t xml:space="preserve">Location</w:t>
-      </w:r>
-      <w:r>
-        <w:t xml:space="preserve">: Leeds, England, United Kingdom · Hybrid</w:t>
-      </w:r>
-      <w:r>
-        <w:br/>
-      </w:r>
-      <w:r>
-        <w:rPr>
-          <w:b/>
-          <w:bCs/>
-        </w:rPr>
-        <w:t xml:space="preserve">Employment Type</w:t>
-      </w:r>
-      <w:r>
-        <w:t xml:space="preserve">: Full-time</w:t>
-      </w:r>
-    </w:p>
-    <w:p>
-      <w:pPr>
-        <w:pStyle w:val="BodyText"/>
-      </w:pPr>
-      <w:r>
-        <w:rPr>
-          <w:b/>
-          <w:bCs/>
-        </w:rPr>
-        <w:t xml:space="preserve">Description</w:t>
-      </w:r>
-      <w:r>
-        <w:t xml:space="preserve">: Maintained public-facing digital assets in a highly regulated FinTech environment while actively mentoring engineering teams to elevate code quality and UX standards.</w:t>
-      </w:r>
-    </w:p>
-    <w:p>
-      <w:pPr>
-        <w:pStyle w:val="BodyText"/>
-      </w:pPr>
-      <w:r>
-        <w:rPr>
-          <w:b/>
-          <w:bCs/>
-        </w:rPr>
-        <w:t xml:space="preserve">Agile First Mover:</w:t>
-      </w:r>
-      <w:r>
-        <w:t xml:space="preserve"> </w:t>
-      </w:r>
-      <w:r>
-        <w:t xml:space="preserve">Introduced Agile and Scrum to LBS for the first time, shifting a high-bureaucracy, low-velocity organisation from ad-hoc output to sprint-based iterative delivery with measurable velocity. Served as the unofficial internal Agile champion throughout my tenure.</w:t>
-      </w:r>
-    </w:p>
-    <w:p>
-      <w:pPr>
-        <w:pStyle w:val="BodyText"/>
-      </w:pPr>
-      <w:r>
-        <w:rPr>
-          <w:b/>
-          <w:bCs/>
-        </w:rPr>
-        <w:t xml:space="preserve">Digital Transformation (Interim Scrum Master, Jun–Oct 2019):</w:t>
-      </w:r>
-      <w:r>
-        <w:t xml:space="preserve"> </w:t>
-      </w:r>
-      <w:r>
-        <w:t xml:space="preserve">Appointed to lead the Digital Transformation programme alongside external consultants and cross-functional teams — moving from firefighting culture to structured, iterative feature development with regular delivery cadences.</w:t>
-      </w:r>
-    </w:p>
-    <w:bookmarkEnd w:id="19"/>
-    <w:bookmarkStart w:id="21" w:name="ux-interface-developer"/>
-    <w:p>
-      <w:pPr>
-        <w:pStyle w:val="Heading3"/>
-      </w:pPr>
-      <w:r>
-        <w:t xml:space="preserve">UX Interface Developer</w:t>
-      </w:r>
-    </w:p>
-    <w:p>
-      <w:pPr>
-        <w:pStyle w:val="FirstParagraph"/>
-      </w:pPr>
-      <w:r>
-        <w:rPr>
-          <w:b/>
-          <w:bCs/>
-        </w:rPr>
-        <w:t xml:space="preserve">Company</w:t>
-      </w:r>
-      <w:r>
-        <w:t xml:space="preserve">: Jadu</w:t>
-      </w:r>
-      <w:r>
-        <w:br/>
-      </w:r>
-      <w:r>
-        <w:rPr>
-          <w:b/>
-          <w:bCs/>
-        </w:rPr>
-        <w:t xml:space="preserve">Dates</w:t>
-      </w:r>
-      <w:r>
-        <w:t xml:space="preserve">: Jan 2017 - Oct 2018 (1 yr 10 mos)</w:t>
-      </w:r>
-      <w:r>
-        <w:br/>
-      </w:r>
-      <w:r>
-        <w:rPr>
-          <w:b/>
-          <w:bCs/>
-        </w:rPr>
-        <w:t xml:space="preserve">Location</w:t>
-      </w:r>
-      <w:r>
-        <w:t xml:space="preserve">: Leeds, England, United Kingdom · Hybrid</w:t>
-      </w:r>
-      <w:r>
-        <w:br/>
-      </w:r>
-      <w:r>
-        <w:rPr>
-          <w:b/>
-          <w:bCs/>
-        </w:rPr>
-        <w:t xml:space="preserve">Employment Type</w:t>
-      </w:r>
-      <w:r>
-        <w:t xml:space="preserve">: Full-time</w:t>
-      </w:r>
-    </w:p>
-    <w:p>
-      <w:pPr>
-        <w:pStyle w:val="BodyText"/>
-      </w:pPr>
-      <w:r>
-        <w:rPr>
-          <w:b/>
-          <w:bCs/>
-        </w:rPr>
-        <w:t xml:space="preserve">Description</w:t>
-      </w:r>
-      <w:r>
-        <w:t xml:space="preserve">: Designed UIs and developed new features with a strict focus on user experience, accessibility, and W3C standards for an award-winning custom CMS used by Local Authorities, Higher Education, and third-sector organisations.</w:t>
-      </w:r>
-    </w:p>
-    <w:p>
-      <w:pPr>
-        <w:pStyle w:val="BodyText"/>
-      </w:pPr>
-      <w:r>
-        <w:rPr>
-          <w:b/>
-          <w:bCs/>
-        </w:rPr>
-        <w:t xml:space="preserve">Design Systems</w:t>
-      </w:r>
-      <w:r>
-        <w:t xml:space="preserve">: Co-created and maintained</w:t>
-      </w:r>
-      <w:r>
-        <w:t xml:space="preserve"> </w:t>
-      </w:r>
-      <w:r>
-        <w:rPr>
-          <w:b/>
-          <w:bCs/>
-        </w:rPr>
-        <w:t xml:space="preserve">Pulsar</w:t>
-      </w:r>
-      <w:r>
-        <w:t xml:space="preserve"> </w:t>
-      </w:r>
-      <w:r>
-        <w:t xml:space="preserve">— an open-source UX and Interface Design System powering the Jadu Continuum Platform. This is the foundation of my Design Systems specialism, combining component architecture, accessibility, and cross-team enablement.</w:t>
-      </w:r>
-    </w:p>
-    <w:p>
-      <w:pPr>
-        <w:pStyle w:val="BodyText"/>
-      </w:pPr>
-      <w:r>
-        <w:rPr>
-          <w:b/>
-          <w:bCs/>
-        </w:rPr>
-        <w:t xml:space="preserve">Agile Delivery</w:t>
-      </w:r>
-      <w:r>
-        <w:t xml:space="preserve">: Gained foundational, hands-on Agile leadership experience through a rotating Scrum Master model, facilitating sprint planning, daily standups, and embedding the core principles of the Agile manifesto into the team’s workflow.</w:t>
-      </w:r>
-    </w:p>
-    <w:p>
-      <w:pPr>
-        <w:pStyle w:val="BodyText"/>
-      </w:pPr>
-      <w:r>
-        <w:rPr>
-          <w:b/>
-          <w:bCs/>
-        </w:rPr>
-        <w:t xml:space="preserve">UX Research &amp; End-to-End Feature Ownership:</w:t>
-      </w:r>
-      <w:r>
-        <w:t xml:space="preserve"> </w:t>
-      </w:r>
-      <w:r>
-        <w:t xml:space="preserve">Owned the full feature lifecycle for the CMS product — conducting regular on-site contextual inquiry at client organisations (Wyre Council, Rotherham Council, Greater Manchester Combined Authority, City of York Council, University of Leeds), distilling field research into reports that shaped the product roadmap, and iterating from mockups through usability testing to production release. Operated as one of three product-area leads (CMS, Forms, CRM), each independently responsible for their domain.</w:t>
-      </w:r>
-    </w:p>
-    <w:p>
-      <w:pPr>
-        <w:pStyle w:val="BodyText"/>
-      </w:pPr>
-      <w:r>
-        <w:rPr>
-          <w:b/>
-          <w:bCs/>
-        </w:rPr>
-        <w:t xml:space="preserve">Projects</w:t>
-      </w:r>
-      <w:r>
         <w:t xml:space="preserve">: Award-winning custom CMS for large-scale public sector institutions — Open source Interface Design System (</w:t>
       </w:r>
-      <w:hyperlink r:id="rId20">
+      <w:hyperlink r:id="rId18">
         <w:r>
           <w:rPr>
             <w:rStyle w:val="Hyperlink"/>
@@ -1632,8 +1678,8 @@
         <w:t xml:space="preserve">)</w:t>
       </w:r>
     </w:p>
-    <w:bookmarkEnd w:id="21"/>
-    <w:bookmarkStart w:id="22" w:name="digital-developer"/>
+    <w:bookmarkEnd w:id="19"/>
+    <w:bookmarkStart w:id="20" w:name="digital-developer"/>
     <w:p>
       <w:pPr>
         <w:pStyle w:val="Heading3"/>
@@ -1764,8 +1810,8 @@
         <w:t xml:space="preserve">: Silverstone, Bowcliffe Hall, St. Leonard’s Place, Woodside Square, Sixteen Real Estate</w:t>
       </w:r>
     </w:p>
-    <w:bookmarkEnd w:id="22"/>
-    <w:bookmarkStart w:id="23" w:name="front-end-developer"/>
+    <w:bookmarkEnd w:id="20"/>
+    <w:bookmarkStart w:id="21" w:name="front-end-developer"/>
     <w:p>
       <w:pPr>
         <w:pStyle w:val="Heading3"/>
@@ -1896,14 +1942,53 @@
         <w:t xml:space="preserve">: Vivienne Westwood, Kärcher, CACI, EQVVS, G-Type</w:t>
       </w:r>
     </w:p>
+    <w:bookmarkEnd w:id="21"/>
+    <w:bookmarkStart w:id="22" w:name="early-career-consulting"/>
+    <w:p>
+      <w:pPr>
+        <w:pStyle w:val="Heading3"/>
+      </w:pPr>
+      <w:r>
+        <w:t xml:space="preserve">Early Career &amp; Consulting</w:t>
+      </w:r>
+    </w:p>
+    <w:p>
+      <w:pPr>
+        <w:pStyle w:val="FirstParagraph"/>
+      </w:pPr>
+      <w:r>
+        <w:rPr>
+          <w:b/>
+          <w:bCs/>
+        </w:rPr>
+        <w:t xml:space="preserve">Dates</w:t>
+      </w:r>
+      <w:r>
+        <w:t xml:space="preserve">: Oct 2005 - Sep 2015 (10 years)</w:t>
+      </w:r>
+      <w:r>
+        <w:t xml:space="preserve"> </w:t>
+      </w:r>
+      <w:r>
+        <w:rPr>
+          <w:b/>
+          <w:bCs/>
+        </w:rPr>
+        <w:t xml:space="preserve">Description</w:t>
+      </w:r>
+      <w:r>
+        <w:t xml:space="preserve">: Various full-stack development, consultancy, and training roles building the foundation of my technical and leadership capabilities. Key experiences included developing CMS-based solutions for non-profits (UNESCO) and local businesses, architecting real estate platforms, engineering e-commerce splits payment systems, and delivering technical training (C Programming, Algorithms).</w:t>
+      </w:r>
+    </w:p>
+    <w:bookmarkEnd w:id="22"/>
     <w:bookmarkEnd w:id="23"/>
-    <w:bookmarkStart w:id="24" w:name="early-career-consulting"/>
-    <w:p>
-      <w:pPr>
-        <w:pStyle w:val="Heading3"/>
-      </w:pPr>
-      <w:r>
-        <w:t xml:space="preserve">Early Career &amp; Consulting</w:t>
+    <w:bookmarkStart w:id="24" w:name="education"/>
+    <w:p>
+      <w:pPr>
+        <w:pStyle w:val="Heading2"/>
+      </w:pPr>
+      <w:r>
+        <w:t xml:space="preserve">Education</w:t>
       </w:r>
     </w:p>
     <w:p>
@@ -1915,96 +2000,57 @@
           <w:b/>
           <w:bCs/>
         </w:rPr>
-        <w:t xml:space="preserve">Dates</w:t>
-      </w:r>
-      <w:r>
-        <w:t xml:space="preserve">: Oct 2005 - Sep 2015 (10 years)</w:t>
-      </w:r>
-      <w:r>
-        <w:t xml:space="preserve"> </w:t>
-      </w:r>
-      <w:r>
-        <w:rPr>
-          <w:b/>
-          <w:bCs/>
-        </w:rPr>
-        <w:t xml:space="preserve">Description</w:t>
-      </w:r>
-      <w:r>
-        <w:t xml:space="preserve">: Various full-stack development, consultancy, and training roles building the foundation of my technical and leadership capabilities. Key experiences included developing CMS-based solutions for non-profits (UNESCO) and local businesses, architecting real estate platforms, engineering e-commerce splits payment systems, and delivering technical training (C Programming, Algorithms).</w:t>
+        <w:t xml:space="preserve">Institution</w:t>
+      </w:r>
+      <w:r>
+        <w:t xml:space="preserve">: freeCodeCamp — Computer Software Engineering</w:t>
+      </w:r>
+    </w:p>
+    <w:p>
+      <w:pPr>
+        <w:pStyle w:val="BodyText"/>
+      </w:pPr>
+      <w:r>
+        <w:rPr>
+          <w:b/>
+          <w:bCs/>
+        </w:rPr>
+        <w:t xml:space="preserve">Institution</w:t>
+      </w:r>
+      <w:r>
+        <w:t xml:space="preserve">: IxDF - The Interaction Design Foundation — User Experience and Interaction Design (2017–2020)</w:t>
+      </w:r>
+    </w:p>
+    <w:p>
+      <w:pPr>
+        <w:pStyle w:val="BodyText"/>
+      </w:pPr>
+      <w:r>
+        <w:rPr>
+          <w:b/>
+          <w:bCs/>
+        </w:rPr>
+        <w:t xml:space="preserve">Institution</w:t>
+      </w:r>
+      <w:r>
+        <w:t xml:space="preserve">: International University of Greece - Serres Campus</w:t>
+      </w:r>
+      <w:r>
+        <w:br/>
+      </w:r>
+      <w:r>
+        <w:rPr>
+          <w:b/>
+          <w:bCs/>
+        </w:rPr>
+        <w:t xml:space="preserve">Degree</w:t>
+      </w:r>
+      <w:r>
+        <w:t xml:space="preserve">: BSc Informatics Engineering (attended 2007–2012; did not graduate due to the Greek financial crisis)</w:t>
       </w:r>
     </w:p>
     <w:bookmarkEnd w:id="24"/>
-    <w:bookmarkEnd w:id="25"/>
-    <w:bookmarkStart w:id="26" w:name="education"/>
-    <w:p>
-      <w:pPr>
-        <w:pStyle w:val="Heading2"/>
-      </w:pPr>
-      <w:r>
-        <w:t xml:space="preserve">Education</w:t>
-      </w:r>
-    </w:p>
-    <w:p>
-      <w:pPr>
-        <w:pStyle w:val="FirstParagraph"/>
-      </w:pPr>
-      <w:r>
-        <w:rPr>
-          <w:b/>
-          <w:bCs/>
-        </w:rPr>
-        <w:t xml:space="preserve">Institution</w:t>
-      </w:r>
-      <w:r>
-        <w:t xml:space="preserve">: freeCodeCamp — Computer Software Engineering</w:t>
-      </w:r>
-    </w:p>
-    <w:p>
-      <w:pPr>
-        <w:pStyle w:val="BodyText"/>
-      </w:pPr>
-      <w:r>
-        <w:rPr>
-          <w:b/>
-          <w:bCs/>
-        </w:rPr>
-        <w:t xml:space="preserve">Institution</w:t>
-      </w:r>
-      <w:r>
-        <w:t xml:space="preserve">: IxDF - The Interaction Design Foundation — User Experience and Interaction Design (2017–2020)</w:t>
-      </w:r>
-    </w:p>
-    <w:p>
-      <w:pPr>
-        <w:pStyle w:val="BodyText"/>
-      </w:pPr>
-      <w:r>
-        <w:rPr>
-          <w:b/>
-          <w:bCs/>
-        </w:rPr>
-        <w:t xml:space="preserve">Institution</w:t>
-      </w:r>
-      <w:r>
-        <w:t xml:space="preserve">: International University of Greece - Serres Campus</w:t>
-      </w:r>
-      <w:r>
-        <w:br/>
-      </w:r>
-      <w:r>
-        <w:rPr>
-          <w:b/>
-          <w:bCs/>
-        </w:rPr>
-        <w:t xml:space="preserve">Degree</w:t>
-      </w:r>
-      <w:r>
-        <w:t xml:space="preserve">: BSc Informatics Engineering (attended 2007–2012; did not graduate due to the Greek financial crisis)</w:t>
-      </w:r>
-    </w:p>
-    <w:bookmarkEnd w:id="26"/>
-    <w:bookmarkStart w:id="28" w:name="professional-credentials"/>
+    <w:bookmarkStart w:id="26" w:name="professional-credentials"/>
     <w:p>
       <w:pPr>
         <w:pStyle w:val="Heading2"/>
@@ -2113,7 +2159,7 @@
         </w:rPr>
         <w:t xml:space="preserve"> </w:t>
       </w:r>
-      <w:hyperlink r:id="rId27">
+      <w:hyperlink r:id="rId25">
         <w:r>
           <w:rPr>
             <w:rStyle w:val="Hyperlink"/>
@@ -2138,8 +2184,8 @@
         <w:t xml:space="preserve">page.</w:t>
       </w:r>
     </w:p>
-    <w:bookmarkEnd w:id="28"/>
-    <w:bookmarkStart w:id="29" w:name="community-leadership"/>
+    <w:bookmarkEnd w:id="26"/>
+    <w:bookmarkStart w:id="27" w:name="community-leadership"/>
     <w:p>
       <w:pPr>
         <w:pStyle w:val="Heading2"/>
@@ -2223,8 +2269,8 @@
         <w:t xml:space="preserve">: Revived an inactive GDG chapter; organised conferences, workshops, and technical meetups.</w:t>
       </w:r>
     </w:p>
-    <w:bookmarkEnd w:id="29"/>
-    <w:bookmarkEnd w:id="30"/>
+    <w:bookmarkEnd w:id="27"/>
+    <w:bookmarkEnd w:id="28"/>
     <w:sectPr>
       <w:footnotePr>
         <w:numRestart w:val="eachSect"/>

</xml_diff>

<commit_message>
feat: update CV job titles to include Scrum Master roles and refine transformation experience descriptions
</commit_message>
<xml_diff>
--- a/assets/Nikos_Vasileiadis_CV.docx
+++ b/assets/Nikos_Vasileiadis_CV.docx
@@ -10,7 +10,7 @@
         <w:t xml:space="preserve">CV — Nikos Vasileiadis | Software Engineering Leader | Leeds, UK</w:t>
       </w:r>
     </w:p>
-    <w:bookmarkStart w:id="28" w:name="nikos-vasileiadis"/>
+    <w:bookmarkStart w:id="26" w:name="nikos-vasileiadis"/>
     <w:p>
       <w:pPr>
         <w:pStyle w:val="Heading1"/>
@@ -396,7 +396,7 @@
       </w:r>
     </w:p>
     <w:bookmarkEnd w:id="13"/>
-    <w:bookmarkStart w:id="23" w:name="experience"/>
+    <w:bookmarkStart w:id="21" w:name="experience"/>
     <w:p>
       <w:pPr>
         <w:pStyle w:val="Heading2"/>
@@ -1395,13 +1395,13 @@
       </w:r>
     </w:p>
     <w:bookmarkEnd w:id="16"/>
-    <w:bookmarkStart w:id="17" w:name="senior-digital-developer"/>
+    <w:bookmarkStart w:id="17" w:name="senior-digital-developer-scrum-master"/>
     <w:p>
       <w:pPr>
         <w:pStyle w:val="Heading3"/>
       </w:pPr>
       <w:r>
-        <w:t xml:space="preserve">Senior Digital Developer</w:t>
+        <w:t xml:space="preserve">Senior Digital Developer &amp; Scrum Master</w:t>
       </w:r>
     </w:p>
     <w:p>
@@ -1500,23 +1500,23 @@
           <w:b/>
           <w:bCs/>
         </w:rPr>
-        <w:t xml:space="preserve">Digital Transformation (Interim Scrum Master, Jun–Oct 2019):</w:t>
-      </w:r>
-      <w:r>
-        <w:t xml:space="preserve"> </w:t>
-      </w:r>
-      <w:r>
-        <w:t xml:space="preserve">Appointed to lead the Digital Transformation programme alongside external consultants and cross-functional teams — moving from firefighting culture to structured, iterative feature development with regular delivery cadences.</w:t>
+        <w:t xml:space="preserve">Leadership in Crisis — Digital Transformation (Interim Scrum Master, Jun–Oct 2019):</w:t>
+      </w:r>
+      <w:r>
+        <w:t xml:space="preserve"> </w:t>
+      </w:r>
+      <w:r>
+        <w:t xml:space="preserve">Formally appointed to stabilise delivery and lead the Digital Transformation programme — working alongside external consultants and cross-functional teams to move a firefighting culture into structured, iterative feature development with regular delivery cadences.</w:t>
       </w:r>
     </w:p>
     <w:bookmarkEnd w:id="17"/>
-    <w:bookmarkStart w:id="19" w:name="ux-interface-developer"/>
+    <w:bookmarkStart w:id="19" w:name="ux-interface-developer-scrum-master"/>
     <w:p>
       <w:pPr>
         <w:pStyle w:val="Heading3"/>
       </w:pPr>
       <w:r>
-        <w:t xml:space="preserve">UX Interface Developer</w:t>
+        <w:t xml:space="preserve">UX Interface Developer &amp; Scrum Master</w:t>
       </w:r>
     </w:p>
     <w:p>
@@ -1679,13 +1679,13 @@
       </w:r>
     </w:p>
     <w:bookmarkEnd w:id="19"/>
-    <w:bookmarkStart w:id="20" w:name="digital-developer"/>
+    <w:bookmarkStart w:id="20" w:name="early-career-consulting"/>
     <w:p>
       <w:pPr>
         <w:pStyle w:val="Heading3"/>
       </w:pPr>
       <w:r>
-        <w:t xml:space="preserve">Digital Developer</w:t>
+        <w:t xml:space="preserve">Early Career &amp; Consulting</w:t>
       </w:r>
     </w:p>
     <w:p>
@@ -1697,10 +1697,79 @@
           <w:b/>
           <w:bCs/>
         </w:rPr>
-        <w:t xml:space="preserve">Company</w:t>
-      </w:r>
-      <w:r>
-        <w:t xml:space="preserve">: DS.Emotion</w:t>
+        <w:t xml:space="preserve">Dates</w:t>
+      </w:r>
+      <w:r>
+        <w:t xml:space="preserve">: Oct 2005 - Dec 2016 (11 years)</w:t>
+      </w:r>
+      <w:r>
+        <w:t xml:space="preserve"> </w:t>
+      </w:r>
+      <w:r>
+        <w:rPr>
+          <w:b/>
+          <w:bCs/>
+        </w:rPr>
+        <w:t xml:space="preserve">Description</w:t>
+      </w:r>
+      <w:r>
+        <w:t xml:space="preserve">: Full-stack development, consultancy, and training roles building the foundation of my technical capabilities. Key experiences included developing CMS-based solutions for non-profits (UNESCO) and local businesses, architecting real estate platforms, engineering e-commerce splits payment systems, and delivering technical training (C Programming, Algorithms). After relocating to the UK in 2015, delivered frontend engineering for Leeds-based agencies — building responsive e-commerce solutions for global fashion and retail brands and driving performance optimisation across client portfolios.</w:t>
+      </w:r>
+    </w:p>
+    <w:bookmarkEnd w:id="20"/>
+    <w:bookmarkEnd w:id="21"/>
+    <w:bookmarkStart w:id="22" w:name="education"/>
+    <w:p>
+      <w:pPr>
+        <w:pStyle w:val="Heading2"/>
+      </w:pPr>
+      <w:r>
+        <w:t xml:space="preserve">Education</w:t>
+      </w:r>
+    </w:p>
+    <w:p>
+      <w:pPr>
+        <w:pStyle w:val="FirstParagraph"/>
+      </w:pPr>
+      <w:r>
+        <w:rPr>
+          <w:b/>
+          <w:bCs/>
+        </w:rPr>
+        <w:t xml:space="preserve">Institution</w:t>
+      </w:r>
+      <w:r>
+        <w:t xml:space="preserve">: freeCodeCamp — Computer Software Engineering</w:t>
+      </w:r>
+    </w:p>
+    <w:p>
+      <w:pPr>
+        <w:pStyle w:val="BodyText"/>
+      </w:pPr>
+      <w:r>
+        <w:rPr>
+          <w:b/>
+          <w:bCs/>
+        </w:rPr>
+        <w:t xml:space="preserve">Institution</w:t>
+      </w:r>
+      <w:r>
+        <w:t xml:space="preserve">: IxDF - The Interaction Design Foundation — User Experience and Interaction Design (2017–2020)</w:t>
+      </w:r>
+    </w:p>
+    <w:p>
+      <w:pPr>
+        <w:pStyle w:val="BodyText"/>
+      </w:pPr>
+      <w:r>
+        <w:rPr>
+          <w:b/>
+          <w:bCs/>
+        </w:rPr>
+        <w:t xml:space="preserve">Institution</w:t>
+      </w:r>
+      <w:r>
+        <w:t xml:space="preserve">: International University of Greece - Serres Campus</w:t>
       </w:r>
       <w:r>
         <w:br/>
@@ -1710,347 +1779,14 @@
           <w:b/>
           <w:bCs/>
         </w:rPr>
-        <w:t xml:space="preserve">Dates</w:t>
-      </w:r>
-      <w:r>
-        <w:t xml:space="preserve">: Oct 2016 - Nov 2016 (2 months)</w:t>
-      </w:r>
-      <w:r>
-        <w:br/>
-      </w:r>
-      <w:r>
-        <w:rPr>
-          <w:b/>
-          <w:bCs/>
-        </w:rPr>
-        <w:t xml:space="preserve">Location</w:t>
-      </w:r>
-      <w:r>
-        <w:t xml:space="preserve">: Leeds, England, United Kingdom</w:t>
-      </w:r>
-      <w:r>
-        <w:br/>
-      </w:r>
-      <w:r>
-        <w:rPr>
-          <w:b/>
-          <w:bCs/>
-        </w:rPr>
-        <w:t xml:space="preserve">Employment Type</w:t>
-      </w:r>
-      <w:r>
-        <w:t xml:space="preserve">: Contract, On-site</w:t>
-      </w:r>
-    </w:p>
-    <w:p>
-      <w:pPr>
-        <w:pStyle w:val="BodyText"/>
-      </w:pPr>
-      <w:r>
-        <w:rPr>
-          <w:b/>
-          <w:bCs/>
-        </w:rPr>
-        <w:t xml:space="preserve">Description</w:t>
-      </w:r>
-      <w:r>
-        <w:t xml:space="preserve">: Delivered high-performance frontend solutions for premium real estate and automotive clients (e.g., Silverstone).</w:t>
-      </w:r>
-    </w:p>
-    <w:p>
-      <w:pPr>
-        <w:pStyle w:val="Compact"/>
-        <w:numPr>
-          <w:ilvl w:val="0"/>
-          <w:numId w:val="1004"/>
-        </w:numPr>
-      </w:pPr>
-      <w:r>
-        <w:rPr>
-          <w:b/>
-          <w:bCs/>
-        </w:rPr>
-        <w:t xml:space="preserve">Performance Optimization</w:t>
-      </w:r>
-      <w:r>
-        <w:t xml:space="preserve">: Spearheaded critical performance optimizations across a portfolio of existing projects, significantly improving load times and user engagement metrics.</w:t>
-      </w:r>
-    </w:p>
-    <w:p>
-      <w:pPr>
-        <w:pStyle w:val="Compact"/>
-        <w:numPr>
-          <w:ilvl w:val="0"/>
-          <w:numId w:val="1004"/>
-        </w:numPr>
-      </w:pPr>
-      <w:r>
-        <w:rPr>
-          <w:b/>
-          <w:bCs/>
-        </w:rPr>
-        <w:t xml:space="preserve">Workflow Modernization</w:t>
-      </w:r>
-      <w:r>
-        <w:t xml:space="preserve">: Championed the transition to modern deployment lifecycles and structured version control (Git), establishing more reliable and efficient engineering workflows for the agency.</w:t>
-      </w:r>
-    </w:p>
-    <w:p>
-      <w:pPr>
-        <w:pStyle w:val="FirstParagraph"/>
-      </w:pPr>
-      <w:r>
-        <w:rPr>
-          <w:b/>
-          <w:bCs/>
-        </w:rPr>
-        <w:t xml:space="preserve">Projects</w:t>
-      </w:r>
-      <w:r>
-        <w:t xml:space="preserve">: Silverstone, Bowcliffe Hall, St. Leonard’s Place, Woodside Square, Sixteen Real Estate</w:t>
-      </w:r>
-    </w:p>
-    <w:bookmarkEnd w:id="20"/>
-    <w:bookmarkStart w:id="21" w:name="front-end-developer"/>
-    <w:p>
-      <w:pPr>
-        <w:pStyle w:val="Heading3"/>
-      </w:pPr>
-      <w:r>
-        <w:t xml:space="preserve">Front-end Developer</w:t>
-      </w:r>
-    </w:p>
-    <w:p>
-      <w:pPr>
-        <w:pStyle w:val="FirstParagraph"/>
-      </w:pPr>
-      <w:r>
-        <w:rPr>
-          <w:b/>
-          <w:bCs/>
-        </w:rPr>
-        <w:t xml:space="preserve">Company</w:t>
-      </w:r>
-      <w:r>
-        <w:t xml:space="preserve">: Creode</w:t>
-      </w:r>
-      <w:r>
-        <w:br/>
-      </w:r>
-      <w:r>
-        <w:rPr>
-          <w:b/>
-          <w:bCs/>
-        </w:rPr>
-        <w:t xml:space="preserve">Dates</w:t>
-      </w:r>
-      <w:r>
-        <w:t xml:space="preserve">: Oct 2015 - Sep 2016 (1 year)</w:t>
-      </w:r>
-      <w:r>
-        <w:br/>
-      </w:r>
-      <w:r>
-        <w:rPr>
-          <w:b/>
-          <w:bCs/>
-        </w:rPr>
-        <w:t xml:space="preserve">Location</w:t>
-      </w:r>
-      <w:r>
-        <w:t xml:space="preserve">: Leeds, England, United Kingdom</w:t>
-      </w:r>
-      <w:r>
-        <w:t xml:space="preserve"> </w:t>
-      </w:r>
-      <w:r>
-        <w:rPr>
-          <w:b/>
-          <w:bCs/>
-        </w:rPr>
-        <w:t xml:space="preserve">Employment Type</w:t>
-      </w:r>
-      <w:r>
-        <w:t xml:space="preserve">: Full-time, On-site</w:t>
-      </w:r>
-    </w:p>
-    <w:p>
-      <w:pPr>
-        <w:pStyle w:val="BodyText"/>
-      </w:pPr>
-      <w:r>
-        <w:rPr>
-          <w:b/>
-          <w:bCs/>
-        </w:rPr>
-        <w:t xml:space="preserve">Description</w:t>
-      </w:r>
-      <w:r>
-        <w:t xml:space="preserve">: Engineered responsive e-commerce solutions for major retail brands (Vivienne Westwood, Kärcher).</w:t>
-      </w:r>
-    </w:p>
-    <w:p>
-      <w:pPr>
-        <w:pStyle w:val="Compact"/>
-        <w:numPr>
-          <w:ilvl w:val="0"/>
-          <w:numId w:val="1005"/>
-        </w:numPr>
-      </w:pPr>
-      <w:r>
-        <w:rPr>
-          <w:b/>
-          <w:bCs/>
-        </w:rPr>
-        <w:t xml:space="preserve">E-Commerce Delivery</w:t>
-      </w:r>
-      <w:r>
-        <w:t xml:space="preserve">: Collaborated cross-functionally to bring complex UI designs to life, ensuring seamless cross-browser compatibility and strict adherence to brand standards.</w:t>
-      </w:r>
-    </w:p>
-    <w:p>
-      <w:pPr>
-        <w:pStyle w:val="Compact"/>
-        <w:numPr>
-          <w:ilvl w:val="0"/>
-          <w:numId w:val="1005"/>
-        </w:numPr>
-      </w:pPr>
-      <w:r>
-        <w:rPr>
-          <w:b/>
-          <w:bCs/>
-        </w:rPr>
-        <w:t xml:space="preserve">Digital Marketing Support</w:t>
-      </w:r>
-      <w:r>
-        <w:t xml:space="preserve">: Developed robust architecture for high-conversion HTML email campaigns, directly supporting the agency’s retention and sales generation strategies.</w:t>
-      </w:r>
-    </w:p>
-    <w:p>
-      <w:pPr>
-        <w:pStyle w:val="FirstParagraph"/>
-      </w:pPr>
-      <w:r>
-        <w:rPr>
-          <w:b/>
-          <w:bCs/>
-        </w:rPr>
-        <w:t xml:space="preserve">Projects</w:t>
-      </w:r>
-      <w:r>
-        <w:t xml:space="preserve">: Vivienne Westwood, Kärcher, CACI, EQVVS, G-Type</w:t>
-      </w:r>
-    </w:p>
-    <w:bookmarkEnd w:id="21"/>
-    <w:bookmarkStart w:id="22" w:name="early-career-consulting"/>
-    <w:p>
-      <w:pPr>
-        <w:pStyle w:val="Heading3"/>
-      </w:pPr>
-      <w:r>
-        <w:t xml:space="preserve">Early Career &amp; Consulting</w:t>
-      </w:r>
-    </w:p>
-    <w:p>
-      <w:pPr>
-        <w:pStyle w:val="FirstParagraph"/>
-      </w:pPr>
-      <w:r>
-        <w:rPr>
-          <w:b/>
-          <w:bCs/>
-        </w:rPr>
-        <w:t xml:space="preserve">Dates</w:t>
-      </w:r>
-      <w:r>
-        <w:t xml:space="preserve">: Oct 2005 - Sep 2015 (10 years)</w:t>
-      </w:r>
-      <w:r>
-        <w:t xml:space="preserve"> </w:t>
-      </w:r>
-      <w:r>
-        <w:rPr>
-          <w:b/>
-          <w:bCs/>
-        </w:rPr>
-        <w:t xml:space="preserve">Description</w:t>
-      </w:r>
-      <w:r>
-        <w:t xml:space="preserve">: Various full-stack development, consultancy, and training roles building the foundation of my technical and leadership capabilities. Key experiences included developing CMS-based solutions for non-profits (UNESCO) and local businesses, architecting real estate platforms, engineering e-commerce splits payment systems, and delivering technical training (C Programming, Algorithms).</w:t>
+        <w:t xml:space="preserve">Degree</w:t>
+      </w:r>
+      <w:r>
+        <w:t xml:space="preserve">: BSc Informatics Engineering (attended 2007–2012; did not graduate due to the Greek financial crisis)</w:t>
       </w:r>
     </w:p>
     <w:bookmarkEnd w:id="22"/>
-    <w:bookmarkEnd w:id="23"/>
-    <w:bookmarkStart w:id="24" w:name="education"/>
-    <w:p>
-      <w:pPr>
-        <w:pStyle w:val="Heading2"/>
-      </w:pPr>
-      <w:r>
-        <w:t xml:space="preserve">Education</w:t>
-      </w:r>
-    </w:p>
-    <w:p>
-      <w:pPr>
-        <w:pStyle w:val="FirstParagraph"/>
-      </w:pPr>
-      <w:r>
-        <w:rPr>
-          <w:b/>
-          <w:bCs/>
-        </w:rPr>
-        <w:t xml:space="preserve">Institution</w:t>
-      </w:r>
-      <w:r>
-        <w:t xml:space="preserve">: freeCodeCamp — Computer Software Engineering</w:t>
-      </w:r>
-    </w:p>
-    <w:p>
-      <w:pPr>
-        <w:pStyle w:val="BodyText"/>
-      </w:pPr>
-      <w:r>
-        <w:rPr>
-          <w:b/>
-          <w:bCs/>
-        </w:rPr>
-        <w:t xml:space="preserve">Institution</w:t>
-      </w:r>
-      <w:r>
-        <w:t xml:space="preserve">: IxDF - The Interaction Design Foundation — User Experience and Interaction Design (2017–2020)</w:t>
-      </w:r>
-    </w:p>
-    <w:p>
-      <w:pPr>
-        <w:pStyle w:val="BodyText"/>
-      </w:pPr>
-      <w:r>
-        <w:rPr>
-          <w:b/>
-          <w:bCs/>
-        </w:rPr>
-        <w:t xml:space="preserve">Institution</w:t>
-      </w:r>
-      <w:r>
-        <w:t xml:space="preserve">: International University of Greece - Serres Campus</w:t>
-      </w:r>
-      <w:r>
-        <w:br/>
-      </w:r>
-      <w:r>
-        <w:rPr>
-          <w:b/>
-          <w:bCs/>
-        </w:rPr>
-        <w:t xml:space="preserve">Degree</w:t>
-      </w:r>
-      <w:r>
-        <w:t xml:space="preserve">: BSc Informatics Engineering (attended 2007–2012; did not graduate due to the Greek financial crisis)</w:t>
-      </w:r>
-    </w:p>
-    <w:bookmarkEnd w:id="24"/>
-    <w:bookmarkStart w:id="26" w:name="professional-credentials"/>
+    <w:bookmarkStart w:id="24" w:name="professional-credentials"/>
     <w:p>
       <w:pPr>
         <w:pStyle w:val="Heading2"/>
@@ -2159,7 +1895,7 @@
         </w:rPr>
         <w:t xml:space="preserve"> </w:t>
       </w:r>
-      <w:hyperlink r:id="rId25">
+      <w:hyperlink r:id="rId23">
         <w:r>
           <w:rPr>
             <w:rStyle w:val="Hyperlink"/>
@@ -2184,8 +1920,8 @@
         <w:t xml:space="preserve">page.</w:t>
       </w:r>
     </w:p>
-    <w:bookmarkEnd w:id="26"/>
-    <w:bookmarkStart w:id="27" w:name="community-leadership"/>
+    <w:bookmarkEnd w:id="24"/>
+    <w:bookmarkStart w:id="25" w:name="community-leadership"/>
     <w:p>
       <w:pPr>
         <w:pStyle w:val="Heading2"/>
@@ -2269,8 +2005,8 @@
         <w:t xml:space="preserve">: Revived an inactive GDG chapter; organised conferences, workshops, and technical meetups.</w:t>
       </w:r>
     </w:p>
-    <w:bookmarkEnd w:id="27"/>
-    <w:bookmarkEnd w:id="28"/>
+    <w:bookmarkEnd w:id="25"/>
+    <w:bookmarkEnd w:id="26"/>
     <w:sectPr>
       <w:footnotePr>
         <w:numRestart w:val="eachSect"/>
@@ -2494,12 +2230,6 @@
     <w:abstractNumId w:val="991"/>
   </w:num>
   <w:num w:numId="1003">
-    <w:abstractNumId w:val="991"/>
-  </w:num>
-  <w:num w:numId="1004">
-    <w:abstractNumId w:val="991"/>
-  </w:num>
-  <w:num w:numId="1005">
     <w:abstractNumId w:val="991"/>
   </w:num>
 </w:numbering>

</xml_diff>

<commit_message>
update CV documents with latest professional experience
</commit_message>
<xml_diff>
--- a/assets/Nikos_Vasileiadis_CV.docx
+++ b/assets/Nikos_Vasileiadis_CV.docx
@@ -113,7 +113,7 @@
         <w:rPr>
           <w:rStyle w:val="VerbatimChar"/>
         </w:rPr>
-        <w:t xml:space="preserve">  &lt;svg xmlns="http://www.w3.org/2000/svg" width="16" height="16" viewBox="0 0 24 24" fill="none" stroke="currentColor" stroke-width="2" stroke-linecap="round" stroke-linejoin="round"&gt;&lt;path d="M21 15v4a2 2 0 0 1-2 2H5a2 2 0 0 1-2-2v-4"/&gt;&lt;polyline points="7 10 12 15 17 10"/&gt;&lt;line x1="12" y1="15" x2="12" y2="3"/&gt;&lt;/svg&gt;</w:t>
+        <w:t xml:space="preserve">  &lt;svg aria-hidden="true" focusable="false" xmlns="http://www.w3.org/2000/svg" width="16" height="16" viewBox="0 0 24 24" fill="none" stroke="currentColor" stroke-width="2" stroke-linecap="round" stroke-linejoin="round"&gt;&lt;path d="M21 15v4a2 2 0 0 1-2 2H5a2 2 0 0 1-2-2v-4"/&gt;&lt;polyline points="7 10 12 15 17 10"/&gt;&lt;line x1="12" y1="15" x2="12" y2="3"/&gt;&lt;/svg&gt;</w:t>
       </w:r>
       <w:r>
         <w:br/>
@@ -149,7 +149,7 @@
         <w:rPr>
           <w:rStyle w:val="VerbatimChar"/>
         </w:rPr>
-        <w:t xml:space="preserve">  &lt;svg xmlns="http://www.w3.org/2000/svg" width="16" height="16" viewBox="0 0 24 24" fill="none" stroke="currentColor" stroke-width="2" stroke-linecap="round" stroke-linejoin="round"&gt;&lt;path d="M21 15v4a2 2 0 0 1-2 2H5a2 2 0 0 1-2-2v-4"/&gt;&lt;polyline points="7 10 12 15 17 10"/&gt;&lt;line x1="12" y1="15" x2="12" y2="3"/&gt;&lt;/svg&gt;</w:t>
+        <w:t xml:space="preserve">  &lt;svg aria-hidden="true" focusable="false" xmlns="http://www.w3.org/2000/svg" width="16" height="16" viewBox="0 0 24 24" fill="none" stroke="currentColor" stroke-width="2" stroke-linecap="round" stroke-linejoin="round"&gt;&lt;path d="M21 15v4a2 2 0 0 1-2 2H5a2 2 0 0 1-2-2v-4"/&gt;&lt;polyline points="7 10 12 15 17 10"/&gt;&lt;line x1="12" y1="15" x2="12" y2="3"/&gt;&lt;/svg&gt;</w:t>
       </w:r>
       <w:r>
         <w:br/>
@@ -319,7 +319,7 @@
         <w:pStyle w:val="FirstParagraph"/>
       </w:pPr>
       <w:r>
-        <w:t xml:space="preserve">After</w:t>
+        <w:t xml:space="preserve">Software Engineering Leader with</w:t>
       </w:r>
       <w:r>
         <w:t xml:space="preserve"> </w:t>
@@ -331,7 +331,7 @@
         <w:t xml:space="preserve"> </w:t>
       </w:r>
       <w:r>
-        <w:t xml:space="preserve">building a career from web developer in Greece to engineering leader in the UK — and</w:t>
+        <w:t xml:space="preserve">in technology and</w:t>
       </w:r>
       <w:r>
         <w:t xml:space="preserve"> </w:t>
@@ -343,56 +343,7 @@
         <w:t xml:space="preserve"> </w:t>
       </w:r>
       <w:r>
-        <w:t xml:space="preserve">of progressive leadership — I’ve learned that my real strength is people: building teams, developing talent, creating clarity, and designing the organisational conditions where engineers do their best work.</w:t>
-      </w:r>
-    </w:p>
-    <w:p>
-      <w:pPr>
-        <w:pStyle w:val="BodyText"/>
-      </w:pPr>
-      <w:r>
-        <w:t xml:space="preserve">My leadership arc has grown continuously since 2017: from Scrum Master rotations at Jadu and Leeds Building Society, to bootstrapping and leading the Content Capability team at Utility Warehouse, to managing multiple teams (</w:t>
-      </w:r>
-      <w:r>
-        <w:t xml:space="preserve">8 engineers</w:t>
-      </w:r>
-      <w:r>
-        <w:t xml:space="preserve"> </w:t>
-      </w:r>
-      <w:r>
-        <w:t xml:space="preserve">at peak) across Content Capability and Design Systems. Through three restructurings, I now lead a specialist</w:t>
-      </w:r>
-      <w:r>
-        <w:t xml:space="preserve"> </w:t>
-      </w:r>
-      <w:r>
-        <w:t xml:space="preserve">3-person</w:t>
-      </w:r>
-      <w:r>
-        <w:t xml:space="preserve"> </w:t>
-      </w:r>
-      <w:r>
-        <w:t xml:space="preserve">team covering</w:t>
-      </w:r>
-      <w:r>
-        <w:t xml:space="preserve"> </w:t>
-      </w:r>
-      <w:r>
-        <w:t xml:space="preserve">six critical platform services</w:t>
-      </w:r>
-      <w:r>
-        <w:t xml:space="preserve"> </w:t>
-      </w:r>
-      <w:r>
-        <w:t xml:space="preserve">across the uw.co.uk estate — having built the same team from scratch twice.</w:t>
-      </w:r>
-    </w:p>
-    <w:p>
-      <w:pPr>
-        <w:pStyle w:val="BodyText"/>
-      </w:pPr>
-      <w:r>
-        <w:t xml:space="preserve">I treat engineering as a business lever — contributing to CapEx/OpEx planning, evaluating vendor ROI, and ensuring technical investments map directly to business outcomes. My technical depth — frontend, full-stack, CMS architecture, platform engineering — gives me credibility with engineers; my focus on people, process, and organisational design is where I create the most value.</w:t>
+        <w:t xml:space="preserve">of progressive leadership experience. Proven track record of building and retaining high-performing remote teams, navigating organisational design through complex restructurings, and architecting critical platform services. I treat engineering as a business lever—contributing to CapEx/OpEx planning and ensuring technical investments map directly to business outcomes. While my technical depth across frontend and platform architecture establishes credibility, my true strength lies in designing the conditions where engineers do their best work.</w:t>
       </w:r>
     </w:p>
     <w:bookmarkEnd w:id="13"/>
@@ -493,7 +444,7 @@
           <w:b/>
           <w:bCs/>
         </w:rPr>
-        <w:t xml:space="preserve">Team Leadership, Retention &amp; Developing Talent:</w:t>
+        <w:t xml:space="preserve">Team Leadership &amp; Retention:</w:t>
       </w:r>
       <w:r>
         <w:t xml:space="preserve"> </w:t>
@@ -523,28 +474,7 @@
         <w:t xml:space="preserve"> </w:t>
       </w:r>
       <w:r>
-        <w:t xml:space="preserve">— maintained through three company restructurings that progressively reduced headcount to a specialist core of</w:t>
-      </w:r>
-      <w:r>
-        <w:t xml:space="preserve"> </w:t>
-      </w:r>
-      <w:r>
-        <w:t xml:space="preserve">2 engineers</w:t>
-      </w:r>
-      <w:r>
-        <w:t xml:space="preserve">, including a pillar move from Customer Experience to Partner. Every reduction was organisational; zero attrition. Drove</w:t>
-      </w:r>
-      <w:r>
-        <w:t xml:space="preserve"> </w:t>
-      </w:r>
-      <w:r>
-        <w:t xml:space="preserve">3 promotions</w:t>
-      </w:r>
-      <w:r>
-        <w:t xml:space="preserve"> </w:t>
-      </w:r>
-      <w:r>
-        <w:t xml:space="preserve">through evidence-based cases — from Associate to Mid-level and Mid-level to Senior — advocating for talent recognition across organisational boundaries. Mentored engineers who subsequently moved into Engineering Manager roles — both within UW and externally — developing leadership capability one level above my formal remit.</w:t>
+        <w:t xml:space="preserve">— maintained through three company restructurings that progressively reduced headcount to a specialist core. Every reduction was organisational; zero attrition.</w:t>
       </w:r>
     </w:p>
     <w:p>
@@ -560,13 +490,25 @@
           <w:b/>
           <w:bCs/>
         </w:rPr>
-        <w:t xml:space="preserve">Org Design &amp; Structural Influence:</w:t>
-      </w:r>
-      <w:r>
-        <w:t xml:space="preserve"> </w:t>
-      </w:r>
-      <w:r>
-        <w:t xml:space="preserve">During restructurings, took on unguided responsibility for scoping and executing team migrations — including the Content Capability team’s moves between pillars (Marketing Capability → Content Capability → CMS Team, spanning Platforms, Customer Experience, and Partner pillars) — by independently mapping scope, chasing stakeholder alignment, and building consensus from scratch. Challenged and reversed structural decisions that would have eliminated the Design Systems team, demonstrating strategic influence well above the Engineering Manager remit.</w:t>
+        <w:t xml:space="preserve">Talent Development:</w:t>
+      </w:r>
+      <w:r>
+        <w:t xml:space="preserve"> </w:t>
+      </w:r>
+      <w:r>
+        <w:t xml:space="preserve">Drove</w:t>
+      </w:r>
+      <w:r>
+        <w:t xml:space="preserve"> </w:t>
+      </w:r>
+      <w:r>
+        <w:t xml:space="preserve">3 promotions</w:t>
+      </w:r>
+      <w:r>
+        <w:t xml:space="preserve"> </w:t>
+      </w:r>
+      <w:r>
+        <w:t xml:space="preserve">through evidence-based cases (Associate to Mid-level, Mid-level to Senior), advocating for talent recognition across organisational boundaries. Mentored engineers who subsequently moved into Engineering Manager roles both internally and externally.</w:t>
       </w:r>
     </w:p>
     <w:p>
@@ -582,31 +524,13 @@
           <w:b/>
           <w:bCs/>
         </w:rPr>
-        <w:t xml:space="preserve">Documentation &amp; Knowledge Culture:</w:t>
-      </w:r>
-      <w:r>
-        <w:t xml:space="preserve"> </w:t>
-      </w:r>
-      <w:r>
-        <w:t xml:space="preserve">Authored over</w:t>
-      </w:r>
-      <w:r>
-        <w:t xml:space="preserve"> </w:t>
-      </w:r>
-      <w:r>
-        <w:t xml:space="preserve">100 articles</w:t>
-      </w:r>
-      <w:r>
-        <w:t xml:space="preserve"> </w:t>
-      </w:r>
-      <w:r>
-        <w:t xml:space="preserve">of technical documentation — from process guides to architecture decisions — making the team the most thoroughly documented at UW. Started from zero: inherited an undocumented legacy CMS and conducted systematic discovery (</w:t>
-      </w:r>
-      <w:r>
-        <w:t xml:space="preserve">“Archeology”</w:t>
-      </w:r>
-      <w:r>
-        <w:t xml:space="preserve">) to map what existed before building the documentation culture from scratch.</w:t>
+        <w:t xml:space="preserve">Org Design &amp; Navigation:</w:t>
+      </w:r>
+      <w:r>
+        <w:t xml:space="preserve"> </w:t>
+      </w:r>
+      <w:r>
+        <w:t xml:space="preserve">During restructurings, took on unguided responsibility for scoping and executing team migrations — including the Content Capability team’s moves between pillars — by independently mapping scope, chasing stakeholder alignment, and building consensus from scratch.</w:t>
       </w:r>
     </w:p>
     <w:p>
@@ -622,13 +546,13 @@
           <w:b/>
           <w:bCs/>
         </w:rPr>
-        <w:t xml:space="preserve">Technical Enablement &amp; Upskilling:</w:t>
-      </w:r>
-      <w:r>
-        <w:t xml:space="preserve"> </w:t>
-      </w:r>
-      <w:r>
-        <w:t xml:space="preserve">Identified capability gaps (e.g. Kubernetes) and closed them through self-directed learning, then trained the team and documented the knowledge for future engineers. Pushed team members to take ownership of RFCs, technical presentations, and cross-team knowledge-sharing — developing engineers who could operate independently across the full platform stack.</w:t>
+        <w:t xml:space="preserve">Strategic Influence:</w:t>
+      </w:r>
+      <w:r>
+        <w:t xml:space="preserve"> </w:t>
+      </w:r>
+      <w:r>
+        <w:t xml:space="preserve">Challenged and reversed structural decisions that would have eliminated the Design Systems team, preserving the critical capability that enabled the 2025 company-wide rebrand.</w:t>
       </w:r>
     </w:p>
     <w:p>
@@ -644,37 +568,31 @@
           <w:b/>
           <w:bCs/>
         </w:rPr>
-        <w:t xml:space="preserve">Hiring &amp; Talent Acquisition:</w:t>
-      </w:r>
-      <w:r>
-        <w:t xml:space="preserve"> </w:t>
-      </w:r>
-      <w:r>
-        <w:t xml:space="preserve">Involved in the end-to-end hiring of</w:t>
-      </w:r>
-      <w:r>
-        <w:t xml:space="preserve"> </w:t>
-      </w:r>
-      <w:r>
-        <w:t xml:space="preserve">3</w:t>
-      </w:r>
-      <w:r>
-        <w:t xml:space="preserve"> </w:t>
-      </w:r>
-      <w:r>
-        <w:t xml:space="preserve">external engineers and facilitated</w:t>
-      </w:r>
-      <w:r>
-        <w:t xml:space="preserve"> </w:t>
-      </w:r>
-      <w:r>
-        <w:t xml:space="preserve">4</w:t>
-      </w:r>
-      <w:r>
-        <w:t xml:space="preserve"> </w:t>
-      </w:r>
-      <w:r>
-        <w:t xml:space="preserve">internal transfers, contributing to recruitment decisions, candidate assessment, and onboarding.</w:t>
+        <w:t xml:space="preserve">Documentation &amp; Knowledge Culture:</w:t>
+      </w:r>
+      <w:r>
+        <w:t xml:space="preserve"> </w:t>
+      </w:r>
+      <w:r>
+        <w:t xml:space="preserve">Authored over</w:t>
+      </w:r>
+      <w:r>
+        <w:t xml:space="preserve"> </w:t>
+      </w:r>
+      <w:r>
+        <w:t xml:space="preserve">100 articles</w:t>
+      </w:r>
+      <w:r>
+        <w:t xml:space="preserve"> </w:t>
+      </w:r>
+      <w:r>
+        <w:t xml:space="preserve">of technical documentation — from process guides to architecture decisions — making the team the most thoroughly documented at UW. Started from zero: inherited an undocumented legacy CMS and conducted systematic discovery (</w:t>
+      </w:r>
+      <w:r>
+        <w:t xml:space="preserve">“Archeology”</w:t>
+      </w:r>
+      <w:r>
+        <w:t xml:space="preserve">) to map what existed before building the documentation culture from scratch.</w:t>
       </w:r>
     </w:p>
     <w:p>
@@ -690,13 +608,13 @@
           <w:b/>
           <w:bCs/>
         </w:rPr>
-        <w:t xml:space="preserve">Continuous Leadership Development:</w:t>
-      </w:r>
-      <w:r>
-        <w:t xml:space="preserve"> </w:t>
-      </w:r>
-      <w:r>
-        <w:t xml:space="preserve">Completed extensive formal management training covering executive-level competencies, including Performance Accountability, Goal Setting for Leaders, Driving Team Results, and Managing Underperformance &amp; Conduct.</w:t>
+        <w:t xml:space="preserve">Technical Enablement &amp; Upskilling:</w:t>
+      </w:r>
+      <w:r>
+        <w:t xml:space="preserve"> </w:t>
+      </w:r>
+      <w:r>
+        <w:t xml:space="preserve">Identified capability gaps (e.g. Kubernetes) and closed them through self-directed learning, then trained the team and documented the knowledge for future engineers. Pushed team members to take ownership of RFCs, technical presentations, and cross-team knowledge-sharing — developing engineers who could operate independently across the full platform stack.</w:t>
       </w:r>
     </w:p>
     <w:p>
@@ -712,41 +630,37 @@
           <w:b/>
           <w:bCs/>
         </w:rPr>
-        <w:t xml:space="preserve">Rebranding Programme (Oct 2025 – Apr 2026;</w:t>
-      </w:r>
-      <w:r>
-        <w:rPr>
-          <w:b/>
-          <w:bCs/>
-        </w:rPr>
-        <w:t xml:space="preserve"> </w:t>
-      </w:r>
-      <w:r>
-        <w:rPr>
-          <w:b/>
-          <w:bCs/>
-        </w:rPr>
-        <w:t xml:space="preserve">522 pages</w:t>
-      </w:r>
-      <w:r>
-        <w:rPr>
-          <w:b/>
-          <w:bCs/>
-        </w:rPr>
-        <w:t xml:space="preserve"> </w:t>
-      </w:r>
-      <w:r>
-        <w:rPr>
-          <w:b/>
-          <w:bCs/>
-        </w:rPr>
-        <w:t xml:space="preserve">shipped):</w:t>
-      </w:r>
-      <w:r>
-        <w:t xml:space="preserve"> </w:t>
-      </w:r>
-      <w:r>
-        <w:t xml:space="preserve">Delivered UW’s company-wide brand refresh across the full uw.co.uk estate — the primary digital entry point for customers, partners, and the subscriber account system, and the platform where all A/B tests and business tracking metrics run. Our delivery was the critical path: no other team’s rebranding work could go live until the main website shipped. Authored automated migration scripts that saved content editors hundreds of manual hours.</w:t>
+        <w:t xml:space="preserve">Hiring &amp; Talent Acquisition:</w:t>
+      </w:r>
+      <w:r>
+        <w:t xml:space="preserve"> </w:t>
+      </w:r>
+      <w:r>
+        <w:t xml:space="preserve">Involved in the end-to-end hiring of</w:t>
+      </w:r>
+      <w:r>
+        <w:t xml:space="preserve"> </w:t>
+      </w:r>
+      <w:r>
+        <w:t xml:space="preserve">3</w:t>
+      </w:r>
+      <w:r>
+        <w:t xml:space="preserve"> </w:t>
+      </w:r>
+      <w:r>
+        <w:t xml:space="preserve">external engineers and facilitated</w:t>
+      </w:r>
+      <w:r>
+        <w:t xml:space="preserve"> </w:t>
+      </w:r>
+      <w:r>
+        <w:t xml:space="preserve">4</w:t>
+      </w:r>
+      <w:r>
+        <w:t xml:space="preserve"> </w:t>
+      </w:r>
+      <w:r>
+        <w:t xml:space="preserve">internal transfers, contributing to recruitment decisions, candidate assessment, and onboarding.</w:t>
       </w:r>
     </w:p>
     <w:p>
@@ -762,130 +676,13 @@
           <w:b/>
           <w:bCs/>
         </w:rPr>
-        <w:t xml:space="preserve">Platform Reliability &amp; Analytics Ownership:</w:t>
-      </w:r>
-      <w:r>
-        <w:t xml:space="preserve"> </w:t>
-      </w:r>
-      <w:r>
-        <w:t xml:space="preserve">Maintained</w:t>
-      </w:r>
-      <w:r>
-        <w:t xml:space="preserve"> </w:t>
-      </w:r>
-      <w:r>
-        <w:t xml:space="preserve">100% uptime</w:t>
-      </w:r>
-      <w:r>
-        <w:t xml:space="preserve"> </w:t>
-      </w:r>
-      <w:r>
-        <w:t xml:space="preserve">on uw.co.uk (SLO: 99.99%) with</w:t>
-      </w:r>
-      <w:r>
-        <w:t xml:space="preserve"> </w:t>
-      </w:r>
-      <w:r>
-        <w:t xml:space="preserve">&lt;3s</w:t>
-      </w:r>
-      <w:r>
-        <w:t xml:space="preserve"> </w:t>
-      </w:r>
-      <w:r>
-        <w:t xml:space="preserve">page load times on critical-path pages and</w:t>
-      </w:r>
-      <w:r>
-        <w:t xml:space="preserve"> </w:t>
-      </w:r>
-      <w:r>
-        <w:t xml:space="preserve">1 incident</w:t>
-      </w:r>
-      <w:r>
-        <w:t xml:space="preserve"> </w:t>
-      </w:r>
-      <w:r>
-        <w:t xml:space="preserve">in the current year, resolved within hours. Managing a digital estate of</w:t>
-      </w:r>
-      <w:r>
-        <w:t xml:space="preserve"> </w:t>
-      </w:r>
-      <w:r>
-        <w:t xml:space="preserve">522 pages</w:t>
-      </w:r>
-      <w:r>
-        <w:t xml:space="preserve">,</w:t>
-      </w:r>
-      <w:r>
-        <w:t xml:space="preserve"> </w:t>
-      </w:r>
-      <w:r>
-        <w:t xml:space="preserve">3,157 media assets</w:t>
-      </w:r>
-      <w:r>
-        <w:t xml:space="preserve">,</w:t>
-      </w:r>
-      <w:r>
-        <w:t xml:space="preserve"> </w:t>
-      </w:r>
-      <w:r>
-        <w:t xml:space="preserve">1,090 shortlinks</w:t>
-      </w:r>
-      <w:r>
-        <w:t xml:space="preserve">, and</w:t>
-      </w:r>
-      <w:r>
-        <w:t xml:space="preserve"> </w:t>
-      </w:r>
-      <w:r>
-        <w:t xml:space="preserve">218 redirects</w:t>
-      </w:r>
-      <w:r>
-        <w:t xml:space="preserve">. Supported</w:t>
-      </w:r>
-      <w:r>
-        <w:t xml:space="preserve"> </w:t>
-      </w:r>
-      <w:r>
-        <w:t xml:space="preserve">8</w:t>
-      </w:r>
-      <w:r>
-        <w:t xml:space="preserve"> </w:t>
-      </w:r>
-      <w:r>
-        <w:t xml:space="preserve">content teams (</w:t>
-      </w:r>
-      <w:r>
-        <w:t xml:space="preserve">33</w:t>
-      </w:r>
-      <w:r>
-        <w:t xml:space="preserve"> </w:t>
-      </w:r>
-      <w:r>
-        <w:t xml:space="preserve">direct users) across Customer Marketing, Digital Marketing, Partner Marketing, Acquisition, Data Science, Partner Training, Recruitment, and PR — plus</w:t>
-      </w:r>
-      <w:r>
-        <w:t xml:space="preserve"> </w:t>
-      </w:r>
-      <w:r>
-        <w:t xml:space="preserve">15+</w:t>
-      </w:r>
-      <w:r>
-        <w:t xml:space="preserve"> </w:t>
-      </w:r>
-      <w:r>
-        <w:t xml:space="preserve">engineering teams as platform dependencies. Owns the full platform analytics and compliance stack: Contentful CMS, Google Tag Manager, Snowplow, Mixpanel, Optimizely, and OneTrust —</w:t>
-      </w:r>
-      <w:r>
-        <w:t xml:space="preserve"> </w:t>
-      </w:r>
-      <w:r>
-        <w:t xml:space="preserve">six platform services</w:t>
-      </w:r>
-      <w:r>
-        <w:t xml:space="preserve"> </w:t>
-      </w:r>
-      <w:r>
-        <w:t xml:space="preserve">monitored via Kubernetes, Sentry, Prometheus, Pingdom, and Cloudflare.</w:t>
+        <w:t xml:space="preserve">Continuous Leadership Development:</w:t>
+      </w:r>
+      <w:r>
+        <w:t xml:space="preserve"> </w:t>
+      </w:r>
+      <w:r>
+        <w:t xml:space="preserve">Completed extensive formal management training covering executive-level competencies, including Performance Accountability, Goal Setting for Leaders, Driving Team Results, and Managing Underperformance &amp; Conduct.</w:t>
       </w:r>
     </w:p>
     <w:p>
@@ -901,46 +698,41 @@
           <w:b/>
           <w:bCs/>
         </w:rPr>
-        <w:t xml:space="preserve">Design Systems (Hearth) —</w:t>
-      </w:r>
-      <w:r>
-        <w:rPr>
-          <w:b/>
-          <w:bCs/>
-        </w:rPr>
-        <w:t xml:space="preserve"> </w:t>
-      </w:r>
-      <w:r>
-        <w:rPr>
-          <w:b/>
-          <w:bCs/>
-        </w:rPr>
-        <w:t xml:space="preserve">20 teams</w:t>
-      </w:r>
-      <w:r>
-        <w:rPr>
-          <w:b/>
-          <w:bCs/>
-        </w:rPr>
-        <w:t xml:space="preserve">, company-wide adoption:</w:t>
-      </w:r>
-      <w:r>
-        <w:t xml:space="preserve"> </w:t>
-      </w:r>
-      <w:r>
-        <w:t xml:space="preserve">Led adoption of the Hearth Design System across</w:t>
-      </w:r>
-      <w:r>
-        <w:t xml:space="preserve"> </w:t>
-      </w:r>
-      <w:r>
-        <w:t xml:space="preserve">20</w:t>
-      </w:r>
-      <w:r>
-        <w:t xml:space="preserve"> </w:t>
-      </w:r>
-      <w:r>
-        <w:t xml:space="preserve">engineering and product teams (15 full adoption, 5 partial). Consolidating component work at the Design System level eliminated thousands of hours of duplicated engineering effort — at £35+/hour, savings at rebrand scale reached into the hundreds of thousands. Contributed to the company’s R&amp;D tax credit claims by translating technical Design Systems work into audit-ready documentation for external advisors.</w:t>
+        <w:t xml:space="preserve">Rebranding Programme (Oct 2025 – Apr 2026;</w:t>
+      </w:r>
+      <w:r>
+        <w:rPr>
+          <w:b/>
+          <w:bCs/>
+        </w:rPr>
+        <w:t xml:space="preserve"> </w:t>
+      </w:r>
+      <w:r>
+        <w:rPr>
+          <w:b/>
+          <w:bCs/>
+        </w:rPr>
+        <w:t xml:space="preserve">522 pages</w:t>
+      </w:r>
+      <w:r>
+        <w:rPr>
+          <w:b/>
+          <w:bCs/>
+        </w:rPr>
+        <w:t xml:space="preserve"> </w:t>
+      </w:r>
+      <w:r>
+        <w:rPr>
+          <w:b/>
+          <w:bCs/>
+        </w:rPr>
+        <w:t xml:space="preserve">shipped):</w:t>
+      </w:r>
+      <w:r>
+        <w:t xml:space="preserve"> </w:t>
+      </w:r>
+      <w:r>
+        <w:t xml:space="preserve">Delivered UW’s company-wide brand refresh across the full uw.co.uk estate — the primary digital entry point for customers, partners, and the subscriber account system, and the platform where all A/B tests and business tracking metrics run. Our delivery was the critical path: no other team’s rebranding work could go live until the main website shipped. Authored automated migration scripts that saved content editors hundreds of manual hours.</w:t>
       </w:r>
     </w:p>
     <w:p>
@@ -956,40 +748,130 @@
           <w:b/>
           <w:bCs/>
         </w:rPr>
-        <w:t xml:space="preserve">CMS Transformation (Apostrophe → Contentful):</w:t>
-      </w:r>
-      <w:r>
-        <w:t xml:space="preserve"> </w:t>
-      </w:r>
-      <w:r>
-        <w:t xml:space="preserve">Led the end-to-end replacement of an effectively abandoned legacy CMS (no SLA, no SSO, dead tech stack). Conducted rigorous</w:t>
-      </w:r>
-      <w:r>
-        <w:t xml:space="preserve"> </w:t>
-      </w:r>
-      <w:r>
-        <w:t xml:space="preserve">2-month</w:t>
-      </w:r>
-      <w:r>
-        <w:t xml:space="preserve"> </w:t>
-      </w:r>
-      <w:r>
-        <w:t xml:space="preserve">evaluation across</w:t>
-      </w:r>
-      <w:r>
-        <w:t xml:space="preserve"> </w:t>
-      </w:r>
-      <w:r>
-        <w:t xml:space="preserve">10 vendors</w:t>
-      </w:r>
-      <w:r>
-        <w:t xml:space="preserve">, shortlisted to 3, and selected Contentful. Executed a zero-disruption dual-serve migration; three marketing teams (</w:t>
-      </w:r>
-      <w:r>
-        <w:t xml:space="preserve">~18 people</w:t>
-      </w:r>
-      <w:r>
-        <w:t xml:space="preserve">) gained content scheduling, structured content models, and eliminated duplication — removing major technical debt.</w:t>
+        <w:t xml:space="preserve">Platform Reliability &amp; Analytics Ownership:</w:t>
+      </w:r>
+      <w:r>
+        <w:t xml:space="preserve"> </w:t>
+      </w:r>
+      <w:r>
+        <w:t xml:space="preserve">Maintained</w:t>
+      </w:r>
+      <w:r>
+        <w:t xml:space="preserve"> </w:t>
+      </w:r>
+      <w:r>
+        <w:t xml:space="preserve">100% uptime</w:t>
+      </w:r>
+      <w:r>
+        <w:t xml:space="preserve"> </w:t>
+      </w:r>
+      <w:r>
+        <w:t xml:space="preserve">on uw.co.uk (SLO: 99.99%) with</w:t>
+      </w:r>
+      <w:r>
+        <w:t xml:space="preserve"> </w:t>
+      </w:r>
+      <w:r>
+        <w:t xml:space="preserve">&lt;3s</w:t>
+      </w:r>
+      <w:r>
+        <w:t xml:space="preserve"> </w:t>
+      </w:r>
+      <w:r>
+        <w:t xml:space="preserve">page load times on critical-path pages and</w:t>
+      </w:r>
+      <w:r>
+        <w:t xml:space="preserve"> </w:t>
+      </w:r>
+      <w:r>
+        <w:t xml:space="preserve">1 incident</w:t>
+      </w:r>
+      <w:r>
+        <w:t xml:space="preserve"> </w:t>
+      </w:r>
+      <w:r>
+        <w:t xml:space="preserve">in the current year, resolved within hours. Managing a digital estate of</w:t>
+      </w:r>
+      <w:r>
+        <w:t xml:space="preserve"> </w:t>
+      </w:r>
+      <w:r>
+        <w:t xml:space="preserve">522 pages</w:t>
+      </w:r>
+      <w:r>
+        <w:t xml:space="preserve">,</w:t>
+      </w:r>
+      <w:r>
+        <w:t xml:space="preserve"> </w:t>
+      </w:r>
+      <w:r>
+        <w:t xml:space="preserve">3,157 media assets</w:t>
+      </w:r>
+      <w:r>
+        <w:t xml:space="preserve">,</w:t>
+      </w:r>
+      <w:r>
+        <w:t xml:space="preserve"> </w:t>
+      </w:r>
+      <w:r>
+        <w:t xml:space="preserve">1,090 shortlinks</w:t>
+      </w:r>
+      <w:r>
+        <w:t xml:space="preserve">, and</w:t>
+      </w:r>
+      <w:r>
+        <w:t xml:space="preserve"> </w:t>
+      </w:r>
+      <w:r>
+        <w:t xml:space="preserve">218 redirects</w:t>
+      </w:r>
+      <w:r>
+        <w:t xml:space="preserve">. Supported</w:t>
+      </w:r>
+      <w:r>
+        <w:t xml:space="preserve"> </w:t>
+      </w:r>
+      <w:r>
+        <w:t xml:space="preserve">8</w:t>
+      </w:r>
+      <w:r>
+        <w:t xml:space="preserve"> </w:t>
+      </w:r>
+      <w:r>
+        <w:t xml:space="preserve">content teams (</w:t>
+      </w:r>
+      <w:r>
+        <w:t xml:space="preserve">33</w:t>
+      </w:r>
+      <w:r>
+        <w:t xml:space="preserve"> </w:t>
+      </w:r>
+      <w:r>
+        <w:t xml:space="preserve">direct users) across Customer Marketing, Digital Marketing, Partner Marketing, Acquisition, Data Science, Partner Training, Recruitment, and PR — plus</w:t>
+      </w:r>
+      <w:r>
+        <w:t xml:space="preserve"> </w:t>
+      </w:r>
+      <w:r>
+        <w:t xml:space="preserve">15+</w:t>
+      </w:r>
+      <w:r>
+        <w:t xml:space="preserve"> </w:t>
+      </w:r>
+      <w:r>
+        <w:t xml:space="preserve">engineering teams as platform dependencies. Owns the full platform analytics and compliance stack: Contentful CMS, Google Tag Manager, Snowplow, Mixpanel, Optimizely, and OneTrust —</w:t>
+      </w:r>
+      <w:r>
+        <w:t xml:space="preserve"> </w:t>
+      </w:r>
+      <w:r>
+        <w:t xml:space="preserve">six platform services</w:t>
+      </w:r>
+      <w:r>
+        <w:t xml:space="preserve"> </w:t>
+      </w:r>
+      <w:r>
+        <w:t xml:space="preserve">monitored via Kubernetes, Sentry, Prometheus, Pingdom, and Cloudflare.</w:t>
       </w:r>
     </w:p>
     <w:p>
@@ -1005,6 +887,110 @@
           <w:b/>
           <w:bCs/>
         </w:rPr>
+        <w:t xml:space="preserve">Design Systems (Hearth) —</w:t>
+      </w:r>
+      <w:r>
+        <w:rPr>
+          <w:b/>
+          <w:bCs/>
+        </w:rPr>
+        <w:t xml:space="preserve"> </w:t>
+      </w:r>
+      <w:r>
+        <w:rPr>
+          <w:b/>
+          <w:bCs/>
+        </w:rPr>
+        <w:t xml:space="preserve">20 teams</w:t>
+      </w:r>
+      <w:r>
+        <w:rPr>
+          <w:b/>
+          <w:bCs/>
+        </w:rPr>
+        <w:t xml:space="preserve">, company-wide adoption:</w:t>
+      </w:r>
+      <w:r>
+        <w:t xml:space="preserve"> </w:t>
+      </w:r>
+      <w:r>
+        <w:t xml:space="preserve">Led adoption of the Hearth Design System across</w:t>
+      </w:r>
+      <w:r>
+        <w:t xml:space="preserve"> </w:t>
+      </w:r>
+      <w:r>
+        <w:t xml:space="preserve">20</w:t>
+      </w:r>
+      <w:r>
+        <w:t xml:space="preserve"> </w:t>
+      </w:r>
+      <w:r>
+        <w:t xml:space="preserve">engineering and product teams (15 full adoption, 5 partial). Consolidating component work at the Design System level eliminated thousands of hours of duplicated engineering effort — at £35+/hour, savings at rebrand scale reached into the hundreds of thousands. Contributed to the company’s R&amp;D tax credit claims by translating technical Design Systems work into audit-ready documentation for external advisors.</w:t>
+      </w:r>
+    </w:p>
+    <w:p>
+      <w:pPr>
+        <w:pStyle w:val="Compact"/>
+        <w:numPr>
+          <w:ilvl w:val="0"/>
+          <w:numId w:val="1002"/>
+        </w:numPr>
+      </w:pPr>
+      <w:r>
+        <w:rPr>
+          <w:b/>
+          <w:bCs/>
+        </w:rPr>
+        <w:t xml:space="preserve">CMS Transformation (Apostrophe → Contentful):</w:t>
+      </w:r>
+      <w:r>
+        <w:t xml:space="preserve"> </w:t>
+      </w:r>
+      <w:r>
+        <w:t xml:space="preserve">Led the end-to-end replacement of an effectively abandoned legacy CMS (no SLA, no SSO, dead tech stack). Conducted rigorous</w:t>
+      </w:r>
+      <w:r>
+        <w:t xml:space="preserve"> </w:t>
+      </w:r>
+      <w:r>
+        <w:t xml:space="preserve">2-month</w:t>
+      </w:r>
+      <w:r>
+        <w:t xml:space="preserve"> </w:t>
+      </w:r>
+      <w:r>
+        <w:t xml:space="preserve">evaluation across</w:t>
+      </w:r>
+      <w:r>
+        <w:t xml:space="preserve"> </w:t>
+      </w:r>
+      <w:r>
+        <w:t xml:space="preserve">10 vendors</w:t>
+      </w:r>
+      <w:r>
+        <w:t xml:space="preserve">, shortlisted to 3, and selected Contentful. Executed a zero-disruption dual-serve migration; three marketing teams (</w:t>
+      </w:r>
+      <w:r>
+        <w:t xml:space="preserve">~18 people</w:t>
+      </w:r>
+      <w:r>
+        <w:t xml:space="preserve">) gained content scheduling, structured content models, and eliminated duplication — removing major technical debt.</w:t>
+      </w:r>
+    </w:p>
+    <w:p>
+      <w:pPr>
+        <w:pStyle w:val="Compact"/>
+        <w:numPr>
+          <w:ilvl w:val="0"/>
+          <w:numId w:val="1002"/>
+        </w:numPr>
+      </w:pPr>
+      <w:r>
+        <w:rPr>
+          <w:b/>
+          <w:bCs/>
+        </w:rPr>
         <w:t xml:space="preserve">Adaptability Under Constraints (2025–Present):</w:t>
       </w:r>
       <w:r>
@@ -1141,7 +1127,7 @@
         <w:t xml:space="preserve"> </w:t>
       </w:r>
       <w:r>
-        <w:t xml:space="preserve">Joined a standalone team with no formal department, no established processes, and no documentation — built to leverage my cross-functional expertise in engineering, UX, and Agile delivery. A pattern I would repeat in 2025 when forming the specialist CMS Team from a larger restructuring.</w:t>
+        <w:t xml:space="preserve">Joined a standalone team with no formal department, no established processes, and no documentation — built to leverage my cross-functional expertise in engineering, UX, and Agile delivery.</w:t>
       </w:r>
     </w:p>
     <w:p>
@@ -1488,7 +1474,7 @@
         <w:t xml:space="preserve"> </w:t>
       </w:r>
       <w:r>
-        <w:t xml:space="preserve">Introduced Agile and Scrum to LBS for the first time, shifting a high-bureaucracy, low-velocity organisation from ad-hoc output to sprint-based iterative delivery with measurable velocity. Served as the unofficial internal Agile champion throughout my tenure.</w:t>
+        <w:t xml:space="preserve">Introduced Agile and Scrum to LBS for the first time, shifting a high-bureaucracy, low-velocity organisation from ad-hoc output to sprint-based iterative delivery with measurable velocity. Acted as the primary driver for Agile adoption across the department throughout my tenure.</w:t>
       </w:r>
     </w:p>
     <w:p>
@@ -1886,7 +1872,7 @@
           <w:i/>
           <w:iCs/>
         </w:rPr>
-        <w:t xml:space="preserve">Full certifications list — Scrum, UX, FinTech, analytics, cloud, accessibility, and more — available on the</w:t>
+        <w:t xml:space="preserve">Full credentials list — Scrum, UX, FinTech, analytics, cloud, accessibility, and more — available on the</w:t>
       </w:r>
       <w:r>
         <w:rPr>
@@ -1902,7 +1888,7 @@
             <w:i/>
             <w:iCs/>
           </w:rPr>
-          <w:t xml:space="preserve">Professional Development</w:t>
+          <w:t xml:space="preserve">Credentials</w:t>
         </w:r>
       </w:hyperlink>
       <w:r>

</xml_diff>

<commit_message>
refactor: enrich personal background, teaching history, and community work across CV and portfolio pages
</commit_message>
<xml_diff>
--- a/assets/Nikos_Vasileiadis_CV.docx
+++ b/assets/Nikos_Vasileiadis_CV.docx
@@ -1665,13 +1665,13 @@
       </w:r>
     </w:p>
     <w:bookmarkEnd w:id="19"/>
-    <w:bookmarkStart w:id="20" w:name="early-career-consulting"/>
+    <w:bookmarkStart w:id="20" w:name="early-career-teaching-consulting"/>
     <w:p>
       <w:pPr>
         <w:pStyle w:val="Heading3"/>
       </w:pPr>
       <w:r>
-        <w:t xml:space="preserve">Early Career &amp; Consulting</w:t>
+        <w:t xml:space="preserve">Early Career, Teaching &amp; Consulting</w:t>
       </w:r>
     </w:p>
     <w:p>
@@ -1688,18 +1688,101 @@
       <w:r>
         <w:t xml:space="preserve">: Oct 2005 - Dec 2016 (11 years)</w:t>
       </w:r>
-      <w:r>
-        <w:t xml:space="preserve"> </w:t>
-      </w:r>
-      <w:r>
-        <w:rPr>
-          <w:b/>
-          <w:bCs/>
-        </w:rPr>
-        <w:t xml:space="preserve">Description</w:t>
-      </w:r>
-      <w:r>
-        <w:t xml:space="preserve">: Full-stack development, consultancy, and training roles building the foundation of my technical capabilities. Key experiences included developing CMS-based solutions for non-profits (UNESCO) and local businesses, architecting real estate platforms, engineering e-commerce splits payment systems, and delivering technical training (C Programming, Algorithms). After relocating to the UK in 2015, delivered frontend engineering for Leeds-based agencies — building responsive e-commerce solutions for global fashion and retail brands and driving performance optimisation across client portfolios.</w:t>
+    </w:p>
+    <w:p>
+      <w:pPr>
+        <w:pStyle w:val="BodyText"/>
+      </w:pPr>
+      <w:r>
+        <w:t xml:space="preserve">Built the technical and leadership foundation across three domains:</w:t>
+      </w:r>
+    </w:p>
+    <w:p>
+      <w:pPr>
+        <w:pStyle w:val="Compact"/>
+        <w:numPr>
+          <w:ilvl w:val="0"/>
+          <w:numId w:val="1004"/>
+        </w:numPr>
+      </w:pPr>
+      <w:r>
+        <w:rPr>
+          <w:b/>
+          <w:bCs/>
+        </w:rPr>
+        <w:t xml:space="preserve">Web Development &amp; Freelancing (2005–2015):</w:t>
+      </w:r>
+      <w:r>
+        <w:t xml:space="preserve"> </w:t>
+      </w:r>
+      <w:r>
+        <w:t xml:space="preserve">Delivered 40+ web projects across Greece and internationally — from local non-profits and bands to a Bitcoin job board for a client in California. Managed end-to-end client relationships, established professional billing structures (40/40/20 payment terms), and coordinated with distributed development teams. Platforms: WordPress, Drupal, custom HTML/CSS.</w:t>
+      </w:r>
+    </w:p>
+    <w:p>
+      <w:pPr>
+        <w:pStyle w:val="Compact"/>
+        <w:numPr>
+          <w:ilvl w:val="0"/>
+          <w:numId w:val="1004"/>
+        </w:numPr>
+      </w:pPr>
+      <w:r>
+        <w:rPr>
+          <w:b/>
+          <w:bCs/>
+        </w:rPr>
+        <w:t xml:space="preserve">Teaching &amp; Mentorship (2006–2012):</w:t>
+      </w:r>
+      <w:r>
+        <w:t xml:space="preserve"> </w:t>
+      </w:r>
+      <w:r>
+        <w:t xml:space="preserve">Earned a Certified Training Professional (CTP) qualification and spent a year teaching ECDL to adult learners. Privately tutored a student in algorithmic logic, C, and hardware (Arduino/Raspberry Pi) — that student went on to earn a BSc and MSc in Manchester and now works as an engineer at Sophos.</w:t>
+      </w:r>
+    </w:p>
+    <w:p>
+      <w:pPr>
+        <w:pStyle w:val="Compact"/>
+        <w:numPr>
+          <w:ilvl w:val="0"/>
+          <w:numId w:val="1004"/>
+        </w:numPr>
+      </w:pPr>
+      <w:r>
+        <w:rPr>
+          <w:b/>
+          <w:bCs/>
+        </w:rPr>
+        <w:t xml:space="preserve">Community &amp; Civic Technology (2008–2014):</w:t>
+      </w:r>
+      <w:r>
+        <w:t xml:space="preserve"> </w:t>
+      </w:r>
+      <w:r>
+        <w:t xml:space="preserve">Co-founded the Serres Linux Users Group, organised FOSSCOMM 2012, and managed the digital presence for UNESCO Serres, the local Natural History Museum, an EVS programme, and the MSG Panserraikos sports club. This civic technology portfolio predates and directly informs my later UK community work (GDG Leeds, IxDF Leeds, NUX).</w:t>
+      </w:r>
+    </w:p>
+    <w:p>
+      <w:pPr>
+        <w:pStyle w:val="Compact"/>
+        <w:numPr>
+          <w:ilvl w:val="0"/>
+          <w:numId w:val="1004"/>
+        </w:numPr>
+      </w:pPr>
+      <w:r>
+        <w:rPr>
+          <w:b/>
+          <w:bCs/>
+        </w:rPr>
+        <w:t xml:space="preserve">UK Agency Work (2015–2016):</w:t>
+      </w:r>
+      <w:r>
+        <w:t xml:space="preserve"> </w:t>
+      </w:r>
+      <w:r>
+        <w:t xml:space="preserve">Relocated to Leeds. Delivered frontend engineering for agencies — building responsive e-commerce for global fashion and retail brands (Vivienne Westwood) and driving performance optimisation.</w:t>
       </w:r>
     </w:p>
     <w:bookmarkEnd w:id="20"/>
@@ -1768,7 +1851,7 @@
         <w:t xml:space="preserve">Degree</w:t>
       </w:r>
       <w:r>
-        <w:t xml:space="preserve">: BSc Informatics Engineering (attended 2007–2012; did not graduate due to the Greek financial crisis)</w:t>
+        <w:t xml:space="preserve">: BSc Informatics Engineering (attended 2007–2012; strong grades in software engineering, programming, and databases; did not graduate due to the Greek economic crisis and systemic university barriers)</w:t>
       </w:r>
     </w:p>
     <w:bookmarkEnd w:id="22"/>
@@ -1861,6 +1944,22 @@
       </w:r>
       <w:r>
         <w:t xml:space="preserve">· Scrum.org, Jun 2019</w:t>
+      </w:r>
+      <w:r>
+        <w:br/>
+      </w:r>
+      <w:r>
+        <w:rPr>
+          <w:b/>
+          <w:bCs/>
+        </w:rPr>
+        <w:t xml:space="preserve">Estonia e-Residency</w:t>
+      </w:r>
+      <w:r>
+        <w:t xml:space="preserve"> </w:t>
+      </w:r>
+      <w:r>
+        <w:t xml:space="preserve">· Republic of Estonia, Dec 2015 — Approved as one of the first 2,000 global pilot participants.</w:t>
       </w:r>
     </w:p>
     <w:p>
@@ -2216,6 +2315,9 @@
     <w:abstractNumId w:val="991"/>
   </w:num>
   <w:num w:numId="1003">
+    <w:abstractNumId w:val="991"/>
+  </w:num>
+  <w:num w:numId="1004">
     <w:abstractNumId w:val="991"/>
   </w:num>
 </w:numbering>

</xml_diff>

<commit_message>
docs: update CV and credentials with project dates, freelance experience highlights, and corrected nomenclature
</commit_message>
<xml_diff>
--- a/assets/Nikos_Vasileiadis_CV.docx
+++ b/assets/Nikos_Vasileiadis_CV.docx
@@ -1944,22 +1944,6 @@
       </w:r>
       <w:r>
         <w:t xml:space="preserve">· Scrum.org, Jun 2019</w:t>
-      </w:r>
-      <w:r>
-        <w:br/>
-      </w:r>
-      <w:r>
-        <w:rPr>
-          <w:b/>
-          <w:bCs/>
-        </w:rPr>
-        <w:t xml:space="preserve">Estonia e-Residency</w:t>
-      </w:r>
-      <w:r>
-        <w:t xml:space="preserve"> </w:t>
-      </w:r>
-      <w:r>
-        <w:t xml:space="preserve">· Republic of Estonia, Dec 2015 — Approved as one of the first 2,000 global pilot participants.</w:t>
       </w:r>
     </w:p>
     <w:p>

</xml_diff>

<commit_message>
refactor: remove completed or redundant education entries from CV
</commit_message>
<xml_diff>
--- a/assets/Nikos_Vasileiadis_CV.docx
+++ b/assets/Nikos_Vasileiadis_CV.docx
@@ -1799,36 +1799,6 @@
     <w:p>
       <w:pPr>
         <w:pStyle w:val="FirstParagraph"/>
-      </w:pPr>
-      <w:r>
-        <w:rPr>
-          <w:b/>
-          <w:bCs/>
-        </w:rPr>
-        <w:t xml:space="preserve">Institution</w:t>
-      </w:r>
-      <w:r>
-        <w:t xml:space="preserve">: freeCodeCamp — Computer Software Engineering</w:t>
-      </w:r>
-    </w:p>
-    <w:p>
-      <w:pPr>
-        <w:pStyle w:val="BodyText"/>
-      </w:pPr>
-      <w:r>
-        <w:rPr>
-          <w:b/>
-          <w:bCs/>
-        </w:rPr>
-        <w:t xml:space="preserve">Institution</w:t>
-      </w:r>
-      <w:r>
-        <w:t xml:space="preserve">: IxDF - The Interaction Design Foundation — User Experience and Interaction Design (2017–2020)</w:t>
-      </w:r>
-    </w:p>
-    <w:p>
-      <w:pPr>
-        <w:pStyle w:val="BodyText"/>
       </w:pPr>
       <w:r>
         <w:rPr>

</xml_diff>

<commit_message>
refactor: update CV content, professional summary, and contact information across markdown and document assets
</commit_message>
<xml_diff>
--- a/assets/Nikos_Vasileiadis_CV.docx
+++ b/assets/Nikos_Vasileiadis_CV.docx
@@ -34,7 +34,7 @@
         <w:t xml:space="preserve"> </w:t>
       </w:r>
       <w:r>
-        <w:t xml:space="preserve">· Leeds, England, United Kingdom · British Citizen</w:t>
+        <w:t xml:space="preserve">· Leeds, United Kingdom · British Citizen</w:t>
       </w:r>
       <w:r>
         <w:br/>
@@ -170,13 +170,55 @@
         <w:t xml:space="preserve">&lt;/a&gt;</w:t>
       </w:r>
     </w:p>
-    <w:bookmarkStart w:id="12" w:name="top-skills"/>
+    <w:bookmarkStart w:id="12" w:name="professional-summary"/>
     <w:p>
       <w:pPr>
         <w:pStyle w:val="Heading2"/>
       </w:pPr>
       <w:r>
-        <w:t xml:space="preserve">Top skills</w:t>
+        <w:t xml:space="preserve">Professional Summary</w:t>
+      </w:r>
+    </w:p>
+    <w:p>
+      <w:pPr>
+        <w:pStyle w:val="FirstParagraph"/>
+      </w:pPr>
+      <w:r>
+        <w:t xml:space="preserve">Software Engineering Leader with</w:t>
+      </w:r>
+      <w:r>
+        <w:t xml:space="preserve"> </w:t>
+      </w:r>
+      <w:r>
+        <w:t xml:space="preserve">20+ years</w:t>
+      </w:r>
+      <w:r>
+        <w:t xml:space="preserve"> </w:t>
+      </w:r>
+      <w:r>
+        <w:t xml:space="preserve">in technology and</w:t>
+      </w:r>
+      <w:r>
+        <w:t xml:space="preserve"> </w:t>
+      </w:r>
+      <w:r>
+        <w:t xml:space="preserve">9 years</w:t>
+      </w:r>
+      <w:r>
+        <w:t xml:space="preserve"> </w:t>
+      </w:r>
+      <w:r>
+        <w:t xml:space="preserve">of progressive leadership experience. Proven track record of building and retaining high-performing remote teams, navigating organisational design through complex restructurings, and architecting critical platform services. I treat engineering as a business lever—contributing to CapEx/OpEx planning and ensuring technical investments map directly to business outcomes. While my technical depth across frontend and platform architecture establishes credibility, my true strength lies in designing the conditions where engineers do their best work.</w:t>
+      </w:r>
+    </w:p>
+    <w:bookmarkEnd w:id="12"/>
+    <w:bookmarkStart w:id="13" w:name="core-competencies"/>
+    <w:p>
+      <w:pPr>
+        <w:pStyle w:val="Heading2"/>
+      </w:pPr>
+      <w:r>
+        <w:t xml:space="preserve">Core Competencies</w:t>
       </w:r>
     </w:p>
     <w:p>
@@ -213,7 +255,7 @@
         <w:t xml:space="preserve"> </w:t>
       </w:r>
       <w:r>
-        <w:t xml:space="preserve">through evidence-based cases. Natural aptitude for understanding people, building trust, and creating the conditions for autonomous, high-quality delivery.</w:t>
+        <w:t xml:space="preserve">through evidence-based cases. Demonstrated ability to understand people, build trust, and create the conditions for autonomous, high-quality delivery.</w:t>
       </w:r>
     </w:p>
     <w:p>
@@ -304,48 +346,6 @@
         <w:t xml:space="preserve">: Treating engineering as a business lever, not a cost centre. Active contributor to CapEx/OpEx planning, vendor ROI evaluation, and ensuring every technical investment maps to a business outcome.</w:t>
       </w:r>
     </w:p>
-    <w:bookmarkEnd w:id="12"/>
-    <w:bookmarkStart w:id="13" w:name="about"/>
-    <w:p>
-      <w:pPr>
-        <w:pStyle w:val="Heading2"/>
-      </w:pPr>
-      <w:r>
-        <w:t xml:space="preserve">About</w:t>
-      </w:r>
-    </w:p>
-    <w:p>
-      <w:pPr>
-        <w:pStyle w:val="FirstParagraph"/>
-      </w:pPr>
-      <w:r>
-        <w:t xml:space="preserve">Software Engineering Leader with</w:t>
-      </w:r>
-      <w:r>
-        <w:t xml:space="preserve"> </w:t>
-      </w:r>
-      <w:r>
-        <w:t xml:space="preserve">20+ years</w:t>
-      </w:r>
-      <w:r>
-        <w:t xml:space="preserve"> </w:t>
-      </w:r>
-      <w:r>
-        <w:t xml:space="preserve">in technology and</w:t>
-      </w:r>
-      <w:r>
-        <w:t xml:space="preserve"> </w:t>
-      </w:r>
-      <w:r>
-        <w:t xml:space="preserve">9 years</w:t>
-      </w:r>
-      <w:r>
-        <w:t xml:space="preserve"> </w:t>
-      </w:r>
-      <w:r>
-        <w:t xml:space="preserve">of progressive leadership experience. Proven track record of building and retaining high-performing remote teams, navigating organisational design through complex restructurings, and architecting critical platform services. I treat engineering as a business lever—contributing to CapEx/OpEx planning and ensuring technical investments map directly to business outcomes. While my technical depth across frontend and platform architecture establishes credibility, my true strength lies in designing the conditions where engineers do their best work.</w:t>
-      </w:r>
-    </w:p>
     <w:bookmarkEnd w:id="13"/>
     <w:bookmarkStart w:id="21" w:name="experience"/>
     <w:p>
@@ -474,7 +474,7 @@
         <w:t xml:space="preserve"> </w:t>
       </w:r>
       <w:r>
-        <w:t xml:space="preserve">— maintained through three company restructurings that progressively reduced headcount to a specialist core. Every reduction was organisational; zero attrition.</w:t>
+        <w:t xml:space="preserve">— maintained through three company restructurings that progressively reduced headcount to a specialist core. Every reduction was organisational; zero voluntary attrition.</w:t>
       </w:r>
     </w:p>
     <w:p>
@@ -1314,7 +1314,7 @@
         <w:t xml:space="preserve">Description</w:t>
       </w:r>
       <w:r>
-        <w:t xml:space="preserve">: Operated as a dual-threat technical leader for global brands (Adidas, MARS). Alongside architecting frontend solutions, I formally took on Scrum Master responsibilities to elevate the organization’s delivery standards and project predictability.</w:t>
+        <w:t xml:space="preserve">: Operated as a dual-role technical leader for global brands (Adidas, MARS). Alongside architecting frontend solutions, I formally took on Scrum Master responsibilities to elevate the organisation’s delivery standards and project predictability.</w:t>
       </w:r>
     </w:p>
     <w:p>
@@ -1468,7 +1468,7 @@
           <w:b/>
           <w:bCs/>
         </w:rPr>
-        <w:t xml:space="preserve">Agile First Mover:</w:t>
+        <w:t xml:space="preserve">Agile Pioneer:</w:t>
       </w:r>
       <w:r>
         <w:t xml:space="preserve"> </w:t>

</xml_diff>

<commit_message>
docs: enhance professional credentials, CV summaries, and experience descriptions with detailed industry context and role specifics.
</commit_message>
<xml_diff>
--- a/assets/Nikos_Vasileiadis_CV.docx
+++ b/assets/Nikos_Vasileiadis_CV.docx
@@ -208,7 +208,7 @@
         <w:t xml:space="preserve"> </w:t>
       </w:r>
       <w:r>
-        <w:t xml:space="preserve">of progressive leadership experience. Proven track record of building and retaining high-performing remote teams, navigating organisational design through complex restructurings, and architecting critical platform services. I treat engineering as a business lever—contributing to CapEx/OpEx planning and ensuring technical investments map directly to business outcomes. While my technical depth across frontend and platform architecture establishes credibility, my true strength lies in designing the conditions where engineers do their best work.</w:t>
+        <w:t xml:space="preserve">of progressive leadership experience across regulated industries — financial services, utilities, energy, global retail, and public sector technology. Proven track record of building and retaining high-performing remote teams, navigating organisational design through complex restructurings, and architecting critical platform services. I treat engineering as a business lever—contributing to CapEx/OpEx planning and ensuring technical investments map directly to business outcomes. While my technical depth across frontend and platform architecture establishes credibility, my true strength lies in designing the conditions where engineers do their best work.</w:t>
       </w:r>
     </w:p>
     <w:bookmarkEnd w:id="12"/>
@@ -346,6 +346,25 @@
         <w:t xml:space="preserve">: Treating engineering as a business lever, not a cost centre. Active contributor to CapEx/OpEx planning, vendor ROI evaluation, and ensuring every technical investment maps to a business outcome.</w:t>
       </w:r>
     </w:p>
+    <w:p>
+      <w:pPr>
+        <w:pStyle w:val="Compact"/>
+        <w:numPr>
+          <w:ilvl w:val="0"/>
+          <w:numId w:val="1001"/>
+        </w:numPr>
+      </w:pPr>
+      <w:r>
+        <w:rPr>
+          <w:b/>
+          <w:bCs/>
+        </w:rPr>
+        <w:t xml:space="preserve">Regulated Industry Experience</w:t>
+      </w:r>
+      <w:r>
+        <w:t xml:space="preserve">: Proven delivery across multiple regulated sectors — financial services (Leeds Building Society), multi-service utilities including energy (Utility Warehouse), and public sector technology (Jadu / Local Authorities). Understanding of compliance-driven environments, data governance, and operating platforms where reliability has regulatory consequences.</w:t>
+      </w:r>
+    </w:p>
     <w:bookmarkEnd w:id="13"/>
     <w:bookmarkStart w:id="21" w:name="experience"/>
     <w:p>
@@ -377,7 +396,7 @@
         <w:t xml:space="preserve">Company</w:t>
       </w:r>
       <w:r>
-        <w:t xml:space="preserve">: Utility Warehouse (Telecom Plus PLC · FTSE 250)</w:t>
+        <w:t xml:space="preserve">: Utility Warehouse (Telecom Plus PLC · FTSE 250 — multi-service provider of energy, broadband, mobile &amp; insurance)</w:t>
       </w:r>
       <w:r>
         <w:br/>
@@ -1070,10 +1089,10 @@
         <w:t xml:space="preserve">Company</w:t>
       </w:r>
       <w:r>
-        <w:t xml:space="preserve">: Utility Warehouse (Telecom Plus PLC · FTSE 250)</w:t>
-      </w:r>
-      <w:r>
-        <w:br/>
+        <w:t xml:space="preserve">: Utility Warehouse (Telecom Plus PLC · FTSE 250 — multi-service provider of energy, broadband, mobile &amp; insurance)</w:t>
+      </w:r>
+      <w:r>
+        <w:t xml:space="preserve"> </w:t>
       </w:r>
       <w:r>
         <w:rPr>
@@ -1456,7 +1475,7 @@
         <w:t xml:space="preserve">Description</w:t>
       </w:r>
       <w:r>
-        <w:t xml:space="preserve">: Maintained public-facing digital assets in a highly regulated FinTech environment while actively mentoring engineering teams to elevate code quality and UX standards.</w:t>
+        <w:t xml:space="preserve">: Maintained public-facing digital assets for the UK’s 5th largest building society — a highly regulated financial services environment — while actively mentoring engineering teams to elevate code quality and UX standards.</w:t>
       </w:r>
     </w:p>
     <w:p>

</xml_diff>

<commit_message>
feat: update CVs and profile pages with new content on DORA/performance metrics, team wellbeing tracking, and icon-based formatting
</commit_message>
<xml_diff>
--- a/assets/Nikos_Vasileiadis_CV.docx
+++ b/assets/Nikos_Vasileiadis_CV.docx
@@ -184,6 +184,14 @@
         <w:pStyle w:val="FirstParagraph"/>
       </w:pPr>
       <w:r>
+        <w:t xml:space="preserve">{: .icon-user}</w:t>
+      </w:r>
+    </w:p>
+    <w:p>
+      <w:pPr>
+        <w:pStyle w:val="BodyText"/>
+      </w:pPr>
+      <w:r>
         <w:t xml:space="preserve">Software Engineering Leader with</w:t>
       </w:r>
       <w:r>
@@ -219,6 +227,14 @@
       </w:pPr>
       <w:r>
         <w:t xml:space="preserve">Core Competencies</w:t>
+      </w:r>
+    </w:p>
+    <w:p>
+      <w:pPr>
+        <w:pStyle w:val="FirstParagraph"/>
+      </w:pPr>
+      <w:r>
+        <w:t xml:space="preserve">{: .icon-grid}</w:t>
       </w:r>
     </w:p>
     <w:p>
@@ -255,7 +271,7 @@
         <w:t xml:space="preserve"> </w:t>
       </w:r>
       <w:r>
-        <w:t xml:space="preserve">through evidence-based cases. Demonstrated ability to understand people, build trust, and create the conditions for autonomous, high-quality delivery.</w:t>
+        <w:t xml:space="preserve">through evidence-based cases informed by DORA metrics. Measurement-led: using DORA (via DX), team health tracking, and Peakon Heartbeat surveys to ensure performance is visible, sustainable, and connected to career progression.</w:t>
       </w:r>
     </w:p>
     <w:p>
@@ -375,6 +391,14 @@
         <w:t xml:space="preserve">Experience</w:t>
       </w:r>
     </w:p>
+    <w:p>
+      <w:pPr>
+        <w:pStyle w:val="FirstParagraph"/>
+      </w:pPr>
+      <w:r>
+        <w:t xml:space="preserve">{: .icon-clock}</w:t>
+      </w:r>
+    </w:p>
     <w:bookmarkStart w:id="14" w:name="software-engineering-manager"/>
     <w:p>
       <w:pPr>
@@ -494,6 +518,28 @@
       </w:r>
       <w:r>
         <w:t xml:space="preserve">— maintained through three company restructurings that progressively reduced headcount to a specialist core. Every reduction was organisational; zero voluntary attrition.</w:t>
+      </w:r>
+    </w:p>
+    <w:p>
+      <w:pPr>
+        <w:pStyle w:val="Compact"/>
+        <w:numPr>
+          <w:ilvl w:val="0"/>
+          <w:numId w:val="1002"/>
+        </w:numPr>
+      </w:pPr>
+      <w:r>
+        <w:rPr>
+          <w:b/>
+          <w:bCs/>
+        </w:rPr>
+        <w:t xml:space="preserve">Performance Measurement &amp; Team Health:</w:t>
+      </w:r>
+      <w:r>
+        <w:t xml:space="preserve"> </w:t>
+      </w:r>
+      <w:r>
+        <w:t xml:space="preserve">Early adopter of DORA metrics — progressed from manual team health tracking (TeamRetro) and custom EM dashboards to the organisation-wide DX platform. Uses deployment frequency, lead time, change failure rate, and MTTR to provide objective visibility into delivery health — data that directly informs promotion cases and bonus decisions. Complements engineering metrics with monthly Peakon Heartbeat surveys, translating engagement and wellbeing signals into concrete actions within the team’s sphere of influence.</w:t>
       </w:r>
     </w:p>
     <w:p>
@@ -1820,6 +1866,14 @@
         <w:pStyle w:val="FirstParagraph"/>
       </w:pPr>
       <w:r>
+        <w:t xml:space="preserve">{: .icon-book}</w:t>
+      </w:r>
+    </w:p>
+    <w:p>
+      <w:pPr>
+        <w:pStyle w:val="BodyText"/>
+      </w:pPr>
+      <w:r>
         <w:rPr>
           <w:b/>
           <w:bCs/>
@@ -1856,6 +1910,14 @@
     <w:p>
       <w:pPr>
         <w:pStyle w:val="FirstParagraph"/>
+      </w:pPr>
+      <w:r>
+        <w:t xml:space="preserve">{: .icon-shield}</w:t>
+      </w:r>
+    </w:p>
+    <w:p>
+      <w:pPr>
+        <w:pStyle w:val="BodyText"/>
       </w:pPr>
       <w:r>
         <w:rPr>
@@ -1991,6 +2053,14 @@
     <w:p>
       <w:pPr>
         <w:pStyle w:val="FirstParagraph"/>
+      </w:pPr>
+      <w:r>
+        <w:t xml:space="preserve">{: .icon-users}</w:t>
+      </w:r>
+    </w:p>
+    <w:p>
+      <w:pPr>
+        <w:pStyle w:val="BodyText"/>
       </w:pPr>
       <w:r>
         <w:rPr>

</xml_diff>

<commit_message>
fix: stop Jekyll icon markup leaking into generated CV documents
The CV markdown is written for kramdown, but md-to-pdf (marked) and pandoc
do not understand its icon attributes, so the class names surfaced as visible
text in the PDF and the section headings lost their Heading2 style in the DOCX.
Normalise the headings and strip the web-only download bar in a temporary copy
at generation time, keeping the source markdown free to serve the website.
</commit_message>
<xml_diff>
--- a/assets/Nikos_Vasileiadis_CV.docx
+++ b/assets/Nikos_Vasileiadis_CV.docx
@@ -2,14 +2,6 @@
 <file path=word/document.xml><?xml version="1.0" encoding="utf-8"?>
 <w:document xmlns:w="http://schemas.openxmlformats.org/wordprocessingml/2006/main" xmlns:m="http://schemas.openxmlformats.org/officeDocument/2006/math" xmlns:r="http://schemas.openxmlformats.org/officeDocument/2006/relationships" xmlns:o="urn:schemas-microsoft-com:office:office" xmlns:v="urn:schemas-microsoft-com:vml" xmlns:w10="urn:schemas-microsoft-com:office:word" xmlns:a="http://schemas.openxmlformats.org/drawingml/2006/main" xmlns:pic="http://schemas.openxmlformats.org/drawingml/2006/picture" xmlns:wp="http://schemas.openxmlformats.org/drawingml/2006/wordprocessingDrawing">
   <w:body>
-    <w:p>
-      <w:pPr>
-        <w:pStyle w:val="Title"/>
-      </w:pPr>
-      <w:r>
-        <w:t xml:space="preserve">CV — Nikos Vasileiadis | Software Engineering Leader | Leeds, UK</w:t>
-      </w:r>
-    </w:p>
     <w:bookmarkStart w:id="26" w:name="nikos-vasileiadis"/>
     <w:p>
       <w:pPr>
@@ -88,88 +80,6 @@
         <w:t xml:space="preserve">· 07729 021 996</w:t>
       </w:r>
     </w:p>
-    <w:p>
-      <w:pPr>
-        <w:pStyle w:val="BodyText"/>
-      </w:pPr>
-      <w:r>
-        <w:t xml:space="preserve">Download CV:</w:t>
-      </w:r>
-    </w:p>
-    <w:p>
-      <w:pPr>
-        <w:pStyle w:val="SourceCode"/>
-      </w:pPr>
-      <w:r>
-        <w:rPr>
-          <w:rStyle w:val="VerbatimChar"/>
-        </w:rPr>
-        <w:t xml:space="preserve">&lt;a href="/assets/Nikos_Vasileiadis_CV.pdf" download target="_blank" rel="noopener" class="cv-download-btn cv-download-btn--primary"&gt;</w:t>
-      </w:r>
-      <w:r>
-        <w:br/>
-      </w:r>
-      <w:r>
-        <w:rPr>
-          <w:rStyle w:val="VerbatimChar"/>
-        </w:rPr>
-        <w:t xml:space="preserve">  &lt;svg aria-hidden="true" focusable="false" xmlns="http://www.w3.org/2000/svg" width="16" height="16" viewBox="0 0 24 24" fill="none" stroke="currentColor" stroke-width="2" stroke-linecap="round" stroke-linejoin="round"&gt;&lt;path d="M21 15v4a2 2 0 0 1-2 2H5a2 2 0 0 1-2-2v-4"/&gt;&lt;polyline points="7 10 12 15 17 10"/&gt;&lt;line x1="12" y1="15" x2="12" y2="3"/&gt;&lt;/svg&gt;</w:t>
-      </w:r>
-      <w:r>
-        <w:br/>
-      </w:r>
-      <w:r>
-        <w:rPr>
-          <w:rStyle w:val="VerbatimChar"/>
-        </w:rPr>
-        <w:t xml:space="preserve">  PDF Version</w:t>
-      </w:r>
-      <w:r>
-        <w:br/>
-      </w:r>
-      <w:r>
-        <w:rPr>
-          <w:rStyle w:val="VerbatimChar"/>
-        </w:rPr>
-        <w:t xml:space="preserve">&lt;/a&gt;</w:t>
-      </w:r>
-      <w:r>
-        <w:br/>
-      </w:r>
-      <w:r>
-        <w:rPr>
-          <w:rStyle w:val="VerbatimChar"/>
-        </w:rPr>
-        <w:t xml:space="preserve">&lt;a href="/assets/Nikos_Vasileiadis_CV.docx" download target="_blank" rel="noopener" class="cv-download-btn cv-download-btn--secondary"&gt;</w:t>
-      </w:r>
-      <w:r>
-        <w:br/>
-      </w:r>
-      <w:r>
-        <w:rPr>
-          <w:rStyle w:val="VerbatimChar"/>
-        </w:rPr>
-        <w:t xml:space="preserve">  &lt;svg aria-hidden="true" focusable="false" xmlns="http://www.w3.org/2000/svg" width="16" height="16" viewBox="0 0 24 24" fill="none" stroke="currentColor" stroke-width="2" stroke-linecap="round" stroke-linejoin="round"&gt;&lt;path d="M21 15v4a2 2 0 0 1-2 2H5a2 2 0 0 1-2-2v-4"/&gt;&lt;polyline points="7 10 12 15 17 10"/&gt;&lt;line x1="12" y1="15" x2="12" y2="3"/&gt;&lt;/svg&gt;</w:t>
-      </w:r>
-      <w:r>
-        <w:br/>
-      </w:r>
-      <w:r>
-        <w:rPr>
-          <w:rStyle w:val="VerbatimChar"/>
-        </w:rPr>
-        <w:t xml:space="preserve">  DOCX Version</w:t>
-      </w:r>
-      <w:r>
-        <w:br/>
-      </w:r>
-      <w:r>
-        <w:rPr>
-          <w:rStyle w:val="VerbatimChar"/>
-        </w:rPr>
-        <w:t xml:space="preserve">&lt;/a&gt;</w:t>
-      </w:r>
-    </w:p>
     <w:bookmarkStart w:id="12" w:name="professional-summary"/>
     <w:p>
       <w:pPr>
@@ -182,14 +92,6 @@
     <w:p>
       <w:pPr>
         <w:pStyle w:val="FirstParagraph"/>
-      </w:pPr>
-      <w:r>
-        <w:t xml:space="preserve">{: .icon-user}</w:t>
-      </w:r>
-    </w:p>
-    <w:p>
-      <w:pPr>
-        <w:pStyle w:val="BodyText"/>
       </w:pPr>
       <w:r>
         <w:t xml:space="preserve">Software Engineering Leader with</w:t>
@@ -227,14 +129,6 @@
       </w:pPr>
       <w:r>
         <w:t xml:space="preserve">Core Competencies</w:t>
-      </w:r>
-    </w:p>
-    <w:p>
-      <w:pPr>
-        <w:pStyle w:val="FirstParagraph"/>
-      </w:pPr>
-      <w:r>
-        <w:t xml:space="preserve">{: .icon-grid}</w:t>
       </w:r>
     </w:p>
     <w:p>
@@ -389,14 +283,6 @@
       </w:pPr>
       <w:r>
         <w:t xml:space="preserve">Experience</w:t>
-      </w:r>
-    </w:p>
-    <w:p>
-      <w:pPr>
-        <w:pStyle w:val="FirstParagraph"/>
-      </w:pPr>
-      <w:r>
-        <w:t xml:space="preserve">{: .icon-clock}</w:t>
       </w:r>
     </w:p>
     <w:bookmarkStart w:id="14" w:name="software-engineering-manager"/>
@@ -1866,14 +1752,6 @@
         <w:pStyle w:val="FirstParagraph"/>
       </w:pPr>
       <w:r>
-        <w:t xml:space="preserve">{: .icon-book}</w:t>
-      </w:r>
-    </w:p>
-    <w:p>
-      <w:pPr>
-        <w:pStyle w:val="BodyText"/>
-      </w:pPr>
-      <w:r>
         <w:rPr>
           <w:b/>
           <w:bCs/>
@@ -1910,14 +1788,6 @@
     <w:p>
       <w:pPr>
         <w:pStyle w:val="FirstParagraph"/>
-      </w:pPr>
-      <w:r>
-        <w:t xml:space="preserve">{: .icon-shield}</w:t>
-      </w:r>
-    </w:p>
-    <w:p>
-      <w:pPr>
-        <w:pStyle w:val="BodyText"/>
       </w:pPr>
       <w:r>
         <w:rPr>
@@ -2053,14 +1923,6 @@
     <w:p>
       <w:pPr>
         <w:pStyle w:val="FirstParagraph"/>
-      </w:pPr>
-      <w:r>
-        <w:t xml:space="preserve">{: .icon-users}</w:t>
-      </w:r>
-    </w:p>
-    <w:p>
-      <w:pPr>
-        <w:pStyle w:val="BodyText"/>
       </w:pPr>
       <w:r>
         <w:rPr>

</xml_diff>

<commit_message>
chore: update CV documents and markdown files with content revisions and formatting improvements
- Updated Dutch, Irish, and general CV documents (DOCX and PDF) to reflect recent changes.
- Revised markdown files for Dutch and Irish CVs to enhance clarity and consistency in language.
- Improved descriptions of platform reliability, team management, and educational background for better readability.
</commit_message>
<xml_diff>
--- a/assets/Nikos_Vasileiadis_CV.docx
+++ b/assets/Nikos_Vasileiadis_CV.docx
@@ -373,7 +373,7 @@
           <w:b/>
           <w:bCs/>
         </w:rPr>
-        <w:t xml:space="preserve">Team Leadership &amp; Retention:</w:t>
+        <w:t xml:space="preserve">Team Leadership, Retention &amp; Development:</w:t>
       </w:r>
       <w:r>
         <w:t xml:space="preserve"> </w:t>
@@ -403,7 +403,19 @@
         <w:t xml:space="preserve"> </w:t>
       </w:r>
       <w:r>
-        <w:t xml:space="preserve">— maintained through three company restructurings that progressively reduced headcount to a specialist core. Every reduction was organisational; zero voluntary attrition.</w:t>
+        <w:t xml:space="preserve">— maintained through three company restructurings that progressively reduced headcount to a specialist core. Every reduction was organisational; zero voluntary attrition. Drove</w:t>
+      </w:r>
+      <w:r>
+        <w:t xml:space="preserve"> </w:t>
+      </w:r>
+      <w:r>
+        <w:t xml:space="preserve">3 promotions</w:t>
+      </w:r>
+      <w:r>
+        <w:t xml:space="preserve"> </w:t>
+      </w:r>
+      <w:r>
+        <w:t xml:space="preserve">through evidence-based cases, advocating across organisational boundaries, and mentored engineers who moved into Engineering Manager roles both internally and externally.</w:t>
       </w:r>
     </w:p>
     <w:p>
@@ -425,7 +437,7 @@
         <w:t xml:space="preserve"> </w:t>
       </w:r>
       <w:r>
-        <w:t xml:space="preserve">Early adopter of DORA metrics — progressed from manual team health tracking (TeamRetro) and custom EM dashboards to the organisation-wide DX platform. Uses deployment frequency, lead time, change failure rate, and MTTR to provide objective visibility into delivery health — data that directly informs promotion cases and bonus decisions. Complements engineering metrics with monthly Peakon Heartbeat surveys, translating engagement and wellbeing signals into concrete actions within the team’s sphere of influence.</w:t>
+        <w:t xml:space="preserve">Early adopter of DORA metrics — progressed from manual team health tracking and custom EM dashboards to the organisation-wide DX platform. Delivery data (deployment frequency, lead time, change failure rate, MTTR) directly informs promotion cases and bonus decisions, complemented by monthly Peakon Heartbeat surveys translated into concrete actions within the team’s sphere of influence.</w:t>
       </w:r>
     </w:p>
     <w:p>
@@ -441,25 +453,13 @@
           <w:b/>
           <w:bCs/>
         </w:rPr>
-        <w:t xml:space="preserve">Talent Development:</w:t>
-      </w:r>
-      <w:r>
-        <w:t xml:space="preserve"> </w:t>
-      </w:r>
-      <w:r>
-        <w:t xml:space="preserve">Drove</w:t>
-      </w:r>
-      <w:r>
-        <w:t xml:space="preserve"> </w:t>
-      </w:r>
-      <w:r>
-        <w:t xml:space="preserve">3 promotions</w:t>
-      </w:r>
-      <w:r>
-        <w:t xml:space="preserve"> </w:t>
-      </w:r>
-      <w:r>
-        <w:t xml:space="preserve">through evidence-based cases (Associate to Mid-level, Mid-level to Senior), advocating for talent recognition across organisational boundaries. Mentored engineers who subsequently moved into Engineering Manager roles both internally and externally.</w:t>
+        <w:t xml:space="preserve">Org Design &amp; Strategic Influence:</w:t>
+      </w:r>
+      <w:r>
+        <w:t xml:space="preserve"> </w:t>
+      </w:r>
+      <w:r>
+        <w:t xml:space="preserve">During restructurings, took on unguided responsibility for scoping and executing team migrations between pillars — independently mapping scope, chasing stakeholder alignment, and building consensus from scratch. Challenged and reversed structural decisions that would have eliminated the Design Systems team, preserving the critical capability that enabled the 2025 company-wide rebrand.</w:t>
       </w:r>
     </w:p>
     <w:p>
@@ -475,13 +475,31 @@
           <w:b/>
           <w:bCs/>
         </w:rPr>
-        <w:t xml:space="preserve">Org Design &amp; Navigation:</w:t>
-      </w:r>
-      <w:r>
-        <w:t xml:space="preserve"> </w:t>
-      </w:r>
-      <w:r>
-        <w:t xml:space="preserve">During restructurings, took on unguided responsibility for scoping and executing team migrations — including the Content Capability team’s moves between pillars — by independently mapping scope, chasing stakeholder alignment, and building consensus from scratch.</w:t>
+        <w:t xml:space="preserve">Documentation, Knowledge Culture &amp; Upskilling:</w:t>
+      </w:r>
+      <w:r>
+        <w:t xml:space="preserve"> </w:t>
+      </w:r>
+      <w:r>
+        <w:t xml:space="preserve">Authored over</w:t>
+      </w:r>
+      <w:r>
+        <w:t xml:space="preserve"> </w:t>
+      </w:r>
+      <w:r>
+        <w:t xml:space="preserve">100 articles</w:t>
+      </w:r>
+      <w:r>
+        <w:t xml:space="preserve"> </w:t>
+      </w:r>
+      <w:r>
+        <w:t xml:space="preserve">of technical documentation — from process guides to architecture decisions — making the team the most thoroughly documented at UW. Inherited an undocumented legacy CMS and conducted systematic discovery (</w:t>
+      </w:r>
+      <w:r>
+        <w:t xml:space="preserve">“Archeology”</w:t>
+      </w:r>
+      <w:r>
+        <w:t xml:space="preserve">) to map what existed before building the culture from scratch. Identified capability gaps (e.g. Kubernetes), closed them through self-directed learning, then trained the team and pushed engineers to own RFCs and cross-team knowledge-sharing.</w:t>
       </w:r>
     </w:p>
     <w:p>
@@ -497,13 +515,41 @@
           <w:b/>
           <w:bCs/>
         </w:rPr>
-        <w:t xml:space="preserve">Strategic Influence:</w:t>
-      </w:r>
-      <w:r>
-        <w:t xml:space="preserve"> </w:t>
-      </w:r>
-      <w:r>
-        <w:t xml:space="preserve">Challenged and reversed structural decisions that would have eliminated the Design Systems team, preserving the critical capability that enabled the 2025 company-wide rebrand.</w:t>
+        <w:t xml:space="preserve">Rebranding Programme (Oct 2025 – Apr 2026;</w:t>
+      </w:r>
+      <w:r>
+        <w:rPr>
+          <w:b/>
+          <w:bCs/>
+        </w:rPr>
+        <w:t xml:space="preserve"> </w:t>
+      </w:r>
+      <w:r>
+        <w:rPr>
+          <w:b/>
+          <w:bCs/>
+        </w:rPr>
+        <w:t xml:space="preserve">522 pages</w:t>
+      </w:r>
+      <w:r>
+        <w:rPr>
+          <w:b/>
+          <w:bCs/>
+        </w:rPr>
+        <w:t xml:space="preserve"> </w:t>
+      </w:r>
+      <w:r>
+        <w:rPr>
+          <w:b/>
+          <w:bCs/>
+        </w:rPr>
+        <w:t xml:space="preserve">shipped):</w:t>
+      </w:r>
+      <w:r>
+        <w:t xml:space="preserve"> </w:t>
+      </w:r>
+      <w:r>
+        <w:t xml:space="preserve">Delivered UW’s company-wide brand refresh across the full uw.co.uk estate — the primary digital entry point for customers, partners, and the subscriber account system, and the platform where all A/B tests and business tracking metrics run. Our delivery was the critical path: no other team’s rebranding work could go live until the main website shipped. Authored automated migration scripts that saved content editors hundreds of manual hours.</w:t>
       </w:r>
     </w:p>
     <w:p>
@@ -519,31 +565,112 @@
           <w:b/>
           <w:bCs/>
         </w:rPr>
-        <w:t xml:space="preserve">Documentation &amp; Knowledge Culture:</w:t>
-      </w:r>
-      <w:r>
-        <w:t xml:space="preserve"> </w:t>
-      </w:r>
-      <w:r>
-        <w:t xml:space="preserve">Authored over</w:t>
-      </w:r>
-      <w:r>
-        <w:t xml:space="preserve"> </w:t>
-      </w:r>
-      <w:r>
-        <w:t xml:space="preserve">100 articles</w:t>
-      </w:r>
-      <w:r>
-        <w:t xml:space="preserve"> </w:t>
-      </w:r>
-      <w:r>
-        <w:t xml:space="preserve">of technical documentation — from process guides to architecture decisions — making the team the most thoroughly documented at UW. Started from zero: inherited an undocumented legacy CMS and conducted systematic discovery (</w:t>
-      </w:r>
-      <w:r>
-        <w:t xml:space="preserve">“Archeology”</w:t>
-      </w:r>
-      <w:r>
-        <w:t xml:space="preserve">) to map what existed before building the documentation culture from scratch.</w:t>
+        <w:t xml:space="preserve">Platform Reliability &amp; Analytics Ownership:</w:t>
+      </w:r>
+      <w:r>
+        <w:t xml:space="preserve"> </w:t>
+      </w:r>
+      <w:r>
+        <w:t xml:space="preserve">Operated uw.co.uk against a</w:t>
+      </w:r>
+      <w:r>
+        <w:t xml:space="preserve"> </w:t>
+      </w:r>
+      <w:r>
+        <w:t xml:space="preserve">99.99% SLO</w:t>
+      </w:r>
+      <w:r>
+        <w:t xml:space="preserve"> </w:t>
+      </w:r>
+      <w:r>
+        <w:t xml:space="preserve">with a single incident in the current year — resolved within hours, zero downtime otherwise — and</w:t>
+      </w:r>
+      <w:r>
+        <w:t xml:space="preserve"> </w:t>
+      </w:r>
+      <w:r>
+        <w:t xml:space="preserve">&lt;3s</w:t>
+      </w:r>
+      <w:r>
+        <w:t xml:space="preserve"> </w:t>
+      </w:r>
+      <w:r>
+        <w:t xml:space="preserve">page load times on critical-path pages. Managing a digital estate of</w:t>
+      </w:r>
+      <w:r>
+        <w:t xml:space="preserve"> </w:t>
+      </w:r>
+      <w:r>
+        <w:t xml:space="preserve">522 pages</w:t>
+      </w:r>
+      <w:r>
+        <w:t xml:space="preserve">,</w:t>
+      </w:r>
+      <w:r>
+        <w:t xml:space="preserve"> </w:t>
+      </w:r>
+      <w:r>
+        <w:t xml:space="preserve">3,157 media assets</w:t>
+      </w:r>
+      <w:r>
+        <w:t xml:space="preserve">, and</w:t>
+      </w:r>
+      <w:r>
+        <w:t xml:space="preserve"> </w:t>
+      </w:r>
+      <w:r>
+        <w:t xml:space="preserve">1,300+</w:t>
+      </w:r>
+      <w:r>
+        <w:t xml:space="preserve"> </w:t>
+      </w:r>
+      <w:r>
+        <w:t xml:space="preserve">shortlinks and redirects. Supported</w:t>
+      </w:r>
+      <w:r>
+        <w:t xml:space="preserve"> </w:t>
+      </w:r>
+      <w:r>
+        <w:t xml:space="preserve">8</w:t>
+      </w:r>
+      <w:r>
+        <w:t xml:space="preserve"> </w:t>
+      </w:r>
+      <w:r>
+        <w:t xml:space="preserve">content teams (</w:t>
+      </w:r>
+      <w:r>
+        <w:t xml:space="preserve">33</w:t>
+      </w:r>
+      <w:r>
+        <w:t xml:space="preserve"> </w:t>
+      </w:r>
+      <w:r>
+        <w:t xml:space="preserve">direct users) and</w:t>
+      </w:r>
+      <w:r>
+        <w:t xml:space="preserve"> </w:t>
+      </w:r>
+      <w:r>
+        <w:t xml:space="preserve">15+</w:t>
+      </w:r>
+      <w:r>
+        <w:t xml:space="preserve"> </w:t>
+      </w:r>
+      <w:r>
+        <w:t xml:space="preserve">engineering teams as platform dependencies. Owns the full platform analytics and compliance stack — Contentful CMS, Google Tag Manager, Snowplow, Mixpanel, Optimizely, and OneTrust —</w:t>
+      </w:r>
+      <w:r>
+        <w:t xml:space="preserve"> </w:t>
+      </w:r>
+      <w:r>
+        <w:t xml:space="preserve">six platform services</w:t>
+      </w:r>
+      <w:r>
+        <w:t xml:space="preserve"> </w:t>
+      </w:r>
+      <w:r>
+        <w:t xml:space="preserve">monitored via Kubernetes, Sentry, Prometheus, Pingdom, and Cloudflare.</w:t>
       </w:r>
     </w:p>
     <w:p>
@@ -559,13 +686,46 @@
           <w:b/>
           <w:bCs/>
         </w:rPr>
-        <w:t xml:space="preserve">Technical Enablement &amp; Upskilling:</w:t>
-      </w:r>
-      <w:r>
-        <w:t xml:space="preserve"> </w:t>
-      </w:r>
-      <w:r>
-        <w:t xml:space="preserve">Identified capability gaps (e.g. Kubernetes) and closed them through self-directed learning, then trained the team and documented the knowledge for future engineers. Pushed team members to take ownership of RFCs, technical presentations, and cross-team knowledge-sharing — developing engineers who could operate independently across the full platform stack.</w:t>
+        <w:t xml:space="preserve">Design Systems (Hearth) —</w:t>
+      </w:r>
+      <w:r>
+        <w:rPr>
+          <w:b/>
+          <w:bCs/>
+        </w:rPr>
+        <w:t xml:space="preserve"> </w:t>
+      </w:r>
+      <w:r>
+        <w:rPr>
+          <w:b/>
+          <w:bCs/>
+        </w:rPr>
+        <w:t xml:space="preserve">20 teams</w:t>
+      </w:r>
+      <w:r>
+        <w:rPr>
+          <w:b/>
+          <w:bCs/>
+        </w:rPr>
+        <w:t xml:space="preserve">, company-wide adoption:</w:t>
+      </w:r>
+      <w:r>
+        <w:t xml:space="preserve"> </w:t>
+      </w:r>
+      <w:r>
+        <w:t xml:space="preserve">Led adoption of the Hearth Design System across</w:t>
+      </w:r>
+      <w:r>
+        <w:t xml:space="preserve"> </w:t>
+      </w:r>
+      <w:r>
+        <w:t xml:space="preserve">20</w:t>
+      </w:r>
+      <w:r>
+        <w:t xml:space="preserve"> </w:t>
+      </w:r>
+      <w:r>
+        <w:t xml:space="preserve">engineering and product teams (15 full adoption, 5 partial). Consolidating component work at the Design System level eliminated thousands of hours of duplicated engineering effort — savings at rebrand scale reaching into the hundreds of thousands. Contributed to the company’s R&amp;D tax credit claims by translating Design Systems work into audit-ready documentation for external advisors.</w:t>
       </w:r>
     </w:p>
     <w:p>
@@ -581,37 +741,40 @@
           <w:b/>
           <w:bCs/>
         </w:rPr>
-        <w:t xml:space="preserve">Hiring &amp; Talent Acquisition:</w:t>
-      </w:r>
-      <w:r>
-        <w:t xml:space="preserve"> </w:t>
-      </w:r>
-      <w:r>
-        <w:t xml:space="preserve">Involved in the end-to-end hiring of</w:t>
-      </w:r>
-      <w:r>
-        <w:t xml:space="preserve"> </w:t>
-      </w:r>
-      <w:r>
-        <w:t xml:space="preserve">3</w:t>
-      </w:r>
-      <w:r>
-        <w:t xml:space="preserve"> </w:t>
-      </w:r>
-      <w:r>
-        <w:t xml:space="preserve">external engineers and facilitated</w:t>
-      </w:r>
-      <w:r>
-        <w:t xml:space="preserve"> </w:t>
-      </w:r>
-      <w:r>
-        <w:t xml:space="preserve">4</w:t>
-      </w:r>
-      <w:r>
-        <w:t xml:space="preserve"> </w:t>
-      </w:r>
-      <w:r>
-        <w:t xml:space="preserve">internal transfers, contributing to recruitment decisions, candidate assessment, and onboarding.</w:t>
+        <w:t xml:space="preserve">CMS Transformation (Apostrophe → Contentful):</w:t>
+      </w:r>
+      <w:r>
+        <w:t xml:space="preserve"> </w:t>
+      </w:r>
+      <w:r>
+        <w:t xml:space="preserve">Led the end-to-end replacement of an effectively abandoned legacy CMS (no SLA, no SSO, dead tech stack). Conducted rigorous</w:t>
+      </w:r>
+      <w:r>
+        <w:t xml:space="preserve"> </w:t>
+      </w:r>
+      <w:r>
+        <w:t xml:space="preserve">2-month</w:t>
+      </w:r>
+      <w:r>
+        <w:t xml:space="preserve"> </w:t>
+      </w:r>
+      <w:r>
+        <w:t xml:space="preserve">evaluation across</w:t>
+      </w:r>
+      <w:r>
+        <w:t xml:space="preserve"> </w:t>
+      </w:r>
+      <w:r>
+        <w:t xml:space="preserve">10 vendors</w:t>
+      </w:r>
+      <w:r>
+        <w:t xml:space="preserve">, shortlisted to 3, and selected Contentful. Executed a zero-disruption dual-serve migration; three marketing teams (</w:t>
+      </w:r>
+      <w:r>
+        <w:t xml:space="preserve">~18 people</w:t>
+      </w:r>
+      <w:r>
+        <w:t xml:space="preserve">) gained content scheduling, structured content models, and eliminated duplication — removing major technical debt.</w:t>
       </w:r>
     </w:p>
     <w:p>
@@ -627,321 +790,6 @@
           <w:b/>
           <w:bCs/>
         </w:rPr>
-        <w:t xml:space="preserve">Continuous Leadership Development:</w:t>
-      </w:r>
-      <w:r>
-        <w:t xml:space="preserve"> </w:t>
-      </w:r>
-      <w:r>
-        <w:t xml:space="preserve">Completed extensive formal management training covering executive-level competencies, including Performance Accountability, Goal Setting for Leaders, Driving Team Results, and Managing Underperformance &amp; Conduct.</w:t>
-      </w:r>
-    </w:p>
-    <w:p>
-      <w:pPr>
-        <w:pStyle w:val="Compact"/>
-        <w:numPr>
-          <w:ilvl w:val="0"/>
-          <w:numId w:val="1002"/>
-        </w:numPr>
-      </w:pPr>
-      <w:r>
-        <w:rPr>
-          <w:b/>
-          <w:bCs/>
-        </w:rPr>
-        <w:t xml:space="preserve">Rebranding Programme (Oct 2025 – Apr 2026;</w:t>
-      </w:r>
-      <w:r>
-        <w:rPr>
-          <w:b/>
-          <w:bCs/>
-        </w:rPr>
-        <w:t xml:space="preserve"> </w:t>
-      </w:r>
-      <w:r>
-        <w:rPr>
-          <w:b/>
-          <w:bCs/>
-        </w:rPr>
-        <w:t xml:space="preserve">522 pages</w:t>
-      </w:r>
-      <w:r>
-        <w:rPr>
-          <w:b/>
-          <w:bCs/>
-        </w:rPr>
-        <w:t xml:space="preserve"> </w:t>
-      </w:r>
-      <w:r>
-        <w:rPr>
-          <w:b/>
-          <w:bCs/>
-        </w:rPr>
-        <w:t xml:space="preserve">shipped):</w:t>
-      </w:r>
-      <w:r>
-        <w:t xml:space="preserve"> </w:t>
-      </w:r>
-      <w:r>
-        <w:t xml:space="preserve">Delivered UW’s company-wide brand refresh across the full uw.co.uk estate — the primary digital entry point for customers, partners, and the subscriber account system, and the platform where all A/B tests and business tracking metrics run. Our delivery was the critical path: no other team’s rebranding work could go live until the main website shipped. Authored automated migration scripts that saved content editors hundreds of manual hours.</w:t>
-      </w:r>
-    </w:p>
-    <w:p>
-      <w:pPr>
-        <w:pStyle w:val="Compact"/>
-        <w:numPr>
-          <w:ilvl w:val="0"/>
-          <w:numId w:val="1002"/>
-        </w:numPr>
-      </w:pPr>
-      <w:r>
-        <w:rPr>
-          <w:b/>
-          <w:bCs/>
-        </w:rPr>
-        <w:t xml:space="preserve">Platform Reliability &amp; Analytics Ownership:</w:t>
-      </w:r>
-      <w:r>
-        <w:t xml:space="preserve"> </w:t>
-      </w:r>
-      <w:r>
-        <w:t xml:space="preserve">Maintained</w:t>
-      </w:r>
-      <w:r>
-        <w:t xml:space="preserve"> </w:t>
-      </w:r>
-      <w:r>
-        <w:t xml:space="preserve">100% uptime</w:t>
-      </w:r>
-      <w:r>
-        <w:t xml:space="preserve"> </w:t>
-      </w:r>
-      <w:r>
-        <w:t xml:space="preserve">on uw.co.uk (SLO: 99.99%) with</w:t>
-      </w:r>
-      <w:r>
-        <w:t xml:space="preserve"> </w:t>
-      </w:r>
-      <w:r>
-        <w:t xml:space="preserve">&lt;3s</w:t>
-      </w:r>
-      <w:r>
-        <w:t xml:space="preserve"> </w:t>
-      </w:r>
-      <w:r>
-        <w:t xml:space="preserve">page load times on critical-path pages and</w:t>
-      </w:r>
-      <w:r>
-        <w:t xml:space="preserve"> </w:t>
-      </w:r>
-      <w:r>
-        <w:t xml:space="preserve">1 incident</w:t>
-      </w:r>
-      <w:r>
-        <w:t xml:space="preserve"> </w:t>
-      </w:r>
-      <w:r>
-        <w:t xml:space="preserve">in the current year, resolved within hours. Managing a digital estate of</w:t>
-      </w:r>
-      <w:r>
-        <w:t xml:space="preserve"> </w:t>
-      </w:r>
-      <w:r>
-        <w:t xml:space="preserve">522 pages</w:t>
-      </w:r>
-      <w:r>
-        <w:t xml:space="preserve">,</w:t>
-      </w:r>
-      <w:r>
-        <w:t xml:space="preserve"> </w:t>
-      </w:r>
-      <w:r>
-        <w:t xml:space="preserve">3,157 media assets</w:t>
-      </w:r>
-      <w:r>
-        <w:t xml:space="preserve">,</w:t>
-      </w:r>
-      <w:r>
-        <w:t xml:space="preserve"> </w:t>
-      </w:r>
-      <w:r>
-        <w:t xml:space="preserve">1,090 shortlinks</w:t>
-      </w:r>
-      <w:r>
-        <w:t xml:space="preserve">, and</w:t>
-      </w:r>
-      <w:r>
-        <w:t xml:space="preserve"> </w:t>
-      </w:r>
-      <w:r>
-        <w:t xml:space="preserve">218 redirects</w:t>
-      </w:r>
-      <w:r>
-        <w:t xml:space="preserve">. Supported</w:t>
-      </w:r>
-      <w:r>
-        <w:t xml:space="preserve"> </w:t>
-      </w:r>
-      <w:r>
-        <w:t xml:space="preserve">8</w:t>
-      </w:r>
-      <w:r>
-        <w:t xml:space="preserve"> </w:t>
-      </w:r>
-      <w:r>
-        <w:t xml:space="preserve">content teams (</w:t>
-      </w:r>
-      <w:r>
-        <w:t xml:space="preserve">33</w:t>
-      </w:r>
-      <w:r>
-        <w:t xml:space="preserve"> </w:t>
-      </w:r>
-      <w:r>
-        <w:t xml:space="preserve">direct users) across Customer Marketing, Digital Marketing, Partner Marketing, Acquisition, Data Science, Partner Training, Recruitment, and PR — plus</w:t>
-      </w:r>
-      <w:r>
-        <w:t xml:space="preserve"> </w:t>
-      </w:r>
-      <w:r>
-        <w:t xml:space="preserve">15+</w:t>
-      </w:r>
-      <w:r>
-        <w:t xml:space="preserve"> </w:t>
-      </w:r>
-      <w:r>
-        <w:t xml:space="preserve">engineering teams as platform dependencies. Owns the full platform analytics and compliance stack: Contentful CMS, Google Tag Manager, Snowplow, Mixpanel, Optimizely, and OneTrust —</w:t>
-      </w:r>
-      <w:r>
-        <w:t xml:space="preserve"> </w:t>
-      </w:r>
-      <w:r>
-        <w:t xml:space="preserve">six platform services</w:t>
-      </w:r>
-      <w:r>
-        <w:t xml:space="preserve"> </w:t>
-      </w:r>
-      <w:r>
-        <w:t xml:space="preserve">monitored via Kubernetes, Sentry, Prometheus, Pingdom, and Cloudflare.</w:t>
-      </w:r>
-    </w:p>
-    <w:p>
-      <w:pPr>
-        <w:pStyle w:val="Compact"/>
-        <w:numPr>
-          <w:ilvl w:val="0"/>
-          <w:numId w:val="1002"/>
-        </w:numPr>
-      </w:pPr>
-      <w:r>
-        <w:rPr>
-          <w:b/>
-          <w:bCs/>
-        </w:rPr>
-        <w:t xml:space="preserve">Design Systems (Hearth) —</w:t>
-      </w:r>
-      <w:r>
-        <w:rPr>
-          <w:b/>
-          <w:bCs/>
-        </w:rPr>
-        <w:t xml:space="preserve"> </w:t>
-      </w:r>
-      <w:r>
-        <w:rPr>
-          <w:b/>
-          <w:bCs/>
-        </w:rPr>
-        <w:t xml:space="preserve">20 teams</w:t>
-      </w:r>
-      <w:r>
-        <w:rPr>
-          <w:b/>
-          <w:bCs/>
-        </w:rPr>
-        <w:t xml:space="preserve">, company-wide adoption:</w:t>
-      </w:r>
-      <w:r>
-        <w:t xml:space="preserve"> </w:t>
-      </w:r>
-      <w:r>
-        <w:t xml:space="preserve">Led adoption of the Hearth Design System across</w:t>
-      </w:r>
-      <w:r>
-        <w:t xml:space="preserve"> </w:t>
-      </w:r>
-      <w:r>
-        <w:t xml:space="preserve">20</w:t>
-      </w:r>
-      <w:r>
-        <w:t xml:space="preserve"> </w:t>
-      </w:r>
-      <w:r>
-        <w:t xml:space="preserve">engineering and product teams (15 full adoption, 5 partial). Consolidating component work at the Design System level eliminated thousands of hours of duplicated engineering effort — at £35+/hour, savings at rebrand scale reached into the hundreds of thousands. Contributed to the company’s R&amp;D tax credit claims by translating technical Design Systems work into audit-ready documentation for external advisors.</w:t>
-      </w:r>
-    </w:p>
-    <w:p>
-      <w:pPr>
-        <w:pStyle w:val="Compact"/>
-        <w:numPr>
-          <w:ilvl w:val="0"/>
-          <w:numId w:val="1002"/>
-        </w:numPr>
-      </w:pPr>
-      <w:r>
-        <w:rPr>
-          <w:b/>
-          <w:bCs/>
-        </w:rPr>
-        <w:t xml:space="preserve">CMS Transformation (Apostrophe → Contentful):</w:t>
-      </w:r>
-      <w:r>
-        <w:t xml:space="preserve"> </w:t>
-      </w:r>
-      <w:r>
-        <w:t xml:space="preserve">Led the end-to-end replacement of an effectively abandoned legacy CMS (no SLA, no SSO, dead tech stack). Conducted rigorous</w:t>
-      </w:r>
-      <w:r>
-        <w:t xml:space="preserve"> </w:t>
-      </w:r>
-      <w:r>
-        <w:t xml:space="preserve">2-month</w:t>
-      </w:r>
-      <w:r>
-        <w:t xml:space="preserve"> </w:t>
-      </w:r>
-      <w:r>
-        <w:t xml:space="preserve">evaluation across</w:t>
-      </w:r>
-      <w:r>
-        <w:t xml:space="preserve"> </w:t>
-      </w:r>
-      <w:r>
-        <w:t xml:space="preserve">10 vendors</w:t>
-      </w:r>
-      <w:r>
-        <w:t xml:space="preserve">, shortlisted to 3, and selected Contentful. Executed a zero-disruption dual-serve migration; three marketing teams (</w:t>
-      </w:r>
-      <w:r>
-        <w:t xml:space="preserve">~18 people</w:t>
-      </w:r>
-      <w:r>
-        <w:t xml:space="preserve">) gained content scheduling, structured content models, and eliminated duplication — removing major technical debt.</w:t>
-      </w:r>
-    </w:p>
-    <w:p>
-      <w:pPr>
-        <w:pStyle w:val="Compact"/>
-        <w:numPr>
-          <w:ilvl w:val="0"/>
-          <w:numId w:val="1002"/>
-        </w:numPr>
-      </w:pPr>
-      <w:r>
-        <w:rPr>
-          <w:b/>
-          <w:bCs/>
-        </w:rPr>
         <w:t xml:space="preserve">Adaptability Under Constraints (2025–Present):</w:t>
       </w:r>
       <w:r>
@@ -969,34 +817,7 @@
         <w:t xml:space="preserve"> </w:t>
       </w:r>
       <w:r>
-        <w:t xml:space="preserve">with a</w:t>
-      </w:r>
-      <w:r>
-        <w:t xml:space="preserve"> </w:t>
-      </w:r>
-      <w:r>
-        <w:t xml:space="preserve">2-person team</w:t>
-      </w:r>
-      <w:r>
-        <w:t xml:space="preserve">, while maintaining</w:t>
-      </w:r>
-      <w:r>
-        <w:t xml:space="preserve"> </w:t>
-      </w:r>
-      <w:r>
-        <w:t xml:space="preserve">100% team retention</w:t>
-      </w:r>
-      <w:r>
-        <w:t xml:space="preserve">,</w:t>
-      </w:r>
-      <w:r>
-        <w:t xml:space="preserve"> </w:t>
-      </w:r>
-      <w:r>
-        <w:t xml:space="preserve">100% platform uptime</w:t>
-      </w:r>
-      <w:r>
-        <w:t xml:space="preserve">, and full accountability for the uw.co.uk estate.</w:t>
+        <w:t xml:space="preserve">with full accountability for the uw.co.uk estate, without losing a single engineer or breaching the platform SLO.</w:t>
       </w:r>
     </w:p>
     <w:bookmarkEnd w:id="14"/>
@@ -1772,7 +1593,7 @@
         <w:t xml:space="preserve">Degree</w:t>
       </w:r>
       <w:r>
-        <w:t xml:space="preserve">: BSc Informatics Engineering (attended 2007–2012; strong grades in software engineering, programming, and databases; did not graduate due to the Greek economic crisis and systemic university barriers)</w:t>
+        <w:t xml:space="preserve">: BSc Informatics Engineering (attended 2007–2012; strong grades in software engineering, programming, and databases; did not complete due to the Greek economic crisis)</w:t>
       </w:r>
     </w:p>
     <w:bookmarkEnd w:id="22"/>

</xml_diff>

<commit_message>
Update credentials and CV pages to reflect additional leadership experience and achievements
- Enhanced descriptions in credentials page to include 4 years of direct line management experience.
- Revised metrics and achievements in the CV to highlight team growth, retention rates, and leadership roles.
- Improved clarity and detail in professional summaries across multiple CV versions (Dutch, Irish, and English) to emphasize commercial awareness and organizational design skills.
- Added specific examples of community contributions and technical upskilling efforts.
- Updated CMS migration details to reflect the selection of Contentful and its impact on team efficiency.
</commit_message>
<xml_diff>
--- a/assets/Nikos_Vasileiadis_CV.docx
+++ b/assets/Nikos_Vasileiadis_CV.docx
@@ -118,7 +118,19 @@
         <w:t xml:space="preserve"> </w:t>
       </w:r>
       <w:r>
-        <w:t xml:space="preserve">of progressive leadership experience across regulated industries — financial services, utilities, energy, global retail, and public sector technology. Proven track record of building and retaining high-performing remote teams, navigating organisational design through complex restructurings, and architecting critical platform services. I treat engineering as a business lever—contributing to CapEx/OpEx planning and ensuring technical investments map directly to business outcomes. While my technical depth across frontend and platform architecture establishes credibility, my true strength lies in designing the conditions where engineers do their best work.</w:t>
+        <w:t xml:space="preserve">of progressive leadership —</w:t>
+      </w:r>
+      <w:r>
+        <w:t xml:space="preserve"> </w:t>
+      </w:r>
+      <w:r>
+        <w:t xml:space="preserve">4</w:t>
+      </w:r>
+      <w:r>
+        <w:t xml:space="preserve"> </w:t>
+      </w:r>
+      <w:r>
+        <w:t xml:space="preserve">of them line-managing engineers — across regulated industries — financial services, utilities, energy, global retail, and public sector technology. Proven track record of building and retaining high-performing remote teams, navigating organisational design through complex restructurings, and architecting critical platform services. I treat engineering as a business lever—contributing to CapEx/OpEx planning and ensuring technical investments map directly to business outcomes. The pattern across those years is consistent: I build the thing that isn’t there — a team where there was no department, documentation from zero, structure where there was firefighting, a career where there was no industry to offer one. While my technical depth across frontend and platform architecture establishes credibility, my true strength lies in designing the conditions where engineers do their best work.</w:t>
       </w:r>
     </w:p>
     <w:bookmarkEnd w:id="12"/>
@@ -253,7 +265,19 @@
         <w:t xml:space="preserve">Commercial Engineering &amp; Business Acumen</w:t>
       </w:r>
       <w:r>
-        <w:t xml:space="preserve">: Treating engineering as a business lever, not a cost centre. Active contributor to CapEx/OpEx planning, vendor ROI evaluation, and ensuring every technical investment maps to a business outcome.</w:t>
+        <w:t xml:space="preserve">: Treating engineering as a business lever, not a cost centre. Managing a vendor portfolio exceeding</w:t>
+      </w:r>
+      <w:r>
+        <w:t xml:space="preserve"> </w:t>
+      </w:r>
+      <w:r>
+        <w:t xml:space="preserve">£200k</w:t>
+      </w:r>
+      <w:r>
+        <w:t xml:space="preserve"> </w:t>
+      </w:r>
+      <w:r>
+        <w:t xml:space="preserve">a year across six platform services, with active contribution to CapEx/OpEx planning, vendor ROI evaluation, and ensuring every technical investment maps to a business outcome.</w:t>
       </w:r>
     </w:p>
     <w:p>
@@ -379,19 +403,19 @@
         <w:t xml:space="preserve"> </w:t>
       </w:r>
       <w:r>
-        <w:t xml:space="preserve">Built and managed up to</w:t>
-      </w:r>
-      <w:r>
-        <w:t xml:space="preserve"> </w:t>
-      </w:r>
-      <w:r>
-        <w:t xml:space="preserve">8 engineers</w:t>
-      </w:r>
-      <w:r>
-        <w:t xml:space="preserve"> </w:t>
-      </w:r>
-      <w:r>
-        <w:t xml:space="preserve">across two teams with a</w:t>
+        <w:t xml:space="preserve">Grew to</w:t>
+      </w:r>
+      <w:r>
+        <w:t xml:space="preserve"> </w:t>
+      </w:r>
+      <w:r>
+        <w:t xml:space="preserve">8 technical reports across three teams</w:t>
+      </w:r>
+      <w:r>
+        <w:t xml:space="preserve"> </w:t>
+      </w:r>
+      <w:r>
+        <w:t xml:space="preserve">with separate backlogs — web/CMS/tracking, mobile, and design systems — comprising six direct reports plus a Design Systems Lead and a Staff Engineer whose day-to-day management and 1:1s I held on a dotted line, alongside a Product Manager. Sustained a</w:t>
       </w:r>
       <w:r>
         <w:t xml:space="preserve"> </w:t>
@@ -403,7 +427,19 @@
         <w:t xml:space="preserve"> </w:t>
       </w:r>
       <w:r>
-        <w:t xml:space="preserve">— maintained through three company restructurings that progressively reduced headcount to a specialist core. Every reduction was organisational; zero voluntary attrition. Drove</w:t>
+        <w:t xml:space="preserve">through three reorganisations that moved the team across three departments in</w:t>
+      </w:r>
+      <w:r>
+        <w:t xml:space="preserve"> </w:t>
+      </w:r>
+      <w:r>
+        <w:t xml:space="preserve">25 months</w:t>
+      </w:r>
+      <w:r>
+        <w:t xml:space="preserve"> </w:t>
+      </w:r>
+      <w:r>
+        <w:t xml:space="preserve">— Platforms (May 2023), Customer Experience (Jul 2024), Partner (Jun 2025) — the last reducing it to a specialist core. Every reduction was organisational; zero voluntary attrition. Drove</w:t>
       </w:r>
       <w:r>
         <w:t xml:space="preserve"> </w:t>
@@ -459,7 +495,7 @@
         <w:t xml:space="preserve"> </w:t>
       </w:r>
       <w:r>
-        <w:t xml:space="preserve">During restructurings, took on unguided responsibility for scoping and executing team migrations between pillars — independently mapping scope, chasing stakeholder alignment, and building consensus from scratch. Challenged and reversed structural decisions that would have eliminated the Design Systems team, preserving the critical capability that enabled the 2025 company-wide rebrand.</w:t>
+        <w:t xml:space="preserve">During restructurings, took on unguided responsibility for scoping and executing team migrations between pillars — independently mapping scope, chasing stakeholder alignment, and building consensus from scratch. When the Customer Experience move brought a mobile backlog into the team’s remit, negotiated the inbound transfer of a Senior Engineer with mobile expertise, matching capability to scope rather than absorbing the work unprepared. Challenged and reversed structural decisions that would have eliminated the Design Systems team, preserving the critical capability that enabled the 2025 company-wide rebrand.</w:t>
       </w:r>
     </w:p>
     <w:p>
@@ -768,7 +804,7 @@
         <w:t xml:space="preserve">10 vendors</w:t>
       </w:r>
       <w:r>
-        <w:t xml:space="preserve">, shortlisted to 3, and selected Contentful. Executed a zero-disruption dual-serve migration; three marketing teams (</w:t>
+        <w:t xml:space="preserve">, shortlisted to 3, and selected Contentful — a six-figure annual enterprise contract, chosen for the enterprise-grade SLAs and support most vendors couldn’t offer. Executed a zero-disruption dual-serve migration; three marketing teams (</w:t>
       </w:r>
       <w:r>
         <w:t xml:space="preserve">~18 people</w:t>
@@ -921,31 +957,31 @@
         <w:t xml:space="preserve"> </w:t>
       </w:r>
       <w:r>
-        <w:t xml:space="preserve">Joined as the founding engineer in a standalone team supporting marketing — no department, no precedent. Grew the team from</w:t>
-      </w:r>
-      <w:r>
-        <w:t xml:space="preserve"> </w:t>
-      </w:r>
-      <w:r>
-        <w:t xml:space="preserve">3 to 6+</w:t>
-      </w:r>
-      <w:r>
-        <w:t xml:space="preserve"> </w:t>
-      </w:r>
-      <w:r>
-        <w:t xml:space="preserve">through recruitment and internal transfers. The team survived</w:t>
-      </w:r>
-      <w:r>
-        <w:t xml:space="preserve"> </w:t>
-      </w:r>
-      <w:r>
-        <w:t xml:space="preserve">three</w:t>
-      </w:r>
-      <w:r>
-        <w:t xml:space="preserve"> </w:t>
-      </w:r>
-      <w:r>
-        <w:t xml:space="preserve">company-wide restructurings (Marketing Capability → Content Capability → CMS Team) — a mark of its embedded value to the business.</w:t>
+        <w:t xml:space="preserve">Joined as the founding engineer in a standalone team supporting marketing — no department, no precedent. Started as three — myself, a Product Manager, and an Associate Engineer — and held that shape for a full year, delivering with a single engineer before headcount arrived. Line-managed that engineer from May 2022: with no Head of Engineering in post and my own manager delegating heavily, people responsibility sat with me from the start —</w:t>
+      </w:r>
+      <w:r>
+        <w:t xml:space="preserve"> </w:t>
+      </w:r>
+      <w:r>
+        <w:t xml:space="preserve">14 months</w:t>
+      </w:r>
+      <w:r>
+        <w:t xml:space="preserve"> </w:t>
+      </w:r>
+      <w:r>
+        <w:t xml:space="preserve">before the title caught up. Grew to</w:t>
+      </w:r>
+      <w:r>
+        <w:t xml:space="preserve"> </w:t>
+      </w:r>
+      <w:r>
+        <w:t xml:space="preserve">five</w:t>
+      </w:r>
+      <w:r>
+        <w:t xml:space="preserve"> </w:t>
+      </w:r>
+      <w:r>
+        <w:t xml:space="preserve">in May 2023 with two external hires, and promoted the founding Associate to Software Engineer a month later. The team was renamed Content Capability (Nov 2022) and moved into the Platforms department (May 2023) — the first of three reorganisations it would outlast, a mark of its embedded value to the business.</w:t>
       </w:r>
     </w:p>
     <w:p>
@@ -1466,7 +1502,7 @@
         <w:pStyle w:val="BodyText"/>
       </w:pPr>
       <w:r>
-        <w:t xml:space="preserve">Built the technical and leadership foundation across three domains:</w:t>
+        <w:t xml:space="preserve">Provincial northern Greece — Xanthi, where I grew up; Serres, where I studied: no tech industry to join and, after 2010, barely an economy. I built the career anyway — client by client — and led long before anyone gave me a title for it:</w:t>
       </w:r>
     </w:p>
     <w:p>
@@ -1504,13 +1540,13 @@
           <w:b/>
           <w:bCs/>
         </w:rPr>
-        <w:t xml:space="preserve">Teaching &amp; Mentorship (2006–2012):</w:t>
-      </w:r>
-      <w:r>
-        <w:t xml:space="preserve"> </w:t>
-      </w:r>
-      <w:r>
-        <w:t xml:space="preserve">Earned a Certified Training Professional (CTP) qualification and spent a year teaching ECDL to adult learners. Privately tutored a student in algorithmic logic, C, and hardware (Arduino/Raspberry Pi) — that student went on to earn a BSc and MSc in Manchester and now works as an engineer at Sophos.</w:t>
+        <w:t xml:space="preserve">Community &amp; Civic Technology (2008–2014):</w:t>
+      </w:r>
+      <w:r>
+        <w:t xml:space="preserve"> </w:t>
+      </w:r>
+      <w:r>
+        <w:t xml:space="preserve">Co-founded the Serres Linux Users Group, organised FOSSCOMM 2012 (a 350-person national open-source conference), and managed the digital presence for UNESCO Serres, the local Natural History Museum, an EVS programme, and the MSG Panserraikos sports club. This civic technology portfolio predates and directly informs my later UK community work (GDG Leeds, IxDF Leeds, NUX).</w:t>
       </w:r>
     </w:p>
     <w:p>
@@ -1526,13 +1562,13 @@
           <w:b/>
           <w:bCs/>
         </w:rPr>
-        <w:t xml:space="preserve">Community &amp; Civic Technology (2008–2014):</w:t>
-      </w:r>
-      <w:r>
-        <w:t xml:space="preserve"> </w:t>
-      </w:r>
-      <w:r>
-        <w:t xml:space="preserve">Co-founded the Serres Linux Users Group, organised FOSSCOMM 2012, and managed the digital presence for UNESCO Serres, the local Natural History Museum, an EVS programme, and the MSG Panserraikos sports club. This civic technology portfolio predates and directly informs my later UK community work (GDG Leeds, IxDF Leeds, NUX).</w:t>
+        <w:t xml:space="preserve">Teaching &amp; Mentorship (2006–2012):</w:t>
+      </w:r>
+      <w:r>
+        <w:t xml:space="preserve"> </w:t>
+      </w:r>
+      <w:r>
+        <w:t xml:space="preserve">Earned a Certified Training Professional (CTP) qualification and spent a year teaching ECDL to adult learners. Privately tutored a student in algorithmic logic, C, and hardware (Arduino/Raspberry Pi) — that student went on to earn a BSc and MSc in Manchester and now works as an engineer at Sophos.</w:t>
       </w:r>
     </w:p>
     <w:p>
@@ -1593,7 +1629,7 @@
         <w:t xml:space="preserve">Degree</w:t>
       </w:r>
       <w:r>
-        <w:t xml:space="preserve">: BSc Informatics Engineering (attended 2007–2012; strong grades in software engineering, programming, and databases; did not complete due to the Greek economic crisis)</w:t>
+        <w:t xml:space="preserve">: BSc Informatics Engineering (2007–2012) — strong grades in software engineering, programming, and databases. Left without the certificate when the Greek economic crisis hit; the freelance business I was already running became the career.</w:t>
       </w:r>
     </w:p>
     <w:bookmarkEnd w:id="22"/>

</xml_diff>

<commit_message>
feat: update CV documents and markdown files to reflect recent leadership experience and achievements
</commit_message>
<xml_diff>
--- a/assets/Nikos_Vasileiadis_CV.docx
+++ b/assets/Nikos_Vasileiadis_CV.docx
@@ -957,7 +957,7 @@
         <w:t xml:space="preserve"> </w:t>
       </w:r>
       <w:r>
-        <w:t xml:space="preserve">Joined as the founding engineer in a standalone team supporting marketing — no department, no precedent. Started as three — myself, a Product Manager, and an Associate Engineer — and held that shape for a full year, delivering with a single engineer before headcount arrived. Line-managed that engineer from May 2022: with no Head of Engineering in post and my own manager delegating heavily, people responsibility sat with me from the start —</w:t>
+        <w:t xml:space="preserve">Joined as the founding engineer in a standalone team supporting marketing — no department, no precedent. Started as three — myself, a Product Manager, and an Associate Engineer — and held that shape for a full year, delivering with a single engineer before headcount arrived. Line-managed that engineer from May 2022: for the first year I reported directly to a VP of Engineering — no Head of Engineering in between — so people responsibility sat with me from the start,</w:t>
       </w:r>
       <w:r>
         <w:t xml:space="preserve"> </w:t>
@@ -981,7 +981,7 @@
         <w:t xml:space="preserve"> </w:t>
       </w:r>
       <w:r>
-        <w:t xml:space="preserve">in May 2023 with two external hires, and promoted the founding Associate to Software Engineer a month later. The team was renamed Content Capability (Nov 2022) and moved into the Platforms department (May 2023) — the first of three reorganisations it would outlast, a mark of its embedded value to the business.</w:t>
+        <w:t xml:space="preserve">in May 2023 with two external hires, and promoted the founding Associate to Software Engineer a month later — a promotion case my manager asked me to prepare and drive while I was still Lead. The team was renamed Content Capability (Nov 2022) and moved into the Platforms department (May 2023) — the first of three reorganisations it would outlast, a mark of its embedded value to the business.</w:t>
       </w:r>
     </w:p>
     <w:p>

</xml_diff>

<commit_message>
Enhance CV formatting and content for improved readability and clarity
- Updated CSS styles for better document presentation in PDF format.
- Revised professional summary and core competencies to emphasize leadership and engineering impact.
- Streamlined responsibilities and achievements in the Software Engineering Manager role at Utility Warehouse.
- Added detailed descriptions of team structure, measurement practices, and project outcomes.
- Improved documentation culture narrative and highlighted adaptability during organizational changes.
- Consolidated and clarified contributions to design systems and CMS transformation projects.
</commit_message>
<xml_diff>
--- a/assets/Nikos_Vasileiadis_CV.docx
+++ b/assets/Nikos_Vasileiadis_CV.docx
@@ -130,7 +130,7 @@
         <w:t xml:space="preserve"> </w:t>
       </w:r>
       <w:r>
-        <w:t xml:space="preserve">of them line-managing engineers — across regulated industries — financial services, utilities, energy, global retail, and public sector technology. Proven track record of building and retaining high-performing remote teams, navigating organisational design through complex restructurings, and architecting critical platform services. I treat engineering as a business lever—contributing to CapEx/OpEx planning and ensuring technical investments map directly to business outcomes. The pattern across those years is consistent: I build the thing that isn’t there — a team where there was no department, documentation from zero, structure where there was firefighting, a career where there was no industry to offer one. While my technical depth across frontend and platform architecture establishes credibility, my true strength lies in designing the conditions where engineers do their best work.</w:t>
+        <w:t xml:space="preserve">of them line-managing engineers — across regulated industries. I treat engineering as a business lever — contributing to CapEx/OpEx planning and ensuring technical investments map directly to business outcomes. The pattern across those years is consistent: I build the thing that isn’t there — a team where there was no department, documentation from zero, structure where there was firefighting, a career where there was no industry to offer one. Technical depth across frontend and platform architecture establishes credibility; my true strength is designing the conditions where engineers do their best work.</w:t>
       </w:r>
     </w:p>
     <w:bookmarkEnd w:id="12"/>
@@ -159,25 +159,10 @@
         <w:t xml:space="preserve">Engineering Leadership &amp; People Development</w:t>
       </w:r>
       <w:r>
-        <w:t xml:space="preserve">: Proven track record of building, mentoring, and retaining high-performing remote teams (</w:t>
-      </w:r>
-      <w:r>
-        <w:t xml:space="preserve">100% retention rate</w:t>
-      </w:r>
-      <w:r>
-        <w:t xml:space="preserve">) while driving</w:t>
-      </w:r>
-      <w:r>
-        <w:t xml:space="preserve"> </w:t>
-      </w:r>
-      <w:r>
-        <w:t xml:space="preserve">3 promotions</w:t>
-      </w:r>
-      <w:r>
-        <w:t xml:space="preserve"> </w:t>
-      </w:r>
-      <w:r>
-        <w:t xml:space="preserve">through evidence-based cases informed by DORA metrics. Measurement-led: using DORA (via DX), team health tracking, and Peakon Heartbeat surveys to ensure performance is visible, sustainable, and connected to career progression.</w:t>
+        <w:t xml:space="preserve"> </w:t>
+      </w:r>
+      <w:r>
+        <w:t xml:space="preserve">— building, mentoring, and retaining high-performing remote teams; measurement-led via DORA metrics (DX), team health tracking, and Peakon Heartbeat surveys, so performance stays visible, sustainable, and connected to career progression.</w:t>
       </w:r>
     </w:p>
     <w:p>
@@ -196,7 +181,10 @@
         <w:t xml:space="preserve">Organisational Design &amp; Change Management</w:t>
       </w:r>
       <w:r>
-        <w:t xml:space="preserve">: Experienced in navigating complex restructurings, building teams from scratch, and shaping team structures that align engineering capability with business outcomes. Have built the same team twice from zero.</w:t>
+        <w:t xml:space="preserve"> </w:t>
+      </w:r>
+      <w:r>
+        <w:t xml:space="preserve">— navigating complex restructurings and shaping team structures that align engineering capability with business outcomes; have built the same team twice from zero.</w:t>
       </w:r>
     </w:p>
     <w:p>
@@ -215,7 +203,10 @@
         <w:t xml:space="preserve">Platform &amp; Infrastructure Strategy</w:t>
       </w:r>
       <w:r>
-        <w:t xml:space="preserve">: Architecting and managing critical platform services and dependencies with a focus on SLAs, SLIs, and operational excellence for</w:t>
+        <w:t xml:space="preserve"> </w:t>
+      </w:r>
+      <w:r>
+        <w:t xml:space="preserve">— architecting and managing critical platform services with SLAs, SLIs, and operational excellence for</w:t>
       </w:r>
       <w:r>
         <w:t xml:space="preserve"> </w:t>
@@ -246,7 +237,10 @@
         <w:t xml:space="preserve">Design Systems Leadership</w:t>
       </w:r>
       <w:r>
-        <w:t xml:space="preserve">: End-to-end experience building and managing Design Systems — from open-source implementation (Pulsar at Jadu) to leading a dedicated Design Systems team at scale, enabling consistent, high-velocity delivery across product and engineering.</w:t>
+        <w:t xml:space="preserve"> </w:t>
+      </w:r>
+      <w:r>
+        <w:t xml:space="preserve">— end-to-end, from open-source implementation (Pulsar at Jadu) to leading a dedicated Design Systems team at scale.</w:t>
       </w:r>
     </w:p>
     <w:p>
@@ -265,7 +259,10 @@
         <w:t xml:space="preserve">Commercial Engineering &amp; Business Acumen</w:t>
       </w:r>
       <w:r>
-        <w:t xml:space="preserve">: Treating engineering as a business lever, not a cost centre. Managing a vendor portfolio exceeding</w:t>
+        <w:t xml:space="preserve"> </w:t>
+      </w:r>
+      <w:r>
+        <w:t xml:space="preserve">— a</w:t>
       </w:r>
       <w:r>
         <w:t xml:space="preserve"> </w:t>
@@ -274,10 +271,7 @@
         <w:t xml:space="preserve">£200k</w:t>
       </w:r>
       <w:r>
-        <w:t xml:space="preserve"> </w:t>
-      </w:r>
-      <w:r>
-        <w:t xml:space="preserve">a year across six platform services, with active contribution to CapEx/OpEx planning, vendor ROI evaluation, and ensuring every technical investment maps to a business outcome.</w:t>
+        <w:t xml:space="preserve">+ annual vendor portfolio across six platform services, active contribution to CapEx/OpEx planning, and vendor ROI evaluation.</w:t>
       </w:r>
     </w:p>
     <w:p>
@@ -296,7 +290,10 @@
         <w:t xml:space="preserve">Regulated Industry Experience</w:t>
       </w:r>
       <w:r>
-        <w:t xml:space="preserve">: Proven delivery across multiple regulated sectors — financial services (Leeds Building Society), multi-service utilities including energy (Utility Warehouse), and public sector technology (Jadu / Local Authorities). Understanding of compliance-driven environments, data governance, and operating platforms where reliability has regulatory consequences.</w:t>
+        <w:t xml:space="preserve"> </w:t>
+      </w:r>
+      <w:r>
+        <w:t xml:space="preserve">— financial services (Leeds Building Society), multi-service utilities including energy (Utility Warehouse), and public sector technology (Jadu / Local Authorities); compliance-driven environments where reliability has regulatory consequences.</w:t>
       </w:r>
     </w:p>
     <w:bookmarkEnd w:id="13"/>
@@ -327,61 +324,19 @@
           <w:b/>
           <w:bCs/>
         </w:rPr>
-        <w:t xml:space="preserve">Company</w:t>
-      </w:r>
-      <w:r>
-        <w:t xml:space="preserve">: Utility Warehouse (Telecom Plus PLC · FTSE 250 — multi-service provider of energy, broadband, mobile &amp; insurance)</w:t>
+        <w:t xml:space="preserve">Utility Warehouse</w:t>
+      </w:r>
+      <w:r>
+        <w:t xml:space="preserve"> </w:t>
+      </w:r>
+      <w:r>
+        <w:t xml:space="preserve">(Telecom Plus PLC · FTSE 250 — multi-service provider of energy, broadband, mobile &amp; insurance)</w:t>
       </w:r>
       <w:r>
         <w:br/>
       </w:r>
       <w:r>
-        <w:rPr>
-          <w:b/>
-          <w:bCs/>
-        </w:rPr>
-        <w:t xml:space="preserve">Dates</w:t>
-      </w:r>
-      <w:r>
-        <w:t xml:space="preserve">: Jul 2023 - Present</w:t>
-      </w:r>
-      <w:r>
-        <w:br/>
-      </w:r>
-      <w:r>
-        <w:rPr>
-          <w:b/>
-          <w:bCs/>
-        </w:rPr>
-        <w:t xml:space="preserve">Location</w:t>
-      </w:r>
-      <w:r>
-        <w:t xml:space="preserve">: United Kingdom · Remote</w:t>
-      </w:r>
-      <w:r>
-        <w:br/>
-      </w:r>
-      <w:r>
-        <w:rPr>
-          <w:b/>
-          <w:bCs/>
-        </w:rPr>
-        <w:t xml:space="preserve">Employment Type</w:t>
-      </w:r>
-      <w:r>
-        <w:t xml:space="preserve">: Full-time</w:t>
-      </w:r>
-    </w:p>
-    <w:p>
-      <w:pPr>
-        <w:pStyle w:val="BodyText"/>
-      </w:pPr>
-      <w:r>
-        <w:rPr>
-          <w:b/>
-          <w:bCs/>
-        </w:rPr>
-        <w:t xml:space="preserve">Responsibilities:</w:t>
+        <w:t xml:space="preserve">Jul 2023 – Present · United Kingdom · Remote</w:t>
       </w:r>
     </w:p>
     <w:p>
@@ -415,13 +370,13 @@
         <w:t xml:space="preserve"> </w:t>
       </w:r>
       <w:r>
-        <w:t xml:space="preserve">with separate backlogs — web/CMS/tracking, mobile, and design systems — comprising six direct reports plus a Design Systems Lead and a Staff Engineer whose day-to-day management and 1:1s I held on a dotted line, alongside a Product Manager. Sustained a</w:t>
-      </w:r>
-      <w:r>
-        <w:t xml:space="preserve"> </w:t>
-      </w:r>
-      <w:r>
-        <w:t xml:space="preserve">100% retention rate</w:t>
+        <w:t xml:space="preserve">with separate backlogs — web/CMS/tracking, mobile, and design systems — alongside a Product Manager. Sustained</w:t>
+      </w:r>
+      <w:r>
+        <w:t xml:space="preserve"> </w:t>
+      </w:r>
+      <w:r>
+        <w:t xml:space="preserve">100% retention</w:t>
       </w:r>
       <w:r>
         <w:t xml:space="preserve"> </w:t>
@@ -436,10 +391,7 @@
         <w:t xml:space="preserve">25 months</w:t>
       </w:r>
       <w:r>
-        <w:t xml:space="preserve"> </w:t>
-      </w:r>
-      <w:r>
-        <w:t xml:space="preserve">— Platforms (May 2023), Customer Experience (Jul 2024), Partner (Jun 2025) — the last reducing it to a specialist core. Every reduction was organisational; zero voluntary attrition. Drove</w:t>
+        <w:t xml:space="preserve">; every reduction was organisational, zero voluntary attrition. Drove</w:t>
       </w:r>
       <w:r>
         <w:t xml:space="preserve"> </w:t>
@@ -451,7 +403,7 @@
         <w:t xml:space="preserve"> </w:t>
       </w:r>
       <w:r>
-        <w:t xml:space="preserve">through evidence-based cases, advocating across organisational boundaries, and mentored engineers who moved into Engineering Manager roles both internally and externally.</w:t>
+        <w:t xml:space="preserve">through evidence-based cases informed by DORA metrics and Peakon Heartbeat surveys, and mentored engineers who moved into Engineering Manager roles both internally and externally.</w:t>
       </w:r>
     </w:p>
     <w:p>
@@ -467,13 +419,13 @@
           <w:b/>
           <w:bCs/>
         </w:rPr>
-        <w:t xml:space="preserve">Performance Measurement &amp; Team Health:</w:t>
-      </w:r>
-      <w:r>
-        <w:t xml:space="preserve"> </w:t>
-      </w:r>
-      <w:r>
-        <w:t xml:space="preserve">Early adopter of DORA metrics — progressed from manual team health tracking and custom EM dashboards to the organisation-wide DX platform. Delivery data (deployment frequency, lead time, change failure rate, MTTR) directly informs promotion cases and bonus decisions, complemented by monthly Peakon Heartbeat surveys translated into concrete actions within the team’s sphere of influence.</w:t>
+        <w:t xml:space="preserve">Org Design &amp; Strategic Influence:</w:t>
+      </w:r>
+      <w:r>
+        <w:t xml:space="preserve"> </w:t>
+      </w:r>
+      <w:r>
+        <w:t xml:space="preserve">Took unguided responsibility for scoping and executing team migrations between pillars during restructurings — mapping scope, chasing stakeholder alignment, and building consensus from scratch. Negotiated the inbound transfer of a Senior Engineer with mobile expertise when a mobile backlog entered the team’s remit, and challenged and reversed structural decisions that would have eliminated the Design Systems team — preserving the capability that enabled the 2025 company-wide rebrand.</w:t>
       </w:r>
     </w:p>
     <w:p>
@@ -489,13 +441,34 @@
           <w:b/>
           <w:bCs/>
         </w:rPr>
-        <w:t xml:space="preserve">Org Design &amp; Strategic Influence:</w:t>
-      </w:r>
-      <w:r>
-        <w:t xml:space="preserve"> </w:t>
-      </w:r>
-      <w:r>
-        <w:t xml:space="preserve">During restructurings, took on unguided responsibility for scoping and executing team migrations between pillars — independently mapping scope, chasing stakeholder alignment, and building consensus from scratch. When the Customer Experience move brought a mobile backlog into the team’s remit, negotiated the inbound transfer of a Senior Engineer with mobile expertise, matching capability to scope rather than absorbing the work unprepared. Challenged and reversed structural decisions that would have eliminated the Design Systems team, preserving the critical capability that enabled the 2025 company-wide rebrand.</w:t>
+        <w:t xml:space="preserve">Rebranding Programme (Oct 2025 – Apr 2026;</w:t>
+      </w:r>
+      <w:r>
+        <w:rPr>
+          <w:b/>
+          <w:bCs/>
+        </w:rPr>
+        <w:t xml:space="preserve"> </w:t>
+      </w:r>
+      <w:r>
+        <w:rPr>
+          <w:b/>
+          <w:bCs/>
+        </w:rPr>
+        <w:t xml:space="preserve">522 pages</w:t>
+      </w:r>
+      <w:r>
+        <w:rPr>
+          <w:b/>
+          <w:bCs/>
+        </w:rPr>
+        <w:t xml:space="preserve">):</w:t>
+      </w:r>
+      <w:r>
+        <w:t xml:space="preserve"> </w:t>
+      </w:r>
+      <w:r>
+        <w:t xml:space="preserve">Delivered UW’s company-wide brand refresh across the full uw.co.uk estate — the primary digital entry point for customers and partners, and the critical path: no other team’s rebranding work could go live until the main website shipped. Authored automated migration scripts that saved content editors hundreds of manual hours.</w:t>
       </w:r>
     </w:p>
     <w:p>
@@ -511,31 +484,112 @@
           <w:b/>
           <w:bCs/>
         </w:rPr>
-        <w:t xml:space="preserve">Documentation, Knowledge Culture &amp; Upskilling:</w:t>
-      </w:r>
-      <w:r>
-        <w:t xml:space="preserve"> </w:t>
-      </w:r>
-      <w:r>
-        <w:t xml:space="preserve">Authored over</w:t>
-      </w:r>
-      <w:r>
-        <w:t xml:space="preserve"> </w:t>
-      </w:r>
-      <w:r>
-        <w:t xml:space="preserve">100 articles</w:t>
-      </w:r>
-      <w:r>
-        <w:t xml:space="preserve"> </w:t>
-      </w:r>
-      <w:r>
-        <w:t xml:space="preserve">of technical documentation — from process guides to architecture decisions — making the team the most thoroughly documented at UW. Inherited an undocumented legacy CMS and conducted systematic discovery (</w:t>
-      </w:r>
-      <w:r>
-        <w:t xml:space="preserve">“Archeology”</w:t>
-      </w:r>
-      <w:r>
-        <w:t xml:space="preserve">) to map what existed before building the culture from scratch. Identified capability gaps (e.g. Kubernetes), closed them through self-directed learning, then trained the team and pushed engineers to own RFCs and cross-team knowledge-sharing.</w:t>
+        <w:t xml:space="preserve">Platform Reliability &amp; Analytics Ownership:</w:t>
+      </w:r>
+      <w:r>
+        <w:t xml:space="preserve"> </w:t>
+      </w:r>
+      <w:r>
+        <w:t xml:space="preserve">Operated uw.co.uk against a</w:t>
+      </w:r>
+      <w:r>
+        <w:t xml:space="preserve"> </w:t>
+      </w:r>
+      <w:r>
+        <w:t xml:space="preserve">99.99% SLO</w:t>
+      </w:r>
+      <w:r>
+        <w:t xml:space="preserve"> </w:t>
+      </w:r>
+      <w:r>
+        <w:t xml:space="preserve">— a single incident in the current year, resolved within hours — with</w:t>
+      </w:r>
+      <w:r>
+        <w:t xml:space="preserve"> </w:t>
+      </w:r>
+      <w:r>
+        <w:t xml:space="preserve">&lt;3s</w:t>
+      </w:r>
+      <w:r>
+        <w:t xml:space="preserve"> </w:t>
+      </w:r>
+      <w:r>
+        <w:t xml:space="preserve">page loads on critical-path pages. Managing an estate of</w:t>
+      </w:r>
+      <w:r>
+        <w:t xml:space="preserve"> </w:t>
+      </w:r>
+      <w:r>
+        <w:t xml:space="preserve">522 pages</w:t>
+      </w:r>
+      <w:r>
+        <w:t xml:space="preserve">,</w:t>
+      </w:r>
+      <w:r>
+        <w:t xml:space="preserve"> </w:t>
+      </w:r>
+      <w:r>
+        <w:t xml:space="preserve">3,157 media assets</w:t>
+      </w:r>
+      <w:r>
+        <w:t xml:space="preserve">, and</w:t>
+      </w:r>
+      <w:r>
+        <w:t xml:space="preserve"> </w:t>
+      </w:r>
+      <w:r>
+        <w:t xml:space="preserve">1,300+</w:t>
+      </w:r>
+      <w:r>
+        <w:t xml:space="preserve"> </w:t>
+      </w:r>
+      <w:r>
+        <w:t xml:space="preserve">shortlinks and redirects; supporting</w:t>
+      </w:r>
+      <w:r>
+        <w:t xml:space="preserve"> </w:t>
+      </w:r>
+      <w:r>
+        <w:t xml:space="preserve">8</w:t>
+      </w:r>
+      <w:r>
+        <w:t xml:space="preserve"> </w:t>
+      </w:r>
+      <w:r>
+        <w:t xml:space="preserve">content teams (</w:t>
+      </w:r>
+      <w:r>
+        <w:t xml:space="preserve">33</w:t>
+      </w:r>
+      <w:r>
+        <w:t xml:space="preserve"> </w:t>
+      </w:r>
+      <w:r>
+        <w:t xml:space="preserve">users) and</w:t>
+      </w:r>
+      <w:r>
+        <w:t xml:space="preserve"> </w:t>
+      </w:r>
+      <w:r>
+        <w:t xml:space="preserve">15+</w:t>
+      </w:r>
+      <w:r>
+        <w:t xml:space="preserve"> </w:t>
+      </w:r>
+      <w:r>
+        <w:t xml:space="preserve">engineering teams across</w:t>
+      </w:r>
+      <w:r>
+        <w:t xml:space="preserve"> </w:t>
+      </w:r>
+      <w:r>
+        <w:t xml:space="preserve">six platform services</w:t>
+      </w:r>
+      <w:r>
+        <w:t xml:space="preserve"> </w:t>
+      </w:r>
+      <w:r>
+        <w:t xml:space="preserve">— Contentful, Google Tag Manager, Snowplow, Mixpanel, Optimizely, and OneTrust.</w:t>
       </w:r>
     </w:p>
     <w:p>
@@ -551,41 +605,34 @@
           <w:b/>
           <w:bCs/>
         </w:rPr>
-        <w:t xml:space="preserve">Rebranding Programme (Oct 2025 – Apr 2026;</w:t>
-      </w:r>
-      <w:r>
-        <w:rPr>
-          <w:b/>
-          <w:bCs/>
-        </w:rPr>
-        <w:t xml:space="preserve"> </w:t>
-      </w:r>
-      <w:r>
-        <w:rPr>
-          <w:b/>
-          <w:bCs/>
-        </w:rPr>
-        <w:t xml:space="preserve">522 pages</w:t>
-      </w:r>
-      <w:r>
-        <w:rPr>
-          <w:b/>
-          <w:bCs/>
-        </w:rPr>
-        <w:t xml:space="preserve"> </w:t>
-      </w:r>
-      <w:r>
-        <w:rPr>
-          <w:b/>
-          <w:bCs/>
-        </w:rPr>
-        <w:t xml:space="preserve">shipped):</w:t>
-      </w:r>
-      <w:r>
-        <w:t xml:space="preserve"> </w:t>
-      </w:r>
-      <w:r>
-        <w:t xml:space="preserve">Delivered UW’s company-wide brand refresh across the full uw.co.uk estate — the primary digital entry point for customers, partners, and the subscriber account system, and the platform where all A/B tests and business tracking metrics run. Our delivery was the critical path: no other team’s rebranding work could go live until the main website shipped. Authored automated migration scripts that saved content editors hundreds of manual hours.</w:t>
+        <w:t xml:space="preserve">Design Systems (Hearth) —</w:t>
+      </w:r>
+      <w:r>
+        <w:rPr>
+          <w:b/>
+          <w:bCs/>
+        </w:rPr>
+        <w:t xml:space="preserve"> </w:t>
+      </w:r>
+      <w:r>
+        <w:rPr>
+          <w:b/>
+          <w:bCs/>
+        </w:rPr>
+        <w:t xml:space="preserve">20 teams</w:t>
+      </w:r>
+      <w:r>
+        <w:rPr>
+          <w:b/>
+          <w:bCs/>
+        </w:rPr>
+        <w:t xml:space="preserve">:</w:t>
+      </w:r>
+      <w:r>
+        <w:t xml:space="preserve"> </w:t>
+      </w:r>
+      <w:r>
+        <w:t xml:space="preserve">Led company-wide adoption (15 full, 5 partial), eliminating thousands of hours of duplicated engineering effort — savings at rebrand scale reaching into the hundreds of thousands — and contributed to R&amp;D tax credit claims with audit-ready documentation for external advisors.</w:t>
       </w:r>
     </w:p>
     <w:p>
@@ -601,112 +648,43 @@
           <w:b/>
           <w:bCs/>
         </w:rPr>
-        <w:t xml:space="preserve">Platform Reliability &amp; Analytics Ownership:</w:t>
-      </w:r>
-      <w:r>
-        <w:t xml:space="preserve"> </w:t>
-      </w:r>
-      <w:r>
-        <w:t xml:space="preserve">Operated uw.co.uk against a</w:t>
-      </w:r>
-      <w:r>
-        <w:t xml:space="preserve"> </w:t>
-      </w:r>
-      <w:r>
-        <w:t xml:space="preserve">99.99% SLO</w:t>
-      </w:r>
-      <w:r>
-        <w:t xml:space="preserve"> </w:t>
-      </w:r>
-      <w:r>
-        <w:t xml:space="preserve">with a single incident in the current year — resolved within hours, zero downtime otherwise — and</w:t>
-      </w:r>
-      <w:r>
-        <w:t xml:space="preserve"> </w:t>
-      </w:r>
-      <w:r>
-        <w:t xml:space="preserve">&lt;3s</w:t>
-      </w:r>
-      <w:r>
-        <w:t xml:space="preserve"> </w:t>
-      </w:r>
-      <w:r>
-        <w:t xml:space="preserve">page load times on critical-path pages. Managing a digital estate of</w:t>
-      </w:r>
-      <w:r>
-        <w:t xml:space="preserve"> </w:t>
-      </w:r>
-      <w:r>
-        <w:t xml:space="preserve">522 pages</w:t>
-      </w:r>
-      <w:r>
-        <w:t xml:space="preserve">,</w:t>
-      </w:r>
-      <w:r>
-        <w:t xml:space="preserve"> </w:t>
-      </w:r>
-      <w:r>
-        <w:t xml:space="preserve">3,157 media assets</w:t>
-      </w:r>
-      <w:r>
-        <w:t xml:space="preserve">, and</w:t>
-      </w:r>
-      <w:r>
-        <w:t xml:space="preserve"> </w:t>
-      </w:r>
-      <w:r>
-        <w:t xml:space="preserve">1,300+</w:t>
-      </w:r>
-      <w:r>
-        <w:t xml:space="preserve"> </w:t>
-      </w:r>
-      <w:r>
-        <w:t xml:space="preserve">shortlinks and redirects. Supported</w:t>
-      </w:r>
-      <w:r>
-        <w:t xml:space="preserve"> </w:t>
-      </w:r>
-      <w:r>
-        <w:t xml:space="preserve">8</w:t>
-      </w:r>
-      <w:r>
-        <w:t xml:space="preserve"> </w:t>
-      </w:r>
-      <w:r>
-        <w:t xml:space="preserve">content teams (</w:t>
-      </w:r>
-      <w:r>
-        <w:t xml:space="preserve">33</w:t>
-      </w:r>
-      <w:r>
-        <w:t xml:space="preserve"> </w:t>
-      </w:r>
-      <w:r>
-        <w:t xml:space="preserve">direct users) and</w:t>
-      </w:r>
-      <w:r>
-        <w:t xml:space="preserve"> </w:t>
-      </w:r>
-      <w:r>
-        <w:t xml:space="preserve">15+</w:t>
-      </w:r>
-      <w:r>
-        <w:t xml:space="preserve"> </w:t>
-      </w:r>
-      <w:r>
-        <w:t xml:space="preserve">engineering teams as platform dependencies. Owns the full platform analytics and compliance stack — Contentful CMS, Google Tag Manager, Snowplow, Mixpanel, Optimizely, and OneTrust —</w:t>
-      </w:r>
-      <w:r>
-        <w:t xml:space="preserve"> </w:t>
-      </w:r>
-      <w:r>
-        <w:t xml:space="preserve">six platform services</w:t>
-      </w:r>
-      <w:r>
-        <w:t xml:space="preserve"> </w:t>
-      </w:r>
-      <w:r>
-        <w:t xml:space="preserve">monitored via Kubernetes, Sentry, Prometheus, Pingdom, and Cloudflare.</w:t>
+        <w:t xml:space="preserve">CMS Transformation (Apostrophe → Contentful):</w:t>
+      </w:r>
+      <w:r>
+        <w:t xml:space="preserve"> </w:t>
+      </w:r>
+      <w:r>
+        <w:t xml:space="preserve">Led the end-to-end replacement of an effectively abandoned legacy CMS (no SLA, no SSO, dead tech stack) — a rigorous</w:t>
+      </w:r>
+      <w:r>
+        <w:t xml:space="preserve"> </w:t>
+      </w:r>
+      <w:r>
+        <w:t xml:space="preserve">2-month</w:t>
+      </w:r>
+      <w:r>
+        <w:t xml:space="preserve"> </w:t>
+      </w:r>
+      <w:r>
+        <w:t xml:space="preserve">evaluation across</w:t>
+      </w:r>
+      <w:r>
+        <w:t xml:space="preserve"> </w:t>
+      </w:r>
+      <w:r>
+        <w:t xml:space="preserve">10 vendors</w:t>
+      </w:r>
+      <w:r>
+        <w:t xml:space="preserve"> </w:t>
+      </w:r>
+      <w:r>
+        <w:t xml:space="preserve">led to Contentful, a six-figure annual enterprise contract, followed by a zero-disruption dual-serve migration; three marketing teams (</w:t>
+      </w:r>
+      <w:r>
+        <w:t xml:space="preserve">~18 people</w:t>
+      </w:r>
+      <w:r>
+        <w:t xml:space="preserve">) gained scheduling and structured content models.</w:t>
       </w:r>
     </w:p>
     <w:p>
@@ -722,46 +700,25 @@
           <w:b/>
           <w:bCs/>
         </w:rPr>
-        <w:t xml:space="preserve">Design Systems (Hearth) —</w:t>
-      </w:r>
-      <w:r>
-        <w:rPr>
-          <w:b/>
-          <w:bCs/>
-        </w:rPr>
-        <w:t xml:space="preserve"> </w:t>
-      </w:r>
-      <w:r>
-        <w:rPr>
-          <w:b/>
-          <w:bCs/>
-        </w:rPr>
-        <w:t xml:space="preserve">20 teams</w:t>
-      </w:r>
-      <w:r>
-        <w:rPr>
-          <w:b/>
-          <w:bCs/>
-        </w:rPr>
-        <w:t xml:space="preserve">, company-wide adoption:</w:t>
-      </w:r>
-      <w:r>
-        <w:t xml:space="preserve"> </w:t>
-      </w:r>
-      <w:r>
-        <w:t xml:space="preserve">Led adoption of the Hearth Design System across</w:t>
-      </w:r>
-      <w:r>
-        <w:t xml:space="preserve"> </w:t>
-      </w:r>
-      <w:r>
-        <w:t xml:space="preserve">20</w:t>
-      </w:r>
-      <w:r>
-        <w:t xml:space="preserve"> </w:t>
-      </w:r>
-      <w:r>
-        <w:t xml:space="preserve">engineering and product teams (15 full adoption, 5 partial). Consolidating component work at the Design System level eliminated thousands of hours of duplicated engineering effort — savings at rebrand scale reaching into the hundreds of thousands. Contributed to the company’s R&amp;D tax credit claims by translating Design Systems work into audit-ready documentation for external advisors.</w:t>
+        <w:t xml:space="preserve">Documentation &amp; Upskilling:</w:t>
+      </w:r>
+      <w:r>
+        <w:t xml:space="preserve"> </w:t>
+      </w:r>
+      <w:r>
+        <w:t xml:space="preserve">Authored over</w:t>
+      </w:r>
+      <w:r>
+        <w:t xml:space="preserve"> </w:t>
+      </w:r>
+      <w:r>
+        <w:t xml:space="preserve">100 articles</w:t>
+      </w:r>
+      <w:r>
+        <w:t xml:space="preserve"> </w:t>
+      </w:r>
+      <w:r>
+        <w:t xml:space="preserve">of technical documentation — the most thoroughly documented team at UW — and closed capability gaps (e.g. Kubernetes) through self-directed learning before training the team.</w:t>
       </w:r>
     </w:p>
     <w:p>
@@ -777,62 +734,13 @@
           <w:b/>
           <w:bCs/>
         </w:rPr>
-        <w:t xml:space="preserve">CMS Transformation (Apostrophe → Contentful):</w:t>
-      </w:r>
-      <w:r>
-        <w:t xml:space="preserve"> </w:t>
-      </w:r>
-      <w:r>
-        <w:t xml:space="preserve">Led the end-to-end replacement of an effectively abandoned legacy CMS (no SLA, no SSO, dead tech stack). Conducted rigorous</w:t>
-      </w:r>
-      <w:r>
-        <w:t xml:space="preserve"> </w:t>
-      </w:r>
-      <w:r>
-        <w:t xml:space="preserve">2-month</w:t>
-      </w:r>
-      <w:r>
-        <w:t xml:space="preserve"> </w:t>
-      </w:r>
-      <w:r>
-        <w:t xml:space="preserve">evaluation across</w:t>
-      </w:r>
-      <w:r>
-        <w:t xml:space="preserve"> </w:t>
-      </w:r>
-      <w:r>
-        <w:t xml:space="preserve">10 vendors</w:t>
-      </w:r>
-      <w:r>
-        <w:t xml:space="preserve">, shortlisted to 3, and selected Contentful — a six-figure annual enterprise contract, chosen for the enterprise-grade SLAs and support most vendors couldn’t offer. Executed a zero-disruption dual-serve migration; three marketing teams (</w:t>
-      </w:r>
-      <w:r>
-        <w:t xml:space="preserve">~18 people</w:t>
-      </w:r>
-      <w:r>
-        <w:t xml:space="preserve">) gained content scheduling, structured content models, and eliminated duplication — removing major technical debt.</w:t>
-      </w:r>
-    </w:p>
-    <w:p>
-      <w:pPr>
-        <w:pStyle w:val="Compact"/>
-        <w:numPr>
-          <w:ilvl w:val="0"/>
-          <w:numId w:val="1002"/>
-        </w:numPr>
-      </w:pPr>
-      <w:r>
-        <w:rPr>
-          <w:b/>
-          <w:bCs/>
-        </w:rPr>
         <w:t xml:space="preserve">Adaptability Under Constraints (2025–Present):</w:t>
       </w:r>
       <w:r>
         <w:t xml:space="preserve"> </w:t>
       </w:r>
       <w:r>
-        <w:t xml:space="preserve">Following restructurings that reduced the team to</w:t>
+        <w:t xml:space="preserve">After restructurings reduced the team to</w:t>
       </w:r>
       <w:r>
         <w:t xml:space="preserve"> </w:t>
@@ -841,7 +749,7 @@
         <w:t xml:space="preserve">2 engineers</w:t>
       </w:r>
       <w:r>
-        <w:t xml:space="preserve">, stepped across role boundaries — absorbing Product Manager and on-call responsibilities alongside Engineering Management — to sustain delivery across</w:t>
+        <w:t xml:space="preserve">, absorbed Product Manager and on-call responsibilities alongside Engineering Management — sustaining delivery across</w:t>
       </w:r>
       <w:r>
         <w:t xml:space="preserve"> </w:t>
@@ -853,7 +761,7 @@
         <w:t xml:space="preserve"> </w:t>
       </w:r>
       <w:r>
-        <w:t xml:space="preserve">with full accountability for the uw.co.uk estate, without losing a single engineer or breaching the platform SLO.</w:t>
+        <w:t xml:space="preserve">with full accountability for the uw.co.uk estate, without losing an engineer or breaching the platform SLO.</w:t>
       </w:r>
     </w:p>
     <w:bookmarkEnd w:id="14"/>
@@ -875,67 +783,13 @@
           <w:b/>
           <w:bCs/>
         </w:rPr>
-        <w:t xml:space="preserve">Company</w:t>
-      </w:r>
-      <w:r>
-        <w:t xml:space="preserve">: Utility Warehouse (Telecom Plus PLC · FTSE 250 — multi-service provider of energy, broadband, mobile &amp; insurance)</w:t>
-      </w:r>
-      <w:r>
-        <w:t xml:space="preserve"> </w:t>
-      </w:r>
-      <w:r>
-        <w:rPr>
-          <w:b/>
-          <w:bCs/>
-        </w:rPr>
-        <w:t xml:space="preserve">Dates</w:t>
-      </w:r>
-      <w:r>
-        <w:t xml:space="preserve">: May 2022 - Jul 2023 (1 yr 3 mos)</w:t>
+        <w:t xml:space="preserve">Utility Warehouse</w:t>
       </w:r>
       <w:r>
         <w:br/>
       </w:r>
       <w:r>
-        <w:rPr>
-          <w:b/>
-          <w:bCs/>
-        </w:rPr>
-        <w:t xml:space="preserve">Location</w:t>
-      </w:r>
-      <w:r>
-        <w:t xml:space="preserve">: United Kingdom · Remote</w:t>
-      </w:r>
-      <w:r>
-        <w:br/>
-      </w:r>
-      <w:r>
-        <w:rPr>
-          <w:b/>
-          <w:bCs/>
-        </w:rPr>
-        <w:t xml:space="preserve">Employment Type</w:t>
-      </w:r>
-      <w:r>
-        <w:t xml:space="preserve">: Full-time</w:t>
-      </w:r>
-    </w:p>
-    <w:p>
-      <w:pPr>
-        <w:pStyle w:val="BodyText"/>
-      </w:pPr>
-      <w:r>
-        <w:rPr>
-          <w:b/>
-          <w:bCs/>
-        </w:rPr>
-        <w:t xml:space="preserve">Description:</w:t>
-      </w:r>
-      <w:r>
-        <w:t xml:space="preserve"> </w:t>
-      </w:r>
-      <w:r>
-        <w:t xml:space="preserve">Joined a standalone team with no formal department, no established processes, and no documentation — built to leverage my cross-functional expertise in engineering, UX, and Agile delivery.</w:t>
+        <w:t xml:space="preserve">May 2022 – Jul 2023 (1 yr 3 mos) · United Kingdom · Remote</w:t>
       </w:r>
     </w:p>
     <w:p>
@@ -957,7 +811,7 @@
         <w:t xml:space="preserve"> </w:t>
       </w:r>
       <w:r>
-        <w:t xml:space="preserve">Joined as the founding engineer in a standalone team supporting marketing — no department, no precedent. Started as three — myself, a Product Manager, and an Associate Engineer — and held that shape for a full year, delivering with a single engineer before headcount arrived. Line-managed that engineer from May 2022: for the first year I reported directly to a VP of Engineering — no Head of Engineering in between — so people responsibility sat with me from the start,</w:t>
+        <w:t xml:space="preserve">Joined as the founding engineer in a standalone team supporting marketing — no department, no processes, no documentation. Started as three — myself, a Product Manager, and an Associate Engineer — and delivered for a full year with a single engineer, whom I line-managed from May 2022: people responsibility</w:t>
       </w:r>
       <w:r>
         <w:t xml:space="preserve"> </w:t>
@@ -969,7 +823,7 @@
         <w:t xml:space="preserve"> </w:t>
       </w:r>
       <w:r>
-        <w:t xml:space="preserve">before the title caught up. Grew to</w:t>
+        <w:t xml:space="preserve">before the title caught up. Grew the team to</w:t>
       </w:r>
       <w:r>
         <w:t xml:space="preserve"> </w:t>
@@ -981,7 +835,7 @@
         <w:t xml:space="preserve"> </w:t>
       </w:r>
       <w:r>
-        <w:t xml:space="preserve">in May 2023 with two external hires, and promoted the founding Associate to Software Engineer a month later — a promotion case my manager asked me to prepare and drive while I was still Lead. The team was renamed Content Capability (Nov 2022) and moved into the Platforms department (May 2023) — the first of three reorganisations it would outlast, a mark of its embedded value to the business.</w:t>
+        <w:t xml:space="preserve">in May 2023 and promoted the founding Associate a month later — a promotion case I prepared and drove while still Lead.</w:t>
       </w:r>
     </w:p>
     <w:p>
@@ -1003,25 +857,19 @@
         <w:t xml:space="preserve"> </w:t>
       </w:r>
       <w:r>
-        <w:t xml:space="preserve">Established a fully operational Scrum environment with structured backlog, measurable velocity, and predictable delivery — filling Product Manager gaps when needed and transforming a nascent capability into a reliable engineering team. Conducted systematic discovery (</w:t>
-      </w:r>
-      <w:r>
-        <w:t xml:space="preserve">“Archeology”</w:t>
-      </w:r>
-      <w:r>
-        <w:t xml:space="preserve">) on the legacy Apostrophe CMS, authored the team’s foundational documentation, and set the standard that would grow into</w:t>
-      </w:r>
-      <w:r>
-        <w:t xml:space="preserve"> </w:t>
-      </w:r>
-      <w:r>
-        <w:t xml:space="preserve">100+ articles</w:t>
-      </w:r>
-      <w:r>
-        <w:t xml:space="preserve"> </w:t>
-      </w:r>
-      <w:r>
-        <w:t xml:space="preserve">of process and technical documentation.</w:t>
+        <w:t xml:space="preserve">Established a fully operational Scrum environment — structured backlog, measurable velocity, predictable delivery — filling Product Manager gaps when needed, and authored the foundational documentation that grew into the team’s</w:t>
+      </w:r>
+      <w:r>
+        <w:t xml:space="preserve"> </w:t>
+      </w:r>
+      <w:r>
+        <w:t xml:space="preserve">100+</w:t>
+      </w:r>
+      <w:r>
+        <w:t xml:space="preserve"> </w:t>
+      </w:r>
+      <w:r>
+        <w:t xml:space="preserve">article library.</w:t>
       </w:r>
     </w:p>
     <w:p>
@@ -1043,7 +891,7 @@
         <w:t xml:space="preserve"> </w:t>
       </w:r>
       <w:r>
-        <w:t xml:space="preserve">Led the evaluation process that resulted in UW’s adoption of Contentful as its enterprise CMS. Presented findings and audit trail to leadership; recommendation accepted and implemented.</w:t>
+        <w:t xml:space="preserve">Led the evaluation that resulted in UW’s adoption of Contentful as its enterprise CMS; presented findings and audit trail to leadership — recommendation accepted and implemented.</w:t>
       </w:r>
     </w:p>
     <w:bookmarkEnd w:id="15"/>
@@ -1065,49 +913,13 @@
           <w:b/>
           <w:bCs/>
         </w:rPr>
-        <w:t xml:space="preserve">Company</w:t>
-      </w:r>
-      <w:r>
-        <w:t xml:space="preserve">: IMA-HOME</w:t>
+        <w:t xml:space="preserve">IMA-HOME</w:t>
       </w:r>
       <w:r>
         <w:br/>
       </w:r>
       <w:r>
-        <w:rPr>
-          <w:b/>
-          <w:bCs/>
-        </w:rPr>
-        <w:t xml:space="preserve">Dates</w:t>
-      </w:r>
-      <w:r>
-        <w:t xml:space="preserve">: Jan 2020 - Apr 2022 (2 yrs 4 mos)</w:t>
-      </w:r>
-      <w:r>
-        <w:br/>
-      </w:r>
-      <w:r>
-        <w:rPr>
-          <w:b/>
-          <w:bCs/>
-        </w:rPr>
-        <w:t xml:space="preserve">Location</w:t>
-      </w:r>
-      <w:r>
-        <w:t xml:space="preserve">: Leeds, England, United Kingdom</w:t>
-      </w:r>
-      <w:r>
-        <w:br/>
-      </w:r>
-      <w:r>
-        <w:rPr>
-          <w:b/>
-          <w:bCs/>
-        </w:rPr>
-        <w:t xml:space="preserve">Employment Type</w:t>
-      </w:r>
-      <w:r>
-        <w:t xml:space="preserve">: Full-time, Hybrid</w:t>
+        <w:t xml:space="preserve">Jan 2020 – Apr 2022 (2 yrs 4 mos) · Leeds, UK · Hybrid</w:t>
       </w:r>
     </w:p>
     <w:p>
@@ -1115,19 +927,16 @@
         <w:pStyle w:val="BodyText"/>
       </w:pPr>
       <w:r>
-        <w:rPr>
-          <w:b/>
-          <w:bCs/>
-        </w:rPr>
-        <w:t xml:space="preserve">Description</w:t>
-      </w:r>
-      <w:r>
-        <w:t xml:space="preserve">: Operated as a dual-role technical leader for global brands (Adidas, MARS). Alongside architecting frontend solutions, I formally took on Scrum Master responsibilities to elevate the organisation’s delivery standards and project predictability.</w:t>
-      </w:r>
-    </w:p>
-    <w:p>
-      <w:pPr>
-        <w:pStyle w:val="BodyText"/>
+        <w:t xml:space="preserve">Dual-role technical leader for global brands (Adidas, MARS) — architecting frontend solutions while formally holding Scrum Master responsibilities to raise the organisation’s delivery standards.</w:t>
+      </w:r>
+    </w:p>
+    <w:p>
+      <w:pPr>
+        <w:pStyle w:val="Compact"/>
+        <w:numPr>
+          <w:ilvl w:val="0"/>
+          <w:numId w:val="1004"/>
+        </w:numPr>
       </w:pPr>
       <w:r>
         <w:rPr>
@@ -1140,12 +949,16 @@
         <w:t xml:space="preserve"> </w:t>
       </w:r>
       <w:r>
-        <w:t xml:space="preserve">Introduced structured Agile/Scrum practices to an agency running entirely on ad-hoc, fire-driven delivery. Result: measurable sprint velocity, predictable project allocation, and regular client demos — improving delivery health and client confidence across the board.</w:t>
-      </w:r>
-    </w:p>
-    <w:p>
-      <w:pPr>
-        <w:pStyle w:val="BodyText"/>
+        <w:t xml:space="preserve">Introduced structured Agile/Scrum practices to an agency running entirely on ad-hoc, fire-driven delivery — measurable sprint velocity, predictable project allocation, and regular client demos.</w:t>
+      </w:r>
+    </w:p>
+    <w:p>
+      <w:pPr>
+        <w:pStyle w:val="Compact"/>
+        <w:numPr>
+          <w:ilvl w:val="0"/>
+          <w:numId w:val="1004"/>
+        </w:numPr>
       </w:pPr>
       <w:r>
         <w:rPr>
@@ -1170,12 +983,12 @@
         <w:t xml:space="preserve"> </w:t>
       </w:r>
       <w:r>
-        <w:t xml:space="preserve">including Japan and Saudi Arabia, with RTL and vertical reading direction support. Served traffic in the millions.</w:t>
-      </w:r>
-    </w:p>
-    <w:p>
-      <w:pPr>
-        <w:pStyle w:val="BodyText"/>
+        <w:t xml:space="preserve">including Japan and Saudi Arabia, with RTL and vertical reading direction support; served traffic in the millions.</w:t>
+      </w:r>
+    </w:p>
+    <w:p>
+      <w:pPr>
+        <w:pStyle w:val="FirstParagraph"/>
       </w:pPr>
       <w:r>
         <w:rPr>
@@ -1207,49 +1020,19 @@
           <w:b/>
           <w:bCs/>
         </w:rPr>
-        <w:t xml:space="preserve">Company</w:t>
-      </w:r>
-      <w:r>
-        <w:t xml:space="preserve">: Leeds Building Society (5th largest UK building society · £31B+ assets)</w:t>
+        <w:t xml:space="preserve">Leeds Building Society</w:t>
+      </w:r>
+      <w:r>
+        <w:t xml:space="preserve"> </w:t>
+      </w:r>
+      <w:r>
+        <w:t xml:space="preserve">(5th largest UK building society · £31B+ assets)</w:t>
       </w:r>
       <w:r>
         <w:br/>
       </w:r>
       <w:r>
-        <w:rPr>
-          <w:b/>
-          <w:bCs/>
-        </w:rPr>
-        <w:t xml:space="preserve">Dates</w:t>
-      </w:r>
-      <w:r>
-        <w:t xml:space="preserve">: Oct 2018 - Jan 2020 (1 yr 4 mos)</w:t>
-      </w:r>
-      <w:r>
-        <w:br/>
-      </w:r>
-      <w:r>
-        <w:rPr>
-          <w:b/>
-          <w:bCs/>
-        </w:rPr>
-        <w:t xml:space="preserve">Location</w:t>
-      </w:r>
-      <w:r>
-        <w:t xml:space="preserve">: Leeds, England, United Kingdom · Hybrid</w:t>
-      </w:r>
-      <w:r>
-        <w:br/>
-      </w:r>
-      <w:r>
-        <w:rPr>
-          <w:b/>
-          <w:bCs/>
-        </w:rPr>
-        <w:t xml:space="preserve">Employment Type</w:t>
-      </w:r>
-      <w:r>
-        <w:t xml:space="preserve">: Full-time</w:t>
+        <w:t xml:space="preserve">Oct 2018 – Jan 2020 (1 yr 4 mos) · Leeds, UK · Hybrid</w:t>
       </w:r>
     </w:p>
     <w:p>
@@ -1257,19 +1040,16 @@
         <w:pStyle w:val="BodyText"/>
       </w:pPr>
       <w:r>
-        <w:rPr>
-          <w:b/>
-          <w:bCs/>
-        </w:rPr>
-        <w:t xml:space="preserve">Description</w:t>
-      </w:r>
-      <w:r>
-        <w:t xml:space="preserve">: Maintained public-facing digital assets for the UK’s 5th largest building society — a highly regulated financial services environment — while actively mentoring engineering teams to elevate code quality and UX standards.</w:t>
-      </w:r>
-    </w:p>
-    <w:p>
-      <w:pPr>
-        <w:pStyle w:val="BodyText"/>
+        <w:t xml:space="preserve">Maintained public-facing digital assets for the UK’s 5th largest building society — a highly regulated financial services environment — while mentoring teams on code quality and UX standards.</w:t>
+      </w:r>
+    </w:p>
+    <w:p>
+      <w:pPr>
+        <w:pStyle w:val="Compact"/>
+        <w:numPr>
+          <w:ilvl w:val="0"/>
+          <w:numId w:val="1005"/>
+        </w:numPr>
       </w:pPr>
       <w:r>
         <w:rPr>
@@ -1282,25 +1062,29 @@
         <w:t xml:space="preserve"> </w:t>
       </w:r>
       <w:r>
-        <w:t xml:space="preserve">Introduced Agile and Scrum to LBS for the first time, shifting a high-bureaucracy, low-velocity organisation from ad-hoc output to sprint-based iterative delivery with measurable velocity. Acted as the primary driver for Agile adoption across the department throughout my tenure.</w:t>
-      </w:r>
-    </w:p>
-    <w:p>
-      <w:pPr>
-        <w:pStyle w:val="BodyText"/>
-      </w:pPr>
-      <w:r>
-        <w:rPr>
-          <w:b/>
-          <w:bCs/>
-        </w:rPr>
-        <w:t xml:space="preserve">Leadership in Crisis — Digital Transformation (Interim Scrum Master, Jun–Oct 2019):</w:t>
-      </w:r>
-      <w:r>
-        <w:t xml:space="preserve"> </w:t>
-      </w:r>
-      <w:r>
-        <w:t xml:space="preserve">Formally appointed to stabilise delivery and lead the Digital Transformation programme — working alongside external consultants and cross-functional teams to move a firefighting culture into structured, iterative feature development with regular delivery cadences.</w:t>
+        <w:t xml:space="preserve">Introduced Agile and Scrum to LBS for the first time — shifting a high-bureaucracy, low-velocity organisation to sprint-based iterative delivery, and acting as the primary driver of Agile adoption across the department.</w:t>
+      </w:r>
+    </w:p>
+    <w:p>
+      <w:pPr>
+        <w:pStyle w:val="Compact"/>
+        <w:numPr>
+          <w:ilvl w:val="0"/>
+          <w:numId w:val="1005"/>
+        </w:numPr>
+      </w:pPr>
+      <w:r>
+        <w:rPr>
+          <w:b/>
+          <w:bCs/>
+        </w:rPr>
+        <w:t xml:space="preserve">Leadership in Crisis (Interim Scrum Master, Jun–Oct 2019):</w:t>
+      </w:r>
+      <w:r>
+        <w:t xml:space="preserve"> </w:t>
+      </w:r>
+      <w:r>
+        <w:t xml:space="preserve">Formally appointed to stabilise delivery and lead the Digital Transformation programme — moving a firefighting culture into structured, iterative feature development alongside external consultants and cross-functional teams.</w:t>
       </w:r>
     </w:p>
     <w:bookmarkEnd w:id="17"/>
@@ -1322,49 +1106,13 @@
           <w:b/>
           <w:bCs/>
         </w:rPr>
-        <w:t xml:space="preserve">Company</w:t>
-      </w:r>
-      <w:r>
-        <w:t xml:space="preserve">: Jadu</w:t>
+        <w:t xml:space="preserve">Jadu</w:t>
       </w:r>
       <w:r>
         <w:br/>
       </w:r>
       <w:r>
-        <w:rPr>
-          <w:b/>
-          <w:bCs/>
-        </w:rPr>
-        <w:t xml:space="preserve">Dates</w:t>
-      </w:r>
-      <w:r>
-        <w:t xml:space="preserve">: Jan 2017 - Oct 2018 (1 yr 10 mos)</w:t>
-      </w:r>
-      <w:r>
-        <w:br/>
-      </w:r>
-      <w:r>
-        <w:rPr>
-          <w:b/>
-          <w:bCs/>
-        </w:rPr>
-        <w:t xml:space="preserve">Location</w:t>
-      </w:r>
-      <w:r>
-        <w:t xml:space="preserve">: Leeds, England, United Kingdom · Hybrid</w:t>
-      </w:r>
-      <w:r>
-        <w:br/>
-      </w:r>
-      <w:r>
-        <w:rPr>
-          <w:b/>
-          <w:bCs/>
-        </w:rPr>
-        <w:t xml:space="preserve">Employment Type</w:t>
-      </w:r>
-      <w:r>
-        <w:t xml:space="preserve">: Full-time</w:t>
+        <w:t xml:space="preserve">Jan 2017 – Oct 2018 (1 yr 10 mos) · Leeds, UK · Hybrid</w:t>
       </w:r>
     </w:p>
     <w:p>
@@ -1372,29 +1120,29 @@
         <w:pStyle w:val="BodyText"/>
       </w:pPr>
       <w:r>
-        <w:rPr>
-          <w:b/>
-          <w:bCs/>
-        </w:rPr>
-        <w:t xml:space="preserve">Description</w:t>
-      </w:r>
-      <w:r>
-        <w:t xml:space="preserve">: Designed UIs and developed new features with a strict focus on user experience, accessibility, and W3C standards for an award-winning custom CMS used by Local Authorities, Higher Education, and third-sector organisations.</w:t>
-      </w:r>
-    </w:p>
-    <w:p>
-      <w:pPr>
-        <w:pStyle w:val="BodyText"/>
-      </w:pPr>
-      <w:r>
-        <w:rPr>
-          <w:b/>
-          <w:bCs/>
-        </w:rPr>
-        <w:t xml:space="preserve">Design Systems</w:t>
-      </w:r>
-      <w:r>
-        <w:t xml:space="preserve">: Co-created and maintained</w:t>
+        <w:t xml:space="preserve">Designed UIs and developed features for an award-winning CMS used by Local Authorities, Higher Education, and third-sector organisations — with UX, accessibility, and W3C standards as non-negotiables.</w:t>
+      </w:r>
+    </w:p>
+    <w:p>
+      <w:pPr>
+        <w:pStyle w:val="Compact"/>
+        <w:numPr>
+          <w:ilvl w:val="0"/>
+          <w:numId w:val="1006"/>
+        </w:numPr>
+      </w:pPr>
+      <w:r>
+        <w:rPr>
+          <w:b/>
+          <w:bCs/>
+        </w:rPr>
+        <w:t xml:space="preserve">Design Systems (Pulsar):</w:t>
+      </w:r>
+      <w:r>
+        <w:t xml:space="preserve"> </w:t>
+      </w:r>
+      <w:r>
+        <w:t xml:space="preserve">Co-created and maintained</w:t>
       </w:r>
       <w:r>
         <w:t xml:space="preserve"> </w:t>
@@ -1410,27 +1158,16 @@
         <w:t xml:space="preserve"> </w:t>
       </w:r>
       <w:r>
-        <w:t xml:space="preserve">— an open-source UX and Interface Design System powering the Jadu Continuum Platform. This is the foundation of my Design Systems specialism, combining component architecture, accessibility, and cross-team enablement.</w:t>
-      </w:r>
-    </w:p>
-    <w:p>
-      <w:pPr>
-        <w:pStyle w:val="BodyText"/>
-      </w:pPr>
-      <w:r>
-        <w:rPr>
-          <w:b/>
-          <w:bCs/>
-        </w:rPr>
-        <w:t xml:space="preserve">Agile Delivery</w:t>
-      </w:r>
-      <w:r>
-        <w:t xml:space="preserve">: Gained foundational, hands-on Agile leadership experience through a rotating Scrum Master model, facilitating sprint planning, daily standups, and embedding the core principles of the Agile manifesto into the team’s workflow.</w:t>
-      </w:r>
-    </w:p>
-    <w:p>
-      <w:pPr>
-        <w:pStyle w:val="BodyText"/>
+        <w:t xml:space="preserve">— an open-source UX and Interface Design System powering the Jadu Continuum Platform, and the foundation of my Design Systems specialism.</w:t>
+      </w:r>
+    </w:p>
+    <w:p>
+      <w:pPr>
+        <w:pStyle w:val="Compact"/>
+        <w:numPr>
+          <w:ilvl w:val="0"/>
+          <w:numId w:val="1006"/>
+        </w:numPr>
       </w:pPr>
       <w:r>
         <w:rPr>
@@ -1443,12 +1180,34 @@
         <w:t xml:space="preserve"> </w:t>
       </w:r>
       <w:r>
-        <w:t xml:space="preserve">Owned the full feature lifecycle for the CMS product — conducting regular on-site contextual inquiry at client organisations (Wyre Council, Rotherham Council, Greater Manchester Combined Authority, City of York Council, University of Leeds), distilling field research into reports that shaped the product roadmap, and iterating from mockups through usability testing to production release. Operated as one of three product-area leads (CMS, Forms, CRM), each independently responsible for their domain.</w:t>
-      </w:r>
-    </w:p>
-    <w:p>
-      <w:pPr>
-        <w:pStyle w:val="BodyText"/>
+        <w:t xml:space="preserve">Owned the full feature lifecycle as one of three product-area leads (CMS, Forms, CRM) — regular on-site contextual inquiry at client organisations (Wyre, Rotherham, and City of York Councils, Greater Manchester Combined Authority, University of Leeds), field research shaping the product roadmap, and iteration from mockups through usability testing to release.</w:t>
+      </w:r>
+    </w:p>
+    <w:p>
+      <w:pPr>
+        <w:pStyle w:val="Compact"/>
+        <w:numPr>
+          <w:ilvl w:val="0"/>
+          <w:numId w:val="1006"/>
+        </w:numPr>
+      </w:pPr>
+      <w:r>
+        <w:rPr>
+          <w:b/>
+          <w:bCs/>
+        </w:rPr>
+        <w:t xml:space="preserve">Agile Delivery:</w:t>
+      </w:r>
+      <w:r>
+        <w:t xml:space="preserve"> </w:t>
+      </w:r>
+      <w:r>
+        <w:t xml:space="preserve">Foundational hands-on Agile leadership through a rotating Scrum Master model.</w:t>
+      </w:r>
+    </w:p>
+    <w:p>
+      <w:pPr>
+        <w:pStyle w:val="FirstParagraph"/>
       </w:pPr>
       <w:r>
         <w:rPr>
@@ -1458,7 +1217,7 @@
         <w:t xml:space="preserve">Projects</w:t>
       </w:r>
       <w:r>
-        <w:t xml:space="preserve">: Award-winning custom CMS for large-scale public sector institutions — Open source Interface Design System (</w:t>
+        <w:t xml:space="preserve">: Award-winning custom CMS for large-scale public sector institutions — open-source Interface Design System (</w:t>
       </w:r>
       <w:hyperlink r:id="rId18">
         <w:r>
@@ -1487,14 +1246,7 @@
         <w:pStyle w:val="FirstParagraph"/>
       </w:pPr>
       <w:r>
-        <w:rPr>
-          <w:b/>
-          <w:bCs/>
-        </w:rPr>
-        <w:t xml:space="preserve">Dates</w:t>
-      </w:r>
-      <w:r>
-        <w:t xml:space="preserve">: Oct 2005 - Dec 2016 (11 years)</w:t>
+        <w:t xml:space="preserve">Oct 2005 – Dec 2016 (11 years)</w:t>
       </w:r>
     </w:p>
     <w:p>
@@ -1510,7 +1262,7 @@
         <w:pStyle w:val="Compact"/>
         <w:numPr>
           <w:ilvl w:val="0"/>
-          <w:numId w:val="1004"/>
+          <w:numId w:val="1007"/>
         </w:numPr>
       </w:pPr>
       <w:r>
@@ -1524,7 +1276,7 @@
         <w:t xml:space="preserve"> </w:t>
       </w:r>
       <w:r>
-        <w:t xml:space="preserve">Delivered 40+ web projects across Greece and internationally — from local non-profits and bands to a Bitcoin job board for a client in California. Managed end-to-end client relationships, established professional billing structures (40/40/20 payment terms), and coordinated with distributed development teams. Platforms: WordPress, Drupal, custom HTML/CSS.</w:t>
+        <w:t xml:space="preserve">Delivered 40+ web projects across Greece and internationally — from local non-profits and bands to a Bitcoin job board for a client in California — managing end-to-end client relationships, professional billing structures, and distributed development teams.</w:t>
       </w:r>
     </w:p>
     <w:p>
@@ -1532,7 +1284,7 @@
         <w:pStyle w:val="Compact"/>
         <w:numPr>
           <w:ilvl w:val="0"/>
-          <w:numId w:val="1004"/>
+          <w:numId w:val="1007"/>
         </w:numPr>
       </w:pPr>
       <w:r>
@@ -1546,7 +1298,7 @@
         <w:t xml:space="preserve"> </w:t>
       </w:r>
       <w:r>
-        <w:t xml:space="preserve">Co-founded the Serres Linux Users Group, organised FOSSCOMM 2012 (a 350-person national open-source conference), and managed the digital presence for UNESCO Serres, the local Natural History Museum, an EVS programme, and the MSG Panserraikos sports club. This civic technology portfolio predates and directly informs my later UK community work (GDG Leeds, IxDF Leeds, NUX).</w:t>
+        <w:t xml:space="preserve">Co-founded the Serres Linux Users Group, organised FOSSCOMM 2012 (a 350-person national open-source conference), and managed the digital presence for UNESCO Serres and other civic organisations — a portfolio that predates and directly informs my later UK community work (GDG Leeds, IxDF Leeds, NUX).</w:t>
       </w:r>
     </w:p>
     <w:p>
@@ -1554,7 +1306,7 @@
         <w:pStyle w:val="Compact"/>
         <w:numPr>
           <w:ilvl w:val="0"/>
-          <w:numId w:val="1004"/>
+          <w:numId w:val="1007"/>
         </w:numPr>
       </w:pPr>
       <w:r>
@@ -1568,7 +1320,7 @@
         <w:t xml:space="preserve"> </w:t>
       </w:r>
       <w:r>
-        <w:t xml:space="preserve">Earned a Certified Training Professional (CTP) qualification and spent a year teaching ECDL to adult learners. Privately tutored a student in algorithmic logic, C, and hardware (Arduino/Raspberry Pi) — that student went on to earn a BSc and MSc in Manchester and now works as an engineer at Sophos.</w:t>
+        <w:t xml:space="preserve">Earned a Certified Training Professional (CTP) qualification and spent a year teaching ECDL to adult learners. Privately tutored a student in algorithmic logic, C, and hardware — that student is now an engineer at Sophos.</w:t>
       </w:r>
     </w:p>
     <w:p>
@@ -1576,7 +1328,7 @@
         <w:pStyle w:val="Compact"/>
         <w:numPr>
           <w:ilvl w:val="0"/>
-          <w:numId w:val="1004"/>
+          <w:numId w:val="1007"/>
         </w:numPr>
       </w:pPr>
       <w:r>
@@ -1590,7 +1342,7 @@
         <w:t xml:space="preserve"> </w:t>
       </w:r>
       <w:r>
-        <w:t xml:space="preserve">Relocated to Leeds. Delivered frontend engineering for agencies — building responsive e-commerce for global fashion and retail brands (Vivienne Westwood) and driving performance optimisation.</w:t>
+        <w:t xml:space="preserve">Relocated to Leeds — frontend engineering for agencies, building responsive e-commerce for global fashion brands (Vivienne Westwood) and driving performance optimisation.</w:t>
       </w:r>
     </w:p>
     <w:bookmarkEnd w:id="20"/>
@@ -2080,6 +1832,15 @@
     <w:abstractNumId w:val="991"/>
   </w:num>
   <w:num w:numId="1004">
+    <w:abstractNumId w:val="991"/>
+  </w:num>
+  <w:num w:numId="1005">
+    <w:abstractNumId w:val="991"/>
+  </w:num>
+  <w:num w:numId="1006">
+    <w:abstractNumId w:val="991"/>
+  </w:num>
+  <w:num w:numId="1007">
     <w:abstractNumId w:val="991"/>
   </w:num>
 </w:numbering>

</xml_diff>

<commit_message>
feat: enhance print styles and update CV generation script with reference DOCX
</commit_message>
<xml_diff>
--- a/assets/Nikos_Vasileiadis_CV.docx
+++ b/assets/Nikos_Vasileiadis_CV.docx
@@ -1610,6 +1610,8 @@
       <w:footnotePr>
         <w:numRestart w:val="eachSect"/>
       </w:footnotePr>
+      <w:pgSz w:h="16838" w:w="11906"/>
+      <w:pgMar w:bottom="737" w:footer="454" w:gutter="0" w:header="454" w:left="850" w:right="850" w:top="737"/>
     </w:sectPr>
   </w:body>
 </w:document>
@@ -1852,8 +1854,8 @@
     <w:rPrDefault>
       <w:rPr>
         <w:rFonts w:asciiTheme="minorHAnsi" w:cstheme="minorBidi" w:eastAsiaTheme="minorEastAsia" w:hAnsiTheme="minorHAnsi"/>
-        <w:sz w:val="24"/>
-        <w:szCs w:val="24"/>
+        <w:sz w:val="21"/>
+        <w:szCs w:val="21"/>
         <w:lang w:bidi="ar-SA" w:eastAsia="zh-CN" w:val="en-US"/>
       </w:rPr>
     </w:rPrDefault>
@@ -1874,7 +1876,7 @@
     <w:link w:val="BodyTextChar"/>
     <w:qFormat/>
     <w:pPr>
-      <w:spacing w:after="180" w:before="180"/>
+      <w:spacing w:after="120" w:before="0"/>
     </w:pPr>
   </w:style>
   <w:style w:customStyle="1" w:styleId="FirstParagraph" w:type="paragraph">
@@ -2035,12 +2037,12 @@
     <w:pPr>
       <w:keepNext/>
       <w:keepLines/>
-      <w:spacing w:after="80" w:before="360"/>
+      <w:spacing w:after="60" w:before="0"/>
       <w:outlineLvl w:val="0"/>
     </w:pPr>
     <w:rPr>
       <w:rFonts w:asciiTheme="majorHAnsi" w:cstheme="majorBidi" w:eastAsiaTheme="majorEastAsia" w:hAnsiTheme="majorHAnsi"/>
-      <w:color w:themeColor="accent1" w:themeShade="BF" w:val="0F4761"/>
+      <w:color w:themeColor="accent1" w:themeShade="BF" w:val="1A1A1A"/>
       <w:sz w:val="40"/>
       <w:szCs w:val="40"/>
     </w:rPr>
@@ -2058,14 +2060,14 @@
     <w:pPr>
       <w:keepNext/>
       <w:keepLines/>
-      <w:spacing w:after="80" w:before="160"/>
+      <w:spacing w:after="100" w:before="240"/>
       <w:outlineLvl w:val="1"/>
     </w:pPr>
     <w:rPr>
       <w:rFonts w:asciiTheme="majorHAnsi" w:cstheme="majorBidi" w:eastAsiaTheme="majorEastAsia" w:hAnsiTheme="majorHAnsi"/>
-      <w:color w:themeColor="accent1" w:themeShade="BF" w:val="0F4761"/>
-      <w:sz w:val="32"/>
-      <w:szCs w:val="32"/>
+      <w:color w:themeColor="accent1" w:themeShade="BF" w:val="1A1A1A"/>
+      <w:sz w:val="26"/>
+      <w:szCs w:val="26"/>
     </w:rPr>
   </w:style>
   <w:style w:styleId="Heading3" w:type="paragraph">
@@ -2081,14 +2083,14 @@
     <w:pPr>
       <w:keepNext/>
       <w:keepLines/>
-      <w:spacing w:after="80" w:before="160"/>
+      <w:spacing w:after="60" w:before="200"/>
       <w:outlineLvl w:val="2"/>
     </w:pPr>
     <w:rPr>
       <w:rFonts w:cstheme="majorBidi" w:eastAsiaTheme="majorEastAsia"/>
-      <w:color w:themeColor="accent1" w:themeShade="BF" w:val="0F4761"/>
-      <w:sz w:val="28"/>
-      <w:szCs w:val="28"/>
+      <w:color w:themeColor="accent1" w:themeShade="BF" w:val="1A1A1A"/>
+      <w:sz w:val="23"/>
+      <w:szCs w:val="23"/>
     </w:rPr>
   </w:style>
   <w:style w:styleId="Heading4" w:type="paragraph">
@@ -2111,7 +2113,7 @@
       <w:rFonts w:cstheme="majorBidi" w:eastAsiaTheme="majorEastAsia"/>
       <w:i/>
       <w:iCs/>
-      <w:color w:themeColor="accent1" w:themeShade="BF" w:val="0F4761"/>
+      <w:color w:themeColor="accent1" w:themeShade="BF" w:val="1A1A1A"/>
     </w:rPr>
   </w:style>
   <w:style w:styleId="Heading5" w:type="paragraph">
@@ -2132,7 +2134,7 @@
     </w:pPr>
     <w:rPr>
       <w:rFonts w:cstheme="majorBidi" w:eastAsiaTheme="majorEastAsia"/>
-      <w:color w:themeColor="accent1" w:themeShade="BF" w:val="0F4761"/>
+      <w:color w:themeColor="accent1" w:themeShade="BF" w:val="1A1A1A"/>
     </w:rPr>
   </w:style>
   <w:style w:styleId="Heading6" w:type="paragraph">
@@ -2155,7 +2157,7 @@
       <w:rFonts w:cstheme="majorBidi" w:eastAsiaTheme="majorEastAsia"/>
       <w:i/>
       <w:iCs/>
-      <w:color w:themeColor="text1" w:themeTint="A6" w:val="595959"/>
+      <w:color w:themeColor="text1" w:themeTint="A6" w:val="1A1A1A"/>
     </w:rPr>
   </w:style>
   <w:style w:styleId="Heading7" w:type="paragraph">

</xml_diff>

<commit_message>
feat: update CV and credentials pages to include Zopa as a client
</commit_message>
<xml_diff>
--- a/assets/Nikos_Vasileiadis_CV.docx
+++ b/assets/Nikos_Vasileiadis_CV.docx
@@ -998,7 +998,17 @@
         <w:t xml:space="preserve">Projects</w:t>
       </w:r>
       <w:r>
-        <w:t xml:space="preserve">: Adidas, MARS, Gregg Wallace, Leeds Rhinos, Royal Canin</w:t>
+        <w:t xml:space="preserve">: Adidas, MARS, Gregg Wallace, Leeds Rhinos, Royal Canin, Zopa</w:t>
+      </w:r>
+      <w:r>
+        <w:t xml:space="preserve"> </w:t>
+      </w:r>
+      <w:r>
+        <w:rPr>
+          <w:i/>
+          <w:iCs/>
+        </w:rPr>
+        <w:t xml:space="preserve">(now Zopa Bank)</w:t>
       </w:r>
     </w:p>
     <w:bookmarkEnd w:id="16"/>

</xml_diff>

<commit_message>
style: update badge styles in minima.scss and revise content in credentials, CV, and CV translations to reflect recent achievements and metrics
</commit_message>
<xml_diff>
--- a/assets/Nikos_Vasileiadis_CV.docx
+++ b/assets/Nikos_Vasileiadis_CV.docx
@@ -130,7 +130,7 @@
         <w:t xml:space="preserve"> </w:t>
       </w:r>
       <w:r>
-        <w:t xml:space="preserve">of them line-managing engineers — across regulated industries. I treat engineering as a business lever — contributing to CapEx/OpEx planning and ensuring technical investments map directly to business outcomes. The pattern across those years is consistent: I build the thing that isn’t there — a team where there was no department, documentation from zero, structure where there was firefighting, a career where there was no industry to offer one. Technical depth across frontend and platform architecture establishes credibility; my true strength is designing the conditions where engineers do their best work.</w:t>
+        <w:t xml:space="preserve">of them line-managing engineers — across regulated industries. I treat engineering as a business lever — contributing to CapEx/OpEx planning and ensuring technical investments map directly to business outcomes. The pattern across those years is consistent: I build the thing that isn’t there — a team where there was no department, documentation from zero, structure where there was firefighting, a career where there was no industry to offer one. Introduced structured delivery in three resistant environments (financial services, a global brand agency, and a greenfield platform team). Technical depth across frontend and platform architecture establishes credibility; my true strength is designing the conditions where engineers do their best work.</w:t>
       </w:r>
     </w:p>
     <w:bookmarkEnd w:id="12"/>
@@ -162,7 +162,7 @@
         <w:t xml:space="preserve"> </w:t>
       </w:r>
       <w:r>
-        <w:t xml:space="preserve">— building, mentoring, and retaining high-performing remote teams; measurement-led via DORA metrics (DX), team health tracking, and Peakon Heartbeat surveys, so performance stays visible, sustainable, and connected to career progression.</w:t>
+        <w:t xml:space="preserve">— building, mentoring, and retaining high-performing remote teams; measurement-led via DORA metrics (DX), team health tracking, and Peakon Heartbeat surveys; reorg communication on a cadence — including empty updates when there’s nothing new — so trust holds when certainty can’t.</w:t>
       </w:r>
     </w:p>
     <w:p>
@@ -184,7 +184,7 @@
         <w:t xml:space="preserve"> </w:t>
       </w:r>
       <w:r>
-        <w:t xml:space="preserve">— navigating complex restructurings and shaping team structures that align engineering capability with business outcomes; have built the same team twice from zero.</w:t>
+        <w:t xml:space="preserve">— navigating complex restructurings and shaping team structures that align engineering capability with business outcomes; have built the same team twice from zero; staff complementary pairs, not just headcount.</w:t>
       </w:r>
     </w:p>
     <w:p>
@@ -271,7 +271,7 @@
         <w:t xml:space="preserve">£200k</w:t>
       </w:r>
       <w:r>
-        <w:t xml:space="preserve">+ annual vendor portfolio across six platform services, active contribution to CapEx/OpEx planning, and vendor ROI evaluation.</w:t>
+        <w:t xml:space="preserve">+ annual vendor portfolio across six platform services, active contribution to CapEx/OpEx planning, and vendor ROI evaluation; commercial literacy from sitting with compliance, marketing, data, and IT.</w:t>
       </w:r>
     </w:p>
     <w:p>
@@ -403,7 +403,7 @@
         <w:t xml:space="preserve"> </w:t>
       </w:r>
       <w:r>
-        <w:t xml:space="preserve">through evidence-based cases informed by DORA metrics and Peakon Heartbeat surveys, and mentored engineers who moved into Engineering Manager roles both internally and externally.</w:t>
+        <w:t xml:space="preserve">through evidence-based cases informed by DORA metrics and Peakon Heartbeat surveys; developed talent other teams had passed over; mentored engineers who moved into Engineering Manager roles both internally and externally.</w:t>
       </w:r>
     </w:p>
     <w:p>
@@ -425,7 +425,7 @@
         <w:t xml:space="preserve"> </w:t>
       </w:r>
       <w:r>
-        <w:t xml:space="preserve">Took unguided responsibility for scoping and executing team migrations between pillars during restructurings — mapping scope, chasing stakeholder alignment, and building consensus from scratch. Negotiated the inbound transfer of a Senior Engineer with mobile expertise when a mobile backlog entered the team’s remit, and challenged and reversed structural decisions that would have eliminated the Design Systems team — preserving the capability that enabled the 2025 company-wide rebrand.</w:t>
+        <w:t xml:space="preserve">Took unguided responsibility for scoping and executing team migrations between pillars during restructurings — mapping scope, chasing stakeholder alignment, and building consensus from scratch. Negotiated skill inbound — a Senior Engineer with mobile expertise — when a mobile backlog entered the team’s remit, rather than stretching the existing team thin; challenged and reversed structural decisions that would have eliminated the Design Systems team — preserving the capability that enabled the 2025 company-wide rebrand.</w:t>
       </w:r>
     </w:p>
     <w:p>
@@ -1072,29 +1072,7 @@
         <w:t xml:space="preserve"> </w:t>
       </w:r>
       <w:r>
-        <w:t xml:space="preserve">Introduced Agile and Scrum to LBS for the first time — shifting a high-bureaucracy, low-velocity organisation to sprint-based iterative delivery, and acting as the primary driver of Agile adoption across the department.</w:t>
-      </w:r>
-    </w:p>
-    <w:p>
-      <w:pPr>
-        <w:pStyle w:val="Compact"/>
-        <w:numPr>
-          <w:ilvl w:val="0"/>
-          <w:numId w:val="1005"/>
-        </w:numPr>
-      </w:pPr>
-      <w:r>
-        <w:rPr>
-          <w:b/>
-          <w:bCs/>
-        </w:rPr>
-        <w:t xml:space="preserve">Leadership in Crisis (Interim Scrum Master, Jun–Oct 2019):</w:t>
-      </w:r>
-      <w:r>
-        <w:t xml:space="preserve"> </w:t>
-      </w:r>
-      <w:r>
-        <w:t xml:space="preserve">Formally appointed to stabilise delivery and lead the Digital Transformation programme — moving a firefighting culture into structured, iterative feature development alongside external consultants and cross-functional teams.</w:t>
+        <w:t xml:space="preserve">Introduced Agile and Scrum to LBS for the first time — voluntary ways-of-working forums (off-site, cross-functional) that grew championing into a parallel Scrum Master role, then a formal Interim SM appointment (Jun–Oct 2019) to stabilise Digital Transformation alongside external consultants.</w:t>
       </w:r>
     </w:p>
     <w:bookmarkEnd w:id="17"/>
@@ -1330,7 +1308,7 @@
         <w:t xml:space="preserve"> </w:t>
       </w:r>
       <w:r>
-        <w:t xml:space="preserve">Earned a Certified Training Professional (CTP) qualification and spent a year teaching ECDL to adult learners. Privately tutored a student in algorithmic logic, C, and hardware — that student is now an engineer at Sophos.</w:t>
+        <w:t xml:space="preserve">Earned a Certified Training Professional (CTP) qualification and spent a year teaching ECDL to adult learners. Privately tutored a student in algorithmic logic, C, and hardware — that student went on into software engineering and is now an Engineering Manager.</w:t>
       </w:r>
     </w:p>
     <w:p>

</xml_diff>